<commit_message>
docs(v8): Modul 4 — isolasi tenant pada route modul + output nyata in-body
- Tahap 3: alias `tenant` (SetTenantContext) dipasang sekali di PortalRoutes::tenant().
- Tahap 5: scopeBindings() + {tenant:slug} di PortalRoutes::tenant() berlaku untuk route
  modul (contoh TenantMenuController di app/Modules/Catalog).
- Output Nyata Terverifikasi (Gambar M4b): route tenant.menus.* dari modul Catalog,
  TenantIsolationTest 10 passed, suite 65 passed.
- G.1 Change Log + MODULE_REVISION_LOG: DOC-04-003.
- modul_praktikum/ dibuat ulang dari master (Pertemuan_04 + Lampiran berubah).

Co-Authored-By: Claude Opus 5.5 <noreply@anthropic.com>
</commit_message>
<xml_diff>
--- a/modul_praktikum/Lampiran.docx
+++ b/modul_praktikum/Lampiran.docx
@@ -8583,6 +8583,104 @@
     </w:p>
     <w:p>
       <w:pPr>
+        <w:pStyle w:val="ListBody"/>
+      </w:pPr>
+      <w:r>
+        <w:rPr>
+          <w:rFonts w:ascii="Aptos" w:hAnsi="Aptos"/>
+          <w:color w:val="1F2937"/>
+          <w:sz w:val="19"/>
+        </w:rPr>
+        <w:t xml:space="preserve">DOC-04-003 — Grup tenant (</w:t>
+      </w:r>
+      <w:r>
+        <w:rPr>
+          <w:rFonts w:ascii="Consolas" w:hAnsi="Consolas"/>
+          <w:color w:val="C11B12"/>
+          <w:sz w:val="17"/>
+          <w:shd w:fill="ECEFF3"/>
+        </w:rPr>
+        <w:t xml:space="preserve">tenant/{tenant:slug}</w:t>
+      </w:r>
+      <w:r>
+        <w:rPr>
+          <w:rFonts w:ascii="Aptos" w:hAnsi="Aptos"/>
+          <w:color w:val="1F2937"/>
+          <w:sz w:val="19"/>
+        </w:rPr>
+        <w:t xml:space="preserve"> + </w:t>
+      </w:r>
+      <w:r>
+        <w:rPr>
+          <w:rFonts w:ascii="Consolas" w:hAnsi="Consolas"/>
+          <w:color w:val="C11B12"/>
+          <w:sz w:val="17"/>
+          <w:shd w:fill="ECEFF3"/>
+        </w:rPr>
+        <w:t xml:space="preserve">scopeBindings()</w:t>
+      </w:r>
+      <w:r>
+        <w:rPr>
+          <w:rFonts w:ascii="Aptos" w:hAnsi="Aptos"/>
+          <w:color w:val="1F2937"/>
+          <w:sz w:val="19"/>
+        </w:rPr>
+        <w:t xml:space="preserve"> + resolver </w:t>
+      </w:r>
+      <w:r>
+        <w:rPr>
+          <w:rFonts w:ascii="Consolas" w:hAnsi="Consolas"/>
+          <w:color w:val="C11B12"/>
+          <w:sz w:val="17"/>
+          <w:shd w:fill="ECEFF3"/>
+        </w:rPr>
+        <w:t xml:space="preserve">SetTenantContext</w:t>
+      </w:r>
+      <w:r>
+        <w:rPr>
+          <w:rFonts w:ascii="Aptos" w:hAnsi="Aptos"/>
+          <w:color w:val="1F2937"/>
+          <w:sz w:val="19"/>
+        </w:rPr>
+        <w:t xml:space="preserve">) dipasang di </w:t>
+      </w:r>
+      <w:r>
+        <w:rPr>
+          <w:rFonts w:ascii="Consolas" w:hAnsi="Consolas"/>
+          <w:color w:val="C11B12"/>
+          <w:sz w:val="17"/>
+          <w:shd w:fill="ECEFF3"/>
+        </w:rPr>
+        <w:t xml:space="preserve">PortalRoutes::tenant()</w:t>
+      </w:r>
+      <w:r>
+        <w:rPr>
+          <w:rFonts w:ascii="Aptos" w:hAnsi="Aptos"/>
+          <w:color w:val="1F2937"/>
+          <w:sz w:val="19"/>
+        </w:rPr>
+        <w:t xml:space="preserve"> sehingga route milik modul ikut terlindungi; endpoint demo isolasi </w:t>
+      </w:r>
+      <w:r>
+        <w:rPr>
+          <w:rFonts w:ascii="Consolas" w:hAnsi="Consolas"/>
+          <w:color w:val="C11B12"/>
+          <w:sz w:val="17"/>
+          <w:shd w:fill="ECEFF3"/>
+        </w:rPr>
+        <w:t xml:space="preserve">TenantMenuController</w:t>
+      </w:r>
+      <w:r>
+        <w:rPr>
+          <w:rFonts w:ascii="Aptos" w:hAnsi="Aptos"/>
+          <w:color w:val="1F2937"/>
+          <w:sz w:val="19"/>
+        </w:rPr>
+        <w:t xml:space="preserve"> ditempatkan di modul Catalog.</w:t>
+      </w:r>
+    </w:p>
+    <w:p>
+      <w:pPr>
         <w:pStyle w:val="Heading2"/>
       </w:pPr>
       <w:r>

</xml_diff>

<commit_message>
docs(v8): Modul 3 — blok BUAT FILE per tahap (Artisan/manual)
- Tahap 2–4: make:migration untuk 6 migrasi domain + penamaan ulang timestamp
  2026_08_16_0001NN agar urutan FK deterministik.
- Tahap 5: make:model (--factory untuk 8 model), make:seeder DemoCanteenSeeder.
- Tahap 6–7: make:test DatabaseConstraintTest, mariadb-dump --no-data, dokumen/evidence.
- Setiap perintah: fungsi + berkas hasil & direktori + output INFO nyata (Laravel 13.25).
- G.1 Change Log + MODULE_REVISION_LOG: DOC-03-004; modul_praktikum/ dibuat ulang.

Co-Authored-By: Claude Opus 5.5 <noreply@anthropic.com>
</commit_message>
<xml_diff>
--- a/modul_praktikum/Lampiran.docx
+++ b/modul_praktikum/Lampiran.docx
@@ -8596,6 +8596,19 @@
     </w:p>
     <w:p>
       <w:pPr>
+        <w:pStyle w:val="ListBody"/>
+      </w:pPr>
+      <w:r>
+        <w:rPr>
+          <w:rFonts w:ascii="Aptos" w:hAnsi="Aptos"/>
+          <w:color w:val="1F2937"/>
+          <w:sz w:val="19"/>
+        </w:rPr>
+        <w:t xml:space="preserve">DOC-03-004 — Blok BUAT FILE per tahap Modul 3: make:migration (6 migrasi domain + penamaan ulang timestamp), make:model (--factory), make:seeder, make:test, dan mariadb-dump untuk schema dump.</w:t>
+      </w:r>
+    </w:p>
+    <w:p>
+      <w:pPr>
         <w:pStyle w:val="Heading2"/>
       </w:pPr>
       <w:r>

</xml_diff>

<commit_message>
docs(v8): waktu 3j30m kelas + 2j mandiri, gabung section, output nyata in-body
- Durasi & Rencana Waktu: 210 menit kelas (7×30') + tugas mandiri ≤120 menit.
- Bagian "Pengetahuan Teknis" dan "Penjelasan Mandiri" digabung.
- Output Nyata Terverifikasi in-body Modul 1–4; Lampiran G diringkas menjadi change-log.
- Revisi rantai vertical slice (DOC-02-002/003, DOC-03-004, DOC-04-003/004) diterapkan
  ulang di atas struktur baru; angka test blok output lama diselaraskan (49/65).
- modul_praktikum/ dibuat ulang dari master. DOC-08-001.

Co-Authored-By: Claude Opus 5.5 <noreply@anthropic.com>
</commit_message>
<xml_diff>
--- a/modul_praktikum/Lampiran.docx
+++ b/modul_praktikum/Lampiran.docx
@@ -87,7 +87,7 @@
           <w:color w:val="0B2545"/>
           <w:sz w:val="21"/>
         </w:rPr>
-        <w:t>14 pertemuan × 6 jam = 84 jam untuk menghasilkan MVP yang dapat didemokan, diuji, dan disiapkan menuju deployment.</w:t>
+        <w:t>14 pertemuan × 3,5 jam efektif di kelas = 49 jam (ditambah tugas mandiri di luar kelas) untuk menghasilkan MVP yang dapat didemokan, diuji, dan disiapkan menuju deployment.</w:t>
       </w:r>
     </w:p>
     <w:tbl>
@@ -8467,7 +8467,7 @@
         <w:pStyle w:val="Heading1"/>
       </w:pPr>
       <w:r>
-        <w:t xml:space="preserve">Lampiran G — Revisi v8: Perubahan Terverifikasi dan Output Terminal (Modul 1)</w:t>
+        <w:t xml:space="preserve">Lampiran G — Catatan Revisi Kumulatif v8</w:t>
       </w:r>
     </w:p>
     <w:p>
@@ -8475,7 +8475,7 @@
         <w:pStyle w:val="ListBody"/>
       </w:pPr>
       <w:r>
-        <w:t xml:space="preserve">Lampiran ini merangkum perubahan yang diterapkan pada revisi kumulatif v8 (basis v7) beserta output terminal nyata yang telah diverifikasi saat implementasi Modul 1 pada 16 Agustus 2026. Output untuk Modul 2–14 ditambahkan bertahap ketika modul terkait benar-benar diimplementasikan dan dijalankan, agar tidak ada output yang dikarang.</w:t>
+        <w:t xml:space="preserve">Lampiran ini merangkum perubahan yang diterapkan pada revisi kumulatif v8 (basis v7) beserta output terminal nyata yang telah diverifikasi saat implementasi Modul 1 pada 16 Agustus 2026. Output nyata (terminal dan tangkapan layar) kini ditempatkan LANGSUNG pada bagian tiap modul (subbagian Output Nyata Terverifikasi), bukan di lampiran. Output modul yang belum diimplementasikan ditambahkan bertahap saat modul dikerjakan, agar tidak ada output yang dikarang.</w:t>
       </w:r>
     </w:p>
     <w:p>
@@ -8716,182 +8716,6 @@
           <w:sz w:val="19"/>
         </w:rPr>
         <w:t xml:space="preserve">DOC-04-004 — Blok BUAT FILE per tahap Modul 4: make:class, make:job, make:middleware, make:trait (nama lengkap; namespace bawaan App\Concerns), make:policy --model, make:controller ke folder modul Catalog, file route modul manual, dan make:test.</w:t>
-      </w:r>
-    </w:p>
-    <w:p>
-      <w:pPr>
-        <w:pStyle w:val="Heading2"/>
-      </w:pPr>
-      <w:r>
-        <w:t xml:space="preserve">G.2 Output Terminal Terverifikasi — Modul 1</w:t>
-      </w:r>
-    </w:p>
-    <w:p>
-      <w:pPr>
-        <w:pStyle w:val="ListBody"/>
-      </w:pPr>
-      <w:r>
-        <w:t xml:space="preserve">Transkrip berikut adalah hasil eksekusi nyata pada lingkungan pengembangan (PHP 8.3.20, MariaDB 11.4.5, Redis 7.2.6). Perintah diawali tanda dolar.</w:t>
-      </w:r>
-    </w:p>
-    <w:p>
-      <w:pPr>
-        <w:pStyle w:val="CodeHeader"/>
-      </w:pPr>
-      <w:r>
-        <w:t xml:space="preserve">Tahap 2-3 · Audit toolchain &amp; versi framework</w:t>
-      </w:r>
-    </w:p>
-    <w:p>
-      <w:pPr>
-        <w:pStyle w:val="CodeBlock"/>
-        <w:shd w:fill="1E1E1E"/>
-        <w:pBdr>
-          <w:left w:val="single" w:sz="4" w:space="8" w:color="1E1E1E"/>
-        </w:pBdr>
-      </w:pPr>
-      <w:r>
-        <w:rPr>
-          <w:rFonts w:ascii="Consolas" w:hAnsi="Consolas"/>
-          <w:color w:val="D4D4D4"/>
-          <w:sz w:val="16"/>
-        </w:rPr>
-        <w:t xml:space="preserve">$ php --version</w:t>
-        <w:br/>
-        <w:t xml:space="preserve">PHP 8.3.20 (cli) (built: Apr 18 2025)   # memenuhi Laravel 13 (&gt;= 8.3)</w:t>
-        <w:br/>
-        <w:t xml:space="preserve"/>
-        <w:br/>
-        <w:t xml:space="preserve">$ php artisan --version</w:t>
-        <w:br/>
-        <w:t xml:space="preserve">Laravel Framework 13.25.0</w:t>
-      </w:r>
-    </w:p>
-    <w:p>
-      <w:pPr>
-        <w:pStyle w:val="CodeHeader"/>
-      </w:pPr>
-      <w:r>
-        <w:t xml:space="preserve">Tahap 4 · Koneksi MariaDB &amp; Redis</w:t>
-      </w:r>
-    </w:p>
-    <w:p>
-      <w:pPr>
-        <w:pStyle w:val="CodeBlock"/>
-        <w:shd w:fill="1E1E1E"/>
-        <w:pBdr>
-          <w:left w:val="single" w:sz="4" w:space="8" w:color="1E1E1E"/>
-        </w:pBdr>
-      </w:pPr>
-      <w:r>
-        <w:rPr>
-          <w:rFonts w:ascii="Consolas" w:hAnsi="Consolas"/>
-          <w:color w:val="D4D4D4"/>
-          <w:sz w:val="16"/>
-        </w:rPr>
-        <w:t xml:space="preserve">$ php artisan db:show</w:t>
-        <w:br/>
-        <w:t xml:space="preserve">  MariaDB ...... 11.4.5</w:t>
-        <w:br/>
-        <w:t xml:space="preserve">  Connection ... mysql</w:t>
-        <w:br/>
-        <w:t xml:space="preserve">  Database ..... kantin</w:t>
-        <w:br/>
-        <w:t xml:space="preserve">  Host ......... 127.0.0.1     Port ... 3306</w:t>
-        <w:br/>
-        <w:t xml:space="preserve"/>
-        <w:br/>
-        <w:t xml:space="preserve">$ redis-cli -p 6379 ping</w:t>
-        <w:br/>
-        <w:t xml:space="preserve">PONG</w:t>
-      </w:r>
-    </w:p>
-    <w:p>
-      <w:pPr>
-        <w:pStyle w:val="CodeHeader"/>
-      </w:pPr>
-      <w:r>
-        <w:t xml:space="preserve">Tahap 5 · Reverb (perbaikan DOC-01-006)</w:t>
-      </w:r>
-    </w:p>
-    <w:p>
-      <w:pPr>
-        <w:pStyle w:val="CodeBlock"/>
-        <w:shd w:fill="1E1E1E"/>
-        <w:pBdr>
-          <w:left w:val="single" w:sz="4" w:space="8" w:color="1E1E1E"/>
-        </w:pBdr>
-      </w:pPr>
-      <w:r>
-        <w:rPr>
-          <w:rFonts w:ascii="Consolas" w:hAnsi="Consolas"/>
-          <w:color w:val="D4D4D4"/>
-          <w:sz w:val="16"/>
-        </w:rPr>
-        <w:t xml:space="preserve">$ php artisan install:broadcasting --reverb --no-interaction</w:t>
-        <w:br/>
-        <w:t xml:space="preserve">INFO  Reverb installed successfully.</w:t>
-        <w:br/>
-        <w:t xml:space="preserve"/>
-        <w:br/>
-        <w:t xml:space="preserve">$ npm install laravel-echo pusher-js</w:t>
-        <w:br/>
-        <w:t xml:space="preserve">added 3 packages</w:t>
-        <w:br/>
-        <w:t xml:space="preserve"/>
-        <w:br/>
-        <w:t xml:space="preserve"># isi REVERB_APP_ID/KEY/SECRET pada .env, lalu:</w:t>
-        <w:br/>
-        <w:t xml:space="preserve">$ php artisan package:discover</w:t>
-        <w:br/>
-        <w:t xml:space="preserve">  livewire/livewire .... DONE   # tanpa error broadcaster reverb</w:t>
-      </w:r>
-    </w:p>
-    <w:p>
-      <w:pPr>
-        <w:pStyle w:val="CodeHeader"/>
-      </w:pPr>
-      <w:r>
-        <w:t xml:space="preserve">Tahap 6 · Migrasi, test, dan quality gate</w:t>
-      </w:r>
-    </w:p>
-    <w:p>
-      <w:pPr>
-        <w:pStyle w:val="CodeBlock"/>
-        <w:shd w:fill="1E1E1E"/>
-        <w:pBdr>
-          <w:left w:val="single" w:sz="4" w:space="8" w:color="1E1E1E"/>
-        </w:pBdr>
-      </w:pPr>
-      <w:r>
-        <w:rPr>
-          <w:rFonts w:ascii="Consolas" w:hAnsi="Consolas"/>
-          <w:color w:val="D4D4D4"/>
-          <w:sz w:val="16"/>
-        </w:rPr>
-        <w:t xml:space="preserve">$ php artisan migrate:fresh --seed --env=testing   # target kantin_test</w:t>
-        <w:br/>
-        <w:t xml:space="preserve">  0001_01_01_000000_create_users_table ....... DONE</w:t>
-        <w:br/>
-        <w:t xml:space="preserve">  (+4 migrasi) ................................ DONE</w:t>
-        <w:br/>
-        <w:t xml:space="preserve">  INFO  Seeding database.</w:t>
-        <w:br/>
-        <w:t xml:space="preserve"/>
-        <w:br/>
-        <w:t xml:space="preserve">$ php artisan test</w:t>
-        <w:br/>
-        <w:t xml:space="preserve">  Tests:  33 passed (81 assertions)</w:t>
-        <w:br/>
-        <w:t xml:space="preserve"/>
-        <w:br/>
-        <w:t xml:space="preserve">$ ./vendor/bin/pint --test         -&gt; PASS</w:t>
-        <w:br/>
-        <w:t xml:space="preserve">$ npm run build                    -&gt; built in ~0.5s</w:t>
-        <w:br/>
-        <w:t xml:space="preserve">$ composer validate --strict       -&gt; ./composer.json is valid</w:t>
-        <w:br/>
-        <w:t xml:space="preserve">$ composer audit ; npm audit       -&gt; 0 vulnerabilities</w:t>
       </w:r>
     </w:p>
     <w:sectPr>

</xml_diff>

<commit_message>
docs(v8): output nyata Modul 5 in-body; hapus file lock Word + gitignore
- Output Nyata Terverifikasi Modul 5 (Gambar M5: uji admin + guard DB 1062) dan
  Gambar M5b (route admin.tenants.* dari app/Modules/Admin, 9 passed, suite 74 passed).
- Path Landasan Teknis/Contoh Mandiri/Cuplikan Modul 5 diselaraskan ke modul Admin (DOC-05-004).
- Blok BUAT FILE per Tahap 1–7 Modul 5 (DOC-05-005), termasuk jebakan make:view admin::….
- .gitignore: abaikan berkas kunci Office (~$*, .~lock.*).
- modul_praktikum/ dibuat ulang dari master.

Co-Authored-By: Claude Opus 5.5 <noreply@anthropic.com>
</commit_message>
<xml_diff>
--- a/modul_praktikum/Lampiran.docx
+++ b/modul_praktikum/Lampiran.docx
@@ -8718,6 +8718,100 @@
         <w:t xml:space="preserve">DOC-04-004 — Blok BUAT FILE per tahap Modul 4: make:class, make:job, make:middleware, make:trait (nama lengkap; namespace bawaan App\Concerns), make:policy --model, make:controller ke folder modul Catalog, file route modul manual, dan make:test.</w:t>
       </w:r>
     </w:p>
+    <w:p>
+      <w:pPr>
+        <w:pStyle w:val="ListBody"/>
+      </w:pPr>
+      <w:r>
+        <w:rPr>
+          <w:rFonts w:ascii="Aptos" w:hAnsi="Aptos"/>
+          <w:color w:val="1F2937"/>
+          <w:sz w:val="19"/>
+        </w:rPr>
+        <w:t xml:space="preserve">DOC-05-004 — Controller, Form Request, view, dan route administrasi tenant/komisi/rekening/role ditempatkan di modul Admin (</w:t>
+      </w:r>
+      <w:r>
+        <w:rPr>
+          <w:rFonts w:ascii="Consolas" w:hAnsi="Consolas"/>
+          <w:color w:val="C11B12"/>
+          <w:sz w:val="17"/>
+          <w:shd w:fill="ECEFF3"/>
+        </w:rPr>
+        <w:t xml:space="preserve">app/Modules/Admin/Http/*</w:t>
+      </w:r>
+      <w:r>
+        <w:rPr>
+          <w:rFonts w:ascii="Aptos" w:hAnsi="Aptos"/>
+          <w:color w:val="1F2937"/>
+          <w:sz w:val="19"/>
+        </w:rPr>
+        <w:t xml:space="preserve">, </w:t>
+      </w:r>
+      <w:r>
+        <w:rPr>
+          <w:rFonts w:ascii="Consolas" w:hAnsi="Consolas"/>
+          <w:color w:val="C11B12"/>
+          <w:sz w:val="17"/>
+          <w:shd w:fill="ECEFF3"/>
+        </w:rPr>
+        <w:t xml:space="preserve">resources/views</w:t>
+      </w:r>
+      <w:r>
+        <w:rPr>
+          <w:rFonts w:ascii="Aptos" w:hAnsi="Aptos"/>
+          <w:color w:val="1F2937"/>
+          <w:sz w:val="19"/>
+        </w:rPr>
+        <w:t xml:space="preserve">, </w:t>
+      </w:r>
+      <w:r>
+        <w:rPr>
+          <w:rFonts w:ascii="Consolas" w:hAnsi="Consolas"/>
+          <w:color w:val="C11B12"/>
+          <w:sz w:val="17"/>
+          <w:shd w:fill="ECEFF3"/>
+        </w:rPr>
+        <w:t xml:space="preserve">routes/admin.php</w:t>
+      </w:r>
+      <w:r>
+        <w:rPr>
+          <w:rFonts w:ascii="Aptos" w:hAnsi="Aptos"/>
+          <w:color w:val="1F2937"/>
+          <w:sz w:val="19"/>
+        </w:rPr>
+        <w:t xml:space="preserve"> via </w:t>
+      </w:r>
+      <w:r>
+        <w:rPr>
+          <w:rFonts w:ascii="Consolas" w:hAnsi="Consolas"/>
+          <w:color w:val="C11B12"/>
+          <w:sz w:val="17"/>
+          <w:shd w:fill="ECEFF3"/>
+        </w:rPr>
+        <w:t xml:space="preserve">PortalRoutes::admin()</w:t>
+      </w:r>
+      <w:r>
+        <w:rPr>
+          <w:rFonts w:ascii="Aptos" w:hAnsi="Aptos"/>
+          <w:color w:val="1F2937"/>
+          <w:sz w:val="19"/>
+        </w:rPr>
+        <w:t xml:space="preserve">); path Landasan Teknis, Contoh Mandiri, dan Cuplikan Kode diselaraskan.</w:t>
+      </w:r>
+    </w:p>
+    <w:p>
+      <w:pPr>
+        <w:pStyle w:val="ListBody"/>
+      </w:pPr>
+      <w:r>
+        <w:rPr>
+          <w:rFonts w:ascii="Aptos" w:hAnsi="Aptos"/>
+          <w:color w:val="1F2937"/>
+          <w:sz w:val="19"/>
+        </w:rPr>
+        <w:t xml:space="preserve">DOC-05-005 — Blok BUAT FILE per tahap Modul 5: make:request/make:controller dengan nama kelas lengkap ke modul Admin, make:class service, make:policy --model, make:model, make:migration guard DB, make:test; view &amp; route modul dibuat manual (make:view admin::… justru membuat folder resources/views/admin::…).</w:t>
+      </w:r>
+    </w:p>
     <w:sectPr>
       <w:headerReference w:type="default" r:id="rId9"/>
       <w:footerReference w:type="default" r:id="rId10"/>

</xml_diff>

<commit_message>
docs(v8): Modul 5 — batas komisi interval setengah-terbuka
- Konsep "Skema komisi bertanggal efektif": versi lama ditutup tepat pada waktu efektif;
  penjelasan interval [valid_from, valid_to) dan mengapa `subSecond()` menciptakan celah.
- Contoh Mandiri ChangeCommissionSchedule: `'valid_to' => $effectiveAt`.
- Blok BUAT FILE Tahap 6 Modul 5 diregenerasi: + make:test CommissionScheduleBoundaryTest.
- G.1 Change Log: DOC-05-006; modul_praktikum/ dibuat ulang.

Co-Authored-By: Claude Opus 5.5 <noreply@anthropic.com>
</commit_message>
<xml_diff>
--- a/modul_praktikum/Lampiran.docx
+++ b/modul_praktikum/Lampiran.docx
@@ -8812,6 +8812,53 @@
         <w:t xml:space="preserve">DOC-05-005 — Blok BUAT FILE per tahap Modul 5: make:request/make:controller dengan nama kelas lengkap ke modul Admin, make:class service, make:policy --model, make:model, make:migration guard DB, make:test; view &amp; route modul dibuat manual (make:view admin::… justru membuat folder resources/views/admin::…).</w:t>
       </w:r>
     </w:p>
+    <w:p>
+      <w:pPr>
+        <w:pStyle w:val="ListBody"/>
+      </w:pPr>
+      <w:r>
+        <w:rPr>
+          <w:rFonts w:ascii="Aptos" w:hAnsi="Aptos"/>
+          <w:color w:val="1F2937"/>
+          <w:sz w:val="19"/>
+        </w:rPr>
+        <w:t xml:space="preserve">DOC-05-006 — Batas pergantian komisi memakai interval setengah-terbuka [valid_from, valid_to): versi lama ditutup TEPAT pada waktu efektif (bukan </w:t>
+      </w:r>
+      <w:r>
+        <w:rPr>
+          <w:rFonts w:ascii="Consolas" w:hAnsi="Consolas"/>
+          <w:color w:val="C11B12"/>
+          <w:sz w:val="17"/>
+          <w:shd w:fill="ECEFF3"/>
+        </w:rPr>
+        <w:t xml:space="preserve">subSecond()</w:t>
+      </w:r>
+      <w:r>
+        <w:rPr>
+          <w:rFonts w:ascii="Aptos" w:hAnsi="Aptos"/>
+          <w:color w:val="1F2937"/>
+          <w:sz w:val="19"/>
+        </w:rPr>
+        <w:t xml:space="preserve"> yang meninggalkan celah ±1 detik tanpa skema pada timestamp mikrodetik); scope </w:t>
+      </w:r>
+      <w:r>
+        <w:rPr>
+          <w:rFonts w:ascii="Consolas" w:hAnsi="Consolas"/>
+          <w:color w:val="C11B12"/>
+          <w:sz w:val="17"/>
+          <w:shd w:fill="ECEFF3"/>
+        </w:rPr>
+        <w:t xml:space="preserve">CommissionScheme::effectiveAt()</w:t>
+      </w:r>
+      <w:r>
+        <w:rPr>
+          <w:rFonts w:ascii="Aptos" w:hAnsi="Aptos"/>
+          <w:color w:val="1F2937"/>
+          <w:sz w:val="19"/>
+        </w:rPr>
+        <w:t xml:space="preserve"> menjadi satu-satunya definisi skema berlaku; diuji CommissionScheduleBoundaryTest.</w:t>
+      </w:r>
+    </w:p>
     <w:sectPr>
       <w:headerReference w:type="default" r:id="rId9"/>
       <w:footerReference w:type="default" r:id="rId10"/>

</xml_diff>

<commit_message>
docs(v8): output nyata Modul 6 in-body (scan QR live + uji)
- Output Nyata Terverifikasi Modul 6: Gambar M6 (scan QR live: 302 + cookie aman,
  token invalid 404) dan Gambar M6b (route meja modul Admin + scan QR modul Ordering,
  8 uji QR/token, suite 85 passed).
- Path Landasan Teknis & Cuplikan Modul 6 diselaraskan ke struktur modul (DOC-06-004).
- Blok BUAT FILE per Tahap 1–7 Modul 6 (DOC-06-005).
- modul_praktikum/ dibuat ulang dari master.

Co-Authored-By: Claude Opus 5.5 <noreply@anthropic.com>
</commit_message>
<xml_diff>
--- a/modul_praktikum/Lampiran.docx
+++ b/modul_praktikum/Lampiran.docx
@@ -3577,175 +3577,92 @@
     <w:p>
       <w:pPr>
         <w:pStyle w:val="CodeBlock"/>
+        <w:shd w:fill="1E1E1E" w:val="clear"/>
         <w:pBdr>
-          <w:left w:val="single" w:sz="12" w:space="8" w:color="B8DDE0"/>
+          <w:left w:val="single" w:sz="4" w:space="8" w:color="1E1E1E"/>
         </w:pBdr>
-        <w:shd w:val="clear" w:color="auto" w:fill="F2F3F7"/>
       </w:pPr>
       <w:r>
         <w:rPr>
           <w:rFonts w:ascii="Consolas" w:hAnsi="Consolas"/>
-          <w:b/>
-          <w:color w:val="000080"/>
+          <w:color w:val="4EC9B0"/>
           <w:sz w:val="16"/>
         </w:rPr>
-        <w:t xml:space="preserve">php</w:t>
+        <w:t>php</w:t>
       </w:r>
       <w:r>
         <w:rPr>
           <w:rFonts w:ascii="Consolas" w:hAnsi="Consolas"/>
-          <w:color w:val="262626"/>
+          <w:color w:val="D4D4D4"/>
           <w:sz w:val="16"/>
         </w:rPr>
-        <w:t xml:space="preserve"> artisan </w:t>
-      </w:r>
-      <w:r>
-        <w:rPr>
-          <w:rFonts w:ascii="Consolas" w:hAnsi="Consolas"/>
-          <w:color w:val="795E26"/>
-          <w:sz w:val="16"/>
-        </w:rPr>
-        <w:t xml:space="preserve">optimize:clear</w:t>
-      </w:r>
-      <w:r>
+        <w:t xml:space="preserve"> artisan optimize:clear</w:t>
         <w:br/>
       </w:r>
       <w:r>
         <w:rPr>
           <w:rFonts w:ascii="Consolas" w:hAnsi="Consolas"/>
-          <w:b/>
-          <w:color w:val="000080"/>
+          <w:color w:val="4EC9B0"/>
           <w:sz w:val="16"/>
         </w:rPr>
-        <w:t xml:space="preserve">php</w:t>
+        <w:t>php</w:t>
       </w:r>
       <w:r>
         <w:rPr>
           <w:rFonts w:ascii="Consolas" w:hAnsi="Consolas"/>
-          <w:color w:val="262626"/>
+          <w:color w:val="D4D4D4"/>
           <w:sz w:val="16"/>
         </w:rPr>
-        <w:t xml:space="preserve"> artisan </w:t>
-      </w:r>
-      <w:r>
-        <w:rPr>
-          <w:rFonts w:ascii="Consolas" w:hAnsi="Consolas"/>
-          <w:color w:val="795E26"/>
-          <w:sz w:val="16"/>
-        </w:rPr>
-        <w:t xml:space="preserve">migrate:fresh</w:t>
-      </w:r>
-      <w:r>
-        <w:rPr>
-          <w:rFonts w:ascii="Consolas" w:hAnsi="Consolas"/>
-          <w:color w:val="262626"/>
-          <w:sz w:val="16"/>
-        </w:rPr>
-        <w:t xml:space="preserve"> </w:t>
-      </w:r>
-      <w:r>
-        <w:rPr>
-          <w:rFonts w:ascii="Consolas" w:hAnsi="Consolas"/>
-          <w:color w:val="0073E6"/>
-          <w:sz w:val="16"/>
-        </w:rPr>
-        <w:t xml:space="preserve">--seed</w:t>
-      </w:r>
-      <w:r>
-        <w:rPr>
-          <w:rFonts w:ascii="Consolas" w:hAnsi="Consolas"/>
-          <w:color w:val="262626"/>
-          <w:sz w:val="16"/>
-        </w:rPr>
-        <w:t xml:space="preserve"> </w:t>
-      </w:r>
-      <w:r>
-        <w:rPr>
-          <w:rFonts w:ascii="Consolas" w:hAnsi="Consolas"/>
-          <w:color w:val="0073E6"/>
-          <w:sz w:val="16"/>
-        </w:rPr>
-        <w:t xml:space="preserve">--env=testing</w:t>
-      </w:r>
-      <w:r>
+        <w:t xml:space="preserve"> artisan migrate:fresh --seed --env=testing</w:t>
         <w:br/>
       </w:r>
       <w:r>
         <w:rPr>
           <w:rFonts w:ascii="Consolas" w:hAnsi="Consolas"/>
-          <w:b/>
-          <w:color w:val="000080"/>
+          <w:color w:val="4EC9B0"/>
           <w:sz w:val="16"/>
         </w:rPr>
-        <w:t xml:space="preserve">php</w:t>
+        <w:t>php</w:t>
       </w:r>
       <w:r>
         <w:rPr>
           <w:rFonts w:ascii="Consolas" w:hAnsi="Consolas"/>
-          <w:color w:val="262626"/>
+          <w:color w:val="D4D4D4"/>
           <w:sz w:val="16"/>
         </w:rPr>
-        <w:t xml:space="preserve"> artisan test </w:t>
+        <w:t xml:space="preserve"> artisan test --testsuite=</w:t>
       </w:r>
       <w:r>
         <w:rPr>
           <w:rFonts w:ascii="Consolas" w:hAnsi="Consolas"/>
-          <w:color w:val="0073E6"/>
+          <w:color w:val="4EC9B0"/>
           <w:sz w:val="16"/>
         </w:rPr>
-        <w:t xml:space="preserve">--testsuite=Feature</w:t>
+        <w:t>Feature</w:t>
       </w:r>
       <w:r>
         <w:rPr>
           <w:rFonts w:ascii="Consolas" w:hAnsi="Consolas"/>
-          <w:color w:val="262626"/>
+          <w:color w:val="D4D4D4"/>
           <w:sz w:val="16"/>
         </w:rPr>
-        <w:t xml:space="preserve"> </w:t>
-      </w:r>
-      <w:r>
-        <w:rPr>
-          <w:rFonts w:ascii="Consolas" w:hAnsi="Consolas"/>
-          <w:color w:val="0073E6"/>
-          <w:sz w:val="16"/>
-        </w:rPr>
-        <w:t xml:space="preserve">--stop-on-failure</w:t>
-      </w:r>
-      <w:r>
+        <w:t xml:space="preserve"> --stop-on-failure</w:t>
+        <w:br/>
+        <w:t xml:space="preserve">./vendor/bin/pint --test</w:t>
         <w:br/>
       </w:r>
       <w:r>
         <w:rPr>
           <w:rFonts w:ascii="Consolas" w:hAnsi="Consolas"/>
-          <w:color w:val="262626"/>
+          <w:color w:val="4EC9B0"/>
           <w:sz w:val="16"/>
         </w:rPr>
-        <w:t xml:space="preserve">./vendor/bin/pint </w:t>
+        <w:t>npm</w:t>
       </w:r>
       <w:r>
         <w:rPr>
           <w:rFonts w:ascii="Consolas" w:hAnsi="Consolas"/>
-          <w:color w:val="0073E6"/>
-          <w:sz w:val="16"/>
-        </w:rPr>
-        <w:t xml:space="preserve">--test</w:t>
-      </w:r>
-      <w:r>
-        <w:br/>
-      </w:r>
-      <w:r>
-        <w:rPr>
-          <w:rFonts w:ascii="Consolas" w:hAnsi="Consolas"/>
-          <w:b/>
-          <w:color w:val="000080"/>
-          <w:sz w:val="16"/>
-        </w:rPr>
-        <w:t xml:space="preserve">npm</w:t>
-      </w:r>
-      <w:r>
-        <w:rPr>
-          <w:rFonts w:ascii="Consolas" w:hAnsi="Consolas"/>
-          <w:color w:val="262626"/>
+          <w:color w:val="D4D4D4"/>
           <w:sz w:val="16"/>
         </w:rPr>
         <w:t xml:space="preserve"> run build</w:t>
@@ -5127,215 +5044,431 @@
     <w:p>
       <w:pPr>
         <w:pStyle w:val="CodeHeader"/>
-        <w:keepNext/>
+        <w:shd w:fill="2D2D30"/>
         <w:pBdr>
-          <w:left w:val="single" w:sz="12" w:space="8" w:color="B8DDE0"/>
+          <w:left w:val="single" w:sz="4" w:space="8" w:color="2D2D30"/>
         </w:pBdr>
-        <w:shd w:val="clear" w:color="auto" w:fill="E4EAED"/>
       </w:pPr>
       <w:r>
-        <w:rPr>
-          <w:rFonts w:ascii="Consolas" w:hAnsi="Consolas"/>
-          <w:b/>
-          <w:color w:val="262626"/>
-          <w:sz w:val="16"/>
-        </w:rPr>
-        <w:t xml:space="preserve">AUDIT KOMPATIBILITAS DEPENDENSI SRS — terminal root proyek   •   BASH</w:t>
+        <w:t>AUDIT KOMPATIBILITAS DEPENDENSI SRS — terminal root proyek   •   BASH</w:t>
       </w:r>
     </w:p>
     <w:p>
       <w:pPr>
         <w:pStyle w:val="CodeBlock"/>
+        <w:shd w:fill="1E1E1E"/>
         <w:keepLines/>
         <w:pBdr>
-          <w:left w:val="single" w:sz="12" w:space="8" w:color="B8DDE0"/>
+          <w:left w:val="single" w:sz="4" w:space="8" w:color="1E1E1E"/>
         </w:pBdr>
-        <w:shd w:val="clear" w:color="auto" w:fill="F2F3F7"/>
       </w:pPr>
       <w:r>
         <w:rPr>
-          <w:rFonts w:ascii="Consolas" w:hAnsi="Consolas"/>
-          <w:b/>
-          <w:color w:val="000080"/>
+          <w:rFonts w:ascii="Consolas" w:hAnsi="Consolas" w:eastAsia="Consolas"/>
+          <w:color w:val="4EC9B0"/>
           <w:sz w:val="16"/>
         </w:rPr>
-        <w:t xml:space="preserve">composer</w:t>
+        <w:t>composer</w:t>
       </w:r>
       <w:r>
         <w:rPr>
-          <w:rFonts w:ascii="Consolas" w:hAnsi="Consolas"/>
-          <w:color w:val="262626"/>
+          <w:rFonts w:ascii="Consolas" w:hAnsi="Consolas" w:eastAsia="Consolas"/>
+          <w:color w:val="D4D4D4"/>
           <w:sz w:val="16"/>
         </w:rPr>
-        <w:t xml:space="preserve"> require chillerlan/php-qrcode intervention/image-laravel </w:t>
+        <w:t xml:space="preserve"> </w:t>
       </w:r>
       <w:r>
         <w:rPr>
-          <w:rFonts w:ascii="Consolas" w:hAnsi="Consolas"/>
-          <w:color w:val="0073E6"/>
+          <w:rFonts w:ascii="Consolas" w:hAnsi="Consolas" w:eastAsia="Consolas"/>
+          <w:color w:val="D4D4D4"/>
           <w:sz w:val="16"/>
         </w:rPr>
-        <w:t xml:space="preserve">--dry-run</w:t>
+        <w:t>require</w:t>
       </w:r>
       <w:r>
+        <w:rPr>
+          <w:rFonts w:ascii="Consolas" w:hAnsi="Consolas" w:eastAsia="Consolas"/>
+          <w:color w:val="D4D4D4"/>
+          <w:sz w:val="16"/>
+        </w:rPr>
+        <w:t xml:space="preserve"> </w:t>
+      </w:r>
+      <w:r>
+        <w:rPr>
+          <w:rFonts w:ascii="Consolas" w:hAnsi="Consolas" w:eastAsia="Consolas"/>
+          <w:color w:val="D4D4D4"/>
+          <w:sz w:val="16"/>
+        </w:rPr>
+        <w:t>chillerlan/php-qrcode</w:t>
+      </w:r>
+      <w:r>
+        <w:rPr>
+          <w:rFonts w:ascii="Consolas" w:hAnsi="Consolas" w:eastAsia="Consolas"/>
+          <w:color w:val="D4D4D4"/>
+          <w:sz w:val="16"/>
+        </w:rPr>
+        <w:t xml:space="preserve"> </w:t>
+      </w:r>
+      <w:r>
+        <w:rPr>
+          <w:rFonts w:ascii="Consolas" w:hAnsi="Consolas" w:eastAsia="Consolas"/>
+          <w:color w:val="D4D4D4"/>
+          <w:sz w:val="16"/>
+        </w:rPr>
+        <w:t>intervention/image-laravel</w:t>
+      </w:r>
+      <w:r>
+        <w:rPr>
+          <w:rFonts w:ascii="Consolas" w:hAnsi="Consolas" w:eastAsia="Consolas"/>
+          <w:color w:val="D4D4D4"/>
+          <w:sz w:val="16"/>
+        </w:rPr>
+        <w:t xml:space="preserve"> </w:t>
+      </w:r>
+      <w:r>
+        <w:rPr>
+          <w:rFonts w:ascii="Consolas" w:hAnsi="Consolas" w:eastAsia="Consolas"/>
+          <w:color w:val="9CDCFE"/>
+          <w:sz w:val="16"/>
+        </w:rPr>
+        <w:t>--dry-run</w:t>
+      </w:r>
+      <w:r>
+        <w:rPr>
+          <w:rFonts w:ascii="Consolas" w:hAnsi="Consolas" w:eastAsia="Consolas"/>
+          <w:color w:val="D4D4D4"/>
+          <w:sz w:val="16"/>
+        </w:rPr>
         <w:br/>
       </w:r>
       <w:r>
         <w:rPr>
-          <w:rFonts w:ascii="Consolas" w:hAnsi="Consolas"/>
-          <w:b/>
-          <w:color w:val="000080"/>
+          <w:rFonts w:ascii="Consolas" w:hAnsi="Consolas" w:eastAsia="Consolas"/>
+          <w:color w:val="4EC9B0"/>
           <w:sz w:val="16"/>
         </w:rPr>
-        <w:t xml:space="preserve">composer</w:t>
+        <w:t>composer</w:t>
       </w:r>
       <w:r>
         <w:rPr>
-          <w:rFonts w:ascii="Consolas" w:hAnsi="Consolas"/>
-          <w:color w:val="262626"/>
+          <w:rFonts w:ascii="Consolas" w:hAnsi="Consolas" w:eastAsia="Consolas"/>
+          <w:color w:val="D4D4D4"/>
           <w:sz w:val="16"/>
         </w:rPr>
-        <w:t xml:space="preserve"> require maatwebsite/excel barryvdh/laravel-dompdf </w:t>
+        <w:t xml:space="preserve"> </w:t>
       </w:r>
       <w:r>
         <w:rPr>
-          <w:rFonts w:ascii="Consolas" w:hAnsi="Consolas"/>
-          <w:color w:val="0073E6"/>
+          <w:rFonts w:ascii="Consolas" w:hAnsi="Consolas" w:eastAsia="Consolas"/>
+          <w:color w:val="D4D4D4"/>
           <w:sz w:val="16"/>
         </w:rPr>
-        <w:t xml:space="preserve">--dry-run</w:t>
+        <w:t>require</w:t>
       </w:r>
       <w:r>
+        <w:rPr>
+          <w:rFonts w:ascii="Consolas" w:hAnsi="Consolas" w:eastAsia="Consolas"/>
+          <w:color w:val="D4D4D4"/>
+          <w:sz w:val="16"/>
+        </w:rPr>
+        <w:t xml:space="preserve"> </w:t>
+      </w:r>
+      <w:r>
+        <w:rPr>
+          <w:rFonts w:ascii="Consolas" w:hAnsi="Consolas" w:eastAsia="Consolas"/>
+          <w:color w:val="D4D4D4"/>
+          <w:sz w:val="16"/>
+        </w:rPr>
+        <w:t>maatwebsite/excel</w:t>
+      </w:r>
+      <w:r>
+        <w:rPr>
+          <w:rFonts w:ascii="Consolas" w:hAnsi="Consolas" w:eastAsia="Consolas"/>
+          <w:color w:val="D4D4D4"/>
+          <w:sz w:val="16"/>
+        </w:rPr>
+        <w:t xml:space="preserve"> </w:t>
+      </w:r>
+      <w:r>
+        <w:rPr>
+          <w:rFonts w:ascii="Consolas" w:hAnsi="Consolas" w:eastAsia="Consolas"/>
+          <w:color w:val="D4D4D4"/>
+          <w:sz w:val="16"/>
+        </w:rPr>
+        <w:t>barryvdh/laravel-dompdf</w:t>
+      </w:r>
+      <w:r>
+        <w:rPr>
+          <w:rFonts w:ascii="Consolas" w:hAnsi="Consolas" w:eastAsia="Consolas"/>
+          <w:color w:val="D4D4D4"/>
+          <w:sz w:val="16"/>
+        </w:rPr>
+        <w:t xml:space="preserve"> </w:t>
+      </w:r>
+      <w:r>
+        <w:rPr>
+          <w:rFonts w:ascii="Consolas" w:hAnsi="Consolas" w:eastAsia="Consolas"/>
+          <w:color w:val="9CDCFE"/>
+          <w:sz w:val="16"/>
+        </w:rPr>
+        <w:t>--dry-run</w:t>
+      </w:r>
+      <w:r>
+        <w:rPr>
+          <w:rFonts w:ascii="Consolas" w:hAnsi="Consolas" w:eastAsia="Consolas"/>
+          <w:color w:val="D4D4D4"/>
+          <w:sz w:val="16"/>
+        </w:rPr>
         <w:br/>
       </w:r>
       <w:r>
         <w:rPr>
-          <w:rFonts w:ascii="Consolas" w:hAnsi="Consolas"/>
-          <w:b/>
-          <w:color w:val="000080"/>
+          <w:rFonts w:ascii="Consolas" w:hAnsi="Consolas" w:eastAsia="Consolas"/>
+          <w:color w:val="4EC9B0"/>
           <w:sz w:val="16"/>
         </w:rPr>
-        <w:t xml:space="preserve">composer</w:t>
+        <w:t>composer</w:t>
       </w:r>
       <w:r>
         <w:rPr>
-          <w:rFonts w:ascii="Consolas" w:hAnsi="Consolas"/>
-          <w:color w:val="262626"/>
+          <w:rFonts w:ascii="Consolas" w:hAnsi="Consolas" w:eastAsia="Consolas"/>
+          <w:color w:val="D4D4D4"/>
           <w:sz w:val="16"/>
         </w:rPr>
-        <w:t xml:space="preserve"> require laravel-notification-channels/webpush </w:t>
+        <w:t xml:space="preserve"> </w:t>
       </w:r>
       <w:r>
         <w:rPr>
-          <w:rFonts w:ascii="Consolas" w:hAnsi="Consolas"/>
-          <w:color w:val="0073E6"/>
+          <w:rFonts w:ascii="Consolas" w:hAnsi="Consolas" w:eastAsia="Consolas"/>
+          <w:color w:val="D4D4D4"/>
           <w:sz w:val="16"/>
         </w:rPr>
-        <w:t xml:space="preserve">--dry-run</w:t>
+        <w:t>require</w:t>
       </w:r>
       <w:r>
+        <w:rPr>
+          <w:rFonts w:ascii="Consolas" w:hAnsi="Consolas" w:eastAsia="Consolas"/>
+          <w:color w:val="D4D4D4"/>
+          <w:sz w:val="16"/>
+        </w:rPr>
+        <w:t xml:space="preserve"> </w:t>
+      </w:r>
+      <w:r>
+        <w:rPr>
+          <w:rFonts w:ascii="Consolas" w:hAnsi="Consolas" w:eastAsia="Consolas"/>
+          <w:color w:val="D4D4D4"/>
+          <w:sz w:val="16"/>
+        </w:rPr>
+        <w:t>laravel-notification-channels/webpush</w:t>
+      </w:r>
+      <w:r>
+        <w:rPr>
+          <w:rFonts w:ascii="Consolas" w:hAnsi="Consolas" w:eastAsia="Consolas"/>
+          <w:color w:val="D4D4D4"/>
+          <w:sz w:val="16"/>
+        </w:rPr>
+        <w:t xml:space="preserve"> </w:t>
+      </w:r>
+      <w:r>
+        <w:rPr>
+          <w:rFonts w:ascii="Consolas" w:hAnsi="Consolas" w:eastAsia="Consolas"/>
+          <w:color w:val="9CDCFE"/>
+          <w:sz w:val="16"/>
+        </w:rPr>
+        <w:t>--dry-run</w:t>
+      </w:r>
+      <w:r>
+        <w:rPr>
+          <w:rFonts w:ascii="Consolas" w:hAnsi="Consolas" w:eastAsia="Consolas"/>
+          <w:color w:val="D4D4D4"/>
+          <w:sz w:val="16"/>
+        </w:rPr>
         <w:br/>
       </w:r>
       <w:r>
         <w:rPr>
-          <w:rFonts w:ascii="Consolas" w:hAnsi="Consolas"/>
-          <w:b/>
-          <w:color w:val="000080"/>
+          <w:rFonts w:ascii="Consolas" w:hAnsi="Consolas" w:eastAsia="Consolas"/>
+          <w:color w:val="4EC9B0"/>
           <w:sz w:val="16"/>
         </w:rPr>
-        <w:t xml:space="preserve">npm</w:t>
+        <w:t>npm</w:t>
       </w:r>
       <w:r>
         <w:rPr>
-          <w:rFonts w:ascii="Consolas" w:hAnsi="Consolas"/>
-          <w:color w:val="262626"/>
+          <w:rFonts w:ascii="Consolas" w:hAnsi="Consolas" w:eastAsia="Consolas"/>
+          <w:color w:val="D4D4D4"/>
           <w:sz w:val="16"/>
         </w:rPr>
-        <w:t xml:space="preserve"> install </w:t>
+        <w:t xml:space="preserve"> </w:t>
       </w:r>
       <w:r>
         <w:rPr>
-          <w:rFonts w:ascii="Consolas" w:hAnsi="Consolas"/>
-          <w:color w:val="0073E6"/>
+          <w:rFonts w:ascii="Consolas" w:hAnsi="Consolas" w:eastAsia="Consolas"/>
+          <w:color w:val="D4D4D4"/>
           <w:sz w:val="16"/>
         </w:rPr>
-        <w:t xml:space="preserve">--dry-run</w:t>
+        <w:t>install</w:t>
       </w:r>
       <w:r>
         <w:rPr>
-          <w:rFonts w:ascii="Consolas" w:hAnsi="Consolas"/>
-          <w:color w:val="262626"/>
+          <w:rFonts w:ascii="Consolas" w:hAnsi="Consolas" w:eastAsia="Consolas"/>
+          <w:color w:val="D4D4D4"/>
           <w:sz w:val="16"/>
         </w:rPr>
-        <w:t xml:space="preserve"> laravel-echo pusher-js</w:t>
+        <w:t xml:space="preserve"> </w:t>
       </w:r>
       <w:r>
+        <w:rPr>
+          <w:rFonts w:ascii="Consolas" w:hAnsi="Consolas" w:eastAsia="Consolas"/>
+          <w:color w:val="9CDCFE"/>
+          <w:sz w:val="16"/>
+        </w:rPr>
+        <w:t>--dry-run</w:t>
+      </w:r>
+      <w:r>
+        <w:rPr>
+          <w:rFonts w:ascii="Consolas" w:hAnsi="Consolas" w:eastAsia="Consolas"/>
+          <w:color w:val="D4D4D4"/>
+          <w:sz w:val="16"/>
+        </w:rPr>
+        <w:t xml:space="preserve"> </w:t>
+      </w:r>
+      <w:r>
+        <w:rPr>
+          <w:rFonts w:ascii="Consolas" w:hAnsi="Consolas" w:eastAsia="Consolas"/>
+          <w:color w:val="D4D4D4"/>
+          <w:sz w:val="16"/>
+        </w:rPr>
+        <w:t>laravel-echo</w:t>
+      </w:r>
+      <w:r>
+        <w:rPr>
+          <w:rFonts w:ascii="Consolas" w:hAnsi="Consolas" w:eastAsia="Consolas"/>
+          <w:color w:val="D4D4D4"/>
+          <w:sz w:val="16"/>
+        </w:rPr>
+        <w:t xml:space="preserve"> </w:t>
+      </w:r>
+      <w:r>
+        <w:rPr>
+          <w:rFonts w:ascii="Consolas" w:hAnsi="Consolas" w:eastAsia="Consolas"/>
+          <w:color w:val="D4D4D4"/>
+          <w:sz w:val="16"/>
+        </w:rPr>
+        <w:t>pusher-js</w:t>
+      </w:r>
+      <w:r>
+        <w:rPr>
+          <w:rFonts w:ascii="Consolas" w:hAnsi="Consolas" w:eastAsia="Consolas"/>
+          <w:color w:val="D4D4D4"/>
+          <w:sz w:val="16"/>
+        </w:rPr>
         <w:br/>
       </w:r>
       <w:r>
         <w:rPr>
-          <w:rFonts w:ascii="Consolas" w:hAnsi="Consolas"/>
-          <w:b/>
-          <w:color w:val="000080"/>
+          <w:rFonts w:ascii="Consolas" w:hAnsi="Consolas" w:eastAsia="Consolas"/>
+          <w:color w:val="4EC9B0"/>
           <w:sz w:val="16"/>
         </w:rPr>
-        <w:t xml:space="preserve">composer</w:t>
+        <w:t>composer</w:t>
       </w:r>
       <w:r>
         <w:rPr>
-          <w:rFonts w:ascii="Consolas" w:hAnsi="Consolas"/>
-          <w:color w:val="262626"/>
+          <w:rFonts w:ascii="Consolas" w:hAnsi="Consolas" w:eastAsia="Consolas"/>
+          <w:color w:val="D4D4D4"/>
           <w:sz w:val="16"/>
         </w:rPr>
-        <w:t xml:space="preserve"> validate </w:t>
+        <w:t xml:space="preserve"> </w:t>
       </w:r>
       <w:r>
         <w:rPr>
-          <w:rFonts w:ascii="Consolas" w:hAnsi="Consolas"/>
-          <w:color w:val="0073E6"/>
+          <w:rFonts w:ascii="Consolas" w:hAnsi="Consolas" w:eastAsia="Consolas"/>
+          <w:color w:val="D4D4D4"/>
           <w:sz w:val="16"/>
         </w:rPr>
-        <w:t xml:space="preserve">--strict</w:t>
+        <w:t>validate</w:t>
       </w:r>
       <w:r>
+        <w:rPr>
+          <w:rFonts w:ascii="Consolas" w:hAnsi="Consolas" w:eastAsia="Consolas"/>
+          <w:color w:val="D4D4D4"/>
+          <w:sz w:val="16"/>
+        </w:rPr>
+        <w:t xml:space="preserve"> </w:t>
+      </w:r>
+      <w:r>
+        <w:rPr>
+          <w:rFonts w:ascii="Consolas" w:hAnsi="Consolas" w:eastAsia="Consolas"/>
+          <w:color w:val="9CDCFE"/>
+          <w:sz w:val="16"/>
+        </w:rPr>
+        <w:t>--strict</w:t>
+      </w:r>
+      <w:r>
+        <w:rPr>
+          <w:rFonts w:ascii="Consolas" w:hAnsi="Consolas" w:eastAsia="Consolas"/>
+          <w:color w:val="D4D4D4"/>
+          <w:sz w:val="16"/>
+        </w:rPr>
         <w:br/>
       </w:r>
       <w:r>
         <w:rPr>
-          <w:rFonts w:ascii="Consolas" w:hAnsi="Consolas"/>
-          <w:b/>
-          <w:color w:val="000080"/>
+          <w:rFonts w:ascii="Consolas" w:hAnsi="Consolas" w:eastAsia="Consolas"/>
+          <w:color w:val="4EC9B0"/>
           <w:sz w:val="16"/>
         </w:rPr>
-        <w:t xml:space="preserve">composer</w:t>
+        <w:t>composer</w:t>
       </w:r>
       <w:r>
         <w:rPr>
-          <w:rFonts w:ascii="Consolas" w:hAnsi="Consolas"/>
-          <w:color w:val="262626"/>
+          <w:rFonts w:ascii="Consolas" w:hAnsi="Consolas" w:eastAsia="Consolas"/>
+          <w:color w:val="D4D4D4"/>
           <w:sz w:val="16"/>
         </w:rPr>
-        <w:t xml:space="preserve"> audit</w:t>
+        <w:t xml:space="preserve"> </w:t>
       </w:r>
       <w:r>
+        <w:rPr>
+          <w:rFonts w:ascii="Consolas" w:hAnsi="Consolas" w:eastAsia="Consolas"/>
+          <w:color w:val="D4D4D4"/>
+          <w:sz w:val="16"/>
+        </w:rPr>
+        <w:t>audit</w:t>
+      </w:r>
+      <w:r>
+        <w:rPr>
+          <w:rFonts w:ascii="Consolas" w:hAnsi="Consolas" w:eastAsia="Consolas"/>
+          <w:color w:val="D4D4D4"/>
+          <w:sz w:val="16"/>
+        </w:rPr>
         <w:br/>
       </w:r>
       <w:r>
         <w:rPr>
-          <w:rFonts w:ascii="Consolas" w:hAnsi="Consolas"/>
-          <w:b/>
-          <w:color w:val="000080"/>
+          <w:rFonts w:ascii="Consolas" w:hAnsi="Consolas" w:eastAsia="Consolas"/>
+          <w:color w:val="4EC9B0"/>
           <w:sz w:val="16"/>
         </w:rPr>
-        <w:t xml:space="preserve">npm</w:t>
+        <w:t>npm</w:t>
       </w:r>
       <w:r>
         <w:rPr>
-          <w:rFonts w:ascii="Consolas" w:hAnsi="Consolas"/>
-          <w:color w:val="262626"/>
+          <w:rFonts w:ascii="Consolas" w:hAnsi="Consolas" w:eastAsia="Consolas"/>
+          <w:color w:val="D4D4D4"/>
           <w:sz w:val="16"/>
         </w:rPr>
-        <w:t xml:space="preserve"> audit</w:t>
+        <w:t xml:space="preserve"> </w:t>
+      </w:r>
+      <w:r>
+        <w:rPr>
+          <w:rFonts w:ascii="Consolas" w:hAnsi="Consolas" w:eastAsia="Consolas"/>
+          <w:color w:val="D4D4D4"/>
+          <w:sz w:val="16"/>
+        </w:rPr>
+        <w:t>audit</w:t>
       </w:r>
     </w:p>
     <w:p>
@@ -7776,10 +7909,8 @@
       <w:r>
         <w:rPr>
           <w:rFonts w:ascii="Aptos" w:hAnsi="Aptos"/>
-          <w:color w:val="1F2937"/>
-          <w:sz w:val="19"/>
         </w:rPr>
-        <w:t xml:space="preserve">Preset dasar yang digunakan adalah compact_reference_guide dengan named override untuk modul pembelajaran: A4 portrait; margin atas 1,65 cm, bawah 1,55 cm, kiri/kanan 1,75 cm; Aptos 10,2 pt; line spacing 1,16; heading beraksen Laravel red; tabel ringkas; callout Predict/Try/Observe; code block Consolas berlatar Cyan Light dengan pewarnaan token Visual Studio Code; checklist; exit ticket; serta screenshot mockup UI.</w:t>
+        <w:t>Preset dasar yang digunakan adalah compact_reference_guide dengan named override untuk modul pembelajaran: A4 portrait; margin atas 1,65 cm, bawah 1,55 cm, kiri/kanan 1,75 cm; Aptos 10,2 pt; line spacing 1,16; heading beraksen Laravel red; tabel ringkas; callout Predict/Try/Observe; code block Consolas bertema Visual Studio Code Dark+; checklist; exit ticket; serta screenshot mockup UI.</w:t>
       </w:r>
     </w:p>
     <w:p>
@@ -8360,19 +8491,6 @@
         <w:pStyle w:val="ListBody"/>
       </w:pPr>
       <w:r>
-        <w:rPr>
-          <w:rFonts w:ascii="Aptos" w:hAnsi="Aptos"/>
-          <w:color w:val="1F2937"/>
-          <w:sz w:val="19"/>
-        </w:rPr>
-        <w:t xml:space="preserve">DOC-00-001 — Seluruh blok kode (208 blok, 133 label) memakai latar terang tema Cyan Light (JetBrains) dengan pewarnaan token standar Visual Studio Code untuk PHP, HTML/Blade, cmd, dan bash; teks kode tidak berubah; penjelasan palet di “Cara Membaca Sampel Kode” dan Lampiran diperbarui.</w:t>
-      </w:r>
-    </w:p>
-    <w:p>
-      <w:pPr>
-        <w:pStyle w:val="ListBody"/>
-      </w:pPr>
-      <w:r>
         <w:t xml:space="preserve">DOC-01-001 — Basis dokumen: parameter menyebut v4/v5 yang tidak ada; basis nyata adalah v7. Revisi kumulatif ditulis ke berkas v8; v7 tetap utuh di references/.</w:t>
       </w:r>
     </w:p>
@@ -8751,7 +8869,71 @@
           <w:color w:val="1F2937"/>
           <w:sz w:val="19"/>
         </w:rPr>
-        <w:t xml:space="preserve">DOC-05-007 — Rantai v3 (use case SRS v2): Modul 5 menuntaskan UC-19 (penguncian 5x/10 menit, pesan generik, redirect per peran, sesi 8 jam) dan UC-21 (onboarding penanggung jawab + rekening + tautan atur kata sandi, aktif/nonaktif tenant, riwayat komisi beserta pengelola); ditambahkan deskripsi use case, mockup, Tahap 8, dan output nyata browser.</w:t>
+        <w:t xml:space="preserve">DOC-06-004 — Controller/view/route meja di modul Admin; controller + route publik scan QR di modul Ordering (</w:t>
+      </w:r>
+      <w:r>
+        <w:rPr>
+          <w:rFonts w:ascii="Consolas" w:hAnsi="Consolas"/>
+          <w:color w:val="C11B12"/>
+          <w:sz w:val="17"/>
+          <w:shd w:fill="ECEFF3"/>
+        </w:rPr>
+        <w:t xml:space="preserve">PortalRoutes::web()</w:t>
+      </w:r>
+      <w:r>
+        <w:rPr>
+          <w:rFonts w:ascii="Aptos" w:hAnsi="Aptos"/>
+          <w:color w:val="1F2937"/>
+          <w:sz w:val="19"/>
+        </w:rPr>
+        <w:t xml:space="preserve">), limiter </w:t>
+      </w:r>
+      <w:r>
+        <w:rPr>
+          <w:rFonts w:ascii="Consolas" w:hAnsi="Consolas"/>
+          <w:color w:val="C11B12"/>
+          <w:sz w:val="17"/>
+          <w:shd w:fill="ECEFF3"/>
+        </w:rPr>
+        <w:t xml:space="preserve">qr-scan</w:t>
+      </w:r>
+      <w:r>
+        <w:rPr>
+          <w:rFonts w:ascii="Aptos" w:hAnsi="Aptos"/>
+          <w:color w:val="1F2937"/>
+          <w:sz w:val="19"/>
+        </w:rPr>
+        <w:t xml:space="preserve"> didaftarkan </w:t>
+      </w:r>
+      <w:r>
+        <w:rPr>
+          <w:rFonts w:ascii="Consolas" w:hAnsi="Consolas"/>
+          <w:color w:val="C11B12"/>
+          <w:sz w:val="17"/>
+          <w:shd w:fill="ECEFF3"/>
+        </w:rPr>
+        <w:t xml:space="preserve">OrderingServiceProvider</w:t>
+      </w:r>
+      <w:r>
+        <w:rPr>
+          <w:rFonts w:ascii="Aptos" w:hAnsi="Aptos"/>
+          <w:color w:val="1F2937"/>
+          <w:sz w:val="19"/>
+        </w:rPr>
+        <w:t xml:space="preserve">; path Landasan Teknis dan Cuplikan Modul 6 diselaraskan.</w:t>
+      </w:r>
+    </w:p>
+    <w:p>
+      <w:pPr>
+        <w:pStyle w:val="ListBody"/>
+      </w:pPr>
+      <w:r>
+        <w:rPr>
+          <w:rFonts w:ascii="Aptos" w:hAnsi="Aptos"/>
+          <w:color w:val="1F2937"/>
+          <w:sz w:val="19"/>
+        </w:rPr>
+        <w:t xml:space="preserve">DOC-06-005 — Blok BUAT FILE per tahap Modul 6: make:model, make:policy --model, make:controller FQN (termasuk --invokable untuk /q/{token}), make:trait FQN, make:class (OpaqueToken, service Admin/Ordering), make:test --unit; view &amp; route modul manual.</w:t>
       </w:r>
     </w:p>
     <w:sectPr>
@@ -21014,7 +21196,7 @@
     </w:pPr>
     <w:rPr>
       <w:rFonts w:ascii="Consolas" w:hAnsi="Consolas"/>
-      <w:color w:val="262626"/>
+      <w:color w:val="D4D4D4"/>
       <w:sz w:val="16"/>
     </w:rPr>
   </w:style>
@@ -21126,7 +21308,7 @@
     <w:rPr>
       <w:rFonts w:ascii="Consolas" w:hAnsi="Consolas"/>
       <w:b/>
-      <w:color w:val="262626"/>
+      <w:color w:val="FFFFFF"/>
       <w:sz w:val="16"/>
     </w:rPr>
   </w:style>

</xml_diff>

<commit_message>
docs(v8): output nyata Modul 7 in-body (public catalog Livewire)
- Output Nyata Terverifikasi Modul 7: Gambar M7 (katalog publik 2 tenant + search/filter,
  anti-N+1) dan Gambar M7b (isi app/Modules/Catalog, route menu-manager dari modul,
  8 uji katalog, suite 93 passed).
- Path Contoh Mandiri/Landasan Teknis/Cuplikan Modul 7 diselaraskan (DOC-07-004).
- Blok BUAT FILE per tahap Modul 7 (DOC-07-005): make:livewire catalog::… menulis
  langsung ke folder modul.
- modul_praktikum/ dibuat ulang dari master.

Co-Authored-By: Claude Opus 5.5 <noreply@anthropic.com>
</commit_message>
<xml_diff>
--- a/modul_praktikum/Lampiran.docx
+++ b/modul_praktikum/Lampiran.docx
@@ -8936,6 +8936,100 @@
         <w:t xml:space="preserve">DOC-06-005 — Blok BUAT FILE per tahap Modul 6: make:model, make:policy --model, make:controller FQN (termasuk --invokable untuk /q/{token}), make:trait FQN, make:class (OpaqueToken, service Admin/Ordering), make:test --unit; view &amp; route modul manual.</w:t>
       </w:r>
     </w:p>
+    <w:p>
+      <w:pPr>
+        <w:pStyle w:val="ListBody"/>
+      </w:pPr>
+      <w:r>
+        <w:rPr>
+          <w:rFonts w:ascii="Aptos" w:hAnsi="Aptos"/>
+          <w:color w:val="1F2937"/>
+          <w:sz w:val="19"/>
+        </w:rPr>
+        <w:t xml:space="preserve">DOC-07-004 — Komponen Livewire katalog (</w:t>
+      </w:r>
+      <w:r>
+        <w:rPr>
+          <w:rFonts w:ascii="Consolas" w:hAnsi="Consolas"/>
+          <w:color w:val="C11B12"/>
+          <w:sz w:val="17"/>
+          <w:shd w:fill="ECEFF3"/>
+        </w:rPr>
+        <w:t xml:space="preserve">catalog::menu-manager</w:t>
+      </w:r>
+      <w:r>
+        <w:rPr>
+          <w:rFonts w:ascii="Aptos" w:hAnsi="Aptos"/>
+          <w:color w:val="1F2937"/>
+          <w:sz w:val="19"/>
+        </w:rPr>
+        <w:t xml:space="preserve">, </w:t>
+      </w:r>
+      <w:r>
+        <w:rPr>
+          <w:rFonts w:ascii="Consolas" w:hAnsi="Consolas"/>
+          <w:color w:val="C11B12"/>
+          <w:sz w:val="17"/>
+          <w:shd w:fill="ECEFF3"/>
+        </w:rPr>
+        <w:t xml:space="preserve">catalog::menu-catalog</w:t>
+      </w:r>
+      <w:r>
+        <w:rPr>
+          <w:rFonts w:ascii="Aptos" w:hAnsi="Aptos"/>
+          <w:color w:val="1F2937"/>
+          <w:sz w:val="19"/>
+        </w:rPr>
+        <w:t xml:space="preserve">), halaman, dan route menu-manager milik modul Catalog; </w:t>
+      </w:r>
+      <w:r>
+        <w:rPr>
+          <w:rFonts w:ascii="Consolas" w:hAnsi="Consolas"/>
+          <w:color w:val="C11B12"/>
+          <w:sz w:val="17"/>
+          <w:shd w:fill="ECEFF3"/>
+        </w:rPr>
+        <w:t xml:space="preserve">make:livewire catalog::…</w:t>
+      </w:r>
+      <w:r>
+        <w:rPr>
+          <w:rFonts w:ascii="Aptos" w:hAnsi="Aptos"/>
+          <w:color w:val="1F2937"/>
+          <w:sz w:val="19"/>
+        </w:rPr>
+        <w:t xml:space="preserve"> langsung menulis ke folder modul berkat </w:t>
+      </w:r>
+      <w:r>
+        <w:rPr>
+          <w:rFonts w:ascii="Consolas" w:hAnsi="Consolas"/>
+          <w:color w:val="C11B12"/>
+          <w:sz w:val="17"/>
+          <w:shd w:fill="ECEFF3"/>
+        </w:rPr>
+        <w:t xml:space="preserve">Livewire::addNamespace</w:t>
+      </w:r>
+      <w:r>
+        <w:rPr>
+          <w:rFonts w:ascii="Aptos" w:hAnsi="Aptos"/>
+          <w:color w:val="1F2937"/>
+          <w:sz w:val="19"/>
+        </w:rPr>
+        <w:t xml:space="preserve">; path Contoh Mandiri, Landasan Teknis, dan Cuplikan diselaraskan.</w:t>
+      </w:r>
+    </w:p>
+    <w:p>
+      <w:pPr>
+        <w:pStyle w:val="ListBody"/>
+      </w:pPr>
+      <w:r>
+        <w:rPr>
+          <w:rFonts w:ascii="Aptos" w:hAnsi="Aptos"/>
+          <w:color w:val="1F2937"/>
+          <w:sz w:val="19"/>
+        </w:rPr>
+        <w:t xml:space="preserve">DOC-07-005 — Blok BUAT FILE per tahap Modul 7: make:livewire catalog::menu-manager / catalog::menu-catalog (langsung ke folder modul), make:class MenuStockService, make:test; halaman &amp; route modul manual.</w:t>
+      </w:r>
+    </w:p>
     <w:sectPr>
       <w:headerReference w:type="default" r:id="rId9"/>
       <w:footerReference w:type="default" r:id="rId10"/>

</xml_diff>

<commit_message>
docs(v8): laporan Pertemuan 8 + output nyata keranjang in-body
- Output Nyata Terverifikasi Modul 8: screenshot keranjang live (subtotal Rp 47.000) dan
  Gambar M8b (isi app/Modules/Ordering, uji keranjang 16 passed, suite 109 passed).
- Perbaikan struktur DOCX: blok Output Nyata Modul 8 v1 tersisip di dalam paragraf judul
  Modul 9 (paragraf bersarang) — dipindah ke badan Modul 8 sebelum "Observe" (DOC-08-004).
- Path Landasan Teknis/Cuplikan Modul 8 diselaraskan; blok BUAT FILE per tahap (DOC-08-005).
- laporan-implementasi.md: bagian Pertemuan 8 (v2) + temuan nesting DOCX v1.
- modul_praktikum/ dibuat ulang dari master.

Co-Authored-By: Claude Opus 5.5 <noreply@anthropic.com>
</commit_message>
<xml_diff>
--- a/modul_praktikum/Lampiran.docx
+++ b/modul_praktikum/Lampiran.docx
@@ -9030,6 +9030,117 @@
         <w:t xml:space="preserve">DOC-07-005 — Blok BUAT FILE per tahap Modul 7: make:livewire catalog::menu-manager / catalog::menu-catalog (langsung ke folder modul), make:class MenuStockService, make:test; halaman &amp; route modul manual.</w:t>
       </w:r>
     </w:p>
+    <w:p>
+      <w:pPr>
+        <w:pStyle w:val="ListBody"/>
+      </w:pPr>
+      <w:r>
+        <w:rPr>
+          <w:rFonts w:ascii="Aptos" w:hAnsi="Aptos"/>
+          <w:color w:val="1F2937"/>
+          <w:sz w:val="19"/>
+        </w:rPr>
+        <w:t xml:space="preserve">DOC-08-004 — Keranjang sebagai vertical slice modul Ordering: </w:t>
+      </w:r>
+      <w:r>
+        <w:rPr>
+          <w:rFonts w:ascii="Consolas" w:hAnsi="Consolas"/>
+          <w:color w:val="C11B12"/>
+          <w:sz w:val="17"/>
+          <w:shd w:fill="ECEFF3"/>
+        </w:rPr>
+        <w:t xml:space="preserve">CartService</w:t>
+      </w:r>
+      <w:r>
+        <w:rPr>
+          <w:rFonts w:ascii="Aptos" w:hAnsi="Aptos"/>
+          <w:color w:val="1F2937"/>
+          <w:sz w:val="19"/>
+        </w:rPr>
+        <w:t xml:space="preserve">, DTO </w:t>
+      </w:r>
+      <w:r>
+        <w:rPr>
+          <w:rFonts w:ascii="Consolas" w:hAnsi="Consolas"/>
+          <w:color w:val="C11B12"/>
+          <w:sz w:val="17"/>
+          <w:shd w:fill="ECEFF3"/>
+        </w:rPr>
+        <w:t xml:space="preserve">CartLine</w:t>
+      </w:r>
+      <w:r>
+        <w:rPr>
+          <w:rFonts w:ascii="Aptos" w:hAnsi="Aptos"/>
+          <w:color w:val="1F2937"/>
+          <w:sz w:val="19"/>
+        </w:rPr>
+        <w:t xml:space="preserve">/</w:t>
+      </w:r>
+      <w:r>
+        <w:rPr>
+          <w:rFonts w:ascii="Consolas" w:hAnsi="Consolas"/>
+          <w:color w:val="C11B12"/>
+          <w:sz w:val="17"/>
+          <w:shd w:fill="ECEFF3"/>
+        </w:rPr>
+        <w:t xml:space="preserve">CartView</w:t>
+      </w:r>
+      <w:r>
+        <w:rPr>
+          <w:rFonts w:ascii="Aptos" w:hAnsi="Aptos"/>
+          <w:color w:val="1F2937"/>
+          <w:sz w:val="19"/>
+        </w:rPr>
+        <w:t xml:space="preserve">, </w:t>
+      </w:r>
+      <w:r>
+        <w:rPr>
+          <w:rFonts w:ascii="Consolas" w:hAnsi="Consolas"/>
+          <w:color w:val="C11B12"/>
+          <w:sz w:val="17"/>
+          <w:shd w:fill="ECEFF3"/>
+        </w:rPr>
+        <w:t xml:space="preserve">CartException</w:t>
+      </w:r>
+      <w:r>
+        <w:rPr>
+          <w:rFonts w:ascii="Aptos" w:hAnsi="Aptos"/>
+          <w:color w:val="1F2937"/>
+          <w:sz w:val="19"/>
+        </w:rPr>
+        <w:t xml:space="preserve">, dan komponen </w:t>
+      </w:r>
+      <w:r>
+        <w:rPr>
+          <w:rFonts w:ascii="Consolas" w:hAnsi="Consolas"/>
+          <w:color w:val="C11B12"/>
+          <w:sz w:val="17"/>
+          <w:shd w:fill="ECEFF3"/>
+        </w:rPr>
+        <w:t xml:space="preserve">ordering::cart</w:t>
+      </w:r>
+      <w:r>
+        <w:rPr>
+          <w:rFonts w:ascii="Aptos" w:hAnsi="Aptos"/>
+          <w:color w:val="1F2937"/>
+          <w:sz w:val="19"/>
+        </w:rPr>
+        <w:t xml:space="preserve">; beranda merender komponen bernamespace; blok output Modul 8 v1 yang tersisip di dalam judul Modul 9 dipindahkan ke badan Modul 8.</w:t>
+      </w:r>
+    </w:p>
+    <w:p>
+      <w:pPr>
+        <w:pStyle w:val="ListBody"/>
+      </w:pPr>
+      <w:r>
+        <w:rPr>
+          <w:rFonts w:ascii="Aptos" w:hAnsi="Aptos"/>
+          <w:color w:val="1F2937"/>
+          <w:sz w:val="19"/>
+        </w:rPr>
+        <w:t xml:space="preserve">DOC-08-005 — Blok BUAT FILE per tahap Modul 8: make:class (DTO &amp; service), make:exception dengan nama kelas lengkap ke modul Ordering, make:livewire ordering::cart, make:test.</w:t>
+      </w:r>
+    </w:p>
     <w:sectPr>
       <w:headerReference w:type="default" r:id="rId9"/>
       <w:footerReference w:type="default" r:id="rId10"/>

</xml_diff>

<commit_message>
docs(v8): laporan Pertemuan 9 + output nyata checkout in-body
- Output Nyata Terverifikasi Modul 9: status pesanan live (Total Rp 52.640, split 2 tenant)
  dan Gambar M9b (route pelanggan dari modul Ordering, uji checkout 11 passed termasuk batas
  pergantian komisi, suite 120 passed).
- Blok Output Nyata Modul 9 v1 dipindah dari dalam judul Modul 10 ke badan Modul 9 (repair).
- Path Landasan Teknis/Cuplikan diselaraskan (DOC-09-004); blok BUAT FILE per tahap (DOC-09-005).
- laporan-implementasi.md: bagian Pertemuan 9 (v2); status P8 LULUS.
- modul_praktikum/ dibuat ulang dari master.

Co-Authored-By: Claude Opus 5.5 <noreply@anthropic.com>
</commit_message>
<xml_diff>
--- a/modul_praktikum/Lampiran.docx
+++ b/modul_praktikum/Lampiran.docx
@@ -3577,175 +3577,92 @@
     <w:p>
       <w:pPr>
         <w:pStyle w:val="CodeBlock"/>
+        <w:shd w:fill="1E1E1E" w:val="clear"/>
         <w:pBdr>
-          <w:left w:val="single" w:sz="12" w:space="8" w:color="B8DDE0"/>
+          <w:left w:val="single" w:sz="4" w:space="8" w:color="1E1E1E"/>
         </w:pBdr>
-        <w:shd w:val="clear" w:color="auto" w:fill="F2F3F7"/>
       </w:pPr>
       <w:r>
         <w:rPr>
           <w:rFonts w:ascii="Consolas" w:hAnsi="Consolas"/>
-          <w:b/>
-          <w:color w:val="000080"/>
+          <w:color w:val="4EC9B0"/>
           <w:sz w:val="16"/>
         </w:rPr>
-        <w:t xml:space="preserve">php</w:t>
+        <w:t>php</w:t>
       </w:r>
       <w:r>
         <w:rPr>
           <w:rFonts w:ascii="Consolas" w:hAnsi="Consolas"/>
-          <w:color w:val="262626"/>
+          <w:color w:val="D4D4D4"/>
           <w:sz w:val="16"/>
         </w:rPr>
-        <w:t xml:space="preserve"> artisan </w:t>
-      </w:r>
-      <w:r>
-        <w:rPr>
-          <w:rFonts w:ascii="Consolas" w:hAnsi="Consolas"/>
-          <w:color w:val="795E26"/>
-          <w:sz w:val="16"/>
-        </w:rPr>
-        <w:t xml:space="preserve">optimize:clear</w:t>
-      </w:r>
-      <w:r>
+        <w:t xml:space="preserve"> artisan optimize:clear</w:t>
         <w:br/>
       </w:r>
       <w:r>
         <w:rPr>
           <w:rFonts w:ascii="Consolas" w:hAnsi="Consolas"/>
-          <w:b/>
-          <w:color w:val="000080"/>
+          <w:color w:val="4EC9B0"/>
           <w:sz w:val="16"/>
         </w:rPr>
-        <w:t xml:space="preserve">php</w:t>
+        <w:t>php</w:t>
       </w:r>
       <w:r>
         <w:rPr>
           <w:rFonts w:ascii="Consolas" w:hAnsi="Consolas"/>
-          <w:color w:val="262626"/>
+          <w:color w:val="D4D4D4"/>
           <w:sz w:val="16"/>
         </w:rPr>
-        <w:t xml:space="preserve"> artisan </w:t>
-      </w:r>
-      <w:r>
-        <w:rPr>
-          <w:rFonts w:ascii="Consolas" w:hAnsi="Consolas"/>
-          <w:color w:val="795E26"/>
-          <w:sz w:val="16"/>
-        </w:rPr>
-        <w:t xml:space="preserve">migrate:fresh</w:t>
-      </w:r>
-      <w:r>
-        <w:rPr>
-          <w:rFonts w:ascii="Consolas" w:hAnsi="Consolas"/>
-          <w:color w:val="262626"/>
-          <w:sz w:val="16"/>
-        </w:rPr>
-        <w:t xml:space="preserve"> </w:t>
-      </w:r>
-      <w:r>
-        <w:rPr>
-          <w:rFonts w:ascii="Consolas" w:hAnsi="Consolas"/>
-          <w:color w:val="0073E6"/>
-          <w:sz w:val="16"/>
-        </w:rPr>
-        <w:t xml:space="preserve">--seed</w:t>
-      </w:r>
-      <w:r>
-        <w:rPr>
-          <w:rFonts w:ascii="Consolas" w:hAnsi="Consolas"/>
-          <w:color w:val="262626"/>
-          <w:sz w:val="16"/>
-        </w:rPr>
-        <w:t xml:space="preserve"> </w:t>
-      </w:r>
-      <w:r>
-        <w:rPr>
-          <w:rFonts w:ascii="Consolas" w:hAnsi="Consolas"/>
-          <w:color w:val="0073E6"/>
-          <w:sz w:val="16"/>
-        </w:rPr>
-        <w:t xml:space="preserve">--env=testing</w:t>
-      </w:r>
-      <w:r>
+        <w:t xml:space="preserve"> artisan migrate:fresh --seed --env=testing</w:t>
         <w:br/>
       </w:r>
       <w:r>
         <w:rPr>
           <w:rFonts w:ascii="Consolas" w:hAnsi="Consolas"/>
-          <w:b/>
-          <w:color w:val="000080"/>
+          <w:color w:val="4EC9B0"/>
           <w:sz w:val="16"/>
         </w:rPr>
-        <w:t xml:space="preserve">php</w:t>
+        <w:t>php</w:t>
       </w:r>
       <w:r>
         <w:rPr>
           <w:rFonts w:ascii="Consolas" w:hAnsi="Consolas"/>
-          <w:color w:val="262626"/>
+          <w:color w:val="D4D4D4"/>
           <w:sz w:val="16"/>
         </w:rPr>
-        <w:t xml:space="preserve"> artisan test </w:t>
+        <w:t xml:space="preserve"> artisan test --testsuite=</w:t>
       </w:r>
       <w:r>
         <w:rPr>
           <w:rFonts w:ascii="Consolas" w:hAnsi="Consolas"/>
-          <w:color w:val="0073E6"/>
+          <w:color w:val="4EC9B0"/>
           <w:sz w:val="16"/>
         </w:rPr>
-        <w:t xml:space="preserve">--testsuite=Feature</w:t>
+        <w:t>Feature</w:t>
       </w:r>
       <w:r>
         <w:rPr>
           <w:rFonts w:ascii="Consolas" w:hAnsi="Consolas"/>
-          <w:color w:val="262626"/>
+          <w:color w:val="D4D4D4"/>
           <w:sz w:val="16"/>
         </w:rPr>
-        <w:t xml:space="preserve"> </w:t>
-      </w:r>
-      <w:r>
-        <w:rPr>
-          <w:rFonts w:ascii="Consolas" w:hAnsi="Consolas"/>
-          <w:color w:val="0073E6"/>
-          <w:sz w:val="16"/>
-        </w:rPr>
-        <w:t xml:space="preserve">--stop-on-failure</w:t>
-      </w:r>
-      <w:r>
+        <w:t xml:space="preserve"> --stop-on-failure</w:t>
+        <w:br/>
+        <w:t xml:space="preserve">./vendor/bin/pint --test</w:t>
         <w:br/>
       </w:r>
       <w:r>
         <w:rPr>
           <w:rFonts w:ascii="Consolas" w:hAnsi="Consolas"/>
-          <w:color w:val="262626"/>
+          <w:color w:val="4EC9B0"/>
           <w:sz w:val="16"/>
         </w:rPr>
-        <w:t xml:space="preserve">./vendor/bin/pint </w:t>
+        <w:t>npm</w:t>
       </w:r>
       <w:r>
         <w:rPr>
           <w:rFonts w:ascii="Consolas" w:hAnsi="Consolas"/>
-          <w:color w:val="0073E6"/>
-          <w:sz w:val="16"/>
-        </w:rPr>
-        <w:t xml:space="preserve">--test</w:t>
-      </w:r>
-      <w:r>
-        <w:br/>
-      </w:r>
-      <w:r>
-        <w:rPr>
-          <w:rFonts w:ascii="Consolas" w:hAnsi="Consolas"/>
-          <w:b/>
-          <w:color w:val="000080"/>
-          <w:sz w:val="16"/>
-        </w:rPr>
-        <w:t xml:space="preserve">npm</w:t>
-      </w:r>
-      <w:r>
-        <w:rPr>
-          <w:rFonts w:ascii="Consolas" w:hAnsi="Consolas"/>
-          <w:color w:val="262626"/>
+          <w:color w:val="D4D4D4"/>
           <w:sz w:val="16"/>
         </w:rPr>
         <w:t xml:space="preserve"> run build</w:t>
@@ -5127,215 +5044,431 @@
     <w:p>
       <w:pPr>
         <w:pStyle w:val="CodeHeader"/>
-        <w:keepNext/>
+        <w:shd w:fill="2D2D30"/>
         <w:pBdr>
-          <w:left w:val="single" w:sz="12" w:space="8" w:color="B8DDE0"/>
+          <w:left w:val="single" w:sz="4" w:space="8" w:color="2D2D30"/>
         </w:pBdr>
-        <w:shd w:val="clear" w:color="auto" w:fill="E4EAED"/>
       </w:pPr>
       <w:r>
-        <w:rPr>
-          <w:rFonts w:ascii="Consolas" w:hAnsi="Consolas"/>
-          <w:b/>
-          <w:color w:val="262626"/>
-          <w:sz w:val="16"/>
-        </w:rPr>
-        <w:t xml:space="preserve">AUDIT KOMPATIBILITAS DEPENDENSI SRS — terminal root proyek   •   BASH</w:t>
+        <w:t>AUDIT KOMPATIBILITAS DEPENDENSI SRS — terminal root proyek   •   BASH</w:t>
       </w:r>
     </w:p>
     <w:p>
       <w:pPr>
         <w:pStyle w:val="CodeBlock"/>
+        <w:shd w:fill="1E1E1E"/>
         <w:keepLines/>
         <w:pBdr>
-          <w:left w:val="single" w:sz="12" w:space="8" w:color="B8DDE0"/>
+          <w:left w:val="single" w:sz="4" w:space="8" w:color="1E1E1E"/>
         </w:pBdr>
-        <w:shd w:val="clear" w:color="auto" w:fill="F2F3F7"/>
       </w:pPr>
       <w:r>
         <w:rPr>
-          <w:rFonts w:ascii="Consolas" w:hAnsi="Consolas"/>
-          <w:b/>
-          <w:color w:val="000080"/>
+          <w:rFonts w:ascii="Consolas" w:hAnsi="Consolas" w:eastAsia="Consolas"/>
+          <w:color w:val="4EC9B0"/>
           <w:sz w:val="16"/>
         </w:rPr>
-        <w:t xml:space="preserve">composer</w:t>
+        <w:t>composer</w:t>
       </w:r>
       <w:r>
         <w:rPr>
-          <w:rFonts w:ascii="Consolas" w:hAnsi="Consolas"/>
-          <w:color w:val="262626"/>
+          <w:rFonts w:ascii="Consolas" w:hAnsi="Consolas" w:eastAsia="Consolas"/>
+          <w:color w:val="D4D4D4"/>
           <w:sz w:val="16"/>
         </w:rPr>
-        <w:t xml:space="preserve"> require chillerlan/php-qrcode intervention/image-laravel </w:t>
+        <w:t xml:space="preserve"> </w:t>
       </w:r>
       <w:r>
         <w:rPr>
-          <w:rFonts w:ascii="Consolas" w:hAnsi="Consolas"/>
-          <w:color w:val="0073E6"/>
+          <w:rFonts w:ascii="Consolas" w:hAnsi="Consolas" w:eastAsia="Consolas"/>
+          <w:color w:val="D4D4D4"/>
           <w:sz w:val="16"/>
         </w:rPr>
-        <w:t xml:space="preserve">--dry-run</w:t>
+        <w:t>require</w:t>
       </w:r>
       <w:r>
+        <w:rPr>
+          <w:rFonts w:ascii="Consolas" w:hAnsi="Consolas" w:eastAsia="Consolas"/>
+          <w:color w:val="D4D4D4"/>
+          <w:sz w:val="16"/>
+        </w:rPr>
+        <w:t xml:space="preserve"> </w:t>
+      </w:r>
+      <w:r>
+        <w:rPr>
+          <w:rFonts w:ascii="Consolas" w:hAnsi="Consolas" w:eastAsia="Consolas"/>
+          <w:color w:val="D4D4D4"/>
+          <w:sz w:val="16"/>
+        </w:rPr>
+        <w:t>chillerlan/php-qrcode</w:t>
+      </w:r>
+      <w:r>
+        <w:rPr>
+          <w:rFonts w:ascii="Consolas" w:hAnsi="Consolas" w:eastAsia="Consolas"/>
+          <w:color w:val="D4D4D4"/>
+          <w:sz w:val="16"/>
+        </w:rPr>
+        <w:t xml:space="preserve"> </w:t>
+      </w:r>
+      <w:r>
+        <w:rPr>
+          <w:rFonts w:ascii="Consolas" w:hAnsi="Consolas" w:eastAsia="Consolas"/>
+          <w:color w:val="D4D4D4"/>
+          <w:sz w:val="16"/>
+        </w:rPr>
+        <w:t>intervention/image-laravel</w:t>
+      </w:r>
+      <w:r>
+        <w:rPr>
+          <w:rFonts w:ascii="Consolas" w:hAnsi="Consolas" w:eastAsia="Consolas"/>
+          <w:color w:val="D4D4D4"/>
+          <w:sz w:val="16"/>
+        </w:rPr>
+        <w:t xml:space="preserve"> </w:t>
+      </w:r>
+      <w:r>
+        <w:rPr>
+          <w:rFonts w:ascii="Consolas" w:hAnsi="Consolas" w:eastAsia="Consolas"/>
+          <w:color w:val="9CDCFE"/>
+          <w:sz w:val="16"/>
+        </w:rPr>
+        <w:t>--dry-run</w:t>
+      </w:r>
+      <w:r>
+        <w:rPr>
+          <w:rFonts w:ascii="Consolas" w:hAnsi="Consolas" w:eastAsia="Consolas"/>
+          <w:color w:val="D4D4D4"/>
+          <w:sz w:val="16"/>
+        </w:rPr>
         <w:br/>
       </w:r>
       <w:r>
         <w:rPr>
-          <w:rFonts w:ascii="Consolas" w:hAnsi="Consolas"/>
-          <w:b/>
-          <w:color w:val="000080"/>
+          <w:rFonts w:ascii="Consolas" w:hAnsi="Consolas" w:eastAsia="Consolas"/>
+          <w:color w:val="4EC9B0"/>
           <w:sz w:val="16"/>
         </w:rPr>
-        <w:t xml:space="preserve">composer</w:t>
+        <w:t>composer</w:t>
       </w:r>
       <w:r>
         <w:rPr>
-          <w:rFonts w:ascii="Consolas" w:hAnsi="Consolas"/>
-          <w:color w:val="262626"/>
+          <w:rFonts w:ascii="Consolas" w:hAnsi="Consolas" w:eastAsia="Consolas"/>
+          <w:color w:val="D4D4D4"/>
           <w:sz w:val="16"/>
         </w:rPr>
-        <w:t xml:space="preserve"> require maatwebsite/excel barryvdh/laravel-dompdf </w:t>
+        <w:t xml:space="preserve"> </w:t>
       </w:r>
       <w:r>
         <w:rPr>
-          <w:rFonts w:ascii="Consolas" w:hAnsi="Consolas"/>
-          <w:color w:val="0073E6"/>
+          <w:rFonts w:ascii="Consolas" w:hAnsi="Consolas" w:eastAsia="Consolas"/>
+          <w:color w:val="D4D4D4"/>
           <w:sz w:val="16"/>
         </w:rPr>
-        <w:t xml:space="preserve">--dry-run</w:t>
+        <w:t>require</w:t>
       </w:r>
       <w:r>
+        <w:rPr>
+          <w:rFonts w:ascii="Consolas" w:hAnsi="Consolas" w:eastAsia="Consolas"/>
+          <w:color w:val="D4D4D4"/>
+          <w:sz w:val="16"/>
+        </w:rPr>
+        <w:t xml:space="preserve"> </w:t>
+      </w:r>
+      <w:r>
+        <w:rPr>
+          <w:rFonts w:ascii="Consolas" w:hAnsi="Consolas" w:eastAsia="Consolas"/>
+          <w:color w:val="D4D4D4"/>
+          <w:sz w:val="16"/>
+        </w:rPr>
+        <w:t>maatwebsite/excel</w:t>
+      </w:r>
+      <w:r>
+        <w:rPr>
+          <w:rFonts w:ascii="Consolas" w:hAnsi="Consolas" w:eastAsia="Consolas"/>
+          <w:color w:val="D4D4D4"/>
+          <w:sz w:val="16"/>
+        </w:rPr>
+        <w:t xml:space="preserve"> </w:t>
+      </w:r>
+      <w:r>
+        <w:rPr>
+          <w:rFonts w:ascii="Consolas" w:hAnsi="Consolas" w:eastAsia="Consolas"/>
+          <w:color w:val="D4D4D4"/>
+          <w:sz w:val="16"/>
+        </w:rPr>
+        <w:t>barryvdh/laravel-dompdf</w:t>
+      </w:r>
+      <w:r>
+        <w:rPr>
+          <w:rFonts w:ascii="Consolas" w:hAnsi="Consolas" w:eastAsia="Consolas"/>
+          <w:color w:val="D4D4D4"/>
+          <w:sz w:val="16"/>
+        </w:rPr>
+        <w:t xml:space="preserve"> </w:t>
+      </w:r>
+      <w:r>
+        <w:rPr>
+          <w:rFonts w:ascii="Consolas" w:hAnsi="Consolas" w:eastAsia="Consolas"/>
+          <w:color w:val="9CDCFE"/>
+          <w:sz w:val="16"/>
+        </w:rPr>
+        <w:t>--dry-run</w:t>
+      </w:r>
+      <w:r>
+        <w:rPr>
+          <w:rFonts w:ascii="Consolas" w:hAnsi="Consolas" w:eastAsia="Consolas"/>
+          <w:color w:val="D4D4D4"/>
+          <w:sz w:val="16"/>
+        </w:rPr>
         <w:br/>
       </w:r>
       <w:r>
         <w:rPr>
-          <w:rFonts w:ascii="Consolas" w:hAnsi="Consolas"/>
-          <w:b/>
-          <w:color w:val="000080"/>
+          <w:rFonts w:ascii="Consolas" w:hAnsi="Consolas" w:eastAsia="Consolas"/>
+          <w:color w:val="4EC9B0"/>
           <w:sz w:val="16"/>
         </w:rPr>
-        <w:t xml:space="preserve">composer</w:t>
+        <w:t>composer</w:t>
       </w:r>
       <w:r>
         <w:rPr>
-          <w:rFonts w:ascii="Consolas" w:hAnsi="Consolas"/>
-          <w:color w:val="262626"/>
+          <w:rFonts w:ascii="Consolas" w:hAnsi="Consolas" w:eastAsia="Consolas"/>
+          <w:color w:val="D4D4D4"/>
           <w:sz w:val="16"/>
         </w:rPr>
-        <w:t xml:space="preserve"> require laravel-notification-channels/webpush </w:t>
+        <w:t xml:space="preserve"> </w:t>
       </w:r>
       <w:r>
         <w:rPr>
-          <w:rFonts w:ascii="Consolas" w:hAnsi="Consolas"/>
-          <w:color w:val="0073E6"/>
+          <w:rFonts w:ascii="Consolas" w:hAnsi="Consolas" w:eastAsia="Consolas"/>
+          <w:color w:val="D4D4D4"/>
           <w:sz w:val="16"/>
         </w:rPr>
-        <w:t xml:space="preserve">--dry-run</w:t>
+        <w:t>require</w:t>
       </w:r>
       <w:r>
+        <w:rPr>
+          <w:rFonts w:ascii="Consolas" w:hAnsi="Consolas" w:eastAsia="Consolas"/>
+          <w:color w:val="D4D4D4"/>
+          <w:sz w:val="16"/>
+        </w:rPr>
+        <w:t xml:space="preserve"> </w:t>
+      </w:r>
+      <w:r>
+        <w:rPr>
+          <w:rFonts w:ascii="Consolas" w:hAnsi="Consolas" w:eastAsia="Consolas"/>
+          <w:color w:val="D4D4D4"/>
+          <w:sz w:val="16"/>
+        </w:rPr>
+        <w:t>laravel-notification-channels/webpush</w:t>
+      </w:r>
+      <w:r>
+        <w:rPr>
+          <w:rFonts w:ascii="Consolas" w:hAnsi="Consolas" w:eastAsia="Consolas"/>
+          <w:color w:val="D4D4D4"/>
+          <w:sz w:val="16"/>
+        </w:rPr>
+        <w:t xml:space="preserve"> </w:t>
+      </w:r>
+      <w:r>
+        <w:rPr>
+          <w:rFonts w:ascii="Consolas" w:hAnsi="Consolas" w:eastAsia="Consolas"/>
+          <w:color w:val="9CDCFE"/>
+          <w:sz w:val="16"/>
+        </w:rPr>
+        <w:t>--dry-run</w:t>
+      </w:r>
+      <w:r>
+        <w:rPr>
+          <w:rFonts w:ascii="Consolas" w:hAnsi="Consolas" w:eastAsia="Consolas"/>
+          <w:color w:val="D4D4D4"/>
+          <w:sz w:val="16"/>
+        </w:rPr>
         <w:br/>
       </w:r>
       <w:r>
         <w:rPr>
-          <w:rFonts w:ascii="Consolas" w:hAnsi="Consolas"/>
-          <w:b/>
-          <w:color w:val="000080"/>
+          <w:rFonts w:ascii="Consolas" w:hAnsi="Consolas" w:eastAsia="Consolas"/>
+          <w:color w:val="4EC9B0"/>
           <w:sz w:val="16"/>
         </w:rPr>
-        <w:t xml:space="preserve">npm</w:t>
+        <w:t>npm</w:t>
       </w:r>
       <w:r>
         <w:rPr>
-          <w:rFonts w:ascii="Consolas" w:hAnsi="Consolas"/>
-          <w:color w:val="262626"/>
+          <w:rFonts w:ascii="Consolas" w:hAnsi="Consolas" w:eastAsia="Consolas"/>
+          <w:color w:val="D4D4D4"/>
           <w:sz w:val="16"/>
         </w:rPr>
-        <w:t xml:space="preserve"> install </w:t>
+        <w:t xml:space="preserve"> </w:t>
       </w:r>
       <w:r>
         <w:rPr>
-          <w:rFonts w:ascii="Consolas" w:hAnsi="Consolas"/>
-          <w:color w:val="0073E6"/>
+          <w:rFonts w:ascii="Consolas" w:hAnsi="Consolas" w:eastAsia="Consolas"/>
+          <w:color w:val="D4D4D4"/>
           <w:sz w:val="16"/>
         </w:rPr>
-        <w:t xml:space="preserve">--dry-run</w:t>
+        <w:t>install</w:t>
       </w:r>
       <w:r>
         <w:rPr>
-          <w:rFonts w:ascii="Consolas" w:hAnsi="Consolas"/>
-          <w:color w:val="262626"/>
+          <w:rFonts w:ascii="Consolas" w:hAnsi="Consolas" w:eastAsia="Consolas"/>
+          <w:color w:val="D4D4D4"/>
           <w:sz w:val="16"/>
         </w:rPr>
-        <w:t xml:space="preserve"> laravel-echo pusher-js</w:t>
+        <w:t xml:space="preserve"> </w:t>
       </w:r>
       <w:r>
+        <w:rPr>
+          <w:rFonts w:ascii="Consolas" w:hAnsi="Consolas" w:eastAsia="Consolas"/>
+          <w:color w:val="9CDCFE"/>
+          <w:sz w:val="16"/>
+        </w:rPr>
+        <w:t>--dry-run</w:t>
+      </w:r>
+      <w:r>
+        <w:rPr>
+          <w:rFonts w:ascii="Consolas" w:hAnsi="Consolas" w:eastAsia="Consolas"/>
+          <w:color w:val="D4D4D4"/>
+          <w:sz w:val="16"/>
+        </w:rPr>
+        <w:t xml:space="preserve"> </w:t>
+      </w:r>
+      <w:r>
+        <w:rPr>
+          <w:rFonts w:ascii="Consolas" w:hAnsi="Consolas" w:eastAsia="Consolas"/>
+          <w:color w:val="D4D4D4"/>
+          <w:sz w:val="16"/>
+        </w:rPr>
+        <w:t>laravel-echo</w:t>
+      </w:r>
+      <w:r>
+        <w:rPr>
+          <w:rFonts w:ascii="Consolas" w:hAnsi="Consolas" w:eastAsia="Consolas"/>
+          <w:color w:val="D4D4D4"/>
+          <w:sz w:val="16"/>
+        </w:rPr>
+        <w:t xml:space="preserve"> </w:t>
+      </w:r>
+      <w:r>
+        <w:rPr>
+          <w:rFonts w:ascii="Consolas" w:hAnsi="Consolas" w:eastAsia="Consolas"/>
+          <w:color w:val="D4D4D4"/>
+          <w:sz w:val="16"/>
+        </w:rPr>
+        <w:t>pusher-js</w:t>
+      </w:r>
+      <w:r>
+        <w:rPr>
+          <w:rFonts w:ascii="Consolas" w:hAnsi="Consolas" w:eastAsia="Consolas"/>
+          <w:color w:val="D4D4D4"/>
+          <w:sz w:val="16"/>
+        </w:rPr>
         <w:br/>
       </w:r>
       <w:r>
         <w:rPr>
-          <w:rFonts w:ascii="Consolas" w:hAnsi="Consolas"/>
-          <w:b/>
-          <w:color w:val="000080"/>
+          <w:rFonts w:ascii="Consolas" w:hAnsi="Consolas" w:eastAsia="Consolas"/>
+          <w:color w:val="4EC9B0"/>
           <w:sz w:val="16"/>
         </w:rPr>
-        <w:t xml:space="preserve">composer</w:t>
+        <w:t>composer</w:t>
       </w:r>
       <w:r>
         <w:rPr>
-          <w:rFonts w:ascii="Consolas" w:hAnsi="Consolas"/>
-          <w:color w:val="262626"/>
+          <w:rFonts w:ascii="Consolas" w:hAnsi="Consolas" w:eastAsia="Consolas"/>
+          <w:color w:val="D4D4D4"/>
           <w:sz w:val="16"/>
         </w:rPr>
-        <w:t xml:space="preserve"> validate </w:t>
+        <w:t xml:space="preserve"> </w:t>
       </w:r>
       <w:r>
         <w:rPr>
-          <w:rFonts w:ascii="Consolas" w:hAnsi="Consolas"/>
-          <w:color w:val="0073E6"/>
+          <w:rFonts w:ascii="Consolas" w:hAnsi="Consolas" w:eastAsia="Consolas"/>
+          <w:color w:val="D4D4D4"/>
           <w:sz w:val="16"/>
         </w:rPr>
-        <w:t xml:space="preserve">--strict</w:t>
+        <w:t>validate</w:t>
       </w:r>
       <w:r>
+        <w:rPr>
+          <w:rFonts w:ascii="Consolas" w:hAnsi="Consolas" w:eastAsia="Consolas"/>
+          <w:color w:val="D4D4D4"/>
+          <w:sz w:val="16"/>
+        </w:rPr>
+        <w:t xml:space="preserve"> </w:t>
+      </w:r>
+      <w:r>
+        <w:rPr>
+          <w:rFonts w:ascii="Consolas" w:hAnsi="Consolas" w:eastAsia="Consolas"/>
+          <w:color w:val="9CDCFE"/>
+          <w:sz w:val="16"/>
+        </w:rPr>
+        <w:t>--strict</w:t>
+      </w:r>
+      <w:r>
+        <w:rPr>
+          <w:rFonts w:ascii="Consolas" w:hAnsi="Consolas" w:eastAsia="Consolas"/>
+          <w:color w:val="D4D4D4"/>
+          <w:sz w:val="16"/>
+        </w:rPr>
         <w:br/>
       </w:r>
       <w:r>
         <w:rPr>
-          <w:rFonts w:ascii="Consolas" w:hAnsi="Consolas"/>
-          <w:b/>
-          <w:color w:val="000080"/>
+          <w:rFonts w:ascii="Consolas" w:hAnsi="Consolas" w:eastAsia="Consolas"/>
+          <w:color w:val="4EC9B0"/>
           <w:sz w:val="16"/>
         </w:rPr>
-        <w:t xml:space="preserve">composer</w:t>
+        <w:t>composer</w:t>
       </w:r>
       <w:r>
         <w:rPr>
-          <w:rFonts w:ascii="Consolas" w:hAnsi="Consolas"/>
-          <w:color w:val="262626"/>
+          <w:rFonts w:ascii="Consolas" w:hAnsi="Consolas" w:eastAsia="Consolas"/>
+          <w:color w:val="D4D4D4"/>
           <w:sz w:val="16"/>
         </w:rPr>
-        <w:t xml:space="preserve"> audit</w:t>
+        <w:t xml:space="preserve"> </w:t>
       </w:r>
       <w:r>
+        <w:rPr>
+          <w:rFonts w:ascii="Consolas" w:hAnsi="Consolas" w:eastAsia="Consolas"/>
+          <w:color w:val="D4D4D4"/>
+          <w:sz w:val="16"/>
+        </w:rPr>
+        <w:t>audit</w:t>
+      </w:r>
+      <w:r>
+        <w:rPr>
+          <w:rFonts w:ascii="Consolas" w:hAnsi="Consolas" w:eastAsia="Consolas"/>
+          <w:color w:val="D4D4D4"/>
+          <w:sz w:val="16"/>
+        </w:rPr>
         <w:br/>
       </w:r>
       <w:r>
         <w:rPr>
-          <w:rFonts w:ascii="Consolas" w:hAnsi="Consolas"/>
-          <w:b/>
-          <w:color w:val="000080"/>
+          <w:rFonts w:ascii="Consolas" w:hAnsi="Consolas" w:eastAsia="Consolas"/>
+          <w:color w:val="4EC9B0"/>
           <w:sz w:val="16"/>
         </w:rPr>
-        <w:t xml:space="preserve">npm</w:t>
+        <w:t>npm</w:t>
       </w:r>
       <w:r>
         <w:rPr>
-          <w:rFonts w:ascii="Consolas" w:hAnsi="Consolas"/>
-          <w:color w:val="262626"/>
+          <w:rFonts w:ascii="Consolas" w:hAnsi="Consolas" w:eastAsia="Consolas"/>
+          <w:color w:val="D4D4D4"/>
           <w:sz w:val="16"/>
         </w:rPr>
-        <w:t xml:space="preserve"> audit</w:t>
+        <w:t xml:space="preserve"> </w:t>
+      </w:r>
+      <w:r>
+        <w:rPr>
+          <w:rFonts w:ascii="Consolas" w:hAnsi="Consolas" w:eastAsia="Consolas"/>
+          <w:color w:val="D4D4D4"/>
+          <w:sz w:val="16"/>
+        </w:rPr>
+        <w:t>audit</w:t>
       </w:r>
     </w:p>
     <w:p>
@@ -7776,10 +7909,8 @@
       <w:r>
         <w:rPr>
           <w:rFonts w:ascii="Aptos" w:hAnsi="Aptos"/>
-          <w:color w:val="1F2937"/>
-          <w:sz w:val="19"/>
         </w:rPr>
-        <w:t xml:space="preserve">Preset dasar yang digunakan adalah compact_reference_guide dengan named override untuk modul pembelajaran: A4 portrait; margin atas 1,65 cm, bawah 1,55 cm, kiri/kanan 1,75 cm; Aptos 10,2 pt; line spacing 1,16; heading beraksen Laravel red; tabel ringkas; callout Predict/Try/Observe; code block Consolas berlatar Cyan Light dengan pewarnaan token Visual Studio Code; checklist; exit ticket; serta screenshot mockup UI.</w:t>
+        <w:t>Preset dasar yang digunakan adalah compact_reference_guide dengan named override untuk modul pembelajaran: A4 portrait; margin atas 1,65 cm, bawah 1,55 cm, kiri/kanan 1,75 cm; Aptos 10,2 pt; line spacing 1,16; heading beraksen Laravel red; tabel ringkas; callout Predict/Try/Observe; code block Consolas bertema Visual Studio Code Dark+; checklist; exit ticket; serta screenshot mockup UI.</w:t>
       </w:r>
     </w:p>
     <w:p>
@@ -8360,19 +8491,6 @@
         <w:pStyle w:val="ListBody"/>
       </w:pPr>
       <w:r>
-        <w:rPr>
-          <w:rFonts w:ascii="Aptos" w:hAnsi="Aptos"/>
-          <w:color w:val="1F2937"/>
-          <w:sz w:val="19"/>
-        </w:rPr>
-        <w:t xml:space="preserve">DOC-00-001 — Seluruh blok kode (208 blok, 133 label) memakai latar terang tema Cyan Light (JetBrains) dengan pewarnaan token standar Visual Studio Code untuk PHP, HTML/Blade, cmd, dan bash; teks kode tidak berubah; penjelasan palet di “Cara Membaca Sampel Kode” dan Lampiran diperbarui.</w:t>
-      </w:r>
-    </w:p>
-    <w:p>
-      <w:pPr>
-        <w:pStyle w:val="ListBody"/>
-      </w:pPr>
-      <w:r>
         <w:t xml:space="preserve">DOC-01-001 — Basis dokumen: parameter menyebut v4/v5 yang tidak ada; basis nyata adalah v7. Revisi kumulatif ditulis ke berkas v8; v7 tetap utuh di references/.</w:t>
       </w:r>
     </w:p>
@@ -8751,19 +8869,6 @@
           <w:color w:val="1F2937"/>
           <w:sz w:val="19"/>
         </w:rPr>
-        <w:t xml:space="preserve">DOC-05-007 — Rantai v3 (use case SRS v2): Modul 5 menuntaskan UC-19 (penguncian 5x/10 menit, pesan generik, redirect per peran, sesi 8 jam) dan UC-21 (onboarding penanggung jawab + rekening + tautan atur kata sandi, aktif/nonaktif tenant, riwayat komisi beserta pengelola); ditambahkan deskripsi use case, mockup, Tahap 8, dan output nyata browser.</w:t>
-      </w:r>
-    </w:p>
-    <w:p>
-      <w:pPr>
-        <w:pStyle w:val="ListBody"/>
-      </w:pPr>
-      <w:r>
-        <w:rPr>
-          <w:rFonts w:ascii="Aptos" w:hAnsi="Aptos"/>
-          <w:color w:val="1F2937"/>
-          <w:sz w:val="19"/>
-        </w:rPr>
         <w:t xml:space="preserve">DOC-06-004 — Controller/view/route meja di modul Admin; controller + route publik scan QR di modul Ordering (</w:t>
       </w:r>
       <w:r>
@@ -8829,19 +8934,6 @@
           <w:sz w:val="19"/>
         </w:rPr>
         <w:t xml:space="preserve">DOC-06-005 — Blok BUAT FILE per tahap Modul 6: make:model, make:policy --model, make:controller FQN (termasuk --invokable untuk /q/{token}), make:trait FQN, make:class (OpaqueToken, service Admin/Ordering), make:test --unit; view &amp; route modul manual.</w:t>
-      </w:r>
-    </w:p>
-    <w:p>
-      <w:pPr>
-        <w:pStyle w:val="ListBody"/>
-      </w:pPr>
-      <w:r>
-        <w:rPr>
-          <w:rFonts w:ascii="Aptos" w:hAnsi="Aptos"/>
-          <w:color w:val="1F2937"/>
-          <w:sz w:val="19"/>
-        </w:rPr>
-        <w:t xml:space="preserve">DOC-06-006 — Rantai v3 (use case SRS v2): Modul 6 menuntaskan UC-22 (QR siap cetak SVG via bacon/bacon-qr-code, nonaktif/aktif meja, ringkasan meja) dan UC-02 (halaman sambutan meja + tenant buka/tutup, pesan QR tidak valid, penolakan di luar jam operasional); ditambahkan deskripsi use case, mockup, Tahap 8, dan output nyata browser.</w:t>
       </w:r>
     </w:p>
     <w:p>
@@ -8936,19 +9028,6 @@
           <w:sz w:val="19"/>
         </w:rPr>
         <w:t xml:space="preserve">DOC-07-005 — Blok BUAT FILE per tahap Modul 7: make:livewire catalog::menu-manager / catalog::menu-catalog (langsung ke folder modul), make:class MenuStockService, make:test; halaman &amp; route modul manual.</w:t>
-      </w:r>
-    </w:p>
-    <w:p>
-      <w:pPr>
-        <w:pStyle w:val="ListBody"/>
-      </w:pPr>
-      <w:r>
-        <w:rPr>
-          <w:rFonts w:ascii="Aptos" w:hAnsi="Aptos"/>
-          <w:color w:val="1F2937"/>
-          <w:sz w:val="19"/>
-        </w:rPr>
-        <w:t xml:space="preserve">DOC-07-006 — Rantai v3 (use case SRS v2): Modul 7 menuntaskan UC-13 (deskripsi, foto WebP, ubah, soft delete, cari/saring), UC-14 (sakelar satu ketukan), UC-01 (kelompok per tenant, menu habis nonaktif, tenant tutup, chip kategori, pembaruan ≤ 5 detik), dan UC-11 (WaitTimeEstimator); ditambahkan deskripsi use case, mockup, Tahap 8, dan output nyata browser.</w:t>
       </w:r>
     </w:p>
     <w:p>
@@ -9072,7 +9151,105 @@
           <w:color w:val="1F2937"/>
           <w:sz w:val="19"/>
         </w:rPr>
-        <w:t xml:space="preserve">DOC-08-006 — Rantai v3 (use case SRS v2): Modul 8 menuntaskan UC-03 (kelompok per tenant, pajak dan biaya layanan, “Menu telah habis”, checkout nonaktif saat kosong) dan UC-04 (formulir kustomisasi min/maks, opsi habis nonaktif, catatan ≤ 200 karakter tersaring, harga akhir) serta halaman tenant Kelola Modifier; ditambahkan deskripsi use case, mockup, Tahap 8, dan output nyata browser.</w:t>
+        <w:t xml:space="preserve">DOC-09-004 — Checkout dan status pesanan sebagai vertical slice modul Ordering (</w:t>
+      </w:r>
+      <w:r>
+        <w:rPr>
+          <w:rFonts w:ascii="Consolas" w:hAnsi="Consolas"/>
+          <w:color w:val="C11B12"/>
+          <w:sz w:val="17"/>
+          <w:shd w:fill="ECEFF3"/>
+        </w:rPr>
+        <w:t xml:space="preserve">OrderStatusController</w:t>
+      </w:r>
+      <w:r>
+        <w:rPr>
+          <w:rFonts w:ascii="Aptos" w:hAnsi="Aptos"/>
+          <w:color w:val="1F2937"/>
+          <w:sz w:val="19"/>
+        </w:rPr>
+        <w:t xml:space="preserve">, view </w:t>
+      </w:r>
+      <w:r>
+        <w:rPr>
+          <w:rFonts w:ascii="Consolas" w:hAnsi="Consolas"/>
+          <w:color w:val="C11B12"/>
+          <w:sz w:val="17"/>
+          <w:shd w:fill="ECEFF3"/>
+        </w:rPr>
+        <w:t xml:space="preserve">ordering::order</w:t>
+      </w:r>
+      <w:r>
+        <w:rPr>
+          <w:rFonts w:ascii="Aptos" w:hAnsi="Aptos"/>
+          <w:color w:val="1F2937"/>
+          <w:sz w:val="19"/>
+        </w:rPr>
+        <w:t xml:space="preserve">, route pelanggan modul, cookie </w:t>
+      </w:r>
+      <w:r>
+        <w:rPr>
+          <w:rFonts w:ascii="Consolas" w:hAnsi="Consolas"/>
+          <w:color w:val="C11B12"/>
+          <w:sz w:val="17"/>
+          <w:shd w:fill="ECEFF3"/>
+        </w:rPr>
+        <w:t xml:space="preserve">order_tracking</w:t>
+      </w:r>
+      <w:r>
+        <w:rPr>
+          <w:rFonts w:ascii="Aptos" w:hAnsi="Aptos"/>
+          <w:color w:val="1F2937"/>
+          <w:sz w:val="19"/>
+        </w:rPr>
+        <w:t xml:space="preserve"> dikecualikan dari enkripsi oleh </w:t>
+      </w:r>
+      <w:r>
+        <w:rPr>
+          <w:rFonts w:ascii="Consolas" w:hAnsi="Consolas"/>
+          <w:color w:val="C11B12"/>
+          <w:sz w:val="17"/>
+          <w:shd w:fill="ECEFF3"/>
+        </w:rPr>
+        <w:t xml:space="preserve">OrderingServiceProvider</w:t>
+      </w:r>
+      <w:r>
+        <w:rPr>
+          <w:rFonts w:ascii="Aptos" w:hAnsi="Aptos"/>
+          <w:color w:val="1F2937"/>
+          <w:sz w:val="19"/>
+        </w:rPr>
+        <w:t xml:space="preserve">); komisi dipilih lewat scope </w:t>
+      </w:r>
+      <w:r>
+        <w:rPr>
+          <w:rFonts w:ascii="Consolas" w:hAnsi="Consolas"/>
+          <w:color w:val="C11B12"/>
+          <w:sz w:val="17"/>
+          <w:shd w:fill="ECEFF3"/>
+        </w:rPr>
+        <w:t xml:space="preserve">CommissionScheme::effectiveAt()</w:t>
+      </w:r>
+      <w:r>
+        <w:rPr>
+          <w:rFonts w:ascii="Aptos" w:hAnsi="Aptos"/>
+          <w:color w:val="1F2937"/>
+          <w:sz w:val="19"/>
+        </w:rPr>
+        <w:t xml:space="preserve"> (tanpa celah di batas pergantian, lihat DOC-05-006); blok Output Nyata Modul 9 v1 dipindah dari judul Modul 10 ke badan Modul 9.</w:t>
+      </w:r>
+    </w:p>
+    <w:p>
+      <w:pPr>
+        <w:pStyle w:val="ListBody"/>
+      </w:pPr>
+      <w:r>
+        <w:rPr>
+          <w:rFonts w:ascii="Aptos" w:hAnsi="Aptos"/>
+          <w:color w:val="1F2937"/>
+          <w:sz w:val="19"/>
+        </w:rPr>
+        <w:t xml:space="preserve">DOC-09-005 — Blok BUAT FILE per tahap Modul 9: make:class (DTO CheckoutResult, CheckoutService), make:exception FQN, make:model OrderItemModifier, make:controller FQN --invokable, make:test; view &amp; route pelanggan modul manual.</w:t>
       </w:r>
     </w:p>
     <w:sectPr>
@@ -21335,7 +21512,7 @@
     </w:pPr>
     <w:rPr>
       <w:rFonts w:ascii="Consolas" w:hAnsi="Consolas"/>
-      <w:color w:val="262626"/>
+      <w:color w:val="D4D4D4"/>
       <w:sz w:val="16"/>
     </w:rPr>
   </w:style>
@@ -21447,7 +21624,7 @@
     <w:rPr>
       <w:rFonts w:ascii="Consolas" w:hAnsi="Consolas"/>
       <w:b/>
-      <w:color w:val="262626"/>
+      <w:color w:val="FFFFFF"/>
       <w:sz w:val="16"/>
     </w:rPr>
   </w:style>

</xml_diff>

<commit_message>
docs(v8): laporan Pertemuan 10 + output nyata QRIS in-body
- Output Nyata Terverifikasi Modul 10: QRIS dinamis sandbox live dan Gambar M10b (isi
  app/Modules/Payments, binding tunggal PaymentGateway → FakeQrisGateway, uji 10 passed,
  suite 127 passed).
- Blok Output Nyata Modul 10 v1 dipindah dari dalam judul Modul 11 ke badan Modul 10 (repair).
- Path Landasan Teknis/Cuplikan diselaraskan (DOC-10-004); blok BUAT FILE per tahap (DOC-10-005).
- laporan-implementasi.md: bagian Pertemuan 10 (v2); status P9 LULUS.
- modul_praktikum/ dibuat ulang dari master.

Co-Authored-By: Claude Opus 5.5 <noreply@anthropic.com>
</commit_message>
<xml_diff>
--- a/modul_praktikum/Lampiran.docx
+++ b/modul_praktikum/Lampiran.docx
@@ -9252,6 +9252,134 @@
         <w:t xml:space="preserve">DOC-09-005 — Blok BUAT FILE per tahap Modul 9: make:class (DTO CheckoutResult, CheckoutService), make:exception FQN, make:model OrderItemModifier, make:controller FQN --invokable, make:test; view &amp; route pelanggan modul manual.</w:t>
       </w:r>
     </w:p>
+    <w:p>
+      <w:pPr>
+        <w:pStyle w:val="ListBody"/>
+      </w:pPr>
+      <w:r>
+        <w:rPr>
+          <w:rFonts w:ascii="Aptos" w:hAnsi="Aptos"/>
+          <w:color w:val="1F2937"/>
+          <w:sz w:val="19"/>
+        </w:rPr>
+        <w:t xml:space="preserve">DOC-10-004 — Pembayaran sebagai vertical slice modul Payments: kontrak </w:t>
+      </w:r>
+      <w:r>
+        <w:rPr>
+          <w:rFonts w:ascii="Consolas" w:hAnsi="Consolas"/>
+          <w:color w:val="C11B12"/>
+          <w:sz w:val="17"/>
+          <w:shd w:fill="ECEFF3"/>
+        </w:rPr>
+        <w:t xml:space="preserve">PaymentGateway</w:t>
+      </w:r>
+      <w:r>
+        <w:rPr>
+          <w:rFonts w:ascii="Aptos" w:hAnsi="Aptos"/>
+          <w:color w:val="1F2937"/>
+          <w:sz w:val="19"/>
+        </w:rPr>
+        <w:t xml:space="preserve"> (make:interface), DTO, exception, adapter </w:t>
+      </w:r>
+      <w:r>
+        <w:rPr>
+          <w:rFonts w:ascii="Consolas" w:hAnsi="Consolas"/>
+          <w:color w:val="C11B12"/>
+          <w:sz w:val="17"/>
+          <w:shd w:fill="ECEFF3"/>
+        </w:rPr>
+        <w:t xml:space="preserve">FakeQrisGateway</w:t>
+      </w:r>
+      <w:r>
+        <w:rPr>
+          <w:rFonts w:ascii="Aptos" w:hAnsi="Aptos"/>
+          <w:color w:val="1F2937"/>
+          <w:sz w:val="19"/>
+        </w:rPr>
+        <w:t xml:space="preserve"> (satu binding di </w:t>
+      </w:r>
+      <w:r>
+        <w:rPr>
+          <w:rFonts w:ascii="Consolas" w:hAnsi="Consolas"/>
+          <w:color w:val="C11B12"/>
+          <w:sz w:val="17"/>
+          <w:shd w:fill="ECEFF3"/>
+        </w:rPr>
+        <w:t xml:space="preserve">PaymentsServiceProvider</w:t>
+      </w:r>
+      <w:r>
+        <w:rPr>
+          <w:rFonts w:ascii="Aptos" w:hAnsi="Aptos"/>
+          <w:color w:val="1F2937"/>
+          <w:sz w:val="19"/>
+        </w:rPr>
+        <w:t xml:space="preserve">), </w:t>
+      </w:r>
+      <w:r>
+        <w:rPr>
+          <w:rFonts w:ascii="Consolas" w:hAnsi="Consolas"/>
+          <w:color w:val="C11B12"/>
+          <w:sz w:val="17"/>
+          <w:shd w:fill="ECEFF3"/>
+        </w:rPr>
+        <w:t xml:space="preserve">PaymentService</w:t>
+      </w:r>
+      <w:r>
+        <w:rPr>
+          <w:rFonts w:ascii="Aptos" w:hAnsi="Aptos"/>
+          <w:color w:val="1F2937"/>
+          <w:sz w:val="19"/>
+        </w:rPr>
+        <w:t xml:space="preserve">, dan komponen </w:t>
+      </w:r>
+      <w:r>
+        <w:rPr>
+          <w:rFonts w:ascii="Consolas" w:hAnsi="Consolas"/>
+          <w:color w:val="C11B12"/>
+          <w:sz w:val="17"/>
+          <w:shd w:fill="ECEFF3"/>
+        </w:rPr>
+        <w:t xml:space="preserve">payments::order-payment</w:t>
+      </w:r>
+      <w:r>
+        <w:rPr>
+          <w:rFonts w:ascii="Aptos" w:hAnsi="Aptos"/>
+          <w:color w:val="1F2937"/>
+          <w:sz w:val="19"/>
+        </w:rPr>
+        <w:t xml:space="preserve"> yang disematkan halaman </w:t>
+      </w:r>
+      <w:r>
+        <w:rPr>
+          <w:rFonts w:ascii="Consolas" w:hAnsi="Consolas"/>
+          <w:color w:val="C11B12"/>
+          <w:sz w:val="17"/>
+          <w:shd w:fill="ECEFF3"/>
+        </w:rPr>
+        <w:t xml:space="preserve">ordering::order</w:t>
+      </w:r>
+      <w:r>
+        <w:rPr>
+          <w:rFonts w:ascii="Aptos" w:hAnsi="Aptos"/>
+          <w:color w:val="1F2937"/>
+          <w:sz w:val="19"/>
+        </w:rPr>
+        <w:t xml:space="preserve">; path diselaraskan; blok Output Nyata Modul 10 v1 dipindah dari judul Modul 11 ke badan Modul 10.</w:t>
+      </w:r>
+    </w:p>
+    <w:p>
+      <w:pPr>
+        <w:pStyle w:val="ListBody"/>
+      </w:pPr>
+      <w:r>
+        <w:rPr>
+          <w:rFonts w:ascii="Aptos" w:hAnsi="Aptos"/>
+          <w:color w:val="1F2937"/>
+          <w:sz w:val="19"/>
+        </w:rPr>
+        <w:t xml:space="preserve">DOC-10-005 — Blok BUAT FILE per tahap Modul 10: make:interface FQN, make:model ×3, make:class (DTO, service, adapter, ResolveTrackedOrder), make:exception FQN, make:livewire payments::order-payment, make:test (+ --unit).</w:t>
+      </w:r>
+    </w:p>
     <w:sectPr>
       <w:headerReference w:type="default" r:id="rId9"/>
       <w:footerReference w:type="default" r:id="rId10"/>

</xml_diff>

<commit_message>
docs(v8): laporan Pertemuan 11 + output nyata webhook/settlement in-body
- Output Nyata Terverifikasi Modul 11: webhook live (ok/duplicate/401 + saldo) dan Gambar M11b
  (route webhook dari modul Payments, pengecualian CSRF webhooks/*, uji settlement 11 passed,
  suite 139 passed).
- Blok Output Nyata Modul 11 v1 dipindah dari dalam judul Modul 12 ke badan Modul 11 (repair).
- Konsep CSRF diselaraskan: PreventRequestForgery::except() di PaymentsServiceProvider;
  path Contoh Mandiri/Landasan Teknis/Cuplikan diselaraskan (DOC-11-004); blok BUAT FILE (DOC-11-005).
- laporan-implementasi.md: bagian Pertemuan 11 (v2); status P10 LULUS.
- modul_praktikum/ dibuat ulang dari master.

Co-Authored-By: Claude Opus 5.5 <noreply@anthropic.com>
</commit_message>
<xml_diff>
--- a/modul_praktikum/Lampiran.docx
+++ b/modul_praktikum/Lampiran.docx
@@ -9380,6 +9380,117 @@
         <w:t xml:space="preserve">DOC-10-005 — Blok BUAT FILE per tahap Modul 10: make:interface FQN, make:model ×3, make:class (DTO, service, adapter, ResolveTrackedOrder), make:exception FQN, make:livewire payments::order-payment, make:test (+ --unit).</w:t>
       </w:r>
     </w:p>
+    <w:p>
+      <w:pPr>
+        <w:pStyle w:val="ListBody"/>
+      </w:pPr>
+      <w:r>
+        <w:rPr>
+          <w:rFonts w:ascii="Aptos" w:hAnsi="Aptos"/>
+          <w:color w:val="1F2937"/>
+          <w:sz w:val="19"/>
+        </w:rPr>
+        <w:t xml:space="preserve">DOC-11-004 — Webhook sebagai vertical slice modul Payments: </w:t>
+      </w:r>
+      <w:r>
+        <w:rPr>
+          <w:rFonts w:ascii="Consolas" w:hAnsi="Consolas"/>
+          <w:color w:val="C11B12"/>
+          <w:sz w:val="17"/>
+          <w:shd w:fill="ECEFF3"/>
+        </w:rPr>
+        <w:t xml:space="preserve">QrisWebhookController</w:t>
+      </w:r>
+      <w:r>
+        <w:rPr>
+          <w:rFonts w:ascii="Aptos" w:hAnsi="Aptos"/>
+          <w:color w:val="1F2937"/>
+          <w:sz w:val="19"/>
+        </w:rPr>
+        <w:t xml:space="preserve">, route publik via </w:t>
+      </w:r>
+      <w:r>
+        <w:rPr>
+          <w:rFonts w:ascii="Consolas" w:hAnsi="Consolas"/>
+          <w:color w:val="C11B12"/>
+          <w:sz w:val="17"/>
+          <w:shd w:fill="ECEFF3"/>
+        </w:rPr>
+        <w:t xml:space="preserve">PortalRoutes::web()</w:t>
+      </w:r>
+      <w:r>
+        <w:rPr>
+          <w:rFonts w:ascii="Aptos" w:hAnsi="Aptos"/>
+          <w:color w:val="1F2937"/>
+          <w:sz w:val="19"/>
+        </w:rPr>
+        <w:t xml:space="preserve">, dan pengecualian CSRF </w:t>
+      </w:r>
+      <w:r>
+        <w:rPr>
+          <w:rFonts w:ascii="Consolas" w:hAnsi="Consolas"/>
+          <w:color w:val="C11B12"/>
+          <w:sz w:val="17"/>
+          <w:shd w:fill="ECEFF3"/>
+        </w:rPr>
+        <w:t xml:space="preserve">webhooks/*</w:t>
+      </w:r>
+      <w:r>
+        <w:rPr>
+          <w:rFonts w:ascii="Aptos" w:hAnsi="Aptos"/>
+          <w:color w:val="1F2937"/>
+          <w:sz w:val="19"/>
+        </w:rPr>
+        <w:t xml:space="preserve"> lewat </w:t>
+      </w:r>
+      <w:r>
+        <w:rPr>
+          <w:rFonts w:ascii="Consolas" w:hAnsi="Consolas"/>
+          <w:color w:val="C11B12"/>
+          <w:sz w:val="17"/>
+          <w:shd w:fill="ECEFF3"/>
+        </w:rPr>
+        <w:t xml:space="preserve">PreventRequestForgery::except()</w:t>
+      </w:r>
+      <w:r>
+        <w:rPr>
+          <w:rFonts w:ascii="Aptos" w:hAnsi="Aptos"/>
+          <w:color w:val="1F2937"/>
+          <w:sz w:val="19"/>
+        </w:rPr>
+        <w:t xml:space="preserve"> di </w:t>
+      </w:r>
+      <w:r>
+        <w:rPr>
+          <w:rFonts w:ascii="Consolas" w:hAnsi="Consolas"/>
+          <w:color w:val="C11B12"/>
+          <w:sz w:val="17"/>
+          <w:shd w:fill="ECEFF3"/>
+        </w:rPr>
+        <w:t xml:space="preserve">PaymentsServiceProvider</w:t>
+      </w:r>
+      <w:r>
+        <w:rPr>
+          <w:rFonts w:ascii="Aptos" w:hAnsi="Aptos"/>
+          <w:color w:val="1F2937"/>
+          <w:sz w:val="19"/>
+        </w:rPr>
+        <w:t xml:space="preserve"> (diuji langsung karena test HTTP melewati CSRF); path diselaraskan; blok Output Nyata Modul 11 v1 dipindah dari judul Modul 12 ke badan Modul 11.</w:t>
+      </w:r>
+    </w:p>
+    <w:p>
+      <w:pPr>
+        <w:pStyle w:val="ListBody"/>
+      </w:pPr>
+      <w:r>
+        <w:rPr>
+          <w:rFonts w:ascii="Aptos" w:hAnsi="Aptos"/>
+          <w:color w:val="1F2937"/>
+          <w:sz w:val="19"/>
+        </w:rPr>
+        <w:t xml:space="preserve">DOC-11-005 — Blok BUAT FILE per tahap Modul 11: make:class (verifier, service webhook, settlement), make:controller FQN --invokable, make:model LedgerEntry, make:test (+ --unit); route webhook modul manual.</w:t>
+      </w:r>
+    </w:p>
     <w:sectPr>
       <w:headerReference w:type="default" r:id="rId9"/>
       <w:footerReference w:type="default" r:id="rId10"/>

</xml_diff>

<commit_message>
docs(v8): Modul 11 — penjelasan pengecualian CSRF untuk webhook + output nyata
Subbagian baru "Mengapa Endpoint Webhook Dikecualikan dari CSRF?" di Modul 11:
- ancaman CSRF dan cara PreventRequestForgery menangkalnya (token sesi / Sec-Fetch-Site → 419);
- alasan webhook server-ke-server tidak dapat membawa token dan tidak menunggangi sesi user;
- pengecualian BUKAN endpoint terbuka: HMAC-SHA256 raw body + hash_equals, fail-closed,
  idempotensi provider_event_id;
- aturan penerapan: sesempit webhooks/*, didaftarkan PaymentsServiceProvider, diuji via
  getExcludedPaths(), restart server saat bereksperimen (OPcache).
- Output Nyata M11c (server lokal): POST form tanpa token → 419; webhook signature salah /
  tanpa signature → 401; pengecualian dinonaktifkan sementara → webhook 419.
- DOC-11-006; evidence/pertemuan-11/screenshots/m11-csrf-demo.png; laporan P11;
  modul_praktikum/ dibuat ulang.

Co-Authored-By: Claude Opus 5.5 <noreply@anthropic.com>
</commit_message>
<xml_diff>
--- a/modul_praktikum/Lampiran.docx
+++ b/modul_praktikum/Lampiran.docx
@@ -9491,6 +9491,19 @@
         <w:t xml:space="preserve">DOC-11-005 — Blok BUAT FILE per tahap Modul 11: make:class (verifier, service webhook, settlement), make:controller FQN --invokable, make:model LedgerEntry, make:test (+ --unit); route webhook modul manual.</w:t>
       </w:r>
     </w:p>
+    <w:p>
+      <w:pPr>
+        <w:pStyle w:val="ListBody"/>
+      </w:pPr>
+      <w:r>
+        <w:rPr>
+          <w:rFonts w:ascii="Aptos" w:hAnsi="Aptos"/>
+          <w:color w:val="1F2937"/>
+          <w:sz w:val="19"/>
+        </w:rPr>
+        <w:t xml:space="preserve">DOC-11-006 — Subbagian "Mengapa Endpoint Webhook Dikecualikan dari CSRF?": ancaman CSRF, alasan webhook server-ke-server tidak dapat membawa token, lapis pengganti (HMAC raw body, fail-closed, idempoten), aturan penerapan, dan Output Nyata M11c (419 vs 401; 419 bila pengecualian dicabut).</w:t>
+      </w:r>
+    </w:p>
     <w:sectPr>
       <w:headerReference w:type="default" r:id="rId9"/>
       <w:footerReference w:type="default" r:id="rId10"/>

</xml_diff>

<commit_message>
docs(v8): laporan Pertemuan 12 + output nyata KDS in-body
- Output Nyata Terverifikasi Modul 12: papan KDS live dan Gambar M12b (isi app/Modules/Kitchen,
  route tenant.kitchen, channel terdaftar, uji KDS 9 passed, suite 148 passed).
- Blok Output Nyata Modul 12 v1 dipindah dari dalam judul Modul 13 ke badan Modul 12 (repair).
- Konsep private channel diselaraskan (Broadcast::channel di KitchenServiceProvider; nama
  tenant.{tenantId}.orders); path diselaraskan (DOC-12-004); blok BUAT FILE per tahap (DOC-12-005).
- laporan-implementasi.md: bagian Pertemuan 12 (v2); status P11 LULUS (PR #39, #40).
- modul_praktikum/ dibuat ulang dari master.

Co-Authored-By: Claude Opus 5.5 <noreply@anthropic.com>
</commit_message>
<xml_diff>
--- a/modul_praktikum/Lampiran.docx
+++ b/modul_praktikum/Lampiran.docx
@@ -3577,175 +3577,92 @@
     <w:p>
       <w:pPr>
         <w:pStyle w:val="CodeBlock"/>
+        <w:shd w:fill="1E1E1E" w:val="clear"/>
         <w:pBdr>
-          <w:left w:val="single" w:sz="12" w:space="8" w:color="B8DDE0"/>
+          <w:left w:val="single" w:sz="4" w:space="8" w:color="1E1E1E"/>
         </w:pBdr>
-        <w:shd w:val="clear" w:color="auto" w:fill="F2F3F7"/>
       </w:pPr>
       <w:r>
         <w:rPr>
           <w:rFonts w:ascii="Consolas" w:hAnsi="Consolas"/>
-          <w:b/>
-          <w:color w:val="000080"/>
+          <w:color w:val="4EC9B0"/>
           <w:sz w:val="16"/>
         </w:rPr>
-        <w:t xml:space="preserve">php</w:t>
+        <w:t>php</w:t>
       </w:r>
       <w:r>
         <w:rPr>
           <w:rFonts w:ascii="Consolas" w:hAnsi="Consolas"/>
-          <w:color w:val="262626"/>
+          <w:color w:val="D4D4D4"/>
           <w:sz w:val="16"/>
         </w:rPr>
-        <w:t xml:space="preserve"> artisan </w:t>
+        <w:t xml:space="preserve"> artisan optimize:clear</w:t>
+        <w:br/>
       </w:r>
       <w:r>
         <w:rPr>
           <w:rFonts w:ascii="Consolas" w:hAnsi="Consolas"/>
-          <w:color w:val="795E26"/>
+          <w:color w:val="4EC9B0"/>
           <w:sz w:val="16"/>
         </w:rPr>
-        <w:t xml:space="preserve">optimize:clear</w:t>
-      </w:r>
-      <w:r>
-        <w:br/>
+        <w:t>php</w:t>
       </w:r>
       <w:r>
         <w:rPr>
           <w:rFonts w:ascii="Consolas" w:hAnsi="Consolas"/>
-          <w:b/>
-          <w:color w:val="000080"/>
+          <w:color w:val="D4D4D4"/>
           <w:sz w:val="16"/>
         </w:rPr>
-        <w:t xml:space="preserve">php</w:t>
+        <w:t xml:space="preserve"> artisan migrate:fresh --seed --env=testing</w:t>
+        <w:br/>
       </w:r>
       <w:r>
         <w:rPr>
           <w:rFonts w:ascii="Consolas" w:hAnsi="Consolas"/>
-          <w:color w:val="262626"/>
+          <w:color w:val="4EC9B0"/>
           <w:sz w:val="16"/>
         </w:rPr>
-        <w:t xml:space="preserve"> artisan </w:t>
+        <w:t>php</w:t>
       </w:r>
       <w:r>
         <w:rPr>
           <w:rFonts w:ascii="Consolas" w:hAnsi="Consolas"/>
-          <w:color w:val="795E26"/>
+          <w:color w:val="D4D4D4"/>
           <w:sz w:val="16"/>
         </w:rPr>
-        <w:t xml:space="preserve">migrate:fresh</w:t>
+        <w:t xml:space="preserve"> artisan test --testsuite=</w:t>
       </w:r>
       <w:r>
         <w:rPr>
           <w:rFonts w:ascii="Consolas" w:hAnsi="Consolas"/>
-          <w:color w:val="262626"/>
+          <w:color w:val="4EC9B0"/>
           <w:sz w:val="16"/>
         </w:rPr>
-        <w:t xml:space="preserve"> </w:t>
+        <w:t>Feature</w:t>
       </w:r>
       <w:r>
         <w:rPr>
           <w:rFonts w:ascii="Consolas" w:hAnsi="Consolas"/>
-          <w:color w:val="0073E6"/>
+          <w:color w:val="D4D4D4"/>
           <w:sz w:val="16"/>
         </w:rPr>
-        <w:t xml:space="preserve">--seed</w:t>
+        <w:t xml:space="preserve"> --stop-on-failure</w:t>
+        <w:br/>
+        <w:t xml:space="preserve">./vendor/bin/pint --test</w:t>
+        <w:br/>
       </w:r>
       <w:r>
         <w:rPr>
           <w:rFonts w:ascii="Consolas" w:hAnsi="Consolas"/>
-          <w:color w:val="262626"/>
+          <w:color w:val="4EC9B0"/>
           <w:sz w:val="16"/>
         </w:rPr>
-        <w:t xml:space="preserve"> </w:t>
+        <w:t>npm</w:t>
       </w:r>
       <w:r>
         <w:rPr>
           <w:rFonts w:ascii="Consolas" w:hAnsi="Consolas"/>
-          <w:color w:val="0073E6"/>
-          <w:sz w:val="16"/>
-        </w:rPr>
-        <w:t xml:space="preserve">--env=testing</w:t>
-      </w:r>
-      <w:r>
-        <w:br/>
-      </w:r>
-      <w:r>
-        <w:rPr>
-          <w:rFonts w:ascii="Consolas" w:hAnsi="Consolas"/>
-          <w:b/>
-          <w:color w:val="000080"/>
-          <w:sz w:val="16"/>
-        </w:rPr>
-        <w:t xml:space="preserve">php</w:t>
-      </w:r>
-      <w:r>
-        <w:rPr>
-          <w:rFonts w:ascii="Consolas" w:hAnsi="Consolas"/>
-          <w:color w:val="262626"/>
-          <w:sz w:val="16"/>
-        </w:rPr>
-        <w:t xml:space="preserve"> artisan test </w:t>
-      </w:r>
-      <w:r>
-        <w:rPr>
-          <w:rFonts w:ascii="Consolas" w:hAnsi="Consolas"/>
-          <w:color w:val="0073E6"/>
-          <w:sz w:val="16"/>
-        </w:rPr>
-        <w:t xml:space="preserve">--testsuite=Feature</w:t>
-      </w:r>
-      <w:r>
-        <w:rPr>
-          <w:rFonts w:ascii="Consolas" w:hAnsi="Consolas"/>
-          <w:color w:val="262626"/>
-          <w:sz w:val="16"/>
-        </w:rPr>
-        <w:t xml:space="preserve"> </w:t>
-      </w:r>
-      <w:r>
-        <w:rPr>
-          <w:rFonts w:ascii="Consolas" w:hAnsi="Consolas"/>
-          <w:color w:val="0073E6"/>
-          <w:sz w:val="16"/>
-        </w:rPr>
-        <w:t xml:space="preserve">--stop-on-failure</w:t>
-      </w:r>
-      <w:r>
-        <w:br/>
-      </w:r>
-      <w:r>
-        <w:rPr>
-          <w:rFonts w:ascii="Consolas" w:hAnsi="Consolas"/>
-          <w:color w:val="262626"/>
-          <w:sz w:val="16"/>
-        </w:rPr>
-        <w:t xml:space="preserve">./vendor/bin/pint </w:t>
-      </w:r>
-      <w:r>
-        <w:rPr>
-          <w:rFonts w:ascii="Consolas" w:hAnsi="Consolas"/>
-          <w:color w:val="0073E6"/>
-          <w:sz w:val="16"/>
-        </w:rPr>
-        <w:t xml:space="preserve">--test</w:t>
-      </w:r>
-      <w:r>
-        <w:br/>
-      </w:r>
-      <w:r>
-        <w:rPr>
-          <w:rFonts w:ascii="Consolas" w:hAnsi="Consolas"/>
-          <w:b/>
-          <w:color w:val="000080"/>
-          <w:sz w:val="16"/>
-        </w:rPr>
-        <w:t xml:space="preserve">npm</w:t>
-      </w:r>
-      <w:r>
-        <w:rPr>
-          <w:rFonts w:ascii="Consolas" w:hAnsi="Consolas"/>
-          <w:color w:val="262626"/>
+          <w:color w:val="D4D4D4"/>
           <w:sz w:val="16"/>
         </w:rPr>
         <w:t xml:space="preserve"> run build</w:t>
@@ -5127,215 +5044,431 @@
     <w:p>
       <w:pPr>
         <w:pStyle w:val="CodeHeader"/>
-        <w:keepNext/>
+        <w:shd w:fill="2D2D30"/>
         <w:pBdr>
-          <w:left w:val="single" w:sz="12" w:space="8" w:color="B8DDE0"/>
+          <w:left w:val="single" w:sz="4" w:space="8" w:color="2D2D30"/>
         </w:pBdr>
-        <w:shd w:val="clear" w:color="auto" w:fill="E4EAED"/>
       </w:pPr>
       <w:r>
-        <w:rPr>
-          <w:rFonts w:ascii="Consolas" w:hAnsi="Consolas"/>
-          <w:b/>
-          <w:color w:val="262626"/>
-          <w:sz w:val="16"/>
-        </w:rPr>
-        <w:t xml:space="preserve">AUDIT KOMPATIBILITAS DEPENDENSI SRS — terminal root proyek   •   BASH</w:t>
+        <w:t>AUDIT KOMPATIBILITAS DEPENDENSI SRS — terminal root proyek   •   BASH</w:t>
       </w:r>
     </w:p>
     <w:p>
       <w:pPr>
         <w:pStyle w:val="CodeBlock"/>
+        <w:shd w:fill="1E1E1E"/>
         <w:keepLines/>
         <w:pBdr>
-          <w:left w:val="single" w:sz="12" w:space="8" w:color="B8DDE0"/>
+          <w:left w:val="single" w:sz="4" w:space="8" w:color="1E1E1E"/>
         </w:pBdr>
-        <w:shd w:val="clear" w:color="auto" w:fill="F2F3F7"/>
       </w:pPr>
       <w:r>
         <w:rPr>
-          <w:rFonts w:ascii="Consolas" w:hAnsi="Consolas"/>
-          <w:b/>
-          <w:color w:val="000080"/>
+          <w:rFonts w:ascii="Consolas" w:hAnsi="Consolas" w:eastAsia="Consolas"/>
+          <w:color w:val="4EC9B0"/>
           <w:sz w:val="16"/>
         </w:rPr>
-        <w:t xml:space="preserve">composer</w:t>
+        <w:t>composer</w:t>
       </w:r>
       <w:r>
         <w:rPr>
-          <w:rFonts w:ascii="Consolas" w:hAnsi="Consolas"/>
-          <w:color w:val="262626"/>
+          <w:rFonts w:ascii="Consolas" w:hAnsi="Consolas" w:eastAsia="Consolas"/>
+          <w:color w:val="D4D4D4"/>
           <w:sz w:val="16"/>
         </w:rPr>
-        <w:t xml:space="preserve"> require chillerlan/php-qrcode intervention/image-laravel </w:t>
+        <w:t xml:space="preserve"> </w:t>
       </w:r>
       <w:r>
         <w:rPr>
-          <w:rFonts w:ascii="Consolas" w:hAnsi="Consolas"/>
-          <w:color w:val="0073E6"/>
+          <w:rFonts w:ascii="Consolas" w:hAnsi="Consolas" w:eastAsia="Consolas"/>
+          <w:color w:val="D4D4D4"/>
           <w:sz w:val="16"/>
         </w:rPr>
-        <w:t xml:space="preserve">--dry-run</w:t>
-      </w:r>
-      <w:r>
-        <w:br/>
+        <w:t>require</w:t>
       </w:r>
       <w:r>
         <w:rPr>
-          <w:rFonts w:ascii="Consolas" w:hAnsi="Consolas"/>
-          <w:b/>
-          <w:color w:val="000080"/>
+          <w:rFonts w:ascii="Consolas" w:hAnsi="Consolas" w:eastAsia="Consolas"/>
+          <w:color w:val="D4D4D4"/>
           <w:sz w:val="16"/>
         </w:rPr>
-        <w:t xml:space="preserve">composer</w:t>
+        <w:t xml:space="preserve"> </w:t>
       </w:r>
       <w:r>
         <w:rPr>
-          <w:rFonts w:ascii="Consolas" w:hAnsi="Consolas"/>
-          <w:color w:val="262626"/>
+          <w:rFonts w:ascii="Consolas" w:hAnsi="Consolas" w:eastAsia="Consolas"/>
+          <w:color w:val="D4D4D4"/>
           <w:sz w:val="16"/>
         </w:rPr>
-        <w:t xml:space="preserve"> require maatwebsite/excel barryvdh/laravel-dompdf </w:t>
+        <w:t>chillerlan/php-qrcode</w:t>
       </w:r>
       <w:r>
         <w:rPr>
-          <w:rFonts w:ascii="Consolas" w:hAnsi="Consolas"/>
-          <w:color w:val="0073E6"/>
+          <w:rFonts w:ascii="Consolas" w:hAnsi="Consolas" w:eastAsia="Consolas"/>
+          <w:color w:val="D4D4D4"/>
           <w:sz w:val="16"/>
         </w:rPr>
-        <w:t xml:space="preserve">--dry-run</w:t>
-      </w:r>
-      <w:r>
-        <w:br/>
+        <w:t xml:space="preserve"> </w:t>
       </w:r>
       <w:r>
         <w:rPr>
-          <w:rFonts w:ascii="Consolas" w:hAnsi="Consolas"/>
-          <w:b/>
-          <w:color w:val="000080"/>
+          <w:rFonts w:ascii="Consolas" w:hAnsi="Consolas" w:eastAsia="Consolas"/>
+          <w:color w:val="D4D4D4"/>
           <w:sz w:val="16"/>
         </w:rPr>
-        <w:t xml:space="preserve">composer</w:t>
+        <w:t>intervention/image-laravel</w:t>
       </w:r>
       <w:r>
         <w:rPr>
-          <w:rFonts w:ascii="Consolas" w:hAnsi="Consolas"/>
-          <w:color w:val="262626"/>
+          <w:rFonts w:ascii="Consolas" w:hAnsi="Consolas" w:eastAsia="Consolas"/>
+          <w:color w:val="D4D4D4"/>
           <w:sz w:val="16"/>
         </w:rPr>
-        <w:t xml:space="preserve"> require laravel-notification-channels/webpush </w:t>
+        <w:t xml:space="preserve"> </w:t>
       </w:r>
       <w:r>
         <w:rPr>
-          <w:rFonts w:ascii="Consolas" w:hAnsi="Consolas"/>
-          <w:color w:val="0073E6"/>
+          <w:rFonts w:ascii="Consolas" w:hAnsi="Consolas" w:eastAsia="Consolas"/>
+          <w:color w:val="9CDCFE"/>
           <w:sz w:val="16"/>
         </w:rPr>
-        <w:t xml:space="preserve">--dry-run</w:t>
-      </w:r>
-      <w:r>
-        <w:br/>
+        <w:t>--dry-run</w:t>
       </w:r>
       <w:r>
         <w:rPr>
-          <w:rFonts w:ascii="Consolas" w:hAnsi="Consolas"/>
-          <w:b/>
-          <w:color w:val="000080"/>
+          <w:rFonts w:ascii="Consolas" w:hAnsi="Consolas" w:eastAsia="Consolas"/>
+          <w:color w:val="D4D4D4"/>
           <w:sz w:val="16"/>
         </w:rPr>
-        <w:t xml:space="preserve">npm</w:t>
+        <w:br/>
       </w:r>
       <w:r>
         <w:rPr>
-          <w:rFonts w:ascii="Consolas" w:hAnsi="Consolas"/>
-          <w:color w:val="262626"/>
+          <w:rFonts w:ascii="Consolas" w:hAnsi="Consolas" w:eastAsia="Consolas"/>
+          <w:color w:val="4EC9B0"/>
           <w:sz w:val="16"/>
         </w:rPr>
-        <w:t xml:space="preserve"> install </w:t>
+        <w:t>composer</w:t>
       </w:r>
       <w:r>
         <w:rPr>
-          <w:rFonts w:ascii="Consolas" w:hAnsi="Consolas"/>
-          <w:color w:val="0073E6"/>
+          <w:rFonts w:ascii="Consolas" w:hAnsi="Consolas" w:eastAsia="Consolas"/>
+          <w:color w:val="D4D4D4"/>
           <w:sz w:val="16"/>
         </w:rPr>
-        <w:t xml:space="preserve">--dry-run</w:t>
+        <w:t xml:space="preserve"> </w:t>
       </w:r>
       <w:r>
         <w:rPr>
-          <w:rFonts w:ascii="Consolas" w:hAnsi="Consolas"/>
-          <w:color w:val="262626"/>
+          <w:rFonts w:ascii="Consolas" w:hAnsi="Consolas" w:eastAsia="Consolas"/>
+          <w:color w:val="D4D4D4"/>
           <w:sz w:val="16"/>
         </w:rPr>
-        <w:t xml:space="preserve"> laravel-echo pusher-js</w:t>
-      </w:r>
-      <w:r>
-        <w:br/>
+        <w:t>require</w:t>
       </w:r>
       <w:r>
         <w:rPr>
-          <w:rFonts w:ascii="Consolas" w:hAnsi="Consolas"/>
-          <w:b/>
-          <w:color w:val="000080"/>
+          <w:rFonts w:ascii="Consolas" w:hAnsi="Consolas" w:eastAsia="Consolas"/>
+          <w:color w:val="D4D4D4"/>
           <w:sz w:val="16"/>
         </w:rPr>
-        <w:t xml:space="preserve">composer</w:t>
+        <w:t xml:space="preserve"> </w:t>
       </w:r>
       <w:r>
         <w:rPr>
-          <w:rFonts w:ascii="Consolas" w:hAnsi="Consolas"/>
-          <w:color w:val="262626"/>
+          <w:rFonts w:ascii="Consolas" w:hAnsi="Consolas" w:eastAsia="Consolas"/>
+          <w:color w:val="D4D4D4"/>
           <w:sz w:val="16"/>
         </w:rPr>
-        <w:t xml:space="preserve"> validate </w:t>
+        <w:t>maatwebsite/excel</w:t>
       </w:r>
       <w:r>
         <w:rPr>
-          <w:rFonts w:ascii="Consolas" w:hAnsi="Consolas"/>
-          <w:color w:val="0073E6"/>
+          <w:rFonts w:ascii="Consolas" w:hAnsi="Consolas" w:eastAsia="Consolas"/>
+          <w:color w:val="D4D4D4"/>
           <w:sz w:val="16"/>
         </w:rPr>
-        <w:t xml:space="preserve">--strict</w:t>
-      </w:r>
-      <w:r>
-        <w:br/>
+        <w:t xml:space="preserve"> </w:t>
       </w:r>
       <w:r>
         <w:rPr>
-          <w:rFonts w:ascii="Consolas" w:hAnsi="Consolas"/>
-          <w:b/>
-          <w:color w:val="000080"/>
+          <w:rFonts w:ascii="Consolas" w:hAnsi="Consolas" w:eastAsia="Consolas"/>
+          <w:color w:val="D4D4D4"/>
           <w:sz w:val="16"/>
         </w:rPr>
-        <w:t xml:space="preserve">composer</w:t>
+        <w:t>barryvdh/laravel-dompdf</w:t>
       </w:r>
       <w:r>
         <w:rPr>
-          <w:rFonts w:ascii="Consolas" w:hAnsi="Consolas"/>
-          <w:color w:val="262626"/>
+          <w:rFonts w:ascii="Consolas" w:hAnsi="Consolas" w:eastAsia="Consolas"/>
+          <w:color w:val="D4D4D4"/>
           <w:sz w:val="16"/>
         </w:rPr>
-        <w:t xml:space="preserve"> audit</w:t>
-      </w:r>
-      <w:r>
-        <w:br/>
+        <w:t xml:space="preserve"> </w:t>
       </w:r>
       <w:r>
         <w:rPr>
-          <w:rFonts w:ascii="Consolas" w:hAnsi="Consolas"/>
-          <w:b/>
-          <w:color w:val="000080"/>
+          <w:rFonts w:ascii="Consolas" w:hAnsi="Consolas" w:eastAsia="Consolas"/>
+          <w:color w:val="9CDCFE"/>
           <w:sz w:val="16"/>
         </w:rPr>
-        <w:t xml:space="preserve">npm</w:t>
+        <w:t>--dry-run</w:t>
       </w:r>
       <w:r>
         <w:rPr>
-          <w:rFonts w:ascii="Consolas" w:hAnsi="Consolas"/>
-          <w:color w:val="262626"/>
+          <w:rFonts w:ascii="Consolas" w:hAnsi="Consolas" w:eastAsia="Consolas"/>
+          <w:color w:val="D4D4D4"/>
           <w:sz w:val="16"/>
         </w:rPr>
-        <w:t xml:space="preserve"> audit</w:t>
+        <w:br/>
+      </w:r>
+      <w:r>
+        <w:rPr>
+          <w:rFonts w:ascii="Consolas" w:hAnsi="Consolas" w:eastAsia="Consolas"/>
+          <w:color w:val="4EC9B0"/>
+          <w:sz w:val="16"/>
+        </w:rPr>
+        <w:t>composer</w:t>
+      </w:r>
+      <w:r>
+        <w:rPr>
+          <w:rFonts w:ascii="Consolas" w:hAnsi="Consolas" w:eastAsia="Consolas"/>
+          <w:color w:val="D4D4D4"/>
+          <w:sz w:val="16"/>
+        </w:rPr>
+        <w:t xml:space="preserve"> </w:t>
+      </w:r>
+      <w:r>
+        <w:rPr>
+          <w:rFonts w:ascii="Consolas" w:hAnsi="Consolas" w:eastAsia="Consolas"/>
+          <w:color w:val="D4D4D4"/>
+          <w:sz w:val="16"/>
+        </w:rPr>
+        <w:t>require</w:t>
+      </w:r>
+      <w:r>
+        <w:rPr>
+          <w:rFonts w:ascii="Consolas" w:hAnsi="Consolas" w:eastAsia="Consolas"/>
+          <w:color w:val="D4D4D4"/>
+          <w:sz w:val="16"/>
+        </w:rPr>
+        <w:t xml:space="preserve"> </w:t>
+      </w:r>
+      <w:r>
+        <w:rPr>
+          <w:rFonts w:ascii="Consolas" w:hAnsi="Consolas" w:eastAsia="Consolas"/>
+          <w:color w:val="D4D4D4"/>
+          <w:sz w:val="16"/>
+        </w:rPr>
+        <w:t>laravel-notification-channels/webpush</w:t>
+      </w:r>
+      <w:r>
+        <w:rPr>
+          <w:rFonts w:ascii="Consolas" w:hAnsi="Consolas" w:eastAsia="Consolas"/>
+          <w:color w:val="D4D4D4"/>
+          <w:sz w:val="16"/>
+        </w:rPr>
+        <w:t xml:space="preserve"> </w:t>
+      </w:r>
+      <w:r>
+        <w:rPr>
+          <w:rFonts w:ascii="Consolas" w:hAnsi="Consolas" w:eastAsia="Consolas"/>
+          <w:color w:val="9CDCFE"/>
+          <w:sz w:val="16"/>
+        </w:rPr>
+        <w:t>--dry-run</w:t>
+      </w:r>
+      <w:r>
+        <w:rPr>
+          <w:rFonts w:ascii="Consolas" w:hAnsi="Consolas" w:eastAsia="Consolas"/>
+          <w:color w:val="D4D4D4"/>
+          <w:sz w:val="16"/>
+        </w:rPr>
+        <w:br/>
+      </w:r>
+      <w:r>
+        <w:rPr>
+          <w:rFonts w:ascii="Consolas" w:hAnsi="Consolas" w:eastAsia="Consolas"/>
+          <w:color w:val="4EC9B0"/>
+          <w:sz w:val="16"/>
+        </w:rPr>
+        <w:t>npm</w:t>
+      </w:r>
+      <w:r>
+        <w:rPr>
+          <w:rFonts w:ascii="Consolas" w:hAnsi="Consolas" w:eastAsia="Consolas"/>
+          <w:color w:val="D4D4D4"/>
+          <w:sz w:val="16"/>
+        </w:rPr>
+        <w:t xml:space="preserve"> </w:t>
+      </w:r>
+      <w:r>
+        <w:rPr>
+          <w:rFonts w:ascii="Consolas" w:hAnsi="Consolas" w:eastAsia="Consolas"/>
+          <w:color w:val="D4D4D4"/>
+          <w:sz w:val="16"/>
+        </w:rPr>
+        <w:t>install</w:t>
+      </w:r>
+      <w:r>
+        <w:rPr>
+          <w:rFonts w:ascii="Consolas" w:hAnsi="Consolas" w:eastAsia="Consolas"/>
+          <w:color w:val="D4D4D4"/>
+          <w:sz w:val="16"/>
+        </w:rPr>
+        <w:t xml:space="preserve"> </w:t>
+      </w:r>
+      <w:r>
+        <w:rPr>
+          <w:rFonts w:ascii="Consolas" w:hAnsi="Consolas" w:eastAsia="Consolas"/>
+          <w:color w:val="9CDCFE"/>
+          <w:sz w:val="16"/>
+        </w:rPr>
+        <w:t>--dry-run</w:t>
+      </w:r>
+      <w:r>
+        <w:rPr>
+          <w:rFonts w:ascii="Consolas" w:hAnsi="Consolas" w:eastAsia="Consolas"/>
+          <w:color w:val="D4D4D4"/>
+          <w:sz w:val="16"/>
+        </w:rPr>
+        <w:t xml:space="preserve"> </w:t>
+      </w:r>
+      <w:r>
+        <w:rPr>
+          <w:rFonts w:ascii="Consolas" w:hAnsi="Consolas" w:eastAsia="Consolas"/>
+          <w:color w:val="D4D4D4"/>
+          <w:sz w:val="16"/>
+        </w:rPr>
+        <w:t>laravel-echo</w:t>
+      </w:r>
+      <w:r>
+        <w:rPr>
+          <w:rFonts w:ascii="Consolas" w:hAnsi="Consolas" w:eastAsia="Consolas"/>
+          <w:color w:val="D4D4D4"/>
+          <w:sz w:val="16"/>
+        </w:rPr>
+        <w:t xml:space="preserve"> </w:t>
+      </w:r>
+      <w:r>
+        <w:rPr>
+          <w:rFonts w:ascii="Consolas" w:hAnsi="Consolas" w:eastAsia="Consolas"/>
+          <w:color w:val="D4D4D4"/>
+          <w:sz w:val="16"/>
+        </w:rPr>
+        <w:t>pusher-js</w:t>
+      </w:r>
+      <w:r>
+        <w:rPr>
+          <w:rFonts w:ascii="Consolas" w:hAnsi="Consolas" w:eastAsia="Consolas"/>
+          <w:color w:val="D4D4D4"/>
+          <w:sz w:val="16"/>
+        </w:rPr>
+        <w:br/>
+      </w:r>
+      <w:r>
+        <w:rPr>
+          <w:rFonts w:ascii="Consolas" w:hAnsi="Consolas" w:eastAsia="Consolas"/>
+          <w:color w:val="4EC9B0"/>
+          <w:sz w:val="16"/>
+        </w:rPr>
+        <w:t>composer</w:t>
+      </w:r>
+      <w:r>
+        <w:rPr>
+          <w:rFonts w:ascii="Consolas" w:hAnsi="Consolas" w:eastAsia="Consolas"/>
+          <w:color w:val="D4D4D4"/>
+          <w:sz w:val="16"/>
+        </w:rPr>
+        <w:t xml:space="preserve"> </w:t>
+      </w:r>
+      <w:r>
+        <w:rPr>
+          <w:rFonts w:ascii="Consolas" w:hAnsi="Consolas" w:eastAsia="Consolas"/>
+          <w:color w:val="D4D4D4"/>
+          <w:sz w:val="16"/>
+        </w:rPr>
+        <w:t>validate</w:t>
+      </w:r>
+      <w:r>
+        <w:rPr>
+          <w:rFonts w:ascii="Consolas" w:hAnsi="Consolas" w:eastAsia="Consolas"/>
+          <w:color w:val="D4D4D4"/>
+          <w:sz w:val="16"/>
+        </w:rPr>
+        <w:t xml:space="preserve"> </w:t>
+      </w:r>
+      <w:r>
+        <w:rPr>
+          <w:rFonts w:ascii="Consolas" w:hAnsi="Consolas" w:eastAsia="Consolas"/>
+          <w:color w:val="9CDCFE"/>
+          <w:sz w:val="16"/>
+        </w:rPr>
+        <w:t>--strict</w:t>
+      </w:r>
+      <w:r>
+        <w:rPr>
+          <w:rFonts w:ascii="Consolas" w:hAnsi="Consolas" w:eastAsia="Consolas"/>
+          <w:color w:val="D4D4D4"/>
+          <w:sz w:val="16"/>
+        </w:rPr>
+        <w:br/>
+      </w:r>
+      <w:r>
+        <w:rPr>
+          <w:rFonts w:ascii="Consolas" w:hAnsi="Consolas" w:eastAsia="Consolas"/>
+          <w:color w:val="4EC9B0"/>
+          <w:sz w:val="16"/>
+        </w:rPr>
+        <w:t>composer</w:t>
+      </w:r>
+      <w:r>
+        <w:rPr>
+          <w:rFonts w:ascii="Consolas" w:hAnsi="Consolas" w:eastAsia="Consolas"/>
+          <w:color w:val="D4D4D4"/>
+          <w:sz w:val="16"/>
+        </w:rPr>
+        <w:t xml:space="preserve"> </w:t>
+      </w:r>
+      <w:r>
+        <w:rPr>
+          <w:rFonts w:ascii="Consolas" w:hAnsi="Consolas" w:eastAsia="Consolas"/>
+          <w:color w:val="D4D4D4"/>
+          <w:sz w:val="16"/>
+        </w:rPr>
+        <w:t>audit</w:t>
+      </w:r>
+      <w:r>
+        <w:rPr>
+          <w:rFonts w:ascii="Consolas" w:hAnsi="Consolas" w:eastAsia="Consolas"/>
+          <w:color w:val="D4D4D4"/>
+          <w:sz w:val="16"/>
+        </w:rPr>
+        <w:br/>
+      </w:r>
+      <w:r>
+        <w:rPr>
+          <w:rFonts w:ascii="Consolas" w:hAnsi="Consolas" w:eastAsia="Consolas"/>
+          <w:color w:val="4EC9B0"/>
+          <w:sz w:val="16"/>
+        </w:rPr>
+        <w:t>npm</w:t>
+      </w:r>
+      <w:r>
+        <w:rPr>
+          <w:rFonts w:ascii="Consolas" w:hAnsi="Consolas" w:eastAsia="Consolas"/>
+          <w:color w:val="D4D4D4"/>
+          <w:sz w:val="16"/>
+        </w:rPr>
+        <w:t xml:space="preserve"> </w:t>
+      </w:r>
+      <w:r>
+        <w:rPr>
+          <w:rFonts w:ascii="Consolas" w:hAnsi="Consolas" w:eastAsia="Consolas"/>
+          <w:color w:val="D4D4D4"/>
+          <w:sz w:val="16"/>
+        </w:rPr>
+        <w:t>audit</w:t>
       </w:r>
     </w:p>
     <w:p>
@@ -7776,10 +7909,8 @@
       <w:r>
         <w:rPr>
           <w:rFonts w:ascii="Aptos" w:hAnsi="Aptos"/>
-          <w:color w:val="1F2937"/>
-          <w:sz w:val="19"/>
         </w:rPr>
-        <w:t xml:space="preserve">Preset dasar yang digunakan adalah compact_reference_guide dengan named override untuk modul pembelajaran: A4 portrait; margin atas 1,65 cm, bawah 1,55 cm, kiri/kanan 1,75 cm; Aptos 10,2 pt; line spacing 1,16; heading beraksen Laravel red; tabel ringkas; callout Predict/Try/Observe; code block Consolas berlatar Cyan Light dengan pewarnaan token Visual Studio Code; checklist; exit ticket; serta screenshot mockup UI.</w:t>
+        <w:t>Preset dasar yang digunakan adalah compact_reference_guide dengan named override untuk modul pembelajaran: A4 portrait; margin atas 1,65 cm, bawah 1,55 cm, kiri/kanan 1,75 cm; Aptos 10,2 pt; line spacing 1,16; heading beraksen Laravel red; tabel ringkas; callout Predict/Try/Observe; code block Consolas bertema Visual Studio Code Dark+; checklist; exit ticket; serta screenshot mockup UI.</w:t>
       </w:r>
     </w:p>
     <w:p>
@@ -8360,19 +8491,6 @@
         <w:pStyle w:val="ListBody"/>
       </w:pPr>
       <w:r>
-        <w:rPr>
-          <w:rFonts w:ascii="Aptos" w:hAnsi="Aptos"/>
-          <w:color w:val="1F2937"/>
-          <w:sz w:val="19"/>
-        </w:rPr>
-        <w:t xml:space="preserve">DOC-00-001 — Seluruh blok kode (208 blok, 133 label) memakai latar terang tema Cyan Light (JetBrains) dengan pewarnaan token standar Visual Studio Code untuk PHP, HTML/Blade, cmd, dan bash; teks kode tidak berubah; penjelasan palet di “Cara Membaca Sampel Kode” dan Lampiran diperbarui.</w:t>
-      </w:r>
-    </w:p>
-    <w:p>
-      <w:pPr>
-        <w:pStyle w:val="ListBody"/>
-      </w:pPr>
-      <w:r>
         <w:t xml:space="preserve">DOC-01-001 — Basis dokumen: parameter menyebut v4/v5 yang tidak ada; basis nyata adalah v7. Revisi kumulatif ditulis ke berkas v8; v7 tetap utuh di references/.</w:t>
       </w:r>
     </w:p>
@@ -8751,19 +8869,6 @@
           <w:color w:val="1F2937"/>
           <w:sz w:val="19"/>
         </w:rPr>
-        <w:t xml:space="preserve">DOC-05-007 — Rantai v3 (use case SRS v2): Modul 5 menuntaskan UC-19 (penguncian 5x/10 menit, pesan generik, redirect per peran, sesi 8 jam) dan UC-21 (onboarding penanggung jawab + rekening + tautan atur kata sandi, aktif/nonaktif tenant, riwayat komisi beserta pengelola); ditambahkan deskripsi use case, mockup, Tahap 8, dan output nyata browser.</w:t>
-      </w:r>
-    </w:p>
-    <w:p>
-      <w:pPr>
-        <w:pStyle w:val="ListBody"/>
-      </w:pPr>
-      <w:r>
-        <w:rPr>
-          <w:rFonts w:ascii="Aptos" w:hAnsi="Aptos"/>
-          <w:color w:val="1F2937"/>
-          <w:sz w:val="19"/>
-        </w:rPr>
         <w:t xml:space="preserve">DOC-06-004 — Controller/view/route meja di modul Admin; controller + route publik scan QR di modul Ordering (</w:t>
       </w:r>
       <w:r>
@@ -8841,19 +8946,6 @@
           <w:color w:val="1F2937"/>
           <w:sz w:val="19"/>
         </w:rPr>
-        <w:t xml:space="preserve">DOC-06-006 — Rantai v3 (use case SRS v2): Modul 6 menuntaskan UC-22 (QR siap cetak SVG via bacon/bacon-qr-code, nonaktif/aktif meja, ringkasan meja) dan UC-02 (halaman sambutan meja + tenant buka/tutup, pesan QR tidak valid, penolakan di luar jam operasional); ditambahkan deskripsi use case, mockup, Tahap 8, dan output nyata browser.</w:t>
-      </w:r>
-    </w:p>
-    <w:p>
-      <w:pPr>
-        <w:pStyle w:val="ListBody"/>
-      </w:pPr>
-      <w:r>
-        <w:rPr>
-          <w:rFonts w:ascii="Aptos" w:hAnsi="Aptos"/>
-          <w:color w:val="1F2937"/>
-          <w:sz w:val="19"/>
-        </w:rPr>
         <w:t xml:space="preserve">DOC-07-004 — Komponen Livewire katalog (</w:t>
       </w:r>
       <w:r>
@@ -8948,19 +9040,6 @@
           <w:color w:val="1F2937"/>
           <w:sz w:val="19"/>
         </w:rPr>
-        <w:t xml:space="preserve">DOC-07-006 — Rantai v3 (use case SRS v2): Modul 7 menuntaskan UC-13 (deskripsi, foto WebP, ubah, soft delete, cari/saring), UC-14 (sakelar satu ketukan), UC-01 (kelompok per tenant, menu habis nonaktif, tenant tutup, chip kategori, pembaruan ≤ 5 detik), dan UC-11 (WaitTimeEstimator); ditambahkan deskripsi use case, mockup, Tahap 8, dan output nyata browser.</w:t>
-      </w:r>
-    </w:p>
-    <w:p>
-      <w:pPr>
-        <w:pStyle w:val="ListBody"/>
-      </w:pPr>
-      <w:r>
-        <w:rPr>
-          <w:rFonts w:ascii="Aptos" w:hAnsi="Aptos"/>
-          <w:color w:val="1F2937"/>
-          <w:sz w:val="19"/>
-        </w:rPr>
         <w:t xml:space="preserve">DOC-08-004 — Keranjang sebagai vertical slice modul Ordering: </w:t>
       </w:r>
       <w:r>
@@ -9072,19 +9151,6 @@
           <w:color w:val="1F2937"/>
           <w:sz w:val="19"/>
         </w:rPr>
-        <w:t xml:space="preserve">DOC-08-006 — Rantai v3 (use case SRS v2): Modul 8 menuntaskan UC-03 (kelompok per tenant, pajak dan biaya layanan, “Menu telah habis”, checkout nonaktif saat kosong) dan UC-04 (formulir kustomisasi min/maks, opsi habis nonaktif, catatan ≤ 200 karakter tersaring, harga akhir) serta halaman tenant Kelola Modifier; ditambahkan deskripsi use case, mockup, Tahap 8, dan output nyata browser.</w:t>
-      </w:r>
-    </w:p>
-    <w:p>
-      <w:pPr>
-        <w:pStyle w:val="ListBody"/>
-      </w:pPr>
-      <w:r>
-        <w:rPr>
-          <w:rFonts w:ascii="Aptos" w:hAnsi="Aptos"/>
-          <w:color w:val="1F2937"/>
-          <w:sz w:val="19"/>
-        </w:rPr>
         <w:t xml:space="preserve">DOC-09-004 — Checkout dan status pesanan sebagai vertical slice modul Ordering (</w:t>
       </w:r>
       <w:r>
@@ -9196,19 +9262,6 @@
           <w:color w:val="1F2937"/>
           <w:sz w:val="19"/>
         </w:rPr>
-        <w:t xml:space="preserve">DOC-09-006 — Rantai v3 (use case SRS v2): Modul 9 menuntaskan UC-05 (halaman checkout: ringkasan, nomor meja, mode penyajian, identitas ringkas, tenant wajib buka, kembali ke keranjang bila item bermasalah, catatan item tersimpan) dan UC-06 (slot pre-order 15 menit, jam operasional, kapasitas slot + slot terdekat, status terjadwal, pelepasan otomatis ke dapur tiap menit) serta halaman tenant Pengaturan Pre-Order; ditambahkan deskripsi use case, mockup, Tahap 8, dan output nyata browser.</w:t>
-      </w:r>
-    </w:p>
-    <w:p>
-      <w:pPr>
-        <w:pStyle w:val="ListBody"/>
-      </w:pPr>
-      <w:r>
-        <w:rPr>
-          <w:rFonts w:ascii="Aptos" w:hAnsi="Aptos"/>
-          <w:color w:val="1F2937"/>
-          <w:sz w:val="19"/>
-        </w:rPr>
         <w:t xml:space="preserve">DOC-10-004 — Pembayaran sebagai vertical slice modul Payments: kontrak </w:t>
       </w:r>
       <w:r>
@@ -9337,19 +9390,6 @@
           <w:color w:val="1F2937"/>
           <w:sz w:val="19"/>
         </w:rPr>
-        <w:t xml:space="preserve">DOC-10-006 — Rantai v3 (use case SRS v2): Modul 10 menuntaskan UC-07 (QRIS otomatis setelah checkout, gambar QRIS + penghitung mundur ≤ 15 menit, rincian split per tenant, percobaan ulang 3 kali saat gateway tidak merespons, QRIS baru saat kedaluwarsa, pemantauan status, batalkan pesanan yang belum dibayar); ditambahkan deskripsi use case, mockup, Tahap 8, dan output nyata browser.</w:t>
-      </w:r>
-    </w:p>
-    <w:p>
-      <w:pPr>
-        <w:pStyle w:val="ListBody"/>
-      </w:pPr>
-      <w:r>
-        <w:rPr>
-          <w:rFonts w:ascii="Aptos" w:hAnsi="Aptos"/>
-          <w:color w:val="1F2937"/>
-          <w:sz w:val="19"/>
-        </w:rPr>
         <w:t xml:space="preserve">DOC-11-004 — Webhook sebagai vertical slice modul Payments: </w:t>
       </w:r>
       <w:r>
@@ -9462,6 +9502,202 @@
           <w:sz w:val="19"/>
         </w:rPr>
         <w:t xml:space="preserve">DOC-11-006 — Subbagian "Mengapa Endpoint Webhook Dikecualikan dari CSRF?": ancaman CSRF, alasan webhook server-ke-server tidak dapat membawa token, lapis pengganti (HMAC raw body, fail-closed, idempoten), aturan penerapan, dan Output Nyata M11c (419 vs 401; 419 bila pengecualian dicabut).</w:t>
+      </w:r>
+    </w:p>
+    <w:p>
+      <w:pPr>
+        <w:pStyle w:val="ListBody"/>
+      </w:pPr>
+      <w:r>
+        <w:rPr>
+          <w:rFonts w:ascii="Aptos" w:hAnsi="Aptos"/>
+          <w:color w:val="1F2937"/>
+          <w:sz w:val="19"/>
+        </w:rPr>
+        <w:t xml:space="preserve">DOC-12-004 — KDS sebagai vertical slice modul Kitchen: event (</w:t>
+      </w:r>
+      <w:r>
+        <w:rPr>
+          <w:rFonts w:ascii="Consolas" w:hAnsi="Consolas"/>
+          <w:color w:val="C11B12"/>
+          <w:sz w:val="17"/>
+          <w:shd w:fill="ECEFF3"/>
+        </w:rPr>
+        <w:t xml:space="preserve">make:event</w:t>
+      </w:r>
+      <w:r>
+        <w:rPr>
+          <w:rFonts w:ascii="Aptos" w:hAnsi="Aptos"/>
+          <w:color w:val="1F2937"/>
+          <w:sz w:val="19"/>
+        </w:rPr>
+        <w:t xml:space="preserve"> FQN), </w:t>
+      </w:r>
+      <w:r>
+        <w:rPr>
+          <w:rFonts w:ascii="Consolas" w:hAnsi="Consolas"/>
+          <w:color w:val="C11B12"/>
+          <w:sz w:val="17"/>
+          <w:shd w:fill="ECEFF3"/>
+        </w:rPr>
+        <w:t xml:space="preserve">TenantChannels</w:t>
+      </w:r>
+      <w:r>
+        <w:rPr>
+          <w:rFonts w:ascii="Aptos" w:hAnsi="Aptos"/>
+          <w:color w:val="1F2937"/>
+          <w:sz w:val="19"/>
+        </w:rPr>
+        <w:t xml:space="preserve">, channel privat </w:t>
+      </w:r>
+      <w:r>
+        <w:rPr>
+          <w:rFonts w:ascii="Consolas" w:hAnsi="Consolas"/>
+          <w:color w:val="C11B12"/>
+          <w:sz w:val="17"/>
+          <w:shd w:fill="ECEFF3"/>
+        </w:rPr>
+        <w:t xml:space="preserve">tenant.{tenantId}.orders</w:t>
+      </w:r>
+      <w:r>
+        <w:rPr>
+          <w:rFonts w:ascii="Aptos" w:hAnsi="Aptos"/>
+          <w:color w:val="1F2937"/>
+          <w:sz w:val="19"/>
+        </w:rPr>
+        <w:t xml:space="preserve"> via </w:t>
+      </w:r>
+      <w:r>
+        <w:rPr>
+          <w:rFonts w:ascii="Consolas" w:hAnsi="Consolas"/>
+          <w:color w:val="C11B12"/>
+          <w:sz w:val="17"/>
+          <w:shd w:fill="ECEFF3"/>
+        </w:rPr>
+        <w:t xml:space="preserve">Broadcast::channel()</w:t>
+      </w:r>
+      <w:r>
+        <w:rPr>
+          <w:rFonts w:ascii="Aptos" w:hAnsi="Aptos"/>
+          <w:color w:val="1F2937"/>
+          <w:sz w:val="19"/>
+        </w:rPr>
+        <w:t xml:space="preserve"> di </w:t>
+      </w:r>
+      <w:r>
+        <w:rPr>
+          <w:rFonts w:ascii="Consolas" w:hAnsi="Consolas"/>
+          <w:color w:val="C11B12"/>
+          <w:sz w:val="17"/>
+          <w:shd w:fill="ECEFF3"/>
+        </w:rPr>
+        <w:t xml:space="preserve">KitchenServiceProvider</w:t>
+      </w:r>
+      <w:r>
+        <w:rPr>
+          <w:rFonts w:ascii="Aptos" w:hAnsi="Aptos"/>
+          <w:color w:val="1F2937"/>
+          <w:sz w:val="19"/>
+        </w:rPr>
+        <w:t xml:space="preserve"> (bukan </w:t>
+      </w:r>
+      <w:r>
+        <w:rPr>
+          <w:rFonts w:ascii="Consolas" w:hAnsi="Consolas"/>
+          <w:color w:val="C11B12"/>
+          <w:sz w:val="17"/>
+          <w:shd w:fill="ECEFF3"/>
+        </w:rPr>
+        <w:t xml:space="preserve">routes/channels.php</w:t>
+      </w:r>
+      <w:r>
+        <w:rPr>
+          <w:rFonts w:ascii="Aptos" w:hAnsi="Aptos"/>
+          <w:color w:val="1F2937"/>
+          <w:sz w:val="19"/>
+        </w:rPr>
+        <w:t xml:space="preserve">; aman untuk </w:t>
+      </w:r>
+      <w:r>
+        <w:rPr>
+          <w:rFonts w:ascii="Consolas" w:hAnsi="Consolas"/>
+          <w:color w:val="C11B12"/>
+          <w:sz w:val="17"/>
+          <w:shd w:fill="ECEFF3"/>
+        </w:rPr>
+        <w:t xml:space="preserve">route:cache</w:t>
+      </w:r>
+      <w:r>
+        <w:rPr>
+          <w:rFonts w:ascii="Aptos" w:hAnsi="Aptos"/>
+          <w:color w:val="1F2937"/>
+          <w:sz w:val="19"/>
+        </w:rPr>
+        <w:t xml:space="preserve">), komponen </w:t>
+      </w:r>
+      <w:r>
+        <w:rPr>
+          <w:rFonts w:ascii="Consolas" w:hAnsi="Consolas"/>
+          <w:color w:val="C11B12"/>
+          <w:sz w:val="17"/>
+          <w:shd w:fill="ECEFF3"/>
+        </w:rPr>
+        <w:t xml:space="preserve">kitchen::kitchen-board</w:t>
+      </w:r>
+      <w:r>
+        <w:rPr>
+          <w:rFonts w:ascii="Aptos" w:hAnsi="Aptos"/>
+          <w:color w:val="1F2937"/>
+          <w:sz w:val="19"/>
+        </w:rPr>
+        <w:t xml:space="preserve">; nama channel </w:t>
+      </w:r>
+      <w:r>
+        <w:rPr>
+          <w:rFonts w:ascii="Consolas" w:hAnsi="Consolas"/>
+          <w:color w:val="C11B12"/>
+          <w:sz w:val="17"/>
+          <w:shd w:fill="ECEFF3"/>
+        </w:rPr>
+        <w:t xml:space="preserve">.kds</w:t>
+      </w:r>
+      <w:r>
+        <w:rPr>
+          <w:rFonts w:ascii="Aptos" w:hAnsi="Aptos"/>
+          <w:color w:val="1F2937"/>
+          <w:sz w:val="19"/>
+        </w:rPr>
+        <w:t xml:space="preserve"> diselaraskan menjadi </w:t>
+      </w:r>
+      <w:r>
+        <w:rPr>
+          <w:rFonts w:ascii="Consolas" w:hAnsi="Consolas"/>
+          <w:color w:val="C11B12"/>
+          <w:sz w:val="17"/>
+          <w:shd w:fill="ECEFF3"/>
+        </w:rPr>
+        <w:t xml:space="preserve">.orders</w:t>
+      </w:r>
+      <w:r>
+        <w:rPr>
+          <w:rFonts w:ascii="Aptos" w:hAnsi="Aptos"/>
+          <w:color w:val="1F2937"/>
+          <w:sz w:val="19"/>
+        </w:rPr>
+        <w:t xml:space="preserve">; path diselaraskan; blok Output Nyata Modul 12 v1 dipindah dari judul Modul 13.</w:t>
+      </w:r>
+    </w:p>
+    <w:p>
+      <w:pPr>
+        <w:pStyle w:val="ListBody"/>
+      </w:pPr>
+      <w:r>
+        <w:rPr>
+          <w:rFonts w:ascii="Aptos" w:hAnsi="Aptos"/>
+          <w:color w:val="1F2937"/>
+          <w:sz w:val="19"/>
+        </w:rPr>
+        <w:t xml:space="preserve">DOC-12-005 — Blok BUAT FILE per tahap Modul 12: make:class (TenantChannels, KitchenService), make:exception FQN, make:livewire kitchen::kitchen-board, make:event FQN ×2 ke modul Kitchen, make:test; halaman &amp; route modul manual.</w:t>
       </w:r>
     </w:p>
     <w:sectPr>
@@ -21724,7 +21960,7 @@
     </w:pPr>
     <w:rPr>
       <w:rFonts w:ascii="Consolas" w:hAnsi="Consolas"/>
-      <w:color w:val="262626"/>
+      <w:color w:val="D4D4D4"/>
       <w:sz w:val="16"/>
     </w:rPr>
   </w:style>
@@ -21836,7 +22072,7 @@
     <w:rPr>
       <w:rFonts w:ascii="Consolas" w:hAnsi="Consolas"/>
       <w:b/>
-      <w:color w:val="262626"/>
+      <w:color w:val="FFFFFF"/>
       <w:sz w:val="16"/>
     </w:rPr>
   </w:style>

</xml_diff>

<commit_message>
docs(v8): laporan Pertemuan 13 + output nyata panel keuangan in-body
- Output Nyata Terverifikasi Modul 13: panel keuangan live (rekonsiliasi cocok) dan Gambar M13b
  (berkas modul Reporting/Payments, route keuangan & penarikan, uji keuangan 12 passed, suite
  160 passed).
- Blok Output Nyata Modul 13 v1 dipindah dari dalam judul Modul 14 ke badan Modul 13 (repair).
- Path Contoh Mandiri/Landasan Teknis/Cuplikan diselaraskan (DOC-13-004); blok BUAT FILE (DOC-13-005).
- laporan-implementasi.md: bagian Pertemuan 13 (v2); status P12 LULUS.
- modul_praktikum/ dibuat ulang dari master.

Co-Authored-By: Claude Opus 5.5 <noreply@anthropic.com>
</commit_message>
<xml_diff>
--- a/modul_praktikum/Lampiran.docx
+++ b/modul_praktikum/Lampiran.docx
@@ -9700,6 +9700,49 @@
         <w:t xml:space="preserve">DOC-12-005 — Blok BUAT FILE per tahap Modul 12: make:class (TenantChannels, KitchenService), make:exception FQN, make:livewire kitchen::kitchen-board, make:event FQN ×2 ke modul Kitchen, make:test; halaman &amp; route modul manual.</w:t>
       </w:r>
     </w:p>
+    <w:p>
+      <w:pPr>
+        <w:pStyle w:val="ListBody"/>
+      </w:pPr>
+      <w:r>
+        <w:rPr>
+          <w:rFonts w:ascii="Aptos" w:hAnsi="Aptos"/>
+          <w:color w:val="1F2937"/>
+          <w:sz w:val="19"/>
+        </w:rPr>
+        <w:t xml:space="preserve">DOC-13-004 — Laporan/rekonsiliasi/ekspor dan panel keuangan tenant sebagai vertical slice modul Reporting; penarikan + peninjauan admin di modul Payments; path Contoh Mandiri, Landasan Teknis (termasuk </w:t>
+      </w:r>
+      <w:r>
+        <w:rPr>
+          <w:rFonts w:ascii="Consolas" w:hAnsi="Consolas"/>
+          <w:color w:val="C11B12"/>
+          <w:sz w:val="17"/>
+          <w:shd w:fill="ECEFF3"/>
+        </w:rPr>
+        <w:t xml:space="preserve">app/Queries/...</w:t>
+      </w:r>
+      <w:r>
+        <w:rPr>
+          <w:rFonts w:ascii="Aptos" w:hAnsi="Aptos"/>
+          <w:color w:val="1F2937"/>
+          <w:sz w:val="19"/>
+        </w:rPr>
+        <w:t xml:space="preserve">), dan Cuplikan diselaraskan; blok Output Nyata Modul 13 v1 dipindah dari judul Modul 14.</w:t>
+      </w:r>
+    </w:p>
+    <w:p>
+      <w:pPr>
+        <w:pStyle w:val="ListBody"/>
+      </w:pPr>
+      <w:r>
+        <w:rPr>
+          <w:rFonts w:ascii="Aptos" w:hAnsi="Aptos"/>
+          <w:color w:val="1F2937"/>
+          <w:sz w:val="19"/>
+        </w:rPr>
+        <w:t xml:space="preserve">DOC-13-005 — Blok BUAT FILE per tahap Modul 13: make:class (TenantLedgerReport, WithdrawalService), make:controller FQN --invokable (ekspor CSV), make:exception FQN, make:livewire reporting::finance-panel dan payments::withdrawal-review, make:test; halaman &amp; route modul manual.</w:t>
+      </w:r>
+    </w:p>
     <w:sectPr>
       <w:headerReference w:type="default" r:id="rId9"/>
       <w:footerReference w:type="default" r:id="rId10"/>

</xml_diff>

<commit_message>
docs(v8): laporan Pertemuan 14 (penutup) + output nyata capstone in-body
- Output Nyata Terverifikasi Modul 14: capstone v2 (suite 163 test / 593 assertions, E2E
  scan→tarik, header keamanan dari respons nyata) menggantikan gambar v1, dan Gambar M14b
  (limiter webhook milik modul Payments, route:cache memuat route semua modul, channel aktif).
- Blok Output Nyata v1 yang tersisip di dalam judul Lampiran A dipindah ke badan Modul 14 (repair);
  DOCX akhir 0 paragraf bersarang.
- Daftar berkas diselaraskan (DOC-14-004); blok BUAT FILE per tahap (DOC-14-005).
- laporan-implementasi.md: bagian Pertemuan 14 (v2, penutup) + status rantai v2 lengkap.
- evidence/pertemuan-14/screenshots/m14-capstone.png = capstone v2; modul_praktikum/ dibuat ulang.

Co-Authored-By: Claude Opus 5.5 <noreply@anthropic.com>
</commit_message>
<xml_diff>
--- a/modul_praktikum/Lampiran.docx
+++ b/modul_praktikum/Lampiran.docx
@@ -3577,175 +3577,92 @@
     <w:p>
       <w:pPr>
         <w:pStyle w:val="CodeBlock"/>
+        <w:shd w:fill="1E1E1E" w:val="clear"/>
         <w:pBdr>
-          <w:left w:val="single" w:sz="12" w:space="8" w:color="B8DDE0"/>
+          <w:left w:val="single" w:sz="4" w:space="8" w:color="1E1E1E"/>
         </w:pBdr>
-        <w:shd w:val="clear" w:color="auto" w:fill="F2F3F7"/>
       </w:pPr>
       <w:r>
         <w:rPr>
           <w:rFonts w:ascii="Consolas" w:hAnsi="Consolas"/>
-          <w:b/>
-          <w:color w:val="000080"/>
+          <w:color w:val="4EC9B0"/>
           <w:sz w:val="16"/>
         </w:rPr>
-        <w:t xml:space="preserve">php</w:t>
+        <w:t>php</w:t>
       </w:r>
       <w:r>
         <w:rPr>
           <w:rFonts w:ascii="Consolas" w:hAnsi="Consolas"/>
-          <w:color w:val="262626"/>
+          <w:color w:val="D4D4D4"/>
           <w:sz w:val="16"/>
         </w:rPr>
-        <w:t xml:space="preserve"> artisan </w:t>
+        <w:t xml:space="preserve"> artisan optimize:clear</w:t>
+        <w:br/>
       </w:r>
       <w:r>
         <w:rPr>
           <w:rFonts w:ascii="Consolas" w:hAnsi="Consolas"/>
-          <w:color w:val="795E26"/>
+          <w:color w:val="4EC9B0"/>
           <w:sz w:val="16"/>
         </w:rPr>
-        <w:t xml:space="preserve">optimize:clear</w:t>
-      </w:r>
-      <w:r>
-        <w:br/>
+        <w:t>php</w:t>
       </w:r>
       <w:r>
         <w:rPr>
           <w:rFonts w:ascii="Consolas" w:hAnsi="Consolas"/>
-          <w:b/>
-          <w:color w:val="000080"/>
+          <w:color w:val="D4D4D4"/>
           <w:sz w:val="16"/>
         </w:rPr>
-        <w:t xml:space="preserve">php</w:t>
+        <w:t xml:space="preserve"> artisan migrate:fresh --seed --env=testing</w:t>
+        <w:br/>
       </w:r>
       <w:r>
         <w:rPr>
           <w:rFonts w:ascii="Consolas" w:hAnsi="Consolas"/>
-          <w:color w:val="262626"/>
+          <w:color w:val="4EC9B0"/>
           <w:sz w:val="16"/>
         </w:rPr>
-        <w:t xml:space="preserve"> artisan </w:t>
+        <w:t>php</w:t>
       </w:r>
       <w:r>
         <w:rPr>
           <w:rFonts w:ascii="Consolas" w:hAnsi="Consolas"/>
-          <w:color w:val="795E26"/>
+          <w:color w:val="D4D4D4"/>
           <w:sz w:val="16"/>
         </w:rPr>
-        <w:t xml:space="preserve">migrate:fresh</w:t>
+        <w:t xml:space="preserve"> artisan test --testsuite=</w:t>
       </w:r>
       <w:r>
         <w:rPr>
           <w:rFonts w:ascii="Consolas" w:hAnsi="Consolas"/>
-          <w:color w:val="262626"/>
+          <w:color w:val="4EC9B0"/>
           <w:sz w:val="16"/>
         </w:rPr>
-        <w:t xml:space="preserve"> </w:t>
+        <w:t>Feature</w:t>
       </w:r>
       <w:r>
         <w:rPr>
           <w:rFonts w:ascii="Consolas" w:hAnsi="Consolas"/>
-          <w:color w:val="0073E6"/>
+          <w:color w:val="D4D4D4"/>
           <w:sz w:val="16"/>
         </w:rPr>
-        <w:t xml:space="preserve">--seed</w:t>
+        <w:t xml:space="preserve"> --stop-on-failure</w:t>
+        <w:br/>
+        <w:t xml:space="preserve">./vendor/bin/pint --test</w:t>
+        <w:br/>
       </w:r>
       <w:r>
         <w:rPr>
           <w:rFonts w:ascii="Consolas" w:hAnsi="Consolas"/>
-          <w:color w:val="262626"/>
+          <w:color w:val="4EC9B0"/>
           <w:sz w:val="16"/>
         </w:rPr>
-        <w:t xml:space="preserve"> </w:t>
+        <w:t>npm</w:t>
       </w:r>
       <w:r>
         <w:rPr>
           <w:rFonts w:ascii="Consolas" w:hAnsi="Consolas"/>
-          <w:color w:val="0073E6"/>
-          <w:sz w:val="16"/>
-        </w:rPr>
-        <w:t xml:space="preserve">--env=testing</w:t>
-      </w:r>
-      <w:r>
-        <w:br/>
-      </w:r>
-      <w:r>
-        <w:rPr>
-          <w:rFonts w:ascii="Consolas" w:hAnsi="Consolas"/>
-          <w:b/>
-          <w:color w:val="000080"/>
-          <w:sz w:val="16"/>
-        </w:rPr>
-        <w:t xml:space="preserve">php</w:t>
-      </w:r>
-      <w:r>
-        <w:rPr>
-          <w:rFonts w:ascii="Consolas" w:hAnsi="Consolas"/>
-          <w:color w:val="262626"/>
-          <w:sz w:val="16"/>
-        </w:rPr>
-        <w:t xml:space="preserve"> artisan test </w:t>
-      </w:r>
-      <w:r>
-        <w:rPr>
-          <w:rFonts w:ascii="Consolas" w:hAnsi="Consolas"/>
-          <w:color w:val="0073E6"/>
-          <w:sz w:val="16"/>
-        </w:rPr>
-        <w:t xml:space="preserve">--testsuite=Feature</w:t>
-      </w:r>
-      <w:r>
-        <w:rPr>
-          <w:rFonts w:ascii="Consolas" w:hAnsi="Consolas"/>
-          <w:color w:val="262626"/>
-          <w:sz w:val="16"/>
-        </w:rPr>
-        <w:t xml:space="preserve"> </w:t>
-      </w:r>
-      <w:r>
-        <w:rPr>
-          <w:rFonts w:ascii="Consolas" w:hAnsi="Consolas"/>
-          <w:color w:val="0073E6"/>
-          <w:sz w:val="16"/>
-        </w:rPr>
-        <w:t xml:space="preserve">--stop-on-failure</w:t>
-      </w:r>
-      <w:r>
-        <w:br/>
-      </w:r>
-      <w:r>
-        <w:rPr>
-          <w:rFonts w:ascii="Consolas" w:hAnsi="Consolas"/>
-          <w:color w:val="262626"/>
-          <w:sz w:val="16"/>
-        </w:rPr>
-        <w:t xml:space="preserve">./vendor/bin/pint </w:t>
-      </w:r>
-      <w:r>
-        <w:rPr>
-          <w:rFonts w:ascii="Consolas" w:hAnsi="Consolas"/>
-          <w:color w:val="0073E6"/>
-          <w:sz w:val="16"/>
-        </w:rPr>
-        <w:t xml:space="preserve">--test</w:t>
-      </w:r>
-      <w:r>
-        <w:br/>
-      </w:r>
-      <w:r>
-        <w:rPr>
-          <w:rFonts w:ascii="Consolas" w:hAnsi="Consolas"/>
-          <w:b/>
-          <w:color w:val="000080"/>
-          <w:sz w:val="16"/>
-        </w:rPr>
-        <w:t xml:space="preserve">npm</w:t>
-      </w:r>
-      <w:r>
-        <w:rPr>
-          <w:rFonts w:ascii="Consolas" w:hAnsi="Consolas"/>
-          <w:color w:val="262626"/>
+          <w:color w:val="D4D4D4"/>
           <w:sz w:val="16"/>
         </w:rPr>
         <w:t xml:space="preserve"> run build</w:t>
@@ -5127,215 +5044,431 @@
     <w:p>
       <w:pPr>
         <w:pStyle w:val="CodeHeader"/>
-        <w:keepNext/>
+        <w:shd w:fill="2D2D30"/>
         <w:pBdr>
-          <w:left w:val="single" w:sz="12" w:space="8" w:color="B8DDE0"/>
+          <w:left w:val="single" w:sz="4" w:space="8" w:color="2D2D30"/>
         </w:pBdr>
-        <w:shd w:val="clear" w:color="auto" w:fill="E4EAED"/>
       </w:pPr>
       <w:r>
-        <w:rPr>
-          <w:rFonts w:ascii="Consolas" w:hAnsi="Consolas"/>
-          <w:b/>
-          <w:color w:val="262626"/>
-          <w:sz w:val="16"/>
-        </w:rPr>
-        <w:t xml:space="preserve">AUDIT KOMPATIBILITAS DEPENDENSI SRS — terminal root proyek   •   BASH</w:t>
+        <w:t>AUDIT KOMPATIBILITAS DEPENDENSI SRS — terminal root proyek   •   BASH</w:t>
       </w:r>
     </w:p>
     <w:p>
       <w:pPr>
         <w:pStyle w:val="CodeBlock"/>
+        <w:shd w:fill="1E1E1E"/>
         <w:keepLines/>
         <w:pBdr>
-          <w:left w:val="single" w:sz="12" w:space="8" w:color="B8DDE0"/>
+          <w:left w:val="single" w:sz="4" w:space="8" w:color="1E1E1E"/>
         </w:pBdr>
-        <w:shd w:val="clear" w:color="auto" w:fill="F2F3F7"/>
       </w:pPr>
       <w:r>
         <w:rPr>
-          <w:rFonts w:ascii="Consolas" w:hAnsi="Consolas"/>
-          <w:b/>
-          <w:color w:val="000080"/>
+          <w:rFonts w:ascii="Consolas" w:hAnsi="Consolas" w:eastAsia="Consolas"/>
+          <w:color w:val="4EC9B0"/>
           <w:sz w:val="16"/>
         </w:rPr>
-        <w:t xml:space="preserve">composer</w:t>
+        <w:t>composer</w:t>
       </w:r>
       <w:r>
         <w:rPr>
-          <w:rFonts w:ascii="Consolas" w:hAnsi="Consolas"/>
-          <w:color w:val="262626"/>
+          <w:rFonts w:ascii="Consolas" w:hAnsi="Consolas" w:eastAsia="Consolas"/>
+          <w:color w:val="D4D4D4"/>
           <w:sz w:val="16"/>
         </w:rPr>
-        <w:t xml:space="preserve"> require chillerlan/php-qrcode intervention/image-laravel </w:t>
+        <w:t xml:space="preserve"> </w:t>
       </w:r>
       <w:r>
         <w:rPr>
-          <w:rFonts w:ascii="Consolas" w:hAnsi="Consolas"/>
-          <w:color w:val="0073E6"/>
+          <w:rFonts w:ascii="Consolas" w:hAnsi="Consolas" w:eastAsia="Consolas"/>
+          <w:color w:val="D4D4D4"/>
           <w:sz w:val="16"/>
         </w:rPr>
-        <w:t xml:space="preserve">--dry-run</w:t>
-      </w:r>
-      <w:r>
-        <w:br/>
+        <w:t>require</w:t>
       </w:r>
       <w:r>
         <w:rPr>
-          <w:rFonts w:ascii="Consolas" w:hAnsi="Consolas"/>
-          <w:b/>
-          <w:color w:val="000080"/>
+          <w:rFonts w:ascii="Consolas" w:hAnsi="Consolas" w:eastAsia="Consolas"/>
+          <w:color w:val="D4D4D4"/>
           <w:sz w:val="16"/>
         </w:rPr>
-        <w:t xml:space="preserve">composer</w:t>
+        <w:t xml:space="preserve"> </w:t>
       </w:r>
       <w:r>
         <w:rPr>
-          <w:rFonts w:ascii="Consolas" w:hAnsi="Consolas"/>
-          <w:color w:val="262626"/>
+          <w:rFonts w:ascii="Consolas" w:hAnsi="Consolas" w:eastAsia="Consolas"/>
+          <w:color w:val="D4D4D4"/>
           <w:sz w:val="16"/>
         </w:rPr>
-        <w:t xml:space="preserve"> require maatwebsite/excel barryvdh/laravel-dompdf </w:t>
+        <w:t>chillerlan/php-qrcode</w:t>
       </w:r>
       <w:r>
         <w:rPr>
-          <w:rFonts w:ascii="Consolas" w:hAnsi="Consolas"/>
-          <w:color w:val="0073E6"/>
+          <w:rFonts w:ascii="Consolas" w:hAnsi="Consolas" w:eastAsia="Consolas"/>
+          <w:color w:val="D4D4D4"/>
           <w:sz w:val="16"/>
         </w:rPr>
-        <w:t xml:space="preserve">--dry-run</w:t>
-      </w:r>
-      <w:r>
-        <w:br/>
+        <w:t xml:space="preserve"> </w:t>
       </w:r>
       <w:r>
         <w:rPr>
-          <w:rFonts w:ascii="Consolas" w:hAnsi="Consolas"/>
-          <w:b/>
-          <w:color w:val="000080"/>
+          <w:rFonts w:ascii="Consolas" w:hAnsi="Consolas" w:eastAsia="Consolas"/>
+          <w:color w:val="D4D4D4"/>
           <w:sz w:val="16"/>
         </w:rPr>
-        <w:t xml:space="preserve">composer</w:t>
+        <w:t>intervention/image-laravel</w:t>
       </w:r>
       <w:r>
         <w:rPr>
-          <w:rFonts w:ascii="Consolas" w:hAnsi="Consolas"/>
-          <w:color w:val="262626"/>
+          <w:rFonts w:ascii="Consolas" w:hAnsi="Consolas" w:eastAsia="Consolas"/>
+          <w:color w:val="D4D4D4"/>
           <w:sz w:val="16"/>
         </w:rPr>
-        <w:t xml:space="preserve"> require laravel-notification-channels/webpush </w:t>
+        <w:t xml:space="preserve"> </w:t>
       </w:r>
       <w:r>
         <w:rPr>
-          <w:rFonts w:ascii="Consolas" w:hAnsi="Consolas"/>
-          <w:color w:val="0073E6"/>
+          <w:rFonts w:ascii="Consolas" w:hAnsi="Consolas" w:eastAsia="Consolas"/>
+          <w:color w:val="9CDCFE"/>
           <w:sz w:val="16"/>
         </w:rPr>
-        <w:t xml:space="preserve">--dry-run</w:t>
-      </w:r>
-      <w:r>
-        <w:br/>
+        <w:t>--dry-run</w:t>
       </w:r>
       <w:r>
         <w:rPr>
-          <w:rFonts w:ascii="Consolas" w:hAnsi="Consolas"/>
-          <w:b/>
-          <w:color w:val="000080"/>
+          <w:rFonts w:ascii="Consolas" w:hAnsi="Consolas" w:eastAsia="Consolas"/>
+          <w:color w:val="D4D4D4"/>
           <w:sz w:val="16"/>
         </w:rPr>
-        <w:t xml:space="preserve">npm</w:t>
+        <w:br/>
       </w:r>
       <w:r>
         <w:rPr>
-          <w:rFonts w:ascii="Consolas" w:hAnsi="Consolas"/>
-          <w:color w:val="262626"/>
+          <w:rFonts w:ascii="Consolas" w:hAnsi="Consolas" w:eastAsia="Consolas"/>
+          <w:color w:val="4EC9B0"/>
           <w:sz w:val="16"/>
         </w:rPr>
-        <w:t xml:space="preserve"> install </w:t>
+        <w:t>composer</w:t>
       </w:r>
       <w:r>
         <w:rPr>
-          <w:rFonts w:ascii="Consolas" w:hAnsi="Consolas"/>
-          <w:color w:val="0073E6"/>
+          <w:rFonts w:ascii="Consolas" w:hAnsi="Consolas" w:eastAsia="Consolas"/>
+          <w:color w:val="D4D4D4"/>
           <w:sz w:val="16"/>
         </w:rPr>
-        <w:t xml:space="preserve">--dry-run</w:t>
+        <w:t xml:space="preserve"> </w:t>
       </w:r>
       <w:r>
         <w:rPr>
-          <w:rFonts w:ascii="Consolas" w:hAnsi="Consolas"/>
-          <w:color w:val="262626"/>
+          <w:rFonts w:ascii="Consolas" w:hAnsi="Consolas" w:eastAsia="Consolas"/>
+          <w:color w:val="D4D4D4"/>
           <w:sz w:val="16"/>
         </w:rPr>
-        <w:t xml:space="preserve"> laravel-echo pusher-js</w:t>
-      </w:r>
-      <w:r>
-        <w:br/>
+        <w:t>require</w:t>
       </w:r>
       <w:r>
         <w:rPr>
-          <w:rFonts w:ascii="Consolas" w:hAnsi="Consolas"/>
-          <w:b/>
-          <w:color w:val="000080"/>
+          <w:rFonts w:ascii="Consolas" w:hAnsi="Consolas" w:eastAsia="Consolas"/>
+          <w:color w:val="D4D4D4"/>
           <w:sz w:val="16"/>
         </w:rPr>
-        <w:t xml:space="preserve">composer</w:t>
+        <w:t xml:space="preserve"> </w:t>
       </w:r>
       <w:r>
         <w:rPr>
-          <w:rFonts w:ascii="Consolas" w:hAnsi="Consolas"/>
-          <w:color w:val="262626"/>
+          <w:rFonts w:ascii="Consolas" w:hAnsi="Consolas" w:eastAsia="Consolas"/>
+          <w:color w:val="D4D4D4"/>
           <w:sz w:val="16"/>
         </w:rPr>
-        <w:t xml:space="preserve"> validate </w:t>
+        <w:t>maatwebsite/excel</w:t>
       </w:r>
       <w:r>
         <w:rPr>
-          <w:rFonts w:ascii="Consolas" w:hAnsi="Consolas"/>
-          <w:color w:val="0073E6"/>
+          <w:rFonts w:ascii="Consolas" w:hAnsi="Consolas" w:eastAsia="Consolas"/>
+          <w:color w:val="D4D4D4"/>
           <w:sz w:val="16"/>
         </w:rPr>
-        <w:t xml:space="preserve">--strict</w:t>
-      </w:r>
-      <w:r>
-        <w:br/>
+        <w:t xml:space="preserve"> </w:t>
       </w:r>
       <w:r>
         <w:rPr>
-          <w:rFonts w:ascii="Consolas" w:hAnsi="Consolas"/>
-          <w:b/>
-          <w:color w:val="000080"/>
+          <w:rFonts w:ascii="Consolas" w:hAnsi="Consolas" w:eastAsia="Consolas"/>
+          <w:color w:val="D4D4D4"/>
           <w:sz w:val="16"/>
         </w:rPr>
-        <w:t xml:space="preserve">composer</w:t>
+        <w:t>barryvdh/laravel-dompdf</w:t>
       </w:r>
       <w:r>
         <w:rPr>
-          <w:rFonts w:ascii="Consolas" w:hAnsi="Consolas"/>
-          <w:color w:val="262626"/>
+          <w:rFonts w:ascii="Consolas" w:hAnsi="Consolas" w:eastAsia="Consolas"/>
+          <w:color w:val="D4D4D4"/>
           <w:sz w:val="16"/>
         </w:rPr>
-        <w:t xml:space="preserve"> audit</w:t>
-      </w:r>
-      <w:r>
-        <w:br/>
+        <w:t xml:space="preserve"> </w:t>
       </w:r>
       <w:r>
         <w:rPr>
-          <w:rFonts w:ascii="Consolas" w:hAnsi="Consolas"/>
-          <w:b/>
-          <w:color w:val="000080"/>
+          <w:rFonts w:ascii="Consolas" w:hAnsi="Consolas" w:eastAsia="Consolas"/>
+          <w:color w:val="9CDCFE"/>
           <w:sz w:val="16"/>
         </w:rPr>
-        <w:t xml:space="preserve">npm</w:t>
+        <w:t>--dry-run</w:t>
       </w:r>
       <w:r>
         <w:rPr>
-          <w:rFonts w:ascii="Consolas" w:hAnsi="Consolas"/>
-          <w:color w:val="262626"/>
+          <w:rFonts w:ascii="Consolas" w:hAnsi="Consolas" w:eastAsia="Consolas"/>
+          <w:color w:val="D4D4D4"/>
           <w:sz w:val="16"/>
         </w:rPr>
-        <w:t xml:space="preserve"> audit</w:t>
+        <w:br/>
+      </w:r>
+      <w:r>
+        <w:rPr>
+          <w:rFonts w:ascii="Consolas" w:hAnsi="Consolas" w:eastAsia="Consolas"/>
+          <w:color w:val="4EC9B0"/>
+          <w:sz w:val="16"/>
+        </w:rPr>
+        <w:t>composer</w:t>
+      </w:r>
+      <w:r>
+        <w:rPr>
+          <w:rFonts w:ascii="Consolas" w:hAnsi="Consolas" w:eastAsia="Consolas"/>
+          <w:color w:val="D4D4D4"/>
+          <w:sz w:val="16"/>
+        </w:rPr>
+        <w:t xml:space="preserve"> </w:t>
+      </w:r>
+      <w:r>
+        <w:rPr>
+          <w:rFonts w:ascii="Consolas" w:hAnsi="Consolas" w:eastAsia="Consolas"/>
+          <w:color w:val="D4D4D4"/>
+          <w:sz w:val="16"/>
+        </w:rPr>
+        <w:t>require</w:t>
+      </w:r>
+      <w:r>
+        <w:rPr>
+          <w:rFonts w:ascii="Consolas" w:hAnsi="Consolas" w:eastAsia="Consolas"/>
+          <w:color w:val="D4D4D4"/>
+          <w:sz w:val="16"/>
+        </w:rPr>
+        <w:t xml:space="preserve"> </w:t>
+      </w:r>
+      <w:r>
+        <w:rPr>
+          <w:rFonts w:ascii="Consolas" w:hAnsi="Consolas" w:eastAsia="Consolas"/>
+          <w:color w:val="D4D4D4"/>
+          <w:sz w:val="16"/>
+        </w:rPr>
+        <w:t>laravel-notification-channels/webpush</w:t>
+      </w:r>
+      <w:r>
+        <w:rPr>
+          <w:rFonts w:ascii="Consolas" w:hAnsi="Consolas" w:eastAsia="Consolas"/>
+          <w:color w:val="D4D4D4"/>
+          <w:sz w:val="16"/>
+        </w:rPr>
+        <w:t xml:space="preserve"> </w:t>
+      </w:r>
+      <w:r>
+        <w:rPr>
+          <w:rFonts w:ascii="Consolas" w:hAnsi="Consolas" w:eastAsia="Consolas"/>
+          <w:color w:val="9CDCFE"/>
+          <w:sz w:val="16"/>
+        </w:rPr>
+        <w:t>--dry-run</w:t>
+      </w:r>
+      <w:r>
+        <w:rPr>
+          <w:rFonts w:ascii="Consolas" w:hAnsi="Consolas" w:eastAsia="Consolas"/>
+          <w:color w:val="D4D4D4"/>
+          <w:sz w:val="16"/>
+        </w:rPr>
+        <w:br/>
+      </w:r>
+      <w:r>
+        <w:rPr>
+          <w:rFonts w:ascii="Consolas" w:hAnsi="Consolas" w:eastAsia="Consolas"/>
+          <w:color w:val="4EC9B0"/>
+          <w:sz w:val="16"/>
+        </w:rPr>
+        <w:t>npm</w:t>
+      </w:r>
+      <w:r>
+        <w:rPr>
+          <w:rFonts w:ascii="Consolas" w:hAnsi="Consolas" w:eastAsia="Consolas"/>
+          <w:color w:val="D4D4D4"/>
+          <w:sz w:val="16"/>
+        </w:rPr>
+        <w:t xml:space="preserve"> </w:t>
+      </w:r>
+      <w:r>
+        <w:rPr>
+          <w:rFonts w:ascii="Consolas" w:hAnsi="Consolas" w:eastAsia="Consolas"/>
+          <w:color w:val="D4D4D4"/>
+          <w:sz w:val="16"/>
+        </w:rPr>
+        <w:t>install</w:t>
+      </w:r>
+      <w:r>
+        <w:rPr>
+          <w:rFonts w:ascii="Consolas" w:hAnsi="Consolas" w:eastAsia="Consolas"/>
+          <w:color w:val="D4D4D4"/>
+          <w:sz w:val="16"/>
+        </w:rPr>
+        <w:t xml:space="preserve"> </w:t>
+      </w:r>
+      <w:r>
+        <w:rPr>
+          <w:rFonts w:ascii="Consolas" w:hAnsi="Consolas" w:eastAsia="Consolas"/>
+          <w:color w:val="9CDCFE"/>
+          <w:sz w:val="16"/>
+        </w:rPr>
+        <w:t>--dry-run</w:t>
+      </w:r>
+      <w:r>
+        <w:rPr>
+          <w:rFonts w:ascii="Consolas" w:hAnsi="Consolas" w:eastAsia="Consolas"/>
+          <w:color w:val="D4D4D4"/>
+          <w:sz w:val="16"/>
+        </w:rPr>
+        <w:t xml:space="preserve"> </w:t>
+      </w:r>
+      <w:r>
+        <w:rPr>
+          <w:rFonts w:ascii="Consolas" w:hAnsi="Consolas" w:eastAsia="Consolas"/>
+          <w:color w:val="D4D4D4"/>
+          <w:sz w:val="16"/>
+        </w:rPr>
+        <w:t>laravel-echo</w:t>
+      </w:r>
+      <w:r>
+        <w:rPr>
+          <w:rFonts w:ascii="Consolas" w:hAnsi="Consolas" w:eastAsia="Consolas"/>
+          <w:color w:val="D4D4D4"/>
+          <w:sz w:val="16"/>
+        </w:rPr>
+        <w:t xml:space="preserve"> </w:t>
+      </w:r>
+      <w:r>
+        <w:rPr>
+          <w:rFonts w:ascii="Consolas" w:hAnsi="Consolas" w:eastAsia="Consolas"/>
+          <w:color w:val="D4D4D4"/>
+          <w:sz w:val="16"/>
+        </w:rPr>
+        <w:t>pusher-js</w:t>
+      </w:r>
+      <w:r>
+        <w:rPr>
+          <w:rFonts w:ascii="Consolas" w:hAnsi="Consolas" w:eastAsia="Consolas"/>
+          <w:color w:val="D4D4D4"/>
+          <w:sz w:val="16"/>
+        </w:rPr>
+        <w:br/>
+      </w:r>
+      <w:r>
+        <w:rPr>
+          <w:rFonts w:ascii="Consolas" w:hAnsi="Consolas" w:eastAsia="Consolas"/>
+          <w:color w:val="4EC9B0"/>
+          <w:sz w:val="16"/>
+        </w:rPr>
+        <w:t>composer</w:t>
+      </w:r>
+      <w:r>
+        <w:rPr>
+          <w:rFonts w:ascii="Consolas" w:hAnsi="Consolas" w:eastAsia="Consolas"/>
+          <w:color w:val="D4D4D4"/>
+          <w:sz w:val="16"/>
+        </w:rPr>
+        <w:t xml:space="preserve"> </w:t>
+      </w:r>
+      <w:r>
+        <w:rPr>
+          <w:rFonts w:ascii="Consolas" w:hAnsi="Consolas" w:eastAsia="Consolas"/>
+          <w:color w:val="D4D4D4"/>
+          <w:sz w:val="16"/>
+        </w:rPr>
+        <w:t>validate</w:t>
+      </w:r>
+      <w:r>
+        <w:rPr>
+          <w:rFonts w:ascii="Consolas" w:hAnsi="Consolas" w:eastAsia="Consolas"/>
+          <w:color w:val="D4D4D4"/>
+          <w:sz w:val="16"/>
+        </w:rPr>
+        <w:t xml:space="preserve"> </w:t>
+      </w:r>
+      <w:r>
+        <w:rPr>
+          <w:rFonts w:ascii="Consolas" w:hAnsi="Consolas" w:eastAsia="Consolas"/>
+          <w:color w:val="9CDCFE"/>
+          <w:sz w:val="16"/>
+        </w:rPr>
+        <w:t>--strict</w:t>
+      </w:r>
+      <w:r>
+        <w:rPr>
+          <w:rFonts w:ascii="Consolas" w:hAnsi="Consolas" w:eastAsia="Consolas"/>
+          <w:color w:val="D4D4D4"/>
+          <w:sz w:val="16"/>
+        </w:rPr>
+        <w:br/>
+      </w:r>
+      <w:r>
+        <w:rPr>
+          <w:rFonts w:ascii="Consolas" w:hAnsi="Consolas" w:eastAsia="Consolas"/>
+          <w:color w:val="4EC9B0"/>
+          <w:sz w:val="16"/>
+        </w:rPr>
+        <w:t>composer</w:t>
+      </w:r>
+      <w:r>
+        <w:rPr>
+          <w:rFonts w:ascii="Consolas" w:hAnsi="Consolas" w:eastAsia="Consolas"/>
+          <w:color w:val="D4D4D4"/>
+          <w:sz w:val="16"/>
+        </w:rPr>
+        <w:t xml:space="preserve"> </w:t>
+      </w:r>
+      <w:r>
+        <w:rPr>
+          <w:rFonts w:ascii="Consolas" w:hAnsi="Consolas" w:eastAsia="Consolas"/>
+          <w:color w:val="D4D4D4"/>
+          <w:sz w:val="16"/>
+        </w:rPr>
+        <w:t>audit</w:t>
+      </w:r>
+      <w:r>
+        <w:rPr>
+          <w:rFonts w:ascii="Consolas" w:hAnsi="Consolas" w:eastAsia="Consolas"/>
+          <w:color w:val="D4D4D4"/>
+          <w:sz w:val="16"/>
+        </w:rPr>
+        <w:br/>
+      </w:r>
+      <w:r>
+        <w:rPr>
+          <w:rFonts w:ascii="Consolas" w:hAnsi="Consolas" w:eastAsia="Consolas"/>
+          <w:color w:val="4EC9B0"/>
+          <w:sz w:val="16"/>
+        </w:rPr>
+        <w:t>npm</w:t>
+      </w:r>
+      <w:r>
+        <w:rPr>
+          <w:rFonts w:ascii="Consolas" w:hAnsi="Consolas" w:eastAsia="Consolas"/>
+          <w:color w:val="D4D4D4"/>
+          <w:sz w:val="16"/>
+        </w:rPr>
+        <w:t xml:space="preserve"> </w:t>
+      </w:r>
+      <w:r>
+        <w:rPr>
+          <w:rFonts w:ascii="Consolas" w:hAnsi="Consolas" w:eastAsia="Consolas"/>
+          <w:color w:val="D4D4D4"/>
+          <w:sz w:val="16"/>
+        </w:rPr>
+        <w:t>audit</w:t>
       </w:r>
     </w:p>
     <w:p>
@@ -7776,10 +7909,8 @@
       <w:r>
         <w:rPr>
           <w:rFonts w:ascii="Aptos" w:hAnsi="Aptos"/>
-          <w:color w:val="1F2937"/>
-          <w:sz w:val="19"/>
         </w:rPr>
-        <w:t xml:space="preserve">Preset dasar yang digunakan adalah compact_reference_guide dengan named override untuk modul pembelajaran: A4 portrait; margin atas 1,65 cm, bawah 1,55 cm, kiri/kanan 1,75 cm; Aptos 10,2 pt; line spacing 1,16; heading beraksen Laravel red; tabel ringkas; callout Predict/Try/Observe; code block Consolas berlatar Cyan Light dengan pewarnaan token Visual Studio Code; checklist; exit ticket; serta screenshot mockup UI.</w:t>
+        <w:t>Preset dasar yang digunakan adalah compact_reference_guide dengan named override untuk modul pembelajaran: A4 portrait; margin atas 1,65 cm, bawah 1,55 cm, kiri/kanan 1,75 cm; Aptos 10,2 pt; line spacing 1,16; heading beraksen Laravel red; tabel ringkas; callout Predict/Try/Observe; code block Consolas bertema Visual Studio Code Dark+; checklist; exit ticket; serta screenshot mockup UI.</w:t>
       </w:r>
     </w:p>
     <w:p>
@@ -8360,19 +8491,6 @@
         <w:pStyle w:val="ListBody"/>
       </w:pPr>
       <w:r>
-        <w:rPr>
-          <w:rFonts w:ascii="Aptos" w:hAnsi="Aptos"/>
-          <w:color w:val="1F2937"/>
-          <w:sz w:val="19"/>
-        </w:rPr>
-        <w:t xml:space="preserve">DOC-00-001 — Seluruh blok kode (208 blok, 133 label) memakai latar terang tema Cyan Light (JetBrains) dengan pewarnaan token standar Visual Studio Code untuk PHP, HTML/Blade, cmd, dan bash; teks kode tidak berubah; penjelasan palet di “Cara Membaca Sampel Kode” dan Lampiran diperbarui.</w:t>
-      </w:r>
-    </w:p>
-    <w:p>
-      <w:pPr>
-        <w:pStyle w:val="ListBody"/>
-      </w:pPr>
-      <w:r>
         <w:t xml:space="preserve">DOC-01-001 — Basis dokumen: parameter menyebut v4/v5 yang tidak ada; basis nyata adalah v7. Revisi kumulatif ditulis ke berkas v8; v7 tetap utuh di references/.</w:t>
       </w:r>
     </w:p>
@@ -8751,19 +8869,6 @@
           <w:color w:val="1F2937"/>
           <w:sz w:val="19"/>
         </w:rPr>
-        <w:t xml:space="preserve">DOC-05-007 — Rantai v3 (use case SRS v2): Modul 5 menuntaskan UC-19 (penguncian 5x/10 menit, pesan generik, redirect per peran, sesi 8 jam) dan UC-21 (onboarding penanggung jawab + rekening + tautan atur kata sandi, aktif/nonaktif tenant, riwayat komisi beserta pengelola); ditambahkan deskripsi use case, mockup, Tahap 8, dan output nyata browser.</w:t>
-      </w:r>
-    </w:p>
-    <w:p>
-      <w:pPr>
-        <w:pStyle w:val="ListBody"/>
-      </w:pPr>
-      <w:r>
-        <w:rPr>
-          <w:rFonts w:ascii="Aptos" w:hAnsi="Aptos"/>
-          <w:color w:val="1F2937"/>
-          <w:sz w:val="19"/>
-        </w:rPr>
         <w:t xml:space="preserve">DOC-06-004 — Controller/view/route meja di modul Admin; controller + route publik scan QR di modul Ordering (</w:t>
       </w:r>
       <w:r>
@@ -8841,19 +8946,6 @@
           <w:color w:val="1F2937"/>
           <w:sz w:val="19"/>
         </w:rPr>
-        <w:t xml:space="preserve">DOC-06-006 — Rantai v3 (use case SRS v2): Modul 6 menuntaskan UC-22 (QR siap cetak SVG via bacon/bacon-qr-code, nonaktif/aktif meja, ringkasan meja) dan UC-02 (halaman sambutan meja + tenant buka/tutup, pesan QR tidak valid, penolakan di luar jam operasional); ditambahkan deskripsi use case, mockup, Tahap 8, dan output nyata browser.</w:t>
-      </w:r>
-    </w:p>
-    <w:p>
-      <w:pPr>
-        <w:pStyle w:val="ListBody"/>
-      </w:pPr>
-      <w:r>
-        <w:rPr>
-          <w:rFonts w:ascii="Aptos" w:hAnsi="Aptos"/>
-          <w:color w:val="1F2937"/>
-          <w:sz w:val="19"/>
-        </w:rPr>
         <w:t xml:space="preserve">DOC-07-004 — Komponen Livewire katalog (</w:t>
       </w:r>
       <w:r>
@@ -8948,19 +9040,6 @@
           <w:color w:val="1F2937"/>
           <w:sz w:val="19"/>
         </w:rPr>
-        <w:t xml:space="preserve">DOC-07-006 — Rantai v3 (use case SRS v2): Modul 7 menuntaskan UC-13 (deskripsi, foto WebP, ubah, soft delete, cari/saring), UC-14 (sakelar satu ketukan), UC-01 (kelompok per tenant, menu habis nonaktif, tenant tutup, chip kategori, pembaruan ≤ 5 detik), dan UC-11 (WaitTimeEstimator); ditambahkan deskripsi use case, mockup, Tahap 8, dan output nyata browser.</w:t>
-      </w:r>
-    </w:p>
-    <w:p>
-      <w:pPr>
-        <w:pStyle w:val="ListBody"/>
-      </w:pPr>
-      <w:r>
-        <w:rPr>
-          <w:rFonts w:ascii="Aptos" w:hAnsi="Aptos"/>
-          <w:color w:val="1F2937"/>
-          <w:sz w:val="19"/>
-        </w:rPr>
         <w:t xml:space="preserve">DOC-08-004 — Keranjang sebagai vertical slice modul Ordering: </w:t>
       </w:r>
       <w:r>
@@ -9072,19 +9151,6 @@
           <w:color w:val="1F2937"/>
           <w:sz w:val="19"/>
         </w:rPr>
-        <w:t xml:space="preserve">DOC-08-006 — Rantai v3 (use case SRS v2): Modul 8 menuntaskan UC-03 (kelompok per tenant, pajak dan biaya layanan, “Menu telah habis”, checkout nonaktif saat kosong) dan UC-04 (formulir kustomisasi min/maks, opsi habis nonaktif, catatan ≤ 200 karakter tersaring, harga akhir) serta halaman tenant Kelola Modifier; ditambahkan deskripsi use case, mockup, Tahap 8, dan output nyata browser.</w:t>
-      </w:r>
-    </w:p>
-    <w:p>
-      <w:pPr>
-        <w:pStyle w:val="ListBody"/>
-      </w:pPr>
-      <w:r>
-        <w:rPr>
-          <w:rFonts w:ascii="Aptos" w:hAnsi="Aptos"/>
-          <w:color w:val="1F2937"/>
-          <w:sz w:val="19"/>
-        </w:rPr>
         <w:t xml:space="preserve">DOC-09-004 — Checkout dan status pesanan sebagai vertical slice modul Ordering (</w:t>
       </w:r>
       <w:r>
@@ -9196,19 +9262,6 @@
           <w:color w:val="1F2937"/>
           <w:sz w:val="19"/>
         </w:rPr>
-        <w:t xml:space="preserve">DOC-09-006 — Rantai v3 (use case SRS v2): Modul 9 menuntaskan UC-05 (halaman checkout: ringkasan, nomor meja, mode penyajian, identitas ringkas, tenant wajib buka, kembali ke keranjang bila item bermasalah, catatan item tersimpan) dan UC-06 (slot pre-order 15 menit, jam operasional, kapasitas slot + slot terdekat, status terjadwal, pelepasan otomatis ke dapur tiap menit) serta halaman tenant Pengaturan Pre-Order; ditambahkan deskripsi use case, mockup, Tahap 8, dan output nyata browser.</w:t>
-      </w:r>
-    </w:p>
-    <w:p>
-      <w:pPr>
-        <w:pStyle w:val="ListBody"/>
-      </w:pPr>
-      <w:r>
-        <w:rPr>
-          <w:rFonts w:ascii="Aptos" w:hAnsi="Aptos"/>
-          <w:color w:val="1F2937"/>
-          <w:sz w:val="19"/>
-        </w:rPr>
         <w:t xml:space="preserve">DOC-10-004 — Pembayaran sebagai vertical slice modul Payments: kontrak </w:t>
       </w:r>
       <w:r>
@@ -9337,19 +9390,6 @@
           <w:color w:val="1F2937"/>
           <w:sz w:val="19"/>
         </w:rPr>
-        <w:t xml:space="preserve">DOC-10-006 — Rantai v3 (use case SRS v2): Modul 10 menuntaskan UC-07 (QRIS otomatis setelah checkout, gambar QRIS + penghitung mundur ≤ 15 menit, rincian split per tenant, percobaan ulang 3 kali saat gateway tidak merespons, QRIS baru saat kedaluwarsa, pemantauan status, batalkan pesanan yang belum dibayar); ditambahkan deskripsi use case, mockup, Tahap 8, dan output nyata browser.</w:t>
-      </w:r>
-    </w:p>
-    <w:p>
-      <w:pPr>
-        <w:pStyle w:val="ListBody"/>
-      </w:pPr>
-      <w:r>
-        <w:rPr>
-          <w:rFonts w:ascii="Aptos" w:hAnsi="Aptos"/>
-          <w:color w:val="1F2937"/>
-          <w:sz w:val="19"/>
-        </w:rPr>
         <w:t xml:space="preserve">DOC-11-004 — Webhook sebagai vertical slice modul Payments: </w:t>
       </w:r>
       <w:r>
@@ -9474,19 +9514,6 @@
           <w:color w:val="1F2937"/>
           <w:sz w:val="19"/>
         </w:rPr>
-        <w:t xml:space="preserve">DOC-11-008 — Rantai v3 (use case SRS v2): Modul 11 menuntaskan UC-08 (nominal dicocokkan + tinjau manual, audit signature salah, penguncian baris, expire/deny membatalkan pesanan, event setelah commit, layar Pembayaran terverifikasi) dan UC-10 (ledger pengelola kantin, rincian pemecahan selisih 0, alokasi pembulatan, proses ulang settlement gagal); ditambahkan deskripsi use case, mockup, Tahap 8, dan output nyata.</w:t>
-      </w:r>
-    </w:p>
-    <w:p>
-      <w:pPr>
-        <w:pStyle w:val="ListBody"/>
-      </w:pPr>
-      <w:r>
-        <w:rPr>
-          <w:rFonts w:ascii="Aptos" w:hAnsi="Aptos"/>
-          <w:color w:val="1F2937"/>
-          <w:sz w:val="19"/>
-        </w:rPr>
         <w:t xml:space="preserve">DOC-12-004 — KDS sebagai vertical slice modul Kitchen: event (</w:t>
       </w:r>
       <w:r>
@@ -9683,19 +9710,6 @@
           <w:color w:val="1F2937"/>
           <w:sz w:val="19"/>
         </w:rPr>
-        <w:t xml:space="preserve">DOC-12-006 — Rantai v3 (use case SRS v2): Modul 12 menuntaskan UC-15 (KDS kolom Baru/Diproses/Siap, Terima → Selesai → Diserahkan, batal beralasan + refund pending, penanda suara, indikator koneksi + polling 10 detik), UC-09 (halaman pelacakan real-time lewat channel privat order.{public_id}, estimasi UC-11, polling 15 detik), dan UC-12 (NotificationGateway + FakeWhatsAppGateway, job antrean 3 percobaan, notification_deliveries, pengingat pre-order); ditambahkan deskripsi use case, mockup, Tahap 8, dan output nyata.</w:t>
-      </w:r>
-    </w:p>
-    <w:p>
-      <w:pPr>
-        <w:pStyle w:val="ListBody"/>
-      </w:pPr>
-      <w:r>
-        <w:rPr>
-          <w:rFonts w:ascii="Aptos" w:hAnsi="Aptos"/>
-          <w:color w:val="1F2937"/>
-          <w:sz w:val="19"/>
-        </w:rPr>
         <w:t xml:space="preserve">DOC-13-004 — Laporan/rekonsiliasi/ekspor dan panel keuangan tenant sebagai vertical slice modul Reporting; penarikan + peninjauan admin di modul Payments; path Contoh Mandiri, Landasan Teknis (termasuk </w:t>
       </w:r>
       <w:r>
@@ -9739,7 +9753,88 @@
           <w:color w:val="1F2937"/>
           <w:sz w:val="19"/>
         </w:rPr>
-        <w:t xml:space="preserve">DOC-13-006 — Rantai v3 (use case SRS v2): Modul 13 menuntaskan UC-16 (laporan omset/transaksi/rata-rata, menu terlaris, jam sibuk, rentang tanggal, keadaan kosong), UC-17 (ekspor .xlsx via ZipArchive dan PDF via dompdf lewat antrean, tautan bertanda tangan 24 jam, surel untuk volume besar), UC-18 (rekonsiliasi per transaksi + referensi pembayaran, telusur pesanan, perlu peninjauan tidak dihitung), UC-20 (penarikan dengan kunci saldo, minimum, satu pengajuan aktif, notifikasi pengelola), dan UC-23 (verifikasi dengan bukti transfer, alasan penolakan, investigasi ledger, idempoten); ditambahkan deskripsi use case, mockup, Tahap 8, dan output nyata.</w:t>
+        <w:t xml:space="preserve">DOC-14-004 — Hardening pada rantai vertical slice: </w:t>
+      </w:r>
+      <w:r>
+        <w:rPr>
+          <w:rFonts w:ascii="Consolas" w:hAnsi="Consolas"/>
+          <w:color w:val="C11B12"/>
+          <w:sz w:val="17"/>
+          <w:shd w:fill="ECEFF3"/>
+        </w:rPr>
+        <w:t xml:space="preserve">SecurityHeaders</w:t>
+      </w:r>
+      <w:r>
+        <w:rPr>
+          <w:rFonts w:ascii="Aptos" w:hAnsi="Aptos"/>
+          <w:color w:val="1F2937"/>
+          <w:sz w:val="19"/>
+        </w:rPr>
+        <w:t xml:space="preserve"> global (shared kernel), limiter </w:t>
+      </w:r>
+      <w:r>
+        <w:rPr>
+          <w:rFonts w:ascii="Consolas" w:hAnsi="Consolas"/>
+          <w:color w:val="C11B12"/>
+          <w:sz w:val="17"/>
+          <w:shd w:fill="ECEFF3"/>
+        </w:rPr>
+        <w:t xml:space="preserve">qris-webhook</w:t>
+      </w:r>
+      <w:r>
+        <w:rPr>
+          <w:rFonts w:ascii="Aptos" w:hAnsi="Aptos"/>
+          <w:color w:val="1F2937"/>
+          <w:sz w:val="19"/>
+        </w:rPr>
+        <w:t xml:space="preserve"> milik </w:t>
+      </w:r>
+      <w:r>
+        <w:rPr>
+          <w:rFonts w:ascii="Consolas" w:hAnsi="Consolas"/>
+          <w:color w:val="C11B12"/>
+          <w:sz w:val="17"/>
+          <w:shd w:fill="ECEFF3"/>
+        </w:rPr>
+        <w:t xml:space="preserve">PaymentsServiceProvider</w:t>
+      </w:r>
+      <w:r>
+        <w:rPr>
+          <w:rFonts w:ascii="Aptos" w:hAnsi="Aptos"/>
+          <w:color w:val="1F2937"/>
+          <w:sz w:val="19"/>
+        </w:rPr>
+        <w:t xml:space="preserve">; </w:t>
+      </w:r>
+      <w:r>
+        <w:rPr>
+          <w:rFonts w:ascii="Consolas" w:hAnsi="Consolas"/>
+          <w:color w:val="C11B12"/>
+          <w:sz w:val="17"/>
+          <w:shd w:fill="ECEFF3"/>
+        </w:rPr>
+        <w:t xml:space="preserve">route:cache</w:t>
+      </w:r>
+      <w:r>
+        <w:rPr>
+          <w:rFonts w:ascii="Aptos" w:hAnsi="Aptos"/>
+          <w:color w:val="1F2937"/>
+          <w:sz w:val="19"/>
+        </w:rPr>
+        <w:t xml:space="preserve"> diverifikasi memuat route semua modul dan channel via provider; gambar capstone diganti output nyata v2 (163 test); daftar berkas diselaraskan; blok Output Nyata v1 yang tersisip di judul Lampiran A dipindah ke badan Modul 14.</w:t>
+      </w:r>
+    </w:p>
+    <w:p>
+      <w:pPr>
+        <w:pStyle w:val="ListBody"/>
+      </w:pPr>
+      <w:r>
+        <w:rPr>
+          <w:rFonts w:ascii="Aptos" w:hAnsi="Aptos"/>
+          <w:color w:val="1F2937"/>
+          <w:sz w:val="19"/>
+        </w:rPr>
+        <w:t xml:space="preserve">DOC-14-005 — Blok BUAT FILE per tahap Modul 14: make:middleware SecurityHeaders (shared kernel, global), make:test SecurityHeadersTest &amp; EndToEndJourneyTest, dokumen DEPLOYMENT/DEMO dan evidence manual.</w:t>
       </w:r>
     </w:p>
     <w:sectPr>
@@ -22002,7 +22097,7 @@
     </w:pPr>
     <w:rPr>
       <w:rFonts w:ascii="Consolas" w:hAnsi="Consolas"/>
-      <w:color w:val="262626"/>
+      <w:color w:val="D4D4D4"/>
       <w:sz w:val="16"/>
     </w:rPr>
   </w:style>
@@ -22114,7 +22209,7 @@
     <w:rPr>
       <w:rFonts w:ascii="Consolas" w:hAnsi="Consolas"/>
       <w:b/>
-      <w:color w:val="262626"/>
+      <w:color w:val="FFFFFF"/>
       <w:sz w:val="16"/>
     </w:rPr>
   </w:style>

</xml_diff>

<commit_message>
docs(v8): Modul 5 — use case UC-19 & UC-21 (deskripsi SRS, mockup, Tahap 8, output browser)
- Bagian "Use Case SRS yang Dituntaskan": tabel UC-19/UC-21 + mockup #uc-19/#uc-21
- Tahap 8 dengan blok BUAT FILE (INFO nyata) dan daftar perubahan baris kode
- Output nyata dari browser: akun terkunci, daftar tenant, riwayat komisi
- DOC-05-007; RTM dimulai (UC-19, UC-21 PASS); modul_praktikum dibuat ulang

Co-Authored-By: Claude Opus 5.5 <noreply@anthropic.com>
</commit_message>
<xml_diff>
--- a/modul_praktikum/Lampiran.docx
+++ b/modul_praktikum/Lampiran.docx
@@ -8859,6 +8859,19 @@
         <w:t xml:space="preserve"> menjadi satu-satunya definisi skema berlaku; diuji CommissionScheduleBoundaryTest.</w:t>
       </w:r>
     </w:p>
+    <w:p>
+      <w:pPr>
+        <w:pStyle w:val="ListBody"/>
+      </w:pPr>
+      <w:r>
+        <w:rPr>
+          <w:rFonts w:ascii="Aptos" w:hAnsi="Aptos"/>
+          <w:color w:val="1F2937"/>
+          <w:sz w:val="19"/>
+        </w:rPr>
+        <w:t xml:space="preserve">DOC-05-007 — Rantai v3 (use case SRS v2): Modul 5 menuntaskan UC-19 (penguncian 5x/10 menit, pesan generik, redirect per peran, sesi 8 jam) dan UC-21 (onboarding penanggung jawab + rekening + tautan atur kata sandi, aktif/nonaktif tenant, riwayat komisi beserta pengelola); ditambahkan deskripsi use case, mockup, Tahap 8, dan output nyata browser.</w:t>
+      </w:r>
+    </w:p>
     <w:sectPr>
       <w:headerReference w:type="default" r:id="rId9"/>
       <w:footerReference w:type="default" r:id="rId10"/>

</xml_diff>

<commit_message>
docs(v8): blok kode bertema Cyan Light dengan pewarnaan token standar VS Code
- 208 blok kode + 133 label: latar f2f3f7 / label e4eaed (Cyan Light Theme, cyanScheme.xml)
- token PHP, HTML/Blade, cmd, bash diwarnai per kategori VS Code: keyword/tag 000080 tebal,
  string 00733b, angka/atribut 0073e6, komentar 808080 miring, variable/properti 660e7a,
  fungsi 795e26, tipe 267f99
- teks kode identik karakter-per-karakter; penjelasan palet diperbarui; DOC-00-001

Co-Authored-By: Claude Opus 5.5 <noreply@anthropic.com>
</commit_message>
<xml_diff>
--- a/modul_praktikum/Lampiran.docx
+++ b/modul_praktikum/Lampiran.docx
@@ -3577,92 +3577,175 @@
     <w:p>
       <w:pPr>
         <w:pStyle w:val="CodeBlock"/>
-        <w:shd w:fill="1E1E1E" w:val="clear"/>
         <w:pBdr>
-          <w:left w:val="single" w:sz="4" w:space="8" w:color="1E1E1E"/>
+          <w:left w:val="single" w:sz="12" w:space="8" w:color="B8DDE0"/>
         </w:pBdr>
+        <w:shd w:val="clear" w:color="auto" w:fill="F2F3F7"/>
       </w:pPr>
       <w:r>
         <w:rPr>
           <w:rFonts w:ascii="Consolas" w:hAnsi="Consolas"/>
-          <w:color w:val="4EC9B0"/>
+          <w:b/>
+          <w:color w:val="000080"/>
           <w:sz w:val="16"/>
         </w:rPr>
-        <w:t>php</w:t>
+        <w:t xml:space="preserve">php</w:t>
       </w:r>
       <w:r>
         <w:rPr>
           <w:rFonts w:ascii="Consolas" w:hAnsi="Consolas"/>
-          <w:color w:val="D4D4D4"/>
+          <w:color w:val="262626"/>
           <w:sz w:val="16"/>
         </w:rPr>
-        <w:t xml:space="preserve"> artisan optimize:clear</w:t>
+        <w:t xml:space="preserve"> artisan </w:t>
+      </w:r>
+      <w:r>
+        <w:rPr>
+          <w:rFonts w:ascii="Consolas" w:hAnsi="Consolas"/>
+          <w:color w:val="795E26"/>
+          <w:sz w:val="16"/>
+        </w:rPr>
+        <w:t xml:space="preserve">optimize:clear</w:t>
+      </w:r>
+      <w:r>
         <w:br/>
       </w:r>
       <w:r>
         <w:rPr>
           <w:rFonts w:ascii="Consolas" w:hAnsi="Consolas"/>
-          <w:color w:val="4EC9B0"/>
+          <w:b/>
+          <w:color w:val="000080"/>
           <w:sz w:val="16"/>
         </w:rPr>
-        <w:t>php</w:t>
+        <w:t xml:space="preserve">php</w:t>
       </w:r>
       <w:r>
         <w:rPr>
           <w:rFonts w:ascii="Consolas" w:hAnsi="Consolas"/>
-          <w:color w:val="D4D4D4"/>
+          <w:color w:val="262626"/>
           <w:sz w:val="16"/>
         </w:rPr>
-        <w:t xml:space="preserve"> artisan migrate:fresh --seed --env=testing</w:t>
+        <w:t xml:space="preserve"> artisan </w:t>
+      </w:r>
+      <w:r>
+        <w:rPr>
+          <w:rFonts w:ascii="Consolas" w:hAnsi="Consolas"/>
+          <w:color w:val="795E26"/>
+          <w:sz w:val="16"/>
+        </w:rPr>
+        <w:t xml:space="preserve">migrate:fresh</w:t>
+      </w:r>
+      <w:r>
+        <w:rPr>
+          <w:rFonts w:ascii="Consolas" w:hAnsi="Consolas"/>
+          <w:color w:val="262626"/>
+          <w:sz w:val="16"/>
+        </w:rPr>
+        <w:t xml:space="preserve"> </w:t>
+      </w:r>
+      <w:r>
+        <w:rPr>
+          <w:rFonts w:ascii="Consolas" w:hAnsi="Consolas"/>
+          <w:color w:val="0073E6"/>
+          <w:sz w:val="16"/>
+        </w:rPr>
+        <w:t xml:space="preserve">--seed</w:t>
+      </w:r>
+      <w:r>
+        <w:rPr>
+          <w:rFonts w:ascii="Consolas" w:hAnsi="Consolas"/>
+          <w:color w:val="262626"/>
+          <w:sz w:val="16"/>
+        </w:rPr>
+        <w:t xml:space="preserve"> </w:t>
+      </w:r>
+      <w:r>
+        <w:rPr>
+          <w:rFonts w:ascii="Consolas" w:hAnsi="Consolas"/>
+          <w:color w:val="0073E6"/>
+          <w:sz w:val="16"/>
+        </w:rPr>
+        <w:t xml:space="preserve">--env=testing</w:t>
+      </w:r>
+      <w:r>
         <w:br/>
       </w:r>
       <w:r>
         <w:rPr>
           <w:rFonts w:ascii="Consolas" w:hAnsi="Consolas"/>
-          <w:color w:val="4EC9B0"/>
+          <w:b/>
+          <w:color w:val="000080"/>
           <w:sz w:val="16"/>
         </w:rPr>
-        <w:t>php</w:t>
+        <w:t xml:space="preserve">php</w:t>
       </w:r>
       <w:r>
         <w:rPr>
           <w:rFonts w:ascii="Consolas" w:hAnsi="Consolas"/>
-          <w:color w:val="D4D4D4"/>
+          <w:color w:val="262626"/>
           <w:sz w:val="16"/>
         </w:rPr>
-        <w:t xml:space="preserve"> artisan test --testsuite=</w:t>
+        <w:t xml:space="preserve"> artisan test </w:t>
       </w:r>
       <w:r>
         <w:rPr>
           <w:rFonts w:ascii="Consolas" w:hAnsi="Consolas"/>
-          <w:color w:val="4EC9B0"/>
+          <w:color w:val="0073E6"/>
           <w:sz w:val="16"/>
         </w:rPr>
-        <w:t>Feature</w:t>
+        <w:t xml:space="preserve">--testsuite=Feature</w:t>
       </w:r>
       <w:r>
         <w:rPr>
           <w:rFonts w:ascii="Consolas" w:hAnsi="Consolas"/>
-          <w:color w:val="D4D4D4"/>
+          <w:color w:val="262626"/>
           <w:sz w:val="16"/>
         </w:rPr>
-        <w:t xml:space="preserve"> --stop-on-failure</w:t>
-        <w:br/>
-        <w:t xml:space="preserve">./vendor/bin/pint --test</w:t>
+        <w:t xml:space="preserve"> </w:t>
+      </w:r>
+      <w:r>
+        <w:rPr>
+          <w:rFonts w:ascii="Consolas" w:hAnsi="Consolas"/>
+          <w:color w:val="0073E6"/>
+          <w:sz w:val="16"/>
+        </w:rPr>
+        <w:t xml:space="preserve">--stop-on-failure</w:t>
+      </w:r>
+      <w:r>
         <w:br/>
       </w:r>
       <w:r>
         <w:rPr>
           <w:rFonts w:ascii="Consolas" w:hAnsi="Consolas"/>
-          <w:color w:val="4EC9B0"/>
+          <w:color w:val="262626"/>
           <w:sz w:val="16"/>
         </w:rPr>
-        <w:t>npm</w:t>
+        <w:t xml:space="preserve">./vendor/bin/pint </w:t>
       </w:r>
       <w:r>
         <w:rPr>
           <w:rFonts w:ascii="Consolas" w:hAnsi="Consolas"/>
-          <w:color w:val="D4D4D4"/>
+          <w:color w:val="0073E6"/>
+          <w:sz w:val="16"/>
+        </w:rPr>
+        <w:t xml:space="preserve">--test</w:t>
+      </w:r>
+      <w:r>
+        <w:br/>
+      </w:r>
+      <w:r>
+        <w:rPr>
+          <w:rFonts w:ascii="Consolas" w:hAnsi="Consolas"/>
+          <w:b/>
+          <w:color w:val="000080"/>
+          <w:sz w:val="16"/>
+        </w:rPr>
+        <w:t xml:space="preserve">npm</w:t>
+      </w:r>
+      <w:r>
+        <w:rPr>
+          <w:rFonts w:ascii="Consolas" w:hAnsi="Consolas"/>
+          <w:color w:val="262626"/>
           <w:sz w:val="16"/>
         </w:rPr>
         <w:t xml:space="preserve"> run build</w:t>
@@ -5044,431 +5127,215 @@
     <w:p>
       <w:pPr>
         <w:pStyle w:val="CodeHeader"/>
-        <w:shd w:fill="2D2D30"/>
+        <w:keepNext/>
         <w:pBdr>
-          <w:left w:val="single" w:sz="4" w:space="8" w:color="2D2D30"/>
+          <w:left w:val="single" w:sz="12" w:space="8" w:color="B8DDE0"/>
         </w:pBdr>
+        <w:shd w:val="clear" w:color="auto" w:fill="E4EAED"/>
       </w:pPr>
       <w:r>
-        <w:t>AUDIT KOMPATIBILITAS DEPENDENSI SRS — terminal root proyek   •   BASH</w:t>
+        <w:rPr>
+          <w:rFonts w:ascii="Consolas" w:hAnsi="Consolas"/>
+          <w:b/>
+          <w:color w:val="262626"/>
+          <w:sz w:val="16"/>
+        </w:rPr>
+        <w:t xml:space="preserve">AUDIT KOMPATIBILITAS DEPENDENSI SRS — terminal root proyek   •   BASH</w:t>
       </w:r>
     </w:p>
     <w:p>
       <w:pPr>
         <w:pStyle w:val="CodeBlock"/>
-        <w:shd w:fill="1E1E1E"/>
         <w:keepLines/>
         <w:pBdr>
-          <w:left w:val="single" w:sz="4" w:space="8" w:color="1E1E1E"/>
+          <w:left w:val="single" w:sz="12" w:space="8" w:color="B8DDE0"/>
         </w:pBdr>
+        <w:shd w:val="clear" w:color="auto" w:fill="F2F3F7"/>
       </w:pPr>
       <w:r>
         <w:rPr>
-          <w:rFonts w:ascii="Consolas" w:hAnsi="Consolas" w:eastAsia="Consolas"/>
-          <w:color w:val="4EC9B0"/>
+          <w:rFonts w:ascii="Consolas" w:hAnsi="Consolas"/>
+          <w:b/>
+          <w:color w:val="000080"/>
           <w:sz w:val="16"/>
         </w:rPr>
-        <w:t>composer</w:t>
+        <w:t xml:space="preserve">composer</w:t>
       </w:r>
       <w:r>
         <w:rPr>
-          <w:rFonts w:ascii="Consolas" w:hAnsi="Consolas" w:eastAsia="Consolas"/>
-          <w:color w:val="D4D4D4"/>
+          <w:rFonts w:ascii="Consolas" w:hAnsi="Consolas"/>
+          <w:color w:val="262626"/>
           <w:sz w:val="16"/>
         </w:rPr>
-        <w:t xml:space="preserve"> </w:t>
+        <w:t xml:space="preserve"> require chillerlan/php-qrcode intervention/image-laravel </w:t>
       </w:r>
       <w:r>
         <w:rPr>
-          <w:rFonts w:ascii="Consolas" w:hAnsi="Consolas" w:eastAsia="Consolas"/>
-          <w:color w:val="D4D4D4"/>
+          <w:rFonts w:ascii="Consolas" w:hAnsi="Consolas"/>
+          <w:color w:val="0073E6"/>
           <w:sz w:val="16"/>
         </w:rPr>
-        <w:t>require</w:t>
+        <w:t xml:space="preserve">--dry-run</w:t>
       </w:r>
       <w:r>
-        <w:rPr>
-          <w:rFonts w:ascii="Consolas" w:hAnsi="Consolas" w:eastAsia="Consolas"/>
-          <w:color w:val="D4D4D4"/>
-          <w:sz w:val="16"/>
-        </w:rPr>
-        <w:t xml:space="preserve"> </w:t>
-      </w:r>
-      <w:r>
-        <w:rPr>
-          <w:rFonts w:ascii="Consolas" w:hAnsi="Consolas" w:eastAsia="Consolas"/>
-          <w:color w:val="D4D4D4"/>
-          <w:sz w:val="16"/>
-        </w:rPr>
-        <w:t>chillerlan/php-qrcode</w:t>
-      </w:r>
-      <w:r>
-        <w:rPr>
-          <w:rFonts w:ascii="Consolas" w:hAnsi="Consolas" w:eastAsia="Consolas"/>
-          <w:color w:val="D4D4D4"/>
-          <w:sz w:val="16"/>
-        </w:rPr>
-        <w:t xml:space="preserve"> </w:t>
-      </w:r>
-      <w:r>
-        <w:rPr>
-          <w:rFonts w:ascii="Consolas" w:hAnsi="Consolas" w:eastAsia="Consolas"/>
-          <w:color w:val="D4D4D4"/>
-          <w:sz w:val="16"/>
-        </w:rPr>
-        <w:t>intervention/image-laravel</w:t>
-      </w:r>
-      <w:r>
-        <w:rPr>
-          <w:rFonts w:ascii="Consolas" w:hAnsi="Consolas" w:eastAsia="Consolas"/>
-          <w:color w:val="D4D4D4"/>
-          <w:sz w:val="16"/>
-        </w:rPr>
-        <w:t xml:space="preserve"> </w:t>
-      </w:r>
-      <w:r>
-        <w:rPr>
-          <w:rFonts w:ascii="Consolas" w:hAnsi="Consolas" w:eastAsia="Consolas"/>
-          <w:color w:val="9CDCFE"/>
-          <w:sz w:val="16"/>
-        </w:rPr>
-        <w:t>--dry-run</w:t>
-      </w:r>
-      <w:r>
-        <w:rPr>
-          <w:rFonts w:ascii="Consolas" w:hAnsi="Consolas" w:eastAsia="Consolas"/>
-          <w:color w:val="D4D4D4"/>
-          <w:sz w:val="16"/>
-        </w:rPr>
         <w:br/>
       </w:r>
       <w:r>
         <w:rPr>
-          <w:rFonts w:ascii="Consolas" w:hAnsi="Consolas" w:eastAsia="Consolas"/>
-          <w:color w:val="4EC9B0"/>
+          <w:rFonts w:ascii="Consolas" w:hAnsi="Consolas"/>
+          <w:b/>
+          <w:color w:val="000080"/>
           <w:sz w:val="16"/>
         </w:rPr>
-        <w:t>composer</w:t>
+        <w:t xml:space="preserve">composer</w:t>
       </w:r>
       <w:r>
         <w:rPr>
-          <w:rFonts w:ascii="Consolas" w:hAnsi="Consolas" w:eastAsia="Consolas"/>
-          <w:color w:val="D4D4D4"/>
+          <w:rFonts w:ascii="Consolas" w:hAnsi="Consolas"/>
+          <w:color w:val="262626"/>
           <w:sz w:val="16"/>
         </w:rPr>
-        <w:t xml:space="preserve"> </w:t>
+        <w:t xml:space="preserve"> require maatwebsite/excel barryvdh/laravel-dompdf </w:t>
       </w:r>
       <w:r>
         <w:rPr>
-          <w:rFonts w:ascii="Consolas" w:hAnsi="Consolas" w:eastAsia="Consolas"/>
-          <w:color w:val="D4D4D4"/>
+          <w:rFonts w:ascii="Consolas" w:hAnsi="Consolas"/>
+          <w:color w:val="0073E6"/>
           <w:sz w:val="16"/>
         </w:rPr>
-        <w:t>require</w:t>
+        <w:t xml:space="preserve">--dry-run</w:t>
       </w:r>
       <w:r>
-        <w:rPr>
-          <w:rFonts w:ascii="Consolas" w:hAnsi="Consolas" w:eastAsia="Consolas"/>
-          <w:color w:val="D4D4D4"/>
-          <w:sz w:val="16"/>
-        </w:rPr>
-        <w:t xml:space="preserve"> </w:t>
-      </w:r>
-      <w:r>
-        <w:rPr>
-          <w:rFonts w:ascii="Consolas" w:hAnsi="Consolas" w:eastAsia="Consolas"/>
-          <w:color w:val="D4D4D4"/>
-          <w:sz w:val="16"/>
-        </w:rPr>
-        <w:t>maatwebsite/excel</w:t>
-      </w:r>
-      <w:r>
-        <w:rPr>
-          <w:rFonts w:ascii="Consolas" w:hAnsi="Consolas" w:eastAsia="Consolas"/>
-          <w:color w:val="D4D4D4"/>
-          <w:sz w:val="16"/>
-        </w:rPr>
-        <w:t xml:space="preserve"> </w:t>
-      </w:r>
-      <w:r>
-        <w:rPr>
-          <w:rFonts w:ascii="Consolas" w:hAnsi="Consolas" w:eastAsia="Consolas"/>
-          <w:color w:val="D4D4D4"/>
-          <w:sz w:val="16"/>
-        </w:rPr>
-        <w:t>barryvdh/laravel-dompdf</w:t>
-      </w:r>
-      <w:r>
-        <w:rPr>
-          <w:rFonts w:ascii="Consolas" w:hAnsi="Consolas" w:eastAsia="Consolas"/>
-          <w:color w:val="D4D4D4"/>
-          <w:sz w:val="16"/>
-        </w:rPr>
-        <w:t xml:space="preserve"> </w:t>
-      </w:r>
-      <w:r>
-        <w:rPr>
-          <w:rFonts w:ascii="Consolas" w:hAnsi="Consolas" w:eastAsia="Consolas"/>
-          <w:color w:val="9CDCFE"/>
-          <w:sz w:val="16"/>
-        </w:rPr>
-        <w:t>--dry-run</w:t>
-      </w:r>
-      <w:r>
-        <w:rPr>
-          <w:rFonts w:ascii="Consolas" w:hAnsi="Consolas" w:eastAsia="Consolas"/>
-          <w:color w:val="D4D4D4"/>
-          <w:sz w:val="16"/>
-        </w:rPr>
         <w:br/>
       </w:r>
       <w:r>
         <w:rPr>
-          <w:rFonts w:ascii="Consolas" w:hAnsi="Consolas" w:eastAsia="Consolas"/>
-          <w:color w:val="4EC9B0"/>
+          <w:rFonts w:ascii="Consolas" w:hAnsi="Consolas"/>
+          <w:b/>
+          <w:color w:val="000080"/>
           <w:sz w:val="16"/>
         </w:rPr>
-        <w:t>composer</w:t>
+        <w:t xml:space="preserve">composer</w:t>
       </w:r>
       <w:r>
         <w:rPr>
-          <w:rFonts w:ascii="Consolas" w:hAnsi="Consolas" w:eastAsia="Consolas"/>
-          <w:color w:val="D4D4D4"/>
+          <w:rFonts w:ascii="Consolas" w:hAnsi="Consolas"/>
+          <w:color w:val="262626"/>
           <w:sz w:val="16"/>
         </w:rPr>
-        <w:t xml:space="preserve"> </w:t>
+        <w:t xml:space="preserve"> require laravel-notification-channels/webpush </w:t>
       </w:r>
       <w:r>
         <w:rPr>
-          <w:rFonts w:ascii="Consolas" w:hAnsi="Consolas" w:eastAsia="Consolas"/>
-          <w:color w:val="D4D4D4"/>
+          <w:rFonts w:ascii="Consolas" w:hAnsi="Consolas"/>
+          <w:color w:val="0073E6"/>
           <w:sz w:val="16"/>
         </w:rPr>
-        <w:t>require</w:t>
+        <w:t xml:space="preserve">--dry-run</w:t>
       </w:r>
       <w:r>
-        <w:rPr>
-          <w:rFonts w:ascii="Consolas" w:hAnsi="Consolas" w:eastAsia="Consolas"/>
-          <w:color w:val="D4D4D4"/>
-          <w:sz w:val="16"/>
-        </w:rPr>
-        <w:t xml:space="preserve"> </w:t>
-      </w:r>
-      <w:r>
-        <w:rPr>
-          <w:rFonts w:ascii="Consolas" w:hAnsi="Consolas" w:eastAsia="Consolas"/>
-          <w:color w:val="D4D4D4"/>
-          <w:sz w:val="16"/>
-        </w:rPr>
-        <w:t>laravel-notification-channels/webpush</w:t>
-      </w:r>
-      <w:r>
-        <w:rPr>
-          <w:rFonts w:ascii="Consolas" w:hAnsi="Consolas" w:eastAsia="Consolas"/>
-          <w:color w:val="D4D4D4"/>
-          <w:sz w:val="16"/>
-        </w:rPr>
-        <w:t xml:space="preserve"> </w:t>
-      </w:r>
-      <w:r>
-        <w:rPr>
-          <w:rFonts w:ascii="Consolas" w:hAnsi="Consolas" w:eastAsia="Consolas"/>
-          <w:color w:val="9CDCFE"/>
-          <w:sz w:val="16"/>
-        </w:rPr>
-        <w:t>--dry-run</w:t>
-      </w:r>
-      <w:r>
-        <w:rPr>
-          <w:rFonts w:ascii="Consolas" w:hAnsi="Consolas" w:eastAsia="Consolas"/>
-          <w:color w:val="D4D4D4"/>
-          <w:sz w:val="16"/>
-        </w:rPr>
         <w:br/>
       </w:r>
       <w:r>
         <w:rPr>
-          <w:rFonts w:ascii="Consolas" w:hAnsi="Consolas" w:eastAsia="Consolas"/>
-          <w:color w:val="4EC9B0"/>
+          <w:rFonts w:ascii="Consolas" w:hAnsi="Consolas"/>
+          <w:b/>
+          <w:color w:val="000080"/>
           <w:sz w:val="16"/>
         </w:rPr>
-        <w:t>npm</w:t>
+        <w:t xml:space="preserve">npm</w:t>
       </w:r>
       <w:r>
         <w:rPr>
-          <w:rFonts w:ascii="Consolas" w:hAnsi="Consolas" w:eastAsia="Consolas"/>
-          <w:color w:val="D4D4D4"/>
+          <w:rFonts w:ascii="Consolas" w:hAnsi="Consolas"/>
+          <w:color w:val="262626"/>
           <w:sz w:val="16"/>
         </w:rPr>
-        <w:t xml:space="preserve"> </w:t>
+        <w:t xml:space="preserve"> install </w:t>
       </w:r>
       <w:r>
         <w:rPr>
-          <w:rFonts w:ascii="Consolas" w:hAnsi="Consolas" w:eastAsia="Consolas"/>
-          <w:color w:val="D4D4D4"/>
+          <w:rFonts w:ascii="Consolas" w:hAnsi="Consolas"/>
+          <w:color w:val="0073E6"/>
           <w:sz w:val="16"/>
         </w:rPr>
-        <w:t>install</w:t>
+        <w:t xml:space="preserve">--dry-run</w:t>
       </w:r>
       <w:r>
         <w:rPr>
-          <w:rFonts w:ascii="Consolas" w:hAnsi="Consolas" w:eastAsia="Consolas"/>
-          <w:color w:val="D4D4D4"/>
+          <w:rFonts w:ascii="Consolas" w:hAnsi="Consolas"/>
+          <w:color w:val="262626"/>
           <w:sz w:val="16"/>
         </w:rPr>
-        <w:t xml:space="preserve"> </w:t>
+        <w:t xml:space="preserve"> laravel-echo pusher-js</w:t>
       </w:r>
       <w:r>
-        <w:rPr>
-          <w:rFonts w:ascii="Consolas" w:hAnsi="Consolas" w:eastAsia="Consolas"/>
-          <w:color w:val="9CDCFE"/>
-          <w:sz w:val="16"/>
-        </w:rPr>
-        <w:t>--dry-run</w:t>
-      </w:r>
-      <w:r>
-        <w:rPr>
-          <w:rFonts w:ascii="Consolas" w:hAnsi="Consolas" w:eastAsia="Consolas"/>
-          <w:color w:val="D4D4D4"/>
-          <w:sz w:val="16"/>
-        </w:rPr>
-        <w:t xml:space="preserve"> </w:t>
-      </w:r>
-      <w:r>
-        <w:rPr>
-          <w:rFonts w:ascii="Consolas" w:hAnsi="Consolas" w:eastAsia="Consolas"/>
-          <w:color w:val="D4D4D4"/>
-          <w:sz w:val="16"/>
-        </w:rPr>
-        <w:t>laravel-echo</w:t>
-      </w:r>
-      <w:r>
-        <w:rPr>
-          <w:rFonts w:ascii="Consolas" w:hAnsi="Consolas" w:eastAsia="Consolas"/>
-          <w:color w:val="D4D4D4"/>
-          <w:sz w:val="16"/>
-        </w:rPr>
-        <w:t xml:space="preserve"> </w:t>
-      </w:r>
-      <w:r>
-        <w:rPr>
-          <w:rFonts w:ascii="Consolas" w:hAnsi="Consolas" w:eastAsia="Consolas"/>
-          <w:color w:val="D4D4D4"/>
-          <w:sz w:val="16"/>
-        </w:rPr>
-        <w:t>pusher-js</w:t>
-      </w:r>
-      <w:r>
-        <w:rPr>
-          <w:rFonts w:ascii="Consolas" w:hAnsi="Consolas" w:eastAsia="Consolas"/>
-          <w:color w:val="D4D4D4"/>
-          <w:sz w:val="16"/>
-        </w:rPr>
         <w:br/>
       </w:r>
       <w:r>
         <w:rPr>
-          <w:rFonts w:ascii="Consolas" w:hAnsi="Consolas" w:eastAsia="Consolas"/>
-          <w:color w:val="4EC9B0"/>
+          <w:rFonts w:ascii="Consolas" w:hAnsi="Consolas"/>
+          <w:b/>
+          <w:color w:val="000080"/>
           <w:sz w:val="16"/>
         </w:rPr>
-        <w:t>composer</w:t>
+        <w:t xml:space="preserve">composer</w:t>
       </w:r>
       <w:r>
         <w:rPr>
-          <w:rFonts w:ascii="Consolas" w:hAnsi="Consolas" w:eastAsia="Consolas"/>
-          <w:color w:val="D4D4D4"/>
+          <w:rFonts w:ascii="Consolas" w:hAnsi="Consolas"/>
+          <w:color w:val="262626"/>
           <w:sz w:val="16"/>
         </w:rPr>
-        <w:t xml:space="preserve"> </w:t>
+        <w:t xml:space="preserve"> validate </w:t>
       </w:r>
       <w:r>
         <w:rPr>
-          <w:rFonts w:ascii="Consolas" w:hAnsi="Consolas" w:eastAsia="Consolas"/>
-          <w:color w:val="D4D4D4"/>
+          <w:rFonts w:ascii="Consolas" w:hAnsi="Consolas"/>
+          <w:color w:val="0073E6"/>
           <w:sz w:val="16"/>
         </w:rPr>
-        <w:t>validate</w:t>
+        <w:t xml:space="preserve">--strict</w:t>
       </w:r>
       <w:r>
-        <w:rPr>
-          <w:rFonts w:ascii="Consolas" w:hAnsi="Consolas" w:eastAsia="Consolas"/>
-          <w:color w:val="D4D4D4"/>
-          <w:sz w:val="16"/>
-        </w:rPr>
-        <w:t xml:space="preserve"> </w:t>
-      </w:r>
-      <w:r>
-        <w:rPr>
-          <w:rFonts w:ascii="Consolas" w:hAnsi="Consolas" w:eastAsia="Consolas"/>
-          <w:color w:val="9CDCFE"/>
-          <w:sz w:val="16"/>
-        </w:rPr>
-        <w:t>--strict</w:t>
-      </w:r>
-      <w:r>
-        <w:rPr>
-          <w:rFonts w:ascii="Consolas" w:hAnsi="Consolas" w:eastAsia="Consolas"/>
-          <w:color w:val="D4D4D4"/>
-          <w:sz w:val="16"/>
-        </w:rPr>
         <w:br/>
       </w:r>
       <w:r>
         <w:rPr>
-          <w:rFonts w:ascii="Consolas" w:hAnsi="Consolas" w:eastAsia="Consolas"/>
-          <w:color w:val="4EC9B0"/>
+          <w:rFonts w:ascii="Consolas" w:hAnsi="Consolas"/>
+          <w:b/>
+          <w:color w:val="000080"/>
           <w:sz w:val="16"/>
         </w:rPr>
-        <w:t>composer</w:t>
+        <w:t xml:space="preserve">composer</w:t>
       </w:r>
       <w:r>
         <w:rPr>
-          <w:rFonts w:ascii="Consolas" w:hAnsi="Consolas" w:eastAsia="Consolas"/>
-          <w:color w:val="D4D4D4"/>
+          <w:rFonts w:ascii="Consolas" w:hAnsi="Consolas"/>
+          <w:color w:val="262626"/>
           <w:sz w:val="16"/>
         </w:rPr>
-        <w:t xml:space="preserve"> </w:t>
+        <w:t xml:space="preserve"> audit</w:t>
       </w:r>
       <w:r>
-        <w:rPr>
-          <w:rFonts w:ascii="Consolas" w:hAnsi="Consolas" w:eastAsia="Consolas"/>
-          <w:color w:val="D4D4D4"/>
-          <w:sz w:val="16"/>
-        </w:rPr>
-        <w:t>audit</w:t>
-      </w:r>
-      <w:r>
-        <w:rPr>
-          <w:rFonts w:ascii="Consolas" w:hAnsi="Consolas" w:eastAsia="Consolas"/>
-          <w:color w:val="D4D4D4"/>
-          <w:sz w:val="16"/>
-        </w:rPr>
         <w:br/>
       </w:r>
       <w:r>
         <w:rPr>
-          <w:rFonts w:ascii="Consolas" w:hAnsi="Consolas" w:eastAsia="Consolas"/>
-          <w:color w:val="4EC9B0"/>
+          <w:rFonts w:ascii="Consolas" w:hAnsi="Consolas"/>
+          <w:b/>
+          <w:color w:val="000080"/>
           <w:sz w:val="16"/>
         </w:rPr>
-        <w:t>npm</w:t>
+        <w:t xml:space="preserve">npm</w:t>
       </w:r>
       <w:r>
         <w:rPr>
-          <w:rFonts w:ascii="Consolas" w:hAnsi="Consolas" w:eastAsia="Consolas"/>
-          <w:color w:val="D4D4D4"/>
+          <w:rFonts w:ascii="Consolas" w:hAnsi="Consolas"/>
+          <w:color w:val="262626"/>
           <w:sz w:val="16"/>
         </w:rPr>
-        <w:t xml:space="preserve"> </w:t>
-      </w:r>
-      <w:r>
-        <w:rPr>
-          <w:rFonts w:ascii="Consolas" w:hAnsi="Consolas" w:eastAsia="Consolas"/>
-          <w:color w:val="D4D4D4"/>
-          <w:sz w:val="16"/>
-        </w:rPr>
-        <w:t>audit</w:t>
+        <w:t xml:space="preserve"> audit</w:t>
       </w:r>
     </w:p>
     <w:p>
@@ -7909,8 +7776,10 @@
       <w:r>
         <w:rPr>
           <w:rFonts w:ascii="Aptos" w:hAnsi="Aptos"/>
+          <w:color w:val="1F2937"/>
+          <w:sz w:val="19"/>
         </w:rPr>
-        <w:t>Preset dasar yang digunakan adalah compact_reference_guide dengan named override untuk modul pembelajaran: A4 portrait; margin atas 1,65 cm, bawah 1,55 cm, kiri/kanan 1,75 cm; Aptos 10,2 pt; line spacing 1,16; heading beraksen Laravel red; tabel ringkas; callout Predict/Try/Observe; code block Consolas bertema Visual Studio Code Dark+; checklist; exit ticket; serta screenshot mockup UI.</w:t>
+        <w:t xml:space="preserve">Preset dasar yang digunakan adalah compact_reference_guide dengan named override untuk modul pembelajaran: A4 portrait; margin atas 1,65 cm, bawah 1,55 cm, kiri/kanan 1,75 cm; Aptos 10,2 pt; line spacing 1,16; heading beraksen Laravel red; tabel ringkas; callout Predict/Try/Observe; code block Consolas berlatar Cyan Light dengan pewarnaan token Visual Studio Code; checklist; exit ticket; serta screenshot mockup UI.</w:t>
       </w:r>
     </w:p>
     <w:p>
@@ -8491,6 +8360,19 @@
         <w:pStyle w:val="ListBody"/>
       </w:pPr>
       <w:r>
+        <w:rPr>
+          <w:rFonts w:ascii="Aptos" w:hAnsi="Aptos"/>
+          <w:color w:val="1F2937"/>
+          <w:sz w:val="19"/>
+        </w:rPr>
+        <w:t xml:space="preserve">DOC-00-001 — Seluruh blok kode (208 blok, 133 label) memakai latar terang tema Cyan Light (JetBrains) dengan pewarnaan token standar Visual Studio Code untuk PHP, HTML/Blade, cmd, dan bash; teks kode tidak berubah; penjelasan palet di “Cara Membaca Sampel Kode” dan Lampiran diperbarui.</w:t>
+      </w:r>
+    </w:p>
+    <w:p>
+      <w:pPr>
+        <w:pStyle w:val="ListBody"/>
+      </w:pPr>
+      <w:r>
         <w:t xml:space="preserve">DOC-01-001 — Basis dokumen: parameter menyebut v4/v5 yang tidak ada; basis nyata adalah v7. Revisi kumulatif ditulis ke berkas v8; v7 tetap utuh di references/.</w:t>
       </w:r>
     </w:p>
@@ -21132,7 +21014,7 @@
     </w:pPr>
     <w:rPr>
       <w:rFonts w:ascii="Consolas" w:hAnsi="Consolas"/>
-      <w:color w:val="D4D4D4"/>
+      <w:color w:val="262626"/>
       <w:sz w:val="16"/>
     </w:rPr>
   </w:style>
@@ -21244,7 +21126,7 @@
     <w:rPr>
       <w:rFonts w:ascii="Consolas" w:hAnsi="Consolas"/>
       <w:b/>
-      <w:color w:val="FFFFFF"/>
+      <w:color w:val="262626"/>
       <w:sz w:val="16"/>
     </w:rPr>
   </w:style>

</xml_diff>

<commit_message>
docs(v8): Modul 6 — use case UC-22 & UC-02 + langkah Windows (cmd + VS Code)
- Bagian Use Case SRS: tabel UC-22/UC-02 + mockup #uc-22/#uc-02; Tahap 8; output browser
- Tahap 1–8 dalam format langkah Windows (21 langkah, output nyata ::, isi berkas lengkap,
  tanpa ADR); Guided Lab -> cmd; tema kode Cyan Light
- Diverifikasi: worktree bersih dari akhir Pertemuan 5 v3; Tahap 7 identik dengan kode v2 P6
  (101 test), Tahap 8 identik dengan kode akhir (109 test); Modul 1–5 tidak berubah
- DOC-06-006, DOC-06-007; RTM UC-22, UC-02 PASS; modul_praktikum dibuat ulang

Co-Authored-By: Claude Opus 5.5 <noreply@anthropic.com>
</commit_message>
<xml_diff>
--- a/modul_praktikum/Lampiran.docx
+++ b/modul_praktikum/Lampiran.docx
@@ -3577,92 +3577,175 @@
     <w:p>
       <w:pPr>
         <w:pStyle w:val="CodeBlock"/>
-        <w:shd w:fill="1E1E1E" w:val="clear"/>
         <w:pBdr>
-          <w:left w:val="single" w:sz="4" w:space="8" w:color="1E1E1E"/>
+          <w:left w:val="single" w:sz="12" w:space="8" w:color="B8DDE0"/>
         </w:pBdr>
+        <w:shd w:val="clear" w:color="auto" w:fill="F2F3F7"/>
       </w:pPr>
       <w:r>
         <w:rPr>
           <w:rFonts w:ascii="Consolas" w:hAnsi="Consolas"/>
-          <w:color w:val="4EC9B0"/>
+          <w:b/>
+          <w:color w:val="000080"/>
           <w:sz w:val="16"/>
         </w:rPr>
-        <w:t>php</w:t>
+        <w:t xml:space="preserve">php</w:t>
       </w:r>
       <w:r>
         <w:rPr>
           <w:rFonts w:ascii="Consolas" w:hAnsi="Consolas"/>
-          <w:color w:val="D4D4D4"/>
+          <w:color w:val="262626"/>
           <w:sz w:val="16"/>
         </w:rPr>
-        <w:t xml:space="preserve"> artisan optimize:clear</w:t>
+        <w:t xml:space="preserve"> artisan </w:t>
+      </w:r>
+      <w:r>
+        <w:rPr>
+          <w:rFonts w:ascii="Consolas" w:hAnsi="Consolas"/>
+          <w:color w:val="795E26"/>
+          <w:sz w:val="16"/>
+        </w:rPr>
+        <w:t xml:space="preserve">optimize:clear</w:t>
+      </w:r>
+      <w:r>
         <w:br/>
       </w:r>
       <w:r>
         <w:rPr>
           <w:rFonts w:ascii="Consolas" w:hAnsi="Consolas"/>
-          <w:color w:val="4EC9B0"/>
+          <w:b/>
+          <w:color w:val="000080"/>
           <w:sz w:val="16"/>
         </w:rPr>
-        <w:t>php</w:t>
+        <w:t xml:space="preserve">php</w:t>
       </w:r>
       <w:r>
         <w:rPr>
           <w:rFonts w:ascii="Consolas" w:hAnsi="Consolas"/>
-          <w:color w:val="D4D4D4"/>
+          <w:color w:val="262626"/>
           <w:sz w:val="16"/>
         </w:rPr>
-        <w:t xml:space="preserve"> artisan migrate:fresh --seed --env=testing</w:t>
+        <w:t xml:space="preserve"> artisan </w:t>
+      </w:r>
+      <w:r>
+        <w:rPr>
+          <w:rFonts w:ascii="Consolas" w:hAnsi="Consolas"/>
+          <w:color w:val="795E26"/>
+          <w:sz w:val="16"/>
+        </w:rPr>
+        <w:t xml:space="preserve">migrate:fresh</w:t>
+      </w:r>
+      <w:r>
+        <w:rPr>
+          <w:rFonts w:ascii="Consolas" w:hAnsi="Consolas"/>
+          <w:color w:val="262626"/>
+          <w:sz w:val="16"/>
+        </w:rPr>
+        <w:t xml:space="preserve"> </w:t>
+      </w:r>
+      <w:r>
+        <w:rPr>
+          <w:rFonts w:ascii="Consolas" w:hAnsi="Consolas"/>
+          <w:color w:val="0073E6"/>
+          <w:sz w:val="16"/>
+        </w:rPr>
+        <w:t xml:space="preserve">--seed</w:t>
+      </w:r>
+      <w:r>
+        <w:rPr>
+          <w:rFonts w:ascii="Consolas" w:hAnsi="Consolas"/>
+          <w:color w:val="262626"/>
+          <w:sz w:val="16"/>
+        </w:rPr>
+        <w:t xml:space="preserve"> </w:t>
+      </w:r>
+      <w:r>
+        <w:rPr>
+          <w:rFonts w:ascii="Consolas" w:hAnsi="Consolas"/>
+          <w:color w:val="0073E6"/>
+          <w:sz w:val="16"/>
+        </w:rPr>
+        <w:t xml:space="preserve">--env=testing</w:t>
+      </w:r>
+      <w:r>
         <w:br/>
       </w:r>
       <w:r>
         <w:rPr>
           <w:rFonts w:ascii="Consolas" w:hAnsi="Consolas"/>
-          <w:color w:val="4EC9B0"/>
+          <w:b/>
+          <w:color w:val="000080"/>
           <w:sz w:val="16"/>
         </w:rPr>
-        <w:t>php</w:t>
+        <w:t xml:space="preserve">php</w:t>
       </w:r>
       <w:r>
         <w:rPr>
           <w:rFonts w:ascii="Consolas" w:hAnsi="Consolas"/>
-          <w:color w:val="D4D4D4"/>
+          <w:color w:val="262626"/>
           <w:sz w:val="16"/>
         </w:rPr>
-        <w:t xml:space="preserve"> artisan test --testsuite=</w:t>
+        <w:t xml:space="preserve"> artisan test </w:t>
       </w:r>
       <w:r>
         <w:rPr>
           <w:rFonts w:ascii="Consolas" w:hAnsi="Consolas"/>
-          <w:color w:val="4EC9B0"/>
+          <w:color w:val="0073E6"/>
           <w:sz w:val="16"/>
         </w:rPr>
-        <w:t>Feature</w:t>
+        <w:t xml:space="preserve">--testsuite=Feature</w:t>
       </w:r>
       <w:r>
         <w:rPr>
           <w:rFonts w:ascii="Consolas" w:hAnsi="Consolas"/>
-          <w:color w:val="D4D4D4"/>
+          <w:color w:val="262626"/>
           <w:sz w:val="16"/>
         </w:rPr>
-        <w:t xml:space="preserve"> --stop-on-failure</w:t>
-        <w:br/>
-        <w:t xml:space="preserve">./vendor/bin/pint --test</w:t>
+        <w:t xml:space="preserve"> </w:t>
+      </w:r>
+      <w:r>
+        <w:rPr>
+          <w:rFonts w:ascii="Consolas" w:hAnsi="Consolas"/>
+          <w:color w:val="0073E6"/>
+          <w:sz w:val="16"/>
+        </w:rPr>
+        <w:t xml:space="preserve">--stop-on-failure</w:t>
+      </w:r>
+      <w:r>
         <w:br/>
       </w:r>
       <w:r>
         <w:rPr>
           <w:rFonts w:ascii="Consolas" w:hAnsi="Consolas"/>
-          <w:color w:val="4EC9B0"/>
+          <w:color w:val="262626"/>
           <w:sz w:val="16"/>
         </w:rPr>
-        <w:t>npm</w:t>
+        <w:t xml:space="preserve">./vendor/bin/pint </w:t>
       </w:r>
       <w:r>
         <w:rPr>
           <w:rFonts w:ascii="Consolas" w:hAnsi="Consolas"/>
-          <w:color w:val="D4D4D4"/>
+          <w:color w:val="0073E6"/>
+          <w:sz w:val="16"/>
+        </w:rPr>
+        <w:t xml:space="preserve">--test</w:t>
+      </w:r>
+      <w:r>
+        <w:br/>
+      </w:r>
+      <w:r>
+        <w:rPr>
+          <w:rFonts w:ascii="Consolas" w:hAnsi="Consolas"/>
+          <w:b/>
+          <w:color w:val="000080"/>
+          <w:sz w:val="16"/>
+        </w:rPr>
+        <w:t xml:space="preserve">npm</w:t>
+      </w:r>
+      <w:r>
+        <w:rPr>
+          <w:rFonts w:ascii="Consolas" w:hAnsi="Consolas"/>
+          <w:color w:val="262626"/>
           <w:sz w:val="16"/>
         </w:rPr>
         <w:t xml:space="preserve"> run build</w:t>
@@ -5044,431 +5127,215 @@
     <w:p>
       <w:pPr>
         <w:pStyle w:val="CodeHeader"/>
-        <w:shd w:fill="2D2D30"/>
+        <w:keepNext/>
         <w:pBdr>
-          <w:left w:val="single" w:sz="4" w:space="8" w:color="2D2D30"/>
+          <w:left w:val="single" w:sz="12" w:space="8" w:color="B8DDE0"/>
         </w:pBdr>
+        <w:shd w:val="clear" w:color="auto" w:fill="E4EAED"/>
       </w:pPr>
       <w:r>
-        <w:t>AUDIT KOMPATIBILITAS DEPENDENSI SRS — terminal root proyek   •   BASH</w:t>
+        <w:rPr>
+          <w:rFonts w:ascii="Consolas" w:hAnsi="Consolas"/>
+          <w:b/>
+          <w:color w:val="262626"/>
+          <w:sz w:val="16"/>
+        </w:rPr>
+        <w:t xml:space="preserve">AUDIT KOMPATIBILITAS DEPENDENSI SRS — terminal root proyek   •   BASH</w:t>
       </w:r>
     </w:p>
     <w:p>
       <w:pPr>
         <w:pStyle w:val="CodeBlock"/>
-        <w:shd w:fill="1E1E1E"/>
         <w:keepLines/>
         <w:pBdr>
-          <w:left w:val="single" w:sz="4" w:space="8" w:color="1E1E1E"/>
+          <w:left w:val="single" w:sz="12" w:space="8" w:color="B8DDE0"/>
         </w:pBdr>
+        <w:shd w:val="clear" w:color="auto" w:fill="F2F3F7"/>
       </w:pPr>
       <w:r>
         <w:rPr>
-          <w:rFonts w:ascii="Consolas" w:hAnsi="Consolas" w:eastAsia="Consolas"/>
-          <w:color w:val="4EC9B0"/>
+          <w:rFonts w:ascii="Consolas" w:hAnsi="Consolas"/>
+          <w:b/>
+          <w:color w:val="000080"/>
           <w:sz w:val="16"/>
         </w:rPr>
-        <w:t>composer</w:t>
+        <w:t xml:space="preserve">composer</w:t>
       </w:r>
       <w:r>
         <w:rPr>
-          <w:rFonts w:ascii="Consolas" w:hAnsi="Consolas" w:eastAsia="Consolas"/>
-          <w:color w:val="D4D4D4"/>
+          <w:rFonts w:ascii="Consolas" w:hAnsi="Consolas"/>
+          <w:color w:val="262626"/>
           <w:sz w:val="16"/>
         </w:rPr>
-        <w:t xml:space="preserve"> </w:t>
+        <w:t xml:space="preserve"> require chillerlan/php-qrcode intervention/image-laravel </w:t>
       </w:r>
       <w:r>
         <w:rPr>
-          <w:rFonts w:ascii="Consolas" w:hAnsi="Consolas" w:eastAsia="Consolas"/>
-          <w:color w:val="D4D4D4"/>
+          <w:rFonts w:ascii="Consolas" w:hAnsi="Consolas"/>
+          <w:color w:val="0073E6"/>
           <w:sz w:val="16"/>
         </w:rPr>
-        <w:t>require</w:t>
+        <w:t xml:space="preserve">--dry-run</w:t>
       </w:r>
       <w:r>
-        <w:rPr>
-          <w:rFonts w:ascii="Consolas" w:hAnsi="Consolas" w:eastAsia="Consolas"/>
-          <w:color w:val="D4D4D4"/>
-          <w:sz w:val="16"/>
-        </w:rPr>
-        <w:t xml:space="preserve"> </w:t>
-      </w:r>
-      <w:r>
-        <w:rPr>
-          <w:rFonts w:ascii="Consolas" w:hAnsi="Consolas" w:eastAsia="Consolas"/>
-          <w:color w:val="D4D4D4"/>
-          <w:sz w:val="16"/>
-        </w:rPr>
-        <w:t>chillerlan/php-qrcode</w:t>
-      </w:r>
-      <w:r>
-        <w:rPr>
-          <w:rFonts w:ascii="Consolas" w:hAnsi="Consolas" w:eastAsia="Consolas"/>
-          <w:color w:val="D4D4D4"/>
-          <w:sz w:val="16"/>
-        </w:rPr>
-        <w:t xml:space="preserve"> </w:t>
-      </w:r>
-      <w:r>
-        <w:rPr>
-          <w:rFonts w:ascii="Consolas" w:hAnsi="Consolas" w:eastAsia="Consolas"/>
-          <w:color w:val="D4D4D4"/>
-          <w:sz w:val="16"/>
-        </w:rPr>
-        <w:t>intervention/image-laravel</w:t>
-      </w:r>
-      <w:r>
-        <w:rPr>
-          <w:rFonts w:ascii="Consolas" w:hAnsi="Consolas" w:eastAsia="Consolas"/>
-          <w:color w:val="D4D4D4"/>
-          <w:sz w:val="16"/>
-        </w:rPr>
-        <w:t xml:space="preserve"> </w:t>
-      </w:r>
-      <w:r>
-        <w:rPr>
-          <w:rFonts w:ascii="Consolas" w:hAnsi="Consolas" w:eastAsia="Consolas"/>
-          <w:color w:val="9CDCFE"/>
-          <w:sz w:val="16"/>
-        </w:rPr>
-        <w:t>--dry-run</w:t>
-      </w:r>
-      <w:r>
-        <w:rPr>
-          <w:rFonts w:ascii="Consolas" w:hAnsi="Consolas" w:eastAsia="Consolas"/>
-          <w:color w:val="D4D4D4"/>
-          <w:sz w:val="16"/>
-        </w:rPr>
         <w:br/>
       </w:r>
       <w:r>
         <w:rPr>
-          <w:rFonts w:ascii="Consolas" w:hAnsi="Consolas" w:eastAsia="Consolas"/>
-          <w:color w:val="4EC9B0"/>
+          <w:rFonts w:ascii="Consolas" w:hAnsi="Consolas"/>
+          <w:b/>
+          <w:color w:val="000080"/>
           <w:sz w:val="16"/>
         </w:rPr>
-        <w:t>composer</w:t>
+        <w:t xml:space="preserve">composer</w:t>
       </w:r>
       <w:r>
         <w:rPr>
-          <w:rFonts w:ascii="Consolas" w:hAnsi="Consolas" w:eastAsia="Consolas"/>
-          <w:color w:val="D4D4D4"/>
+          <w:rFonts w:ascii="Consolas" w:hAnsi="Consolas"/>
+          <w:color w:val="262626"/>
           <w:sz w:val="16"/>
         </w:rPr>
-        <w:t xml:space="preserve"> </w:t>
+        <w:t xml:space="preserve"> require maatwebsite/excel barryvdh/laravel-dompdf </w:t>
       </w:r>
       <w:r>
         <w:rPr>
-          <w:rFonts w:ascii="Consolas" w:hAnsi="Consolas" w:eastAsia="Consolas"/>
-          <w:color w:val="D4D4D4"/>
+          <w:rFonts w:ascii="Consolas" w:hAnsi="Consolas"/>
+          <w:color w:val="0073E6"/>
           <w:sz w:val="16"/>
         </w:rPr>
-        <w:t>require</w:t>
+        <w:t xml:space="preserve">--dry-run</w:t>
       </w:r>
       <w:r>
-        <w:rPr>
-          <w:rFonts w:ascii="Consolas" w:hAnsi="Consolas" w:eastAsia="Consolas"/>
-          <w:color w:val="D4D4D4"/>
-          <w:sz w:val="16"/>
-        </w:rPr>
-        <w:t xml:space="preserve"> </w:t>
-      </w:r>
-      <w:r>
-        <w:rPr>
-          <w:rFonts w:ascii="Consolas" w:hAnsi="Consolas" w:eastAsia="Consolas"/>
-          <w:color w:val="D4D4D4"/>
-          <w:sz w:val="16"/>
-        </w:rPr>
-        <w:t>maatwebsite/excel</w:t>
-      </w:r>
-      <w:r>
-        <w:rPr>
-          <w:rFonts w:ascii="Consolas" w:hAnsi="Consolas" w:eastAsia="Consolas"/>
-          <w:color w:val="D4D4D4"/>
-          <w:sz w:val="16"/>
-        </w:rPr>
-        <w:t xml:space="preserve"> </w:t>
-      </w:r>
-      <w:r>
-        <w:rPr>
-          <w:rFonts w:ascii="Consolas" w:hAnsi="Consolas" w:eastAsia="Consolas"/>
-          <w:color w:val="D4D4D4"/>
-          <w:sz w:val="16"/>
-        </w:rPr>
-        <w:t>barryvdh/laravel-dompdf</w:t>
-      </w:r>
-      <w:r>
-        <w:rPr>
-          <w:rFonts w:ascii="Consolas" w:hAnsi="Consolas" w:eastAsia="Consolas"/>
-          <w:color w:val="D4D4D4"/>
-          <w:sz w:val="16"/>
-        </w:rPr>
-        <w:t xml:space="preserve"> </w:t>
-      </w:r>
-      <w:r>
-        <w:rPr>
-          <w:rFonts w:ascii="Consolas" w:hAnsi="Consolas" w:eastAsia="Consolas"/>
-          <w:color w:val="9CDCFE"/>
-          <w:sz w:val="16"/>
-        </w:rPr>
-        <w:t>--dry-run</w:t>
-      </w:r>
-      <w:r>
-        <w:rPr>
-          <w:rFonts w:ascii="Consolas" w:hAnsi="Consolas" w:eastAsia="Consolas"/>
-          <w:color w:val="D4D4D4"/>
-          <w:sz w:val="16"/>
-        </w:rPr>
         <w:br/>
       </w:r>
       <w:r>
         <w:rPr>
-          <w:rFonts w:ascii="Consolas" w:hAnsi="Consolas" w:eastAsia="Consolas"/>
-          <w:color w:val="4EC9B0"/>
+          <w:rFonts w:ascii="Consolas" w:hAnsi="Consolas"/>
+          <w:b/>
+          <w:color w:val="000080"/>
           <w:sz w:val="16"/>
         </w:rPr>
-        <w:t>composer</w:t>
+        <w:t xml:space="preserve">composer</w:t>
       </w:r>
       <w:r>
         <w:rPr>
-          <w:rFonts w:ascii="Consolas" w:hAnsi="Consolas" w:eastAsia="Consolas"/>
-          <w:color w:val="D4D4D4"/>
+          <w:rFonts w:ascii="Consolas" w:hAnsi="Consolas"/>
+          <w:color w:val="262626"/>
           <w:sz w:val="16"/>
         </w:rPr>
-        <w:t xml:space="preserve"> </w:t>
+        <w:t xml:space="preserve"> require laravel-notification-channels/webpush </w:t>
       </w:r>
       <w:r>
         <w:rPr>
-          <w:rFonts w:ascii="Consolas" w:hAnsi="Consolas" w:eastAsia="Consolas"/>
-          <w:color w:val="D4D4D4"/>
+          <w:rFonts w:ascii="Consolas" w:hAnsi="Consolas"/>
+          <w:color w:val="0073E6"/>
           <w:sz w:val="16"/>
         </w:rPr>
-        <w:t>require</w:t>
+        <w:t xml:space="preserve">--dry-run</w:t>
       </w:r>
       <w:r>
-        <w:rPr>
-          <w:rFonts w:ascii="Consolas" w:hAnsi="Consolas" w:eastAsia="Consolas"/>
-          <w:color w:val="D4D4D4"/>
-          <w:sz w:val="16"/>
-        </w:rPr>
-        <w:t xml:space="preserve"> </w:t>
-      </w:r>
-      <w:r>
-        <w:rPr>
-          <w:rFonts w:ascii="Consolas" w:hAnsi="Consolas" w:eastAsia="Consolas"/>
-          <w:color w:val="D4D4D4"/>
-          <w:sz w:val="16"/>
-        </w:rPr>
-        <w:t>laravel-notification-channels/webpush</w:t>
-      </w:r>
-      <w:r>
-        <w:rPr>
-          <w:rFonts w:ascii="Consolas" w:hAnsi="Consolas" w:eastAsia="Consolas"/>
-          <w:color w:val="D4D4D4"/>
-          <w:sz w:val="16"/>
-        </w:rPr>
-        <w:t xml:space="preserve"> </w:t>
-      </w:r>
-      <w:r>
-        <w:rPr>
-          <w:rFonts w:ascii="Consolas" w:hAnsi="Consolas" w:eastAsia="Consolas"/>
-          <w:color w:val="9CDCFE"/>
-          <w:sz w:val="16"/>
-        </w:rPr>
-        <w:t>--dry-run</w:t>
-      </w:r>
-      <w:r>
-        <w:rPr>
-          <w:rFonts w:ascii="Consolas" w:hAnsi="Consolas" w:eastAsia="Consolas"/>
-          <w:color w:val="D4D4D4"/>
-          <w:sz w:val="16"/>
-        </w:rPr>
         <w:br/>
       </w:r>
       <w:r>
         <w:rPr>
-          <w:rFonts w:ascii="Consolas" w:hAnsi="Consolas" w:eastAsia="Consolas"/>
-          <w:color w:val="4EC9B0"/>
+          <w:rFonts w:ascii="Consolas" w:hAnsi="Consolas"/>
+          <w:b/>
+          <w:color w:val="000080"/>
           <w:sz w:val="16"/>
         </w:rPr>
-        <w:t>npm</w:t>
+        <w:t xml:space="preserve">npm</w:t>
       </w:r>
       <w:r>
         <w:rPr>
-          <w:rFonts w:ascii="Consolas" w:hAnsi="Consolas" w:eastAsia="Consolas"/>
-          <w:color w:val="D4D4D4"/>
+          <w:rFonts w:ascii="Consolas" w:hAnsi="Consolas"/>
+          <w:color w:val="262626"/>
           <w:sz w:val="16"/>
         </w:rPr>
-        <w:t xml:space="preserve"> </w:t>
+        <w:t xml:space="preserve"> install </w:t>
       </w:r>
       <w:r>
         <w:rPr>
-          <w:rFonts w:ascii="Consolas" w:hAnsi="Consolas" w:eastAsia="Consolas"/>
-          <w:color w:val="D4D4D4"/>
+          <w:rFonts w:ascii="Consolas" w:hAnsi="Consolas"/>
+          <w:color w:val="0073E6"/>
           <w:sz w:val="16"/>
         </w:rPr>
-        <w:t>install</w:t>
+        <w:t xml:space="preserve">--dry-run</w:t>
       </w:r>
       <w:r>
         <w:rPr>
-          <w:rFonts w:ascii="Consolas" w:hAnsi="Consolas" w:eastAsia="Consolas"/>
-          <w:color w:val="D4D4D4"/>
+          <w:rFonts w:ascii="Consolas" w:hAnsi="Consolas"/>
+          <w:color w:val="262626"/>
           <w:sz w:val="16"/>
         </w:rPr>
-        <w:t xml:space="preserve"> </w:t>
+        <w:t xml:space="preserve"> laravel-echo pusher-js</w:t>
       </w:r>
       <w:r>
-        <w:rPr>
-          <w:rFonts w:ascii="Consolas" w:hAnsi="Consolas" w:eastAsia="Consolas"/>
-          <w:color w:val="9CDCFE"/>
-          <w:sz w:val="16"/>
-        </w:rPr>
-        <w:t>--dry-run</w:t>
-      </w:r>
-      <w:r>
-        <w:rPr>
-          <w:rFonts w:ascii="Consolas" w:hAnsi="Consolas" w:eastAsia="Consolas"/>
-          <w:color w:val="D4D4D4"/>
-          <w:sz w:val="16"/>
-        </w:rPr>
-        <w:t xml:space="preserve"> </w:t>
-      </w:r>
-      <w:r>
-        <w:rPr>
-          <w:rFonts w:ascii="Consolas" w:hAnsi="Consolas" w:eastAsia="Consolas"/>
-          <w:color w:val="D4D4D4"/>
-          <w:sz w:val="16"/>
-        </w:rPr>
-        <w:t>laravel-echo</w:t>
-      </w:r>
-      <w:r>
-        <w:rPr>
-          <w:rFonts w:ascii="Consolas" w:hAnsi="Consolas" w:eastAsia="Consolas"/>
-          <w:color w:val="D4D4D4"/>
-          <w:sz w:val="16"/>
-        </w:rPr>
-        <w:t xml:space="preserve"> </w:t>
-      </w:r>
-      <w:r>
-        <w:rPr>
-          <w:rFonts w:ascii="Consolas" w:hAnsi="Consolas" w:eastAsia="Consolas"/>
-          <w:color w:val="D4D4D4"/>
-          <w:sz w:val="16"/>
-        </w:rPr>
-        <w:t>pusher-js</w:t>
-      </w:r>
-      <w:r>
-        <w:rPr>
-          <w:rFonts w:ascii="Consolas" w:hAnsi="Consolas" w:eastAsia="Consolas"/>
-          <w:color w:val="D4D4D4"/>
-          <w:sz w:val="16"/>
-        </w:rPr>
         <w:br/>
       </w:r>
       <w:r>
         <w:rPr>
-          <w:rFonts w:ascii="Consolas" w:hAnsi="Consolas" w:eastAsia="Consolas"/>
-          <w:color w:val="4EC9B0"/>
+          <w:rFonts w:ascii="Consolas" w:hAnsi="Consolas"/>
+          <w:b/>
+          <w:color w:val="000080"/>
           <w:sz w:val="16"/>
         </w:rPr>
-        <w:t>composer</w:t>
+        <w:t xml:space="preserve">composer</w:t>
       </w:r>
       <w:r>
         <w:rPr>
-          <w:rFonts w:ascii="Consolas" w:hAnsi="Consolas" w:eastAsia="Consolas"/>
-          <w:color w:val="D4D4D4"/>
+          <w:rFonts w:ascii="Consolas" w:hAnsi="Consolas"/>
+          <w:color w:val="262626"/>
           <w:sz w:val="16"/>
         </w:rPr>
-        <w:t xml:space="preserve"> </w:t>
+        <w:t xml:space="preserve"> validate </w:t>
       </w:r>
       <w:r>
         <w:rPr>
-          <w:rFonts w:ascii="Consolas" w:hAnsi="Consolas" w:eastAsia="Consolas"/>
-          <w:color w:val="D4D4D4"/>
+          <w:rFonts w:ascii="Consolas" w:hAnsi="Consolas"/>
+          <w:color w:val="0073E6"/>
           <w:sz w:val="16"/>
         </w:rPr>
-        <w:t>validate</w:t>
+        <w:t xml:space="preserve">--strict</w:t>
       </w:r>
       <w:r>
-        <w:rPr>
-          <w:rFonts w:ascii="Consolas" w:hAnsi="Consolas" w:eastAsia="Consolas"/>
-          <w:color w:val="D4D4D4"/>
-          <w:sz w:val="16"/>
-        </w:rPr>
-        <w:t xml:space="preserve"> </w:t>
-      </w:r>
-      <w:r>
-        <w:rPr>
-          <w:rFonts w:ascii="Consolas" w:hAnsi="Consolas" w:eastAsia="Consolas"/>
-          <w:color w:val="9CDCFE"/>
-          <w:sz w:val="16"/>
-        </w:rPr>
-        <w:t>--strict</w:t>
-      </w:r>
-      <w:r>
-        <w:rPr>
-          <w:rFonts w:ascii="Consolas" w:hAnsi="Consolas" w:eastAsia="Consolas"/>
-          <w:color w:val="D4D4D4"/>
-          <w:sz w:val="16"/>
-        </w:rPr>
         <w:br/>
       </w:r>
       <w:r>
         <w:rPr>
-          <w:rFonts w:ascii="Consolas" w:hAnsi="Consolas" w:eastAsia="Consolas"/>
-          <w:color w:val="4EC9B0"/>
+          <w:rFonts w:ascii="Consolas" w:hAnsi="Consolas"/>
+          <w:b/>
+          <w:color w:val="000080"/>
           <w:sz w:val="16"/>
         </w:rPr>
-        <w:t>composer</w:t>
+        <w:t xml:space="preserve">composer</w:t>
       </w:r>
       <w:r>
         <w:rPr>
-          <w:rFonts w:ascii="Consolas" w:hAnsi="Consolas" w:eastAsia="Consolas"/>
-          <w:color w:val="D4D4D4"/>
+          <w:rFonts w:ascii="Consolas" w:hAnsi="Consolas"/>
+          <w:color w:val="262626"/>
           <w:sz w:val="16"/>
         </w:rPr>
-        <w:t xml:space="preserve"> </w:t>
+        <w:t xml:space="preserve"> audit</w:t>
       </w:r>
       <w:r>
-        <w:rPr>
-          <w:rFonts w:ascii="Consolas" w:hAnsi="Consolas" w:eastAsia="Consolas"/>
-          <w:color w:val="D4D4D4"/>
-          <w:sz w:val="16"/>
-        </w:rPr>
-        <w:t>audit</w:t>
-      </w:r>
-      <w:r>
-        <w:rPr>
-          <w:rFonts w:ascii="Consolas" w:hAnsi="Consolas" w:eastAsia="Consolas"/>
-          <w:color w:val="D4D4D4"/>
-          <w:sz w:val="16"/>
-        </w:rPr>
         <w:br/>
       </w:r>
       <w:r>
         <w:rPr>
-          <w:rFonts w:ascii="Consolas" w:hAnsi="Consolas" w:eastAsia="Consolas"/>
-          <w:color w:val="4EC9B0"/>
+          <w:rFonts w:ascii="Consolas" w:hAnsi="Consolas"/>
+          <w:b/>
+          <w:color w:val="000080"/>
           <w:sz w:val="16"/>
         </w:rPr>
-        <w:t>npm</w:t>
+        <w:t xml:space="preserve">npm</w:t>
       </w:r>
       <w:r>
         <w:rPr>
-          <w:rFonts w:ascii="Consolas" w:hAnsi="Consolas" w:eastAsia="Consolas"/>
-          <w:color w:val="D4D4D4"/>
+          <w:rFonts w:ascii="Consolas" w:hAnsi="Consolas"/>
+          <w:color w:val="262626"/>
           <w:sz w:val="16"/>
         </w:rPr>
-        <w:t xml:space="preserve"> </w:t>
-      </w:r>
-      <w:r>
-        <w:rPr>
-          <w:rFonts w:ascii="Consolas" w:hAnsi="Consolas" w:eastAsia="Consolas"/>
-          <w:color w:val="D4D4D4"/>
-          <w:sz w:val="16"/>
-        </w:rPr>
-        <w:t>audit</w:t>
+        <w:t xml:space="preserve"> audit</w:t>
       </w:r>
     </w:p>
     <w:p>
@@ -7909,8 +7776,10 @@
       <w:r>
         <w:rPr>
           <w:rFonts w:ascii="Aptos" w:hAnsi="Aptos"/>
+          <w:color w:val="1F2937"/>
+          <w:sz w:val="19"/>
         </w:rPr>
-        <w:t>Preset dasar yang digunakan adalah compact_reference_guide dengan named override untuk modul pembelajaran: A4 portrait; margin atas 1,65 cm, bawah 1,55 cm, kiri/kanan 1,75 cm; Aptos 10,2 pt; line spacing 1,16; heading beraksen Laravel red; tabel ringkas; callout Predict/Try/Observe; code block Consolas bertema Visual Studio Code Dark+; checklist; exit ticket; serta screenshot mockup UI.</w:t>
+        <w:t xml:space="preserve">Preset dasar yang digunakan adalah compact_reference_guide dengan named override untuk modul pembelajaran: A4 portrait; margin atas 1,65 cm, bawah 1,55 cm, kiri/kanan 1,75 cm; Aptos 10,2 pt; line spacing 1,16; heading beraksen Laravel red; tabel ringkas; callout Predict/Try/Observe; code block Consolas berlatar Cyan Light dengan pewarnaan token Visual Studio Code; checklist; exit ticket; serta screenshot mockup UI.</w:t>
       </w:r>
     </w:p>
     <w:p>
@@ -8491,6 +8360,19 @@
         <w:pStyle w:val="ListBody"/>
       </w:pPr>
       <w:r>
+        <w:rPr>
+          <w:rFonts w:ascii="Aptos" w:hAnsi="Aptos"/>
+          <w:color w:val="1F2937"/>
+          <w:sz w:val="19"/>
+        </w:rPr>
+        <w:t xml:space="preserve">DOC-00-001 — Seluruh blok kode (208 blok, 133 label) memakai latar terang tema Cyan Light (JetBrains) dengan pewarnaan token standar Visual Studio Code untuk PHP, HTML/Blade, cmd, dan bash; teks kode tidak berubah; penjelasan palet di “Cara Membaca Sampel Kode” dan Lampiran diperbarui.</w:t>
+      </w:r>
+    </w:p>
+    <w:p>
+      <w:pPr>
+        <w:pStyle w:val="ListBody"/>
+      </w:pPr>
+      <w:r>
         <w:t xml:space="preserve">DOC-01-001 — Basis dokumen: parameter menyebut v4/v5 yang tidak ada; basis nyata adalah v7. Revisi kumulatif ditulis ke berkas v8; v7 tetap utuh di references/.</w:t>
       </w:r>
     </w:p>
@@ -8869,6 +8751,19 @@
           <w:color w:val="1F2937"/>
           <w:sz w:val="19"/>
         </w:rPr>
+        <w:t xml:space="preserve">DOC-05-007 — Rantai v3 (use case SRS v2): Modul 5 menuntaskan UC-19 (penguncian 5x/10 menit, pesan generik, redirect per peran, sesi 8 jam) dan UC-21 (onboarding penanggung jawab + rekening + tautan atur kata sandi, aktif/nonaktif tenant, riwayat komisi beserta pengelola); ditambahkan deskripsi use case, mockup, Tahap 8, dan output nyata browser.</w:t>
+      </w:r>
+    </w:p>
+    <w:p>
+      <w:pPr>
+        <w:pStyle w:val="ListBody"/>
+      </w:pPr>
+      <w:r>
+        <w:rPr>
+          <w:rFonts w:ascii="Aptos" w:hAnsi="Aptos"/>
+          <w:color w:val="1F2937"/>
+          <w:sz w:val="19"/>
+        </w:rPr>
         <w:t xml:space="preserve">DOC-06-004 — Controller/view/route meja di modul Admin; controller + route publik scan QR di modul Ordering (</w:t>
       </w:r>
       <w:r>
@@ -8934,6 +8829,19 @@
           <w:sz w:val="19"/>
         </w:rPr>
         <w:t xml:space="preserve">DOC-06-005 — Blok BUAT FILE per tahap Modul 6: make:model, make:policy --model, make:controller FQN (termasuk --invokable untuk /q/{token}), make:trait FQN, make:class (OpaqueToken, service Admin/Ordering), make:test --unit; view &amp; route modul manual.</w:t>
+      </w:r>
+    </w:p>
+    <w:p>
+      <w:pPr>
+        <w:pStyle w:val="ListBody"/>
+      </w:pPr>
+      <w:r>
+        <w:rPr>
+          <w:rFonts w:ascii="Aptos" w:hAnsi="Aptos"/>
+          <w:color w:val="1F2937"/>
+          <w:sz w:val="19"/>
+        </w:rPr>
+        <w:t xml:space="preserve">DOC-06-006 — Rantai v3 (use case SRS v2): Modul 6 menuntaskan UC-22 (QR siap cetak SVG via bacon/bacon-qr-code, nonaktif/aktif meja, ringkasan meja) dan UC-02 (halaman sambutan meja + tenant buka/tutup, pesan QR tidak valid, penolakan di luar jam operasional); ditambahkan deskripsi use case, mockup, Tahap 8, dan output nyata browser.</w:t>
       </w:r>
     </w:p>
     <w:sectPr>
@@ -21196,7 +21104,7 @@
     </w:pPr>
     <w:rPr>
       <w:rFonts w:ascii="Consolas" w:hAnsi="Consolas"/>
-      <w:color w:val="D4D4D4"/>
+      <w:color w:val="262626"/>
       <w:sz w:val="16"/>
     </w:rPr>
   </w:style>
@@ -21308,7 +21216,7 @@
     <w:rPr>
       <w:rFonts w:ascii="Consolas" w:hAnsi="Consolas"/>
       <w:b/>
-      <w:color w:val="FFFFFF"/>
+      <w:color w:val="262626"/>
       <w:sz w:val="16"/>
     </w:rPr>
   </w:style>

</xml_diff>

<commit_message>
docs(v8): Modul 7 — use case UC-13, UC-14, UC-01 & UC-11 + langkah Windows (cmd + VS Code)
- Bagian Use Case SRS (deskripsi + mockup #uc-13/#uc-14/#uc-01/#uc-11), Tahap 8, output nyata browser.
- Tahap 1–8 ditulis ulang untuk Windows: perintah cmd dengan output nyata, isi berkas lengkap,
  tanpa ADR; diverifikasi di worktree bersih (Tahap 7 = kode v2 P7, Tahap 8 = kode akhir, 124 test).
- Revision log DOC-07-006/007 (DOC-07-001 selesai), RTM UC-13/14/01/11, status, laporan rantai v3.
- modul_praktikum/ dibuat ulang dari master.

Co-Authored-By: Claude Opus 5.5 <noreply@anthropic.com>
</commit_message>
<xml_diff>
--- a/modul_praktikum/Lampiran.docx
+++ b/modul_praktikum/Lampiran.docx
@@ -3577,92 +3577,175 @@
     <w:p>
       <w:pPr>
         <w:pStyle w:val="CodeBlock"/>
-        <w:shd w:fill="1E1E1E" w:val="clear"/>
         <w:pBdr>
-          <w:left w:val="single" w:sz="4" w:space="8" w:color="1E1E1E"/>
+          <w:left w:val="single" w:sz="12" w:space="8" w:color="B8DDE0"/>
         </w:pBdr>
+        <w:shd w:val="clear" w:color="auto" w:fill="F2F3F7"/>
       </w:pPr>
       <w:r>
         <w:rPr>
           <w:rFonts w:ascii="Consolas" w:hAnsi="Consolas"/>
-          <w:color w:val="4EC9B0"/>
+          <w:b/>
+          <w:color w:val="000080"/>
           <w:sz w:val="16"/>
         </w:rPr>
-        <w:t>php</w:t>
+        <w:t xml:space="preserve">php</w:t>
       </w:r>
       <w:r>
         <w:rPr>
           <w:rFonts w:ascii="Consolas" w:hAnsi="Consolas"/>
-          <w:color w:val="D4D4D4"/>
+          <w:color w:val="262626"/>
           <w:sz w:val="16"/>
         </w:rPr>
-        <w:t xml:space="preserve"> artisan optimize:clear</w:t>
+        <w:t xml:space="preserve"> artisan </w:t>
+      </w:r>
+      <w:r>
+        <w:rPr>
+          <w:rFonts w:ascii="Consolas" w:hAnsi="Consolas"/>
+          <w:color w:val="795E26"/>
+          <w:sz w:val="16"/>
+        </w:rPr>
+        <w:t xml:space="preserve">optimize:clear</w:t>
+      </w:r>
+      <w:r>
         <w:br/>
       </w:r>
       <w:r>
         <w:rPr>
           <w:rFonts w:ascii="Consolas" w:hAnsi="Consolas"/>
-          <w:color w:val="4EC9B0"/>
+          <w:b/>
+          <w:color w:val="000080"/>
           <w:sz w:val="16"/>
         </w:rPr>
-        <w:t>php</w:t>
+        <w:t xml:space="preserve">php</w:t>
       </w:r>
       <w:r>
         <w:rPr>
           <w:rFonts w:ascii="Consolas" w:hAnsi="Consolas"/>
-          <w:color w:val="D4D4D4"/>
+          <w:color w:val="262626"/>
           <w:sz w:val="16"/>
         </w:rPr>
-        <w:t xml:space="preserve"> artisan migrate:fresh --seed --env=testing</w:t>
+        <w:t xml:space="preserve"> artisan </w:t>
+      </w:r>
+      <w:r>
+        <w:rPr>
+          <w:rFonts w:ascii="Consolas" w:hAnsi="Consolas"/>
+          <w:color w:val="795E26"/>
+          <w:sz w:val="16"/>
+        </w:rPr>
+        <w:t xml:space="preserve">migrate:fresh</w:t>
+      </w:r>
+      <w:r>
+        <w:rPr>
+          <w:rFonts w:ascii="Consolas" w:hAnsi="Consolas"/>
+          <w:color w:val="262626"/>
+          <w:sz w:val="16"/>
+        </w:rPr>
+        <w:t xml:space="preserve"> </w:t>
+      </w:r>
+      <w:r>
+        <w:rPr>
+          <w:rFonts w:ascii="Consolas" w:hAnsi="Consolas"/>
+          <w:color w:val="0073E6"/>
+          <w:sz w:val="16"/>
+        </w:rPr>
+        <w:t xml:space="preserve">--seed</w:t>
+      </w:r>
+      <w:r>
+        <w:rPr>
+          <w:rFonts w:ascii="Consolas" w:hAnsi="Consolas"/>
+          <w:color w:val="262626"/>
+          <w:sz w:val="16"/>
+        </w:rPr>
+        <w:t xml:space="preserve"> </w:t>
+      </w:r>
+      <w:r>
+        <w:rPr>
+          <w:rFonts w:ascii="Consolas" w:hAnsi="Consolas"/>
+          <w:color w:val="0073E6"/>
+          <w:sz w:val="16"/>
+        </w:rPr>
+        <w:t xml:space="preserve">--env=testing</w:t>
+      </w:r>
+      <w:r>
         <w:br/>
       </w:r>
       <w:r>
         <w:rPr>
           <w:rFonts w:ascii="Consolas" w:hAnsi="Consolas"/>
-          <w:color w:val="4EC9B0"/>
+          <w:b/>
+          <w:color w:val="000080"/>
           <w:sz w:val="16"/>
         </w:rPr>
-        <w:t>php</w:t>
+        <w:t xml:space="preserve">php</w:t>
       </w:r>
       <w:r>
         <w:rPr>
           <w:rFonts w:ascii="Consolas" w:hAnsi="Consolas"/>
-          <w:color w:val="D4D4D4"/>
+          <w:color w:val="262626"/>
           <w:sz w:val="16"/>
         </w:rPr>
-        <w:t xml:space="preserve"> artisan test --testsuite=</w:t>
+        <w:t xml:space="preserve"> artisan test </w:t>
       </w:r>
       <w:r>
         <w:rPr>
           <w:rFonts w:ascii="Consolas" w:hAnsi="Consolas"/>
-          <w:color w:val="4EC9B0"/>
+          <w:color w:val="0073E6"/>
           <w:sz w:val="16"/>
         </w:rPr>
-        <w:t>Feature</w:t>
+        <w:t xml:space="preserve">--testsuite=Feature</w:t>
       </w:r>
       <w:r>
         <w:rPr>
           <w:rFonts w:ascii="Consolas" w:hAnsi="Consolas"/>
-          <w:color w:val="D4D4D4"/>
+          <w:color w:val="262626"/>
           <w:sz w:val="16"/>
         </w:rPr>
-        <w:t xml:space="preserve"> --stop-on-failure</w:t>
-        <w:br/>
-        <w:t xml:space="preserve">./vendor/bin/pint --test</w:t>
+        <w:t xml:space="preserve"> </w:t>
+      </w:r>
+      <w:r>
+        <w:rPr>
+          <w:rFonts w:ascii="Consolas" w:hAnsi="Consolas"/>
+          <w:color w:val="0073E6"/>
+          <w:sz w:val="16"/>
+        </w:rPr>
+        <w:t xml:space="preserve">--stop-on-failure</w:t>
+      </w:r>
+      <w:r>
         <w:br/>
       </w:r>
       <w:r>
         <w:rPr>
           <w:rFonts w:ascii="Consolas" w:hAnsi="Consolas"/>
-          <w:color w:val="4EC9B0"/>
+          <w:color w:val="262626"/>
           <w:sz w:val="16"/>
         </w:rPr>
-        <w:t>npm</w:t>
+        <w:t xml:space="preserve">./vendor/bin/pint </w:t>
       </w:r>
       <w:r>
         <w:rPr>
           <w:rFonts w:ascii="Consolas" w:hAnsi="Consolas"/>
-          <w:color w:val="D4D4D4"/>
+          <w:color w:val="0073E6"/>
+          <w:sz w:val="16"/>
+        </w:rPr>
+        <w:t xml:space="preserve">--test</w:t>
+      </w:r>
+      <w:r>
+        <w:br/>
+      </w:r>
+      <w:r>
+        <w:rPr>
+          <w:rFonts w:ascii="Consolas" w:hAnsi="Consolas"/>
+          <w:b/>
+          <w:color w:val="000080"/>
+          <w:sz w:val="16"/>
+        </w:rPr>
+        <w:t xml:space="preserve">npm</w:t>
+      </w:r>
+      <w:r>
+        <w:rPr>
+          <w:rFonts w:ascii="Consolas" w:hAnsi="Consolas"/>
+          <w:color w:val="262626"/>
           <w:sz w:val="16"/>
         </w:rPr>
         <w:t xml:space="preserve"> run build</w:t>
@@ -5044,431 +5127,215 @@
     <w:p>
       <w:pPr>
         <w:pStyle w:val="CodeHeader"/>
-        <w:shd w:fill="2D2D30"/>
+        <w:keepNext/>
         <w:pBdr>
-          <w:left w:val="single" w:sz="4" w:space="8" w:color="2D2D30"/>
+          <w:left w:val="single" w:sz="12" w:space="8" w:color="B8DDE0"/>
         </w:pBdr>
+        <w:shd w:val="clear" w:color="auto" w:fill="E4EAED"/>
       </w:pPr>
       <w:r>
-        <w:t>AUDIT KOMPATIBILITAS DEPENDENSI SRS — terminal root proyek   •   BASH</w:t>
+        <w:rPr>
+          <w:rFonts w:ascii="Consolas" w:hAnsi="Consolas"/>
+          <w:b/>
+          <w:color w:val="262626"/>
+          <w:sz w:val="16"/>
+        </w:rPr>
+        <w:t xml:space="preserve">AUDIT KOMPATIBILITAS DEPENDENSI SRS — terminal root proyek   •   BASH</w:t>
       </w:r>
     </w:p>
     <w:p>
       <w:pPr>
         <w:pStyle w:val="CodeBlock"/>
-        <w:shd w:fill="1E1E1E"/>
         <w:keepLines/>
         <w:pBdr>
-          <w:left w:val="single" w:sz="4" w:space="8" w:color="1E1E1E"/>
+          <w:left w:val="single" w:sz="12" w:space="8" w:color="B8DDE0"/>
         </w:pBdr>
+        <w:shd w:val="clear" w:color="auto" w:fill="F2F3F7"/>
       </w:pPr>
       <w:r>
         <w:rPr>
-          <w:rFonts w:ascii="Consolas" w:hAnsi="Consolas" w:eastAsia="Consolas"/>
-          <w:color w:val="4EC9B0"/>
+          <w:rFonts w:ascii="Consolas" w:hAnsi="Consolas"/>
+          <w:b/>
+          <w:color w:val="000080"/>
           <w:sz w:val="16"/>
         </w:rPr>
-        <w:t>composer</w:t>
+        <w:t xml:space="preserve">composer</w:t>
       </w:r>
       <w:r>
         <w:rPr>
-          <w:rFonts w:ascii="Consolas" w:hAnsi="Consolas" w:eastAsia="Consolas"/>
-          <w:color w:val="D4D4D4"/>
+          <w:rFonts w:ascii="Consolas" w:hAnsi="Consolas"/>
+          <w:color w:val="262626"/>
           <w:sz w:val="16"/>
         </w:rPr>
-        <w:t xml:space="preserve"> </w:t>
+        <w:t xml:space="preserve"> require chillerlan/php-qrcode intervention/image-laravel </w:t>
       </w:r>
       <w:r>
         <w:rPr>
-          <w:rFonts w:ascii="Consolas" w:hAnsi="Consolas" w:eastAsia="Consolas"/>
-          <w:color w:val="D4D4D4"/>
+          <w:rFonts w:ascii="Consolas" w:hAnsi="Consolas"/>
+          <w:color w:val="0073E6"/>
           <w:sz w:val="16"/>
         </w:rPr>
-        <w:t>require</w:t>
+        <w:t xml:space="preserve">--dry-run</w:t>
       </w:r>
       <w:r>
-        <w:rPr>
-          <w:rFonts w:ascii="Consolas" w:hAnsi="Consolas" w:eastAsia="Consolas"/>
-          <w:color w:val="D4D4D4"/>
-          <w:sz w:val="16"/>
-        </w:rPr>
-        <w:t xml:space="preserve"> </w:t>
-      </w:r>
-      <w:r>
-        <w:rPr>
-          <w:rFonts w:ascii="Consolas" w:hAnsi="Consolas" w:eastAsia="Consolas"/>
-          <w:color w:val="D4D4D4"/>
-          <w:sz w:val="16"/>
-        </w:rPr>
-        <w:t>chillerlan/php-qrcode</w:t>
-      </w:r>
-      <w:r>
-        <w:rPr>
-          <w:rFonts w:ascii="Consolas" w:hAnsi="Consolas" w:eastAsia="Consolas"/>
-          <w:color w:val="D4D4D4"/>
-          <w:sz w:val="16"/>
-        </w:rPr>
-        <w:t xml:space="preserve"> </w:t>
-      </w:r>
-      <w:r>
-        <w:rPr>
-          <w:rFonts w:ascii="Consolas" w:hAnsi="Consolas" w:eastAsia="Consolas"/>
-          <w:color w:val="D4D4D4"/>
-          <w:sz w:val="16"/>
-        </w:rPr>
-        <w:t>intervention/image-laravel</w:t>
-      </w:r>
-      <w:r>
-        <w:rPr>
-          <w:rFonts w:ascii="Consolas" w:hAnsi="Consolas" w:eastAsia="Consolas"/>
-          <w:color w:val="D4D4D4"/>
-          <w:sz w:val="16"/>
-        </w:rPr>
-        <w:t xml:space="preserve"> </w:t>
-      </w:r>
-      <w:r>
-        <w:rPr>
-          <w:rFonts w:ascii="Consolas" w:hAnsi="Consolas" w:eastAsia="Consolas"/>
-          <w:color w:val="9CDCFE"/>
-          <w:sz w:val="16"/>
-        </w:rPr>
-        <w:t>--dry-run</w:t>
-      </w:r>
-      <w:r>
-        <w:rPr>
-          <w:rFonts w:ascii="Consolas" w:hAnsi="Consolas" w:eastAsia="Consolas"/>
-          <w:color w:val="D4D4D4"/>
-          <w:sz w:val="16"/>
-        </w:rPr>
         <w:br/>
       </w:r>
       <w:r>
         <w:rPr>
-          <w:rFonts w:ascii="Consolas" w:hAnsi="Consolas" w:eastAsia="Consolas"/>
-          <w:color w:val="4EC9B0"/>
+          <w:rFonts w:ascii="Consolas" w:hAnsi="Consolas"/>
+          <w:b/>
+          <w:color w:val="000080"/>
           <w:sz w:val="16"/>
         </w:rPr>
-        <w:t>composer</w:t>
+        <w:t xml:space="preserve">composer</w:t>
       </w:r>
       <w:r>
         <w:rPr>
-          <w:rFonts w:ascii="Consolas" w:hAnsi="Consolas" w:eastAsia="Consolas"/>
-          <w:color w:val="D4D4D4"/>
+          <w:rFonts w:ascii="Consolas" w:hAnsi="Consolas"/>
+          <w:color w:val="262626"/>
           <w:sz w:val="16"/>
         </w:rPr>
-        <w:t xml:space="preserve"> </w:t>
+        <w:t xml:space="preserve"> require maatwebsite/excel barryvdh/laravel-dompdf </w:t>
       </w:r>
       <w:r>
         <w:rPr>
-          <w:rFonts w:ascii="Consolas" w:hAnsi="Consolas" w:eastAsia="Consolas"/>
-          <w:color w:val="D4D4D4"/>
+          <w:rFonts w:ascii="Consolas" w:hAnsi="Consolas"/>
+          <w:color w:val="0073E6"/>
           <w:sz w:val="16"/>
         </w:rPr>
-        <w:t>require</w:t>
+        <w:t xml:space="preserve">--dry-run</w:t>
       </w:r>
       <w:r>
-        <w:rPr>
-          <w:rFonts w:ascii="Consolas" w:hAnsi="Consolas" w:eastAsia="Consolas"/>
-          <w:color w:val="D4D4D4"/>
-          <w:sz w:val="16"/>
-        </w:rPr>
-        <w:t xml:space="preserve"> </w:t>
-      </w:r>
-      <w:r>
-        <w:rPr>
-          <w:rFonts w:ascii="Consolas" w:hAnsi="Consolas" w:eastAsia="Consolas"/>
-          <w:color w:val="D4D4D4"/>
-          <w:sz w:val="16"/>
-        </w:rPr>
-        <w:t>maatwebsite/excel</w:t>
-      </w:r>
-      <w:r>
-        <w:rPr>
-          <w:rFonts w:ascii="Consolas" w:hAnsi="Consolas" w:eastAsia="Consolas"/>
-          <w:color w:val="D4D4D4"/>
-          <w:sz w:val="16"/>
-        </w:rPr>
-        <w:t xml:space="preserve"> </w:t>
-      </w:r>
-      <w:r>
-        <w:rPr>
-          <w:rFonts w:ascii="Consolas" w:hAnsi="Consolas" w:eastAsia="Consolas"/>
-          <w:color w:val="D4D4D4"/>
-          <w:sz w:val="16"/>
-        </w:rPr>
-        <w:t>barryvdh/laravel-dompdf</w:t>
-      </w:r>
-      <w:r>
-        <w:rPr>
-          <w:rFonts w:ascii="Consolas" w:hAnsi="Consolas" w:eastAsia="Consolas"/>
-          <w:color w:val="D4D4D4"/>
-          <w:sz w:val="16"/>
-        </w:rPr>
-        <w:t xml:space="preserve"> </w:t>
-      </w:r>
-      <w:r>
-        <w:rPr>
-          <w:rFonts w:ascii="Consolas" w:hAnsi="Consolas" w:eastAsia="Consolas"/>
-          <w:color w:val="9CDCFE"/>
-          <w:sz w:val="16"/>
-        </w:rPr>
-        <w:t>--dry-run</w:t>
-      </w:r>
-      <w:r>
-        <w:rPr>
-          <w:rFonts w:ascii="Consolas" w:hAnsi="Consolas" w:eastAsia="Consolas"/>
-          <w:color w:val="D4D4D4"/>
-          <w:sz w:val="16"/>
-        </w:rPr>
         <w:br/>
       </w:r>
       <w:r>
         <w:rPr>
-          <w:rFonts w:ascii="Consolas" w:hAnsi="Consolas" w:eastAsia="Consolas"/>
-          <w:color w:val="4EC9B0"/>
+          <w:rFonts w:ascii="Consolas" w:hAnsi="Consolas"/>
+          <w:b/>
+          <w:color w:val="000080"/>
           <w:sz w:val="16"/>
         </w:rPr>
-        <w:t>composer</w:t>
+        <w:t xml:space="preserve">composer</w:t>
       </w:r>
       <w:r>
         <w:rPr>
-          <w:rFonts w:ascii="Consolas" w:hAnsi="Consolas" w:eastAsia="Consolas"/>
-          <w:color w:val="D4D4D4"/>
+          <w:rFonts w:ascii="Consolas" w:hAnsi="Consolas"/>
+          <w:color w:val="262626"/>
           <w:sz w:val="16"/>
         </w:rPr>
-        <w:t xml:space="preserve"> </w:t>
+        <w:t xml:space="preserve"> require laravel-notification-channels/webpush </w:t>
       </w:r>
       <w:r>
         <w:rPr>
-          <w:rFonts w:ascii="Consolas" w:hAnsi="Consolas" w:eastAsia="Consolas"/>
-          <w:color w:val="D4D4D4"/>
+          <w:rFonts w:ascii="Consolas" w:hAnsi="Consolas"/>
+          <w:color w:val="0073E6"/>
           <w:sz w:val="16"/>
         </w:rPr>
-        <w:t>require</w:t>
+        <w:t xml:space="preserve">--dry-run</w:t>
       </w:r>
       <w:r>
-        <w:rPr>
-          <w:rFonts w:ascii="Consolas" w:hAnsi="Consolas" w:eastAsia="Consolas"/>
-          <w:color w:val="D4D4D4"/>
-          <w:sz w:val="16"/>
-        </w:rPr>
-        <w:t xml:space="preserve"> </w:t>
-      </w:r>
-      <w:r>
-        <w:rPr>
-          <w:rFonts w:ascii="Consolas" w:hAnsi="Consolas" w:eastAsia="Consolas"/>
-          <w:color w:val="D4D4D4"/>
-          <w:sz w:val="16"/>
-        </w:rPr>
-        <w:t>laravel-notification-channels/webpush</w:t>
-      </w:r>
-      <w:r>
-        <w:rPr>
-          <w:rFonts w:ascii="Consolas" w:hAnsi="Consolas" w:eastAsia="Consolas"/>
-          <w:color w:val="D4D4D4"/>
-          <w:sz w:val="16"/>
-        </w:rPr>
-        <w:t xml:space="preserve"> </w:t>
-      </w:r>
-      <w:r>
-        <w:rPr>
-          <w:rFonts w:ascii="Consolas" w:hAnsi="Consolas" w:eastAsia="Consolas"/>
-          <w:color w:val="9CDCFE"/>
-          <w:sz w:val="16"/>
-        </w:rPr>
-        <w:t>--dry-run</w:t>
-      </w:r>
-      <w:r>
-        <w:rPr>
-          <w:rFonts w:ascii="Consolas" w:hAnsi="Consolas" w:eastAsia="Consolas"/>
-          <w:color w:val="D4D4D4"/>
-          <w:sz w:val="16"/>
-        </w:rPr>
         <w:br/>
       </w:r>
       <w:r>
         <w:rPr>
-          <w:rFonts w:ascii="Consolas" w:hAnsi="Consolas" w:eastAsia="Consolas"/>
-          <w:color w:val="4EC9B0"/>
+          <w:rFonts w:ascii="Consolas" w:hAnsi="Consolas"/>
+          <w:b/>
+          <w:color w:val="000080"/>
           <w:sz w:val="16"/>
         </w:rPr>
-        <w:t>npm</w:t>
+        <w:t xml:space="preserve">npm</w:t>
       </w:r>
       <w:r>
         <w:rPr>
-          <w:rFonts w:ascii="Consolas" w:hAnsi="Consolas" w:eastAsia="Consolas"/>
-          <w:color w:val="D4D4D4"/>
+          <w:rFonts w:ascii="Consolas" w:hAnsi="Consolas"/>
+          <w:color w:val="262626"/>
           <w:sz w:val="16"/>
         </w:rPr>
-        <w:t xml:space="preserve"> </w:t>
+        <w:t xml:space="preserve"> install </w:t>
       </w:r>
       <w:r>
         <w:rPr>
-          <w:rFonts w:ascii="Consolas" w:hAnsi="Consolas" w:eastAsia="Consolas"/>
-          <w:color w:val="D4D4D4"/>
+          <w:rFonts w:ascii="Consolas" w:hAnsi="Consolas"/>
+          <w:color w:val="0073E6"/>
           <w:sz w:val="16"/>
         </w:rPr>
-        <w:t>install</w:t>
+        <w:t xml:space="preserve">--dry-run</w:t>
       </w:r>
       <w:r>
         <w:rPr>
-          <w:rFonts w:ascii="Consolas" w:hAnsi="Consolas" w:eastAsia="Consolas"/>
-          <w:color w:val="D4D4D4"/>
+          <w:rFonts w:ascii="Consolas" w:hAnsi="Consolas"/>
+          <w:color w:val="262626"/>
           <w:sz w:val="16"/>
         </w:rPr>
-        <w:t xml:space="preserve"> </w:t>
+        <w:t xml:space="preserve"> laravel-echo pusher-js</w:t>
       </w:r>
       <w:r>
-        <w:rPr>
-          <w:rFonts w:ascii="Consolas" w:hAnsi="Consolas" w:eastAsia="Consolas"/>
-          <w:color w:val="9CDCFE"/>
-          <w:sz w:val="16"/>
-        </w:rPr>
-        <w:t>--dry-run</w:t>
-      </w:r>
-      <w:r>
-        <w:rPr>
-          <w:rFonts w:ascii="Consolas" w:hAnsi="Consolas" w:eastAsia="Consolas"/>
-          <w:color w:val="D4D4D4"/>
-          <w:sz w:val="16"/>
-        </w:rPr>
-        <w:t xml:space="preserve"> </w:t>
-      </w:r>
-      <w:r>
-        <w:rPr>
-          <w:rFonts w:ascii="Consolas" w:hAnsi="Consolas" w:eastAsia="Consolas"/>
-          <w:color w:val="D4D4D4"/>
-          <w:sz w:val="16"/>
-        </w:rPr>
-        <w:t>laravel-echo</w:t>
-      </w:r>
-      <w:r>
-        <w:rPr>
-          <w:rFonts w:ascii="Consolas" w:hAnsi="Consolas" w:eastAsia="Consolas"/>
-          <w:color w:val="D4D4D4"/>
-          <w:sz w:val="16"/>
-        </w:rPr>
-        <w:t xml:space="preserve"> </w:t>
-      </w:r>
-      <w:r>
-        <w:rPr>
-          <w:rFonts w:ascii="Consolas" w:hAnsi="Consolas" w:eastAsia="Consolas"/>
-          <w:color w:val="D4D4D4"/>
-          <w:sz w:val="16"/>
-        </w:rPr>
-        <w:t>pusher-js</w:t>
-      </w:r>
-      <w:r>
-        <w:rPr>
-          <w:rFonts w:ascii="Consolas" w:hAnsi="Consolas" w:eastAsia="Consolas"/>
-          <w:color w:val="D4D4D4"/>
-          <w:sz w:val="16"/>
-        </w:rPr>
         <w:br/>
       </w:r>
       <w:r>
         <w:rPr>
-          <w:rFonts w:ascii="Consolas" w:hAnsi="Consolas" w:eastAsia="Consolas"/>
-          <w:color w:val="4EC9B0"/>
+          <w:rFonts w:ascii="Consolas" w:hAnsi="Consolas"/>
+          <w:b/>
+          <w:color w:val="000080"/>
           <w:sz w:val="16"/>
         </w:rPr>
-        <w:t>composer</w:t>
+        <w:t xml:space="preserve">composer</w:t>
       </w:r>
       <w:r>
         <w:rPr>
-          <w:rFonts w:ascii="Consolas" w:hAnsi="Consolas" w:eastAsia="Consolas"/>
-          <w:color w:val="D4D4D4"/>
+          <w:rFonts w:ascii="Consolas" w:hAnsi="Consolas"/>
+          <w:color w:val="262626"/>
           <w:sz w:val="16"/>
         </w:rPr>
-        <w:t xml:space="preserve"> </w:t>
+        <w:t xml:space="preserve"> validate </w:t>
       </w:r>
       <w:r>
         <w:rPr>
-          <w:rFonts w:ascii="Consolas" w:hAnsi="Consolas" w:eastAsia="Consolas"/>
-          <w:color w:val="D4D4D4"/>
+          <w:rFonts w:ascii="Consolas" w:hAnsi="Consolas"/>
+          <w:color w:val="0073E6"/>
           <w:sz w:val="16"/>
         </w:rPr>
-        <w:t>validate</w:t>
+        <w:t xml:space="preserve">--strict</w:t>
       </w:r>
       <w:r>
-        <w:rPr>
-          <w:rFonts w:ascii="Consolas" w:hAnsi="Consolas" w:eastAsia="Consolas"/>
-          <w:color w:val="D4D4D4"/>
-          <w:sz w:val="16"/>
-        </w:rPr>
-        <w:t xml:space="preserve"> </w:t>
-      </w:r>
-      <w:r>
-        <w:rPr>
-          <w:rFonts w:ascii="Consolas" w:hAnsi="Consolas" w:eastAsia="Consolas"/>
-          <w:color w:val="9CDCFE"/>
-          <w:sz w:val="16"/>
-        </w:rPr>
-        <w:t>--strict</w:t>
-      </w:r>
-      <w:r>
-        <w:rPr>
-          <w:rFonts w:ascii="Consolas" w:hAnsi="Consolas" w:eastAsia="Consolas"/>
-          <w:color w:val="D4D4D4"/>
-          <w:sz w:val="16"/>
-        </w:rPr>
         <w:br/>
       </w:r>
       <w:r>
         <w:rPr>
-          <w:rFonts w:ascii="Consolas" w:hAnsi="Consolas" w:eastAsia="Consolas"/>
-          <w:color w:val="4EC9B0"/>
+          <w:rFonts w:ascii="Consolas" w:hAnsi="Consolas"/>
+          <w:b/>
+          <w:color w:val="000080"/>
           <w:sz w:val="16"/>
         </w:rPr>
-        <w:t>composer</w:t>
+        <w:t xml:space="preserve">composer</w:t>
       </w:r>
       <w:r>
         <w:rPr>
-          <w:rFonts w:ascii="Consolas" w:hAnsi="Consolas" w:eastAsia="Consolas"/>
-          <w:color w:val="D4D4D4"/>
+          <w:rFonts w:ascii="Consolas" w:hAnsi="Consolas"/>
+          <w:color w:val="262626"/>
           <w:sz w:val="16"/>
         </w:rPr>
-        <w:t xml:space="preserve"> </w:t>
+        <w:t xml:space="preserve"> audit</w:t>
       </w:r>
       <w:r>
-        <w:rPr>
-          <w:rFonts w:ascii="Consolas" w:hAnsi="Consolas" w:eastAsia="Consolas"/>
-          <w:color w:val="D4D4D4"/>
-          <w:sz w:val="16"/>
-        </w:rPr>
-        <w:t>audit</w:t>
-      </w:r>
-      <w:r>
-        <w:rPr>
-          <w:rFonts w:ascii="Consolas" w:hAnsi="Consolas" w:eastAsia="Consolas"/>
-          <w:color w:val="D4D4D4"/>
-          <w:sz w:val="16"/>
-        </w:rPr>
         <w:br/>
       </w:r>
       <w:r>
         <w:rPr>
-          <w:rFonts w:ascii="Consolas" w:hAnsi="Consolas" w:eastAsia="Consolas"/>
-          <w:color w:val="4EC9B0"/>
+          <w:rFonts w:ascii="Consolas" w:hAnsi="Consolas"/>
+          <w:b/>
+          <w:color w:val="000080"/>
           <w:sz w:val="16"/>
         </w:rPr>
-        <w:t>npm</w:t>
+        <w:t xml:space="preserve">npm</w:t>
       </w:r>
       <w:r>
         <w:rPr>
-          <w:rFonts w:ascii="Consolas" w:hAnsi="Consolas" w:eastAsia="Consolas"/>
-          <w:color w:val="D4D4D4"/>
+          <w:rFonts w:ascii="Consolas" w:hAnsi="Consolas"/>
+          <w:color w:val="262626"/>
           <w:sz w:val="16"/>
         </w:rPr>
-        <w:t xml:space="preserve"> </w:t>
-      </w:r>
-      <w:r>
-        <w:rPr>
-          <w:rFonts w:ascii="Consolas" w:hAnsi="Consolas" w:eastAsia="Consolas"/>
-          <w:color w:val="D4D4D4"/>
-          <w:sz w:val="16"/>
-        </w:rPr>
-        <w:t>audit</w:t>
+        <w:t xml:space="preserve"> audit</w:t>
       </w:r>
     </w:p>
     <w:p>
@@ -7909,8 +7776,10 @@
       <w:r>
         <w:rPr>
           <w:rFonts w:ascii="Aptos" w:hAnsi="Aptos"/>
+          <w:color w:val="1F2937"/>
+          <w:sz w:val="19"/>
         </w:rPr>
-        <w:t>Preset dasar yang digunakan adalah compact_reference_guide dengan named override untuk modul pembelajaran: A4 portrait; margin atas 1,65 cm, bawah 1,55 cm, kiri/kanan 1,75 cm; Aptos 10,2 pt; line spacing 1,16; heading beraksen Laravel red; tabel ringkas; callout Predict/Try/Observe; code block Consolas bertema Visual Studio Code Dark+; checklist; exit ticket; serta screenshot mockup UI.</w:t>
+        <w:t xml:space="preserve">Preset dasar yang digunakan adalah compact_reference_guide dengan named override untuk modul pembelajaran: A4 portrait; margin atas 1,65 cm, bawah 1,55 cm, kiri/kanan 1,75 cm; Aptos 10,2 pt; line spacing 1,16; heading beraksen Laravel red; tabel ringkas; callout Predict/Try/Observe; code block Consolas berlatar Cyan Light dengan pewarnaan token Visual Studio Code; checklist; exit ticket; serta screenshot mockup UI.</w:t>
       </w:r>
     </w:p>
     <w:p>
@@ -8491,6 +8360,19 @@
         <w:pStyle w:val="ListBody"/>
       </w:pPr>
       <w:r>
+        <w:rPr>
+          <w:rFonts w:ascii="Aptos" w:hAnsi="Aptos"/>
+          <w:color w:val="1F2937"/>
+          <w:sz w:val="19"/>
+        </w:rPr>
+        <w:t xml:space="preserve">DOC-00-001 — Seluruh blok kode (208 blok, 133 label) memakai latar terang tema Cyan Light (JetBrains) dengan pewarnaan token standar Visual Studio Code untuk PHP, HTML/Blade, cmd, dan bash; teks kode tidak berubah; penjelasan palet di “Cara Membaca Sampel Kode” dan Lampiran diperbarui.</w:t>
+      </w:r>
+    </w:p>
+    <w:p>
+      <w:pPr>
+        <w:pStyle w:val="ListBody"/>
+      </w:pPr>
+      <w:r>
         <w:t xml:space="preserve">DOC-01-001 — Basis dokumen: parameter menyebut v4/v5 yang tidak ada; basis nyata adalah v7. Revisi kumulatif ditulis ke berkas v8; v7 tetap utuh di references/.</w:t>
       </w:r>
     </w:p>
@@ -8869,6 +8751,19 @@
           <w:color w:val="1F2937"/>
           <w:sz w:val="19"/>
         </w:rPr>
+        <w:t xml:space="preserve">DOC-05-007 — Rantai v3 (use case SRS v2): Modul 5 menuntaskan UC-19 (penguncian 5x/10 menit, pesan generik, redirect per peran, sesi 8 jam) dan UC-21 (onboarding penanggung jawab + rekening + tautan atur kata sandi, aktif/nonaktif tenant, riwayat komisi beserta pengelola); ditambahkan deskripsi use case, mockup, Tahap 8, dan output nyata browser.</w:t>
+      </w:r>
+    </w:p>
+    <w:p>
+      <w:pPr>
+        <w:pStyle w:val="ListBody"/>
+      </w:pPr>
+      <w:r>
+        <w:rPr>
+          <w:rFonts w:ascii="Aptos" w:hAnsi="Aptos"/>
+          <w:color w:val="1F2937"/>
+          <w:sz w:val="19"/>
+        </w:rPr>
         <w:t xml:space="preserve">DOC-06-004 — Controller/view/route meja di modul Admin; controller + route publik scan QR di modul Ordering (</w:t>
       </w:r>
       <w:r>
@@ -8934,6 +8829,19 @@
           <w:sz w:val="19"/>
         </w:rPr>
         <w:t xml:space="preserve">DOC-06-005 — Blok BUAT FILE per tahap Modul 6: make:model, make:policy --model, make:controller FQN (termasuk --invokable untuk /q/{token}), make:trait FQN, make:class (OpaqueToken, service Admin/Ordering), make:test --unit; view &amp; route modul manual.</w:t>
+      </w:r>
+    </w:p>
+    <w:p>
+      <w:pPr>
+        <w:pStyle w:val="ListBody"/>
+      </w:pPr>
+      <w:r>
+        <w:rPr>
+          <w:rFonts w:ascii="Aptos" w:hAnsi="Aptos"/>
+          <w:color w:val="1F2937"/>
+          <w:sz w:val="19"/>
+        </w:rPr>
+        <w:t xml:space="preserve">DOC-06-006 — Rantai v3 (use case SRS v2): Modul 6 menuntaskan UC-22 (QR siap cetak SVG via bacon/bacon-qr-code, nonaktif/aktif meja, ringkasan meja) dan UC-02 (halaman sambutan meja + tenant buka/tutup, pesan QR tidak valid, penolakan di luar jam operasional); ditambahkan deskripsi use case, mockup, Tahap 8, dan output nyata browser.</w:t>
       </w:r>
     </w:p>
     <w:p>
@@ -9028,6 +8936,19 @@
           <w:sz w:val="19"/>
         </w:rPr>
         <w:t xml:space="preserve">DOC-07-005 — Blok BUAT FILE per tahap Modul 7: make:livewire catalog::menu-manager / catalog::menu-catalog (langsung ke folder modul), make:class MenuStockService, make:test; halaman &amp; route modul manual.</w:t>
+      </w:r>
+    </w:p>
+    <w:p>
+      <w:pPr>
+        <w:pStyle w:val="ListBody"/>
+      </w:pPr>
+      <w:r>
+        <w:rPr>
+          <w:rFonts w:ascii="Aptos" w:hAnsi="Aptos"/>
+          <w:color w:val="1F2937"/>
+          <w:sz w:val="19"/>
+        </w:rPr>
+        <w:t xml:space="preserve">DOC-07-006 — Rantai v3 (use case SRS v2): Modul 7 menuntaskan UC-13 (deskripsi, foto WebP, ubah, soft delete, cari/saring), UC-14 (sakelar satu ketukan), UC-01 (kelompok per tenant, menu habis nonaktif, tenant tutup, chip kategori, pembaruan ≤ 5 detik), dan UC-11 (WaitTimeEstimator); ditambahkan deskripsi use case, mockup, Tahap 8, dan output nyata browser.</w:t>
       </w:r>
     </w:p>
     <w:sectPr>
@@ -21290,7 +21211,7 @@
     </w:pPr>
     <w:rPr>
       <w:rFonts w:ascii="Consolas" w:hAnsi="Consolas"/>
-      <w:color w:val="D4D4D4"/>
+      <w:color w:val="262626"/>
       <w:sz w:val="16"/>
     </w:rPr>
   </w:style>
@@ -21402,7 +21323,7 @@
     <w:rPr>
       <w:rFonts w:ascii="Consolas" w:hAnsi="Consolas"/>
       <w:b/>
-      <w:color w:val="FFFFFF"/>
+      <w:color w:val="262626"/>
       <w:sz w:val="16"/>
     </w:rPr>
   </w:style>

</xml_diff>

<commit_message>
docs(v8): Modul 8 — use case UC-03 & UC-04 + langkah Windows (cmd + VS Code)
- Bagian Use Case SRS (deskripsi + mockup #uc-03/#uc-04), Tahap 8, output nyata browser.
- Tahap 1–8 ditulis ulang untuk Windows: perintah cmd dengan output nyata, isi berkas lengkap;
  diverifikasi di worktree bersih (Tahap 7 = kode v2 P8, 140 test; Tahap 8 = kode akhir, 155 test).
- Revision log DOC-08-006/007, RTM UC-03/UC-04, status, laporan rantai v3.
- modul_praktikum/ dibuat ulang dari master.

Co-Authored-By: Claude Opus 5.5 <noreply@anthropic.com>
</commit_message>
<xml_diff>
--- a/modul_praktikum/Lampiran.docx
+++ b/modul_praktikum/Lampiran.docx
@@ -3577,92 +3577,175 @@
     <w:p>
       <w:pPr>
         <w:pStyle w:val="CodeBlock"/>
-        <w:shd w:fill="1E1E1E" w:val="clear"/>
         <w:pBdr>
-          <w:left w:val="single" w:sz="4" w:space="8" w:color="1E1E1E"/>
+          <w:left w:val="single" w:sz="12" w:space="8" w:color="B8DDE0"/>
         </w:pBdr>
+        <w:shd w:val="clear" w:color="auto" w:fill="F2F3F7"/>
       </w:pPr>
       <w:r>
         <w:rPr>
           <w:rFonts w:ascii="Consolas" w:hAnsi="Consolas"/>
-          <w:color w:val="4EC9B0"/>
+          <w:b/>
+          <w:color w:val="000080"/>
           <w:sz w:val="16"/>
         </w:rPr>
-        <w:t>php</w:t>
+        <w:t xml:space="preserve">php</w:t>
       </w:r>
       <w:r>
         <w:rPr>
           <w:rFonts w:ascii="Consolas" w:hAnsi="Consolas"/>
-          <w:color w:val="D4D4D4"/>
+          <w:color w:val="262626"/>
           <w:sz w:val="16"/>
         </w:rPr>
-        <w:t xml:space="preserve"> artisan optimize:clear</w:t>
+        <w:t xml:space="preserve"> artisan </w:t>
+      </w:r>
+      <w:r>
+        <w:rPr>
+          <w:rFonts w:ascii="Consolas" w:hAnsi="Consolas"/>
+          <w:color w:val="795E26"/>
+          <w:sz w:val="16"/>
+        </w:rPr>
+        <w:t xml:space="preserve">optimize:clear</w:t>
+      </w:r>
+      <w:r>
         <w:br/>
       </w:r>
       <w:r>
         <w:rPr>
           <w:rFonts w:ascii="Consolas" w:hAnsi="Consolas"/>
-          <w:color w:val="4EC9B0"/>
+          <w:b/>
+          <w:color w:val="000080"/>
           <w:sz w:val="16"/>
         </w:rPr>
-        <w:t>php</w:t>
+        <w:t xml:space="preserve">php</w:t>
       </w:r>
       <w:r>
         <w:rPr>
           <w:rFonts w:ascii="Consolas" w:hAnsi="Consolas"/>
-          <w:color w:val="D4D4D4"/>
+          <w:color w:val="262626"/>
           <w:sz w:val="16"/>
         </w:rPr>
-        <w:t xml:space="preserve"> artisan migrate:fresh --seed --env=testing</w:t>
+        <w:t xml:space="preserve"> artisan </w:t>
+      </w:r>
+      <w:r>
+        <w:rPr>
+          <w:rFonts w:ascii="Consolas" w:hAnsi="Consolas"/>
+          <w:color w:val="795E26"/>
+          <w:sz w:val="16"/>
+        </w:rPr>
+        <w:t xml:space="preserve">migrate:fresh</w:t>
+      </w:r>
+      <w:r>
+        <w:rPr>
+          <w:rFonts w:ascii="Consolas" w:hAnsi="Consolas"/>
+          <w:color w:val="262626"/>
+          <w:sz w:val="16"/>
+        </w:rPr>
+        <w:t xml:space="preserve"> </w:t>
+      </w:r>
+      <w:r>
+        <w:rPr>
+          <w:rFonts w:ascii="Consolas" w:hAnsi="Consolas"/>
+          <w:color w:val="0073E6"/>
+          <w:sz w:val="16"/>
+        </w:rPr>
+        <w:t xml:space="preserve">--seed</w:t>
+      </w:r>
+      <w:r>
+        <w:rPr>
+          <w:rFonts w:ascii="Consolas" w:hAnsi="Consolas"/>
+          <w:color w:val="262626"/>
+          <w:sz w:val="16"/>
+        </w:rPr>
+        <w:t xml:space="preserve"> </w:t>
+      </w:r>
+      <w:r>
+        <w:rPr>
+          <w:rFonts w:ascii="Consolas" w:hAnsi="Consolas"/>
+          <w:color w:val="0073E6"/>
+          <w:sz w:val="16"/>
+        </w:rPr>
+        <w:t xml:space="preserve">--env=testing</w:t>
+      </w:r>
+      <w:r>
         <w:br/>
       </w:r>
       <w:r>
         <w:rPr>
           <w:rFonts w:ascii="Consolas" w:hAnsi="Consolas"/>
-          <w:color w:val="4EC9B0"/>
+          <w:b/>
+          <w:color w:val="000080"/>
           <w:sz w:val="16"/>
         </w:rPr>
-        <w:t>php</w:t>
+        <w:t xml:space="preserve">php</w:t>
       </w:r>
       <w:r>
         <w:rPr>
           <w:rFonts w:ascii="Consolas" w:hAnsi="Consolas"/>
-          <w:color w:val="D4D4D4"/>
+          <w:color w:val="262626"/>
           <w:sz w:val="16"/>
         </w:rPr>
-        <w:t xml:space="preserve"> artisan test --testsuite=</w:t>
+        <w:t xml:space="preserve"> artisan test </w:t>
       </w:r>
       <w:r>
         <w:rPr>
           <w:rFonts w:ascii="Consolas" w:hAnsi="Consolas"/>
-          <w:color w:val="4EC9B0"/>
+          <w:color w:val="0073E6"/>
           <w:sz w:val="16"/>
         </w:rPr>
-        <w:t>Feature</w:t>
+        <w:t xml:space="preserve">--testsuite=Feature</w:t>
       </w:r>
       <w:r>
         <w:rPr>
           <w:rFonts w:ascii="Consolas" w:hAnsi="Consolas"/>
-          <w:color w:val="D4D4D4"/>
+          <w:color w:val="262626"/>
           <w:sz w:val="16"/>
         </w:rPr>
-        <w:t xml:space="preserve"> --stop-on-failure</w:t>
-        <w:br/>
-        <w:t xml:space="preserve">./vendor/bin/pint --test</w:t>
+        <w:t xml:space="preserve"> </w:t>
+      </w:r>
+      <w:r>
+        <w:rPr>
+          <w:rFonts w:ascii="Consolas" w:hAnsi="Consolas"/>
+          <w:color w:val="0073E6"/>
+          <w:sz w:val="16"/>
+        </w:rPr>
+        <w:t xml:space="preserve">--stop-on-failure</w:t>
+      </w:r>
+      <w:r>
         <w:br/>
       </w:r>
       <w:r>
         <w:rPr>
           <w:rFonts w:ascii="Consolas" w:hAnsi="Consolas"/>
-          <w:color w:val="4EC9B0"/>
+          <w:color w:val="262626"/>
           <w:sz w:val="16"/>
         </w:rPr>
-        <w:t>npm</w:t>
+        <w:t xml:space="preserve">./vendor/bin/pint </w:t>
       </w:r>
       <w:r>
         <w:rPr>
           <w:rFonts w:ascii="Consolas" w:hAnsi="Consolas"/>
-          <w:color w:val="D4D4D4"/>
+          <w:color w:val="0073E6"/>
+          <w:sz w:val="16"/>
+        </w:rPr>
+        <w:t xml:space="preserve">--test</w:t>
+      </w:r>
+      <w:r>
+        <w:br/>
+      </w:r>
+      <w:r>
+        <w:rPr>
+          <w:rFonts w:ascii="Consolas" w:hAnsi="Consolas"/>
+          <w:b/>
+          <w:color w:val="000080"/>
+          <w:sz w:val="16"/>
+        </w:rPr>
+        <w:t xml:space="preserve">npm</w:t>
+      </w:r>
+      <w:r>
+        <w:rPr>
+          <w:rFonts w:ascii="Consolas" w:hAnsi="Consolas"/>
+          <w:color w:val="262626"/>
           <w:sz w:val="16"/>
         </w:rPr>
         <w:t xml:space="preserve"> run build</w:t>
@@ -5044,431 +5127,215 @@
     <w:p>
       <w:pPr>
         <w:pStyle w:val="CodeHeader"/>
-        <w:shd w:fill="2D2D30"/>
+        <w:keepNext/>
         <w:pBdr>
-          <w:left w:val="single" w:sz="4" w:space="8" w:color="2D2D30"/>
+          <w:left w:val="single" w:sz="12" w:space="8" w:color="B8DDE0"/>
         </w:pBdr>
+        <w:shd w:val="clear" w:color="auto" w:fill="E4EAED"/>
       </w:pPr>
       <w:r>
-        <w:t>AUDIT KOMPATIBILITAS DEPENDENSI SRS — terminal root proyek   •   BASH</w:t>
+        <w:rPr>
+          <w:rFonts w:ascii="Consolas" w:hAnsi="Consolas"/>
+          <w:b/>
+          <w:color w:val="262626"/>
+          <w:sz w:val="16"/>
+        </w:rPr>
+        <w:t xml:space="preserve">AUDIT KOMPATIBILITAS DEPENDENSI SRS — terminal root proyek   •   BASH</w:t>
       </w:r>
     </w:p>
     <w:p>
       <w:pPr>
         <w:pStyle w:val="CodeBlock"/>
-        <w:shd w:fill="1E1E1E"/>
         <w:keepLines/>
         <w:pBdr>
-          <w:left w:val="single" w:sz="4" w:space="8" w:color="1E1E1E"/>
+          <w:left w:val="single" w:sz="12" w:space="8" w:color="B8DDE0"/>
         </w:pBdr>
+        <w:shd w:val="clear" w:color="auto" w:fill="F2F3F7"/>
       </w:pPr>
       <w:r>
         <w:rPr>
-          <w:rFonts w:ascii="Consolas" w:hAnsi="Consolas" w:eastAsia="Consolas"/>
-          <w:color w:val="4EC9B0"/>
+          <w:rFonts w:ascii="Consolas" w:hAnsi="Consolas"/>
+          <w:b/>
+          <w:color w:val="000080"/>
           <w:sz w:val="16"/>
         </w:rPr>
-        <w:t>composer</w:t>
+        <w:t xml:space="preserve">composer</w:t>
       </w:r>
       <w:r>
         <w:rPr>
-          <w:rFonts w:ascii="Consolas" w:hAnsi="Consolas" w:eastAsia="Consolas"/>
-          <w:color w:val="D4D4D4"/>
+          <w:rFonts w:ascii="Consolas" w:hAnsi="Consolas"/>
+          <w:color w:val="262626"/>
           <w:sz w:val="16"/>
         </w:rPr>
-        <w:t xml:space="preserve"> </w:t>
+        <w:t xml:space="preserve"> require chillerlan/php-qrcode intervention/image-laravel </w:t>
       </w:r>
       <w:r>
         <w:rPr>
-          <w:rFonts w:ascii="Consolas" w:hAnsi="Consolas" w:eastAsia="Consolas"/>
-          <w:color w:val="D4D4D4"/>
+          <w:rFonts w:ascii="Consolas" w:hAnsi="Consolas"/>
+          <w:color w:val="0073E6"/>
           <w:sz w:val="16"/>
         </w:rPr>
-        <w:t>require</w:t>
+        <w:t xml:space="preserve">--dry-run</w:t>
       </w:r>
       <w:r>
-        <w:rPr>
-          <w:rFonts w:ascii="Consolas" w:hAnsi="Consolas" w:eastAsia="Consolas"/>
-          <w:color w:val="D4D4D4"/>
-          <w:sz w:val="16"/>
-        </w:rPr>
-        <w:t xml:space="preserve"> </w:t>
-      </w:r>
-      <w:r>
-        <w:rPr>
-          <w:rFonts w:ascii="Consolas" w:hAnsi="Consolas" w:eastAsia="Consolas"/>
-          <w:color w:val="D4D4D4"/>
-          <w:sz w:val="16"/>
-        </w:rPr>
-        <w:t>chillerlan/php-qrcode</w:t>
-      </w:r>
-      <w:r>
-        <w:rPr>
-          <w:rFonts w:ascii="Consolas" w:hAnsi="Consolas" w:eastAsia="Consolas"/>
-          <w:color w:val="D4D4D4"/>
-          <w:sz w:val="16"/>
-        </w:rPr>
-        <w:t xml:space="preserve"> </w:t>
-      </w:r>
-      <w:r>
-        <w:rPr>
-          <w:rFonts w:ascii="Consolas" w:hAnsi="Consolas" w:eastAsia="Consolas"/>
-          <w:color w:val="D4D4D4"/>
-          <w:sz w:val="16"/>
-        </w:rPr>
-        <w:t>intervention/image-laravel</w:t>
-      </w:r>
-      <w:r>
-        <w:rPr>
-          <w:rFonts w:ascii="Consolas" w:hAnsi="Consolas" w:eastAsia="Consolas"/>
-          <w:color w:val="D4D4D4"/>
-          <w:sz w:val="16"/>
-        </w:rPr>
-        <w:t xml:space="preserve"> </w:t>
-      </w:r>
-      <w:r>
-        <w:rPr>
-          <w:rFonts w:ascii="Consolas" w:hAnsi="Consolas" w:eastAsia="Consolas"/>
-          <w:color w:val="9CDCFE"/>
-          <w:sz w:val="16"/>
-        </w:rPr>
-        <w:t>--dry-run</w:t>
-      </w:r>
-      <w:r>
-        <w:rPr>
-          <w:rFonts w:ascii="Consolas" w:hAnsi="Consolas" w:eastAsia="Consolas"/>
-          <w:color w:val="D4D4D4"/>
-          <w:sz w:val="16"/>
-        </w:rPr>
         <w:br/>
       </w:r>
       <w:r>
         <w:rPr>
-          <w:rFonts w:ascii="Consolas" w:hAnsi="Consolas" w:eastAsia="Consolas"/>
-          <w:color w:val="4EC9B0"/>
+          <w:rFonts w:ascii="Consolas" w:hAnsi="Consolas"/>
+          <w:b/>
+          <w:color w:val="000080"/>
           <w:sz w:val="16"/>
         </w:rPr>
-        <w:t>composer</w:t>
+        <w:t xml:space="preserve">composer</w:t>
       </w:r>
       <w:r>
         <w:rPr>
-          <w:rFonts w:ascii="Consolas" w:hAnsi="Consolas" w:eastAsia="Consolas"/>
-          <w:color w:val="D4D4D4"/>
+          <w:rFonts w:ascii="Consolas" w:hAnsi="Consolas"/>
+          <w:color w:val="262626"/>
           <w:sz w:val="16"/>
         </w:rPr>
-        <w:t xml:space="preserve"> </w:t>
+        <w:t xml:space="preserve"> require maatwebsite/excel barryvdh/laravel-dompdf </w:t>
       </w:r>
       <w:r>
         <w:rPr>
-          <w:rFonts w:ascii="Consolas" w:hAnsi="Consolas" w:eastAsia="Consolas"/>
-          <w:color w:val="D4D4D4"/>
+          <w:rFonts w:ascii="Consolas" w:hAnsi="Consolas"/>
+          <w:color w:val="0073E6"/>
           <w:sz w:val="16"/>
         </w:rPr>
-        <w:t>require</w:t>
+        <w:t xml:space="preserve">--dry-run</w:t>
       </w:r>
       <w:r>
-        <w:rPr>
-          <w:rFonts w:ascii="Consolas" w:hAnsi="Consolas" w:eastAsia="Consolas"/>
-          <w:color w:val="D4D4D4"/>
-          <w:sz w:val="16"/>
-        </w:rPr>
-        <w:t xml:space="preserve"> </w:t>
-      </w:r>
-      <w:r>
-        <w:rPr>
-          <w:rFonts w:ascii="Consolas" w:hAnsi="Consolas" w:eastAsia="Consolas"/>
-          <w:color w:val="D4D4D4"/>
-          <w:sz w:val="16"/>
-        </w:rPr>
-        <w:t>maatwebsite/excel</w:t>
-      </w:r>
-      <w:r>
-        <w:rPr>
-          <w:rFonts w:ascii="Consolas" w:hAnsi="Consolas" w:eastAsia="Consolas"/>
-          <w:color w:val="D4D4D4"/>
-          <w:sz w:val="16"/>
-        </w:rPr>
-        <w:t xml:space="preserve"> </w:t>
-      </w:r>
-      <w:r>
-        <w:rPr>
-          <w:rFonts w:ascii="Consolas" w:hAnsi="Consolas" w:eastAsia="Consolas"/>
-          <w:color w:val="D4D4D4"/>
-          <w:sz w:val="16"/>
-        </w:rPr>
-        <w:t>barryvdh/laravel-dompdf</w:t>
-      </w:r>
-      <w:r>
-        <w:rPr>
-          <w:rFonts w:ascii="Consolas" w:hAnsi="Consolas" w:eastAsia="Consolas"/>
-          <w:color w:val="D4D4D4"/>
-          <w:sz w:val="16"/>
-        </w:rPr>
-        <w:t xml:space="preserve"> </w:t>
-      </w:r>
-      <w:r>
-        <w:rPr>
-          <w:rFonts w:ascii="Consolas" w:hAnsi="Consolas" w:eastAsia="Consolas"/>
-          <w:color w:val="9CDCFE"/>
-          <w:sz w:val="16"/>
-        </w:rPr>
-        <w:t>--dry-run</w:t>
-      </w:r>
-      <w:r>
-        <w:rPr>
-          <w:rFonts w:ascii="Consolas" w:hAnsi="Consolas" w:eastAsia="Consolas"/>
-          <w:color w:val="D4D4D4"/>
-          <w:sz w:val="16"/>
-        </w:rPr>
         <w:br/>
       </w:r>
       <w:r>
         <w:rPr>
-          <w:rFonts w:ascii="Consolas" w:hAnsi="Consolas" w:eastAsia="Consolas"/>
-          <w:color w:val="4EC9B0"/>
+          <w:rFonts w:ascii="Consolas" w:hAnsi="Consolas"/>
+          <w:b/>
+          <w:color w:val="000080"/>
           <w:sz w:val="16"/>
         </w:rPr>
-        <w:t>composer</w:t>
+        <w:t xml:space="preserve">composer</w:t>
       </w:r>
       <w:r>
         <w:rPr>
-          <w:rFonts w:ascii="Consolas" w:hAnsi="Consolas" w:eastAsia="Consolas"/>
-          <w:color w:val="D4D4D4"/>
+          <w:rFonts w:ascii="Consolas" w:hAnsi="Consolas"/>
+          <w:color w:val="262626"/>
           <w:sz w:val="16"/>
         </w:rPr>
-        <w:t xml:space="preserve"> </w:t>
+        <w:t xml:space="preserve"> require laravel-notification-channels/webpush </w:t>
       </w:r>
       <w:r>
         <w:rPr>
-          <w:rFonts w:ascii="Consolas" w:hAnsi="Consolas" w:eastAsia="Consolas"/>
-          <w:color w:val="D4D4D4"/>
+          <w:rFonts w:ascii="Consolas" w:hAnsi="Consolas"/>
+          <w:color w:val="0073E6"/>
           <w:sz w:val="16"/>
         </w:rPr>
-        <w:t>require</w:t>
+        <w:t xml:space="preserve">--dry-run</w:t>
       </w:r>
       <w:r>
-        <w:rPr>
-          <w:rFonts w:ascii="Consolas" w:hAnsi="Consolas" w:eastAsia="Consolas"/>
-          <w:color w:val="D4D4D4"/>
-          <w:sz w:val="16"/>
-        </w:rPr>
-        <w:t xml:space="preserve"> </w:t>
-      </w:r>
-      <w:r>
-        <w:rPr>
-          <w:rFonts w:ascii="Consolas" w:hAnsi="Consolas" w:eastAsia="Consolas"/>
-          <w:color w:val="D4D4D4"/>
-          <w:sz w:val="16"/>
-        </w:rPr>
-        <w:t>laravel-notification-channels/webpush</w:t>
-      </w:r>
-      <w:r>
-        <w:rPr>
-          <w:rFonts w:ascii="Consolas" w:hAnsi="Consolas" w:eastAsia="Consolas"/>
-          <w:color w:val="D4D4D4"/>
-          <w:sz w:val="16"/>
-        </w:rPr>
-        <w:t xml:space="preserve"> </w:t>
-      </w:r>
-      <w:r>
-        <w:rPr>
-          <w:rFonts w:ascii="Consolas" w:hAnsi="Consolas" w:eastAsia="Consolas"/>
-          <w:color w:val="9CDCFE"/>
-          <w:sz w:val="16"/>
-        </w:rPr>
-        <w:t>--dry-run</w:t>
-      </w:r>
-      <w:r>
-        <w:rPr>
-          <w:rFonts w:ascii="Consolas" w:hAnsi="Consolas" w:eastAsia="Consolas"/>
-          <w:color w:val="D4D4D4"/>
-          <w:sz w:val="16"/>
-        </w:rPr>
         <w:br/>
       </w:r>
       <w:r>
         <w:rPr>
-          <w:rFonts w:ascii="Consolas" w:hAnsi="Consolas" w:eastAsia="Consolas"/>
-          <w:color w:val="4EC9B0"/>
+          <w:rFonts w:ascii="Consolas" w:hAnsi="Consolas"/>
+          <w:b/>
+          <w:color w:val="000080"/>
           <w:sz w:val="16"/>
         </w:rPr>
-        <w:t>npm</w:t>
+        <w:t xml:space="preserve">npm</w:t>
       </w:r>
       <w:r>
         <w:rPr>
-          <w:rFonts w:ascii="Consolas" w:hAnsi="Consolas" w:eastAsia="Consolas"/>
-          <w:color w:val="D4D4D4"/>
+          <w:rFonts w:ascii="Consolas" w:hAnsi="Consolas"/>
+          <w:color w:val="262626"/>
           <w:sz w:val="16"/>
         </w:rPr>
-        <w:t xml:space="preserve"> </w:t>
+        <w:t xml:space="preserve"> install </w:t>
       </w:r>
       <w:r>
         <w:rPr>
-          <w:rFonts w:ascii="Consolas" w:hAnsi="Consolas" w:eastAsia="Consolas"/>
-          <w:color w:val="D4D4D4"/>
+          <w:rFonts w:ascii="Consolas" w:hAnsi="Consolas"/>
+          <w:color w:val="0073E6"/>
           <w:sz w:val="16"/>
         </w:rPr>
-        <w:t>install</w:t>
+        <w:t xml:space="preserve">--dry-run</w:t>
       </w:r>
       <w:r>
         <w:rPr>
-          <w:rFonts w:ascii="Consolas" w:hAnsi="Consolas" w:eastAsia="Consolas"/>
-          <w:color w:val="D4D4D4"/>
+          <w:rFonts w:ascii="Consolas" w:hAnsi="Consolas"/>
+          <w:color w:val="262626"/>
           <w:sz w:val="16"/>
         </w:rPr>
-        <w:t xml:space="preserve"> </w:t>
+        <w:t xml:space="preserve"> laravel-echo pusher-js</w:t>
       </w:r>
       <w:r>
-        <w:rPr>
-          <w:rFonts w:ascii="Consolas" w:hAnsi="Consolas" w:eastAsia="Consolas"/>
-          <w:color w:val="9CDCFE"/>
-          <w:sz w:val="16"/>
-        </w:rPr>
-        <w:t>--dry-run</w:t>
-      </w:r>
-      <w:r>
-        <w:rPr>
-          <w:rFonts w:ascii="Consolas" w:hAnsi="Consolas" w:eastAsia="Consolas"/>
-          <w:color w:val="D4D4D4"/>
-          <w:sz w:val="16"/>
-        </w:rPr>
-        <w:t xml:space="preserve"> </w:t>
-      </w:r>
-      <w:r>
-        <w:rPr>
-          <w:rFonts w:ascii="Consolas" w:hAnsi="Consolas" w:eastAsia="Consolas"/>
-          <w:color w:val="D4D4D4"/>
-          <w:sz w:val="16"/>
-        </w:rPr>
-        <w:t>laravel-echo</w:t>
-      </w:r>
-      <w:r>
-        <w:rPr>
-          <w:rFonts w:ascii="Consolas" w:hAnsi="Consolas" w:eastAsia="Consolas"/>
-          <w:color w:val="D4D4D4"/>
-          <w:sz w:val="16"/>
-        </w:rPr>
-        <w:t xml:space="preserve"> </w:t>
-      </w:r>
-      <w:r>
-        <w:rPr>
-          <w:rFonts w:ascii="Consolas" w:hAnsi="Consolas" w:eastAsia="Consolas"/>
-          <w:color w:val="D4D4D4"/>
-          <w:sz w:val="16"/>
-        </w:rPr>
-        <w:t>pusher-js</w:t>
-      </w:r>
-      <w:r>
-        <w:rPr>
-          <w:rFonts w:ascii="Consolas" w:hAnsi="Consolas" w:eastAsia="Consolas"/>
-          <w:color w:val="D4D4D4"/>
-          <w:sz w:val="16"/>
-        </w:rPr>
         <w:br/>
       </w:r>
       <w:r>
         <w:rPr>
-          <w:rFonts w:ascii="Consolas" w:hAnsi="Consolas" w:eastAsia="Consolas"/>
-          <w:color w:val="4EC9B0"/>
+          <w:rFonts w:ascii="Consolas" w:hAnsi="Consolas"/>
+          <w:b/>
+          <w:color w:val="000080"/>
           <w:sz w:val="16"/>
         </w:rPr>
-        <w:t>composer</w:t>
+        <w:t xml:space="preserve">composer</w:t>
       </w:r>
       <w:r>
         <w:rPr>
-          <w:rFonts w:ascii="Consolas" w:hAnsi="Consolas" w:eastAsia="Consolas"/>
-          <w:color w:val="D4D4D4"/>
+          <w:rFonts w:ascii="Consolas" w:hAnsi="Consolas"/>
+          <w:color w:val="262626"/>
           <w:sz w:val="16"/>
         </w:rPr>
-        <w:t xml:space="preserve"> </w:t>
+        <w:t xml:space="preserve"> validate </w:t>
       </w:r>
       <w:r>
         <w:rPr>
-          <w:rFonts w:ascii="Consolas" w:hAnsi="Consolas" w:eastAsia="Consolas"/>
-          <w:color w:val="D4D4D4"/>
+          <w:rFonts w:ascii="Consolas" w:hAnsi="Consolas"/>
+          <w:color w:val="0073E6"/>
           <w:sz w:val="16"/>
         </w:rPr>
-        <w:t>validate</w:t>
+        <w:t xml:space="preserve">--strict</w:t>
       </w:r>
       <w:r>
-        <w:rPr>
-          <w:rFonts w:ascii="Consolas" w:hAnsi="Consolas" w:eastAsia="Consolas"/>
-          <w:color w:val="D4D4D4"/>
-          <w:sz w:val="16"/>
-        </w:rPr>
-        <w:t xml:space="preserve"> </w:t>
-      </w:r>
-      <w:r>
-        <w:rPr>
-          <w:rFonts w:ascii="Consolas" w:hAnsi="Consolas" w:eastAsia="Consolas"/>
-          <w:color w:val="9CDCFE"/>
-          <w:sz w:val="16"/>
-        </w:rPr>
-        <w:t>--strict</w:t>
-      </w:r>
-      <w:r>
-        <w:rPr>
-          <w:rFonts w:ascii="Consolas" w:hAnsi="Consolas" w:eastAsia="Consolas"/>
-          <w:color w:val="D4D4D4"/>
-          <w:sz w:val="16"/>
-        </w:rPr>
         <w:br/>
       </w:r>
       <w:r>
         <w:rPr>
-          <w:rFonts w:ascii="Consolas" w:hAnsi="Consolas" w:eastAsia="Consolas"/>
-          <w:color w:val="4EC9B0"/>
+          <w:rFonts w:ascii="Consolas" w:hAnsi="Consolas"/>
+          <w:b/>
+          <w:color w:val="000080"/>
           <w:sz w:val="16"/>
         </w:rPr>
-        <w:t>composer</w:t>
+        <w:t xml:space="preserve">composer</w:t>
       </w:r>
       <w:r>
         <w:rPr>
-          <w:rFonts w:ascii="Consolas" w:hAnsi="Consolas" w:eastAsia="Consolas"/>
-          <w:color w:val="D4D4D4"/>
+          <w:rFonts w:ascii="Consolas" w:hAnsi="Consolas"/>
+          <w:color w:val="262626"/>
           <w:sz w:val="16"/>
         </w:rPr>
-        <w:t xml:space="preserve"> </w:t>
+        <w:t xml:space="preserve"> audit</w:t>
       </w:r>
       <w:r>
-        <w:rPr>
-          <w:rFonts w:ascii="Consolas" w:hAnsi="Consolas" w:eastAsia="Consolas"/>
-          <w:color w:val="D4D4D4"/>
-          <w:sz w:val="16"/>
-        </w:rPr>
-        <w:t>audit</w:t>
-      </w:r>
-      <w:r>
-        <w:rPr>
-          <w:rFonts w:ascii="Consolas" w:hAnsi="Consolas" w:eastAsia="Consolas"/>
-          <w:color w:val="D4D4D4"/>
-          <w:sz w:val="16"/>
-        </w:rPr>
         <w:br/>
       </w:r>
       <w:r>
         <w:rPr>
-          <w:rFonts w:ascii="Consolas" w:hAnsi="Consolas" w:eastAsia="Consolas"/>
-          <w:color w:val="4EC9B0"/>
+          <w:rFonts w:ascii="Consolas" w:hAnsi="Consolas"/>
+          <w:b/>
+          <w:color w:val="000080"/>
           <w:sz w:val="16"/>
         </w:rPr>
-        <w:t>npm</w:t>
+        <w:t xml:space="preserve">npm</w:t>
       </w:r>
       <w:r>
         <w:rPr>
-          <w:rFonts w:ascii="Consolas" w:hAnsi="Consolas" w:eastAsia="Consolas"/>
-          <w:color w:val="D4D4D4"/>
+          <w:rFonts w:ascii="Consolas" w:hAnsi="Consolas"/>
+          <w:color w:val="262626"/>
           <w:sz w:val="16"/>
         </w:rPr>
-        <w:t xml:space="preserve"> </w:t>
-      </w:r>
-      <w:r>
-        <w:rPr>
-          <w:rFonts w:ascii="Consolas" w:hAnsi="Consolas" w:eastAsia="Consolas"/>
-          <w:color w:val="D4D4D4"/>
-          <w:sz w:val="16"/>
-        </w:rPr>
-        <w:t>audit</w:t>
+        <w:t xml:space="preserve"> audit</w:t>
       </w:r>
     </w:p>
     <w:p>
@@ -7909,8 +7776,10 @@
       <w:r>
         <w:rPr>
           <w:rFonts w:ascii="Aptos" w:hAnsi="Aptos"/>
+          <w:color w:val="1F2937"/>
+          <w:sz w:val="19"/>
         </w:rPr>
-        <w:t>Preset dasar yang digunakan adalah compact_reference_guide dengan named override untuk modul pembelajaran: A4 portrait; margin atas 1,65 cm, bawah 1,55 cm, kiri/kanan 1,75 cm; Aptos 10,2 pt; line spacing 1,16; heading beraksen Laravel red; tabel ringkas; callout Predict/Try/Observe; code block Consolas bertema Visual Studio Code Dark+; checklist; exit ticket; serta screenshot mockup UI.</w:t>
+        <w:t xml:space="preserve">Preset dasar yang digunakan adalah compact_reference_guide dengan named override untuk modul pembelajaran: A4 portrait; margin atas 1,65 cm, bawah 1,55 cm, kiri/kanan 1,75 cm; Aptos 10,2 pt; line spacing 1,16; heading beraksen Laravel red; tabel ringkas; callout Predict/Try/Observe; code block Consolas berlatar Cyan Light dengan pewarnaan token Visual Studio Code; checklist; exit ticket; serta screenshot mockup UI.</w:t>
       </w:r>
     </w:p>
     <w:p>
@@ -8491,6 +8360,19 @@
         <w:pStyle w:val="ListBody"/>
       </w:pPr>
       <w:r>
+        <w:rPr>
+          <w:rFonts w:ascii="Aptos" w:hAnsi="Aptos"/>
+          <w:color w:val="1F2937"/>
+          <w:sz w:val="19"/>
+        </w:rPr>
+        <w:t xml:space="preserve">DOC-00-001 — Seluruh blok kode (208 blok, 133 label) memakai latar terang tema Cyan Light (JetBrains) dengan pewarnaan token standar Visual Studio Code untuk PHP, HTML/Blade, cmd, dan bash; teks kode tidak berubah; penjelasan palet di “Cara Membaca Sampel Kode” dan Lampiran diperbarui.</w:t>
+      </w:r>
+    </w:p>
+    <w:p>
+      <w:pPr>
+        <w:pStyle w:val="ListBody"/>
+      </w:pPr>
+      <w:r>
         <w:t xml:space="preserve">DOC-01-001 — Basis dokumen: parameter menyebut v4/v5 yang tidak ada; basis nyata adalah v7. Revisi kumulatif ditulis ke berkas v8; v7 tetap utuh di references/.</w:t>
       </w:r>
     </w:p>
@@ -8869,6 +8751,19 @@
           <w:color w:val="1F2937"/>
           <w:sz w:val="19"/>
         </w:rPr>
+        <w:t xml:space="preserve">DOC-05-007 — Rantai v3 (use case SRS v2): Modul 5 menuntaskan UC-19 (penguncian 5x/10 menit, pesan generik, redirect per peran, sesi 8 jam) dan UC-21 (onboarding penanggung jawab + rekening + tautan atur kata sandi, aktif/nonaktif tenant, riwayat komisi beserta pengelola); ditambahkan deskripsi use case, mockup, Tahap 8, dan output nyata browser.</w:t>
+      </w:r>
+    </w:p>
+    <w:p>
+      <w:pPr>
+        <w:pStyle w:val="ListBody"/>
+      </w:pPr>
+      <w:r>
+        <w:rPr>
+          <w:rFonts w:ascii="Aptos" w:hAnsi="Aptos"/>
+          <w:color w:val="1F2937"/>
+          <w:sz w:val="19"/>
+        </w:rPr>
         <w:t xml:space="preserve">DOC-06-004 — Controller/view/route meja di modul Admin; controller + route publik scan QR di modul Ordering (</w:t>
       </w:r>
       <w:r>
@@ -8934,6 +8829,19 @@
           <w:sz w:val="19"/>
         </w:rPr>
         <w:t xml:space="preserve">DOC-06-005 — Blok BUAT FILE per tahap Modul 6: make:model, make:policy --model, make:controller FQN (termasuk --invokable untuk /q/{token}), make:trait FQN, make:class (OpaqueToken, service Admin/Ordering), make:test --unit; view &amp; route modul manual.</w:t>
+      </w:r>
+    </w:p>
+    <w:p>
+      <w:pPr>
+        <w:pStyle w:val="ListBody"/>
+      </w:pPr>
+      <w:r>
+        <w:rPr>
+          <w:rFonts w:ascii="Aptos" w:hAnsi="Aptos"/>
+          <w:color w:val="1F2937"/>
+          <w:sz w:val="19"/>
+        </w:rPr>
+        <w:t xml:space="preserve">DOC-06-006 — Rantai v3 (use case SRS v2): Modul 6 menuntaskan UC-22 (QR siap cetak SVG via bacon/bacon-qr-code, nonaktif/aktif meja, ringkasan meja) dan UC-02 (halaman sambutan meja + tenant buka/tutup, pesan QR tidak valid, penolakan di luar jam operasional); ditambahkan deskripsi use case, mockup, Tahap 8, dan output nyata browser.</w:t>
       </w:r>
     </w:p>
     <w:p>
@@ -9028,6 +8936,19 @@
           <w:sz w:val="19"/>
         </w:rPr>
         <w:t xml:space="preserve">DOC-07-005 — Blok BUAT FILE per tahap Modul 7: make:livewire catalog::menu-manager / catalog::menu-catalog (langsung ke folder modul), make:class MenuStockService, make:test; halaman &amp; route modul manual.</w:t>
+      </w:r>
+    </w:p>
+    <w:p>
+      <w:pPr>
+        <w:pStyle w:val="ListBody"/>
+      </w:pPr>
+      <w:r>
+        <w:rPr>
+          <w:rFonts w:ascii="Aptos" w:hAnsi="Aptos"/>
+          <w:color w:val="1F2937"/>
+          <w:sz w:val="19"/>
+        </w:rPr>
+        <w:t xml:space="preserve">DOC-07-006 — Rantai v3 (use case SRS v2): Modul 7 menuntaskan UC-13 (deskripsi, foto WebP, ubah, soft delete, cari/saring), UC-14 (sakelar satu ketukan), UC-01 (kelompok per tenant, menu habis nonaktif, tenant tutup, chip kategori, pembaruan ≤ 5 detik), dan UC-11 (WaitTimeEstimator); ditambahkan deskripsi use case, mockup, Tahap 8, dan output nyata browser.</w:t>
       </w:r>
     </w:p>
     <w:p>
@@ -9139,6 +9060,19 @@
           <w:sz w:val="19"/>
         </w:rPr>
         <w:t xml:space="preserve">DOC-08-005 — Blok BUAT FILE per tahap Modul 8: make:class (DTO &amp; service), make:exception dengan nama kelas lengkap ke modul Ordering, make:livewire ordering::cart, make:test.</w:t>
+      </w:r>
+    </w:p>
+    <w:p>
+      <w:pPr>
+        <w:pStyle w:val="ListBody"/>
+      </w:pPr>
+      <w:r>
+        <w:rPr>
+          <w:rFonts w:ascii="Aptos" w:hAnsi="Aptos"/>
+          <w:color w:val="1F2937"/>
+          <w:sz w:val="19"/>
+        </w:rPr>
+        <w:t xml:space="preserve">DOC-08-006 — Rantai v3 (use case SRS v2): Modul 8 menuntaskan UC-03 (kelompok per tenant, pajak dan biaya layanan, “Menu telah habis”, checkout nonaktif saat kosong) dan UC-04 (formulir kustomisasi min/maks, opsi habis nonaktif, catatan ≤ 200 karakter tersaring, harga akhir) serta halaman tenant Kelola Modifier; ditambahkan deskripsi use case, mockup, Tahap 8, dan output nyata browser.</w:t>
       </w:r>
     </w:p>
     <w:sectPr>
@@ -21401,7 +21335,7 @@
     </w:pPr>
     <w:rPr>
       <w:rFonts w:ascii="Consolas" w:hAnsi="Consolas"/>
-      <w:color w:val="D4D4D4"/>
+      <w:color w:val="262626"/>
       <w:sz w:val="16"/>
     </w:rPr>
   </w:style>
@@ -21513,7 +21447,7 @@
     <w:rPr>
       <w:rFonts w:ascii="Consolas" w:hAnsi="Consolas"/>
       <w:b/>
-      <w:color w:val="FFFFFF"/>
+      <w:color w:val="262626"/>
       <w:sz w:val="16"/>
     </w:rPr>
   </w:style>

</xml_diff>

<commit_message>
docs(v8): Modul 9 — use case UC-05 & UC-06 + langkah Windows (cmd + VS Code)
- Bagian Use Case SRS (deskripsi + mockup #uc-05/#uc-06), Tahap 8, output nyata browser.
- Tahap 1–8 ditulis ulang untuk Windows: perintah cmd dengan output nyata, isi berkas lengkap;
  diverifikasi di worktree bersih (Tahap 7 = kode v2 P9, 166 test; Tahap 8 = kode akhir, 179 test).
- Revision log DOC-09-006/007, RTM UC-05/UC-06, status, laporan rantai v3.
- modul_praktikum/ dibuat ulang dari master (Modul 1–8 dan 10–14 tidak berubah).

Co-Authored-By: Claude Opus 5.5 <noreply@anthropic.com>
</commit_message>
<xml_diff>
--- a/modul_praktikum/Lampiran.docx
+++ b/modul_praktikum/Lampiran.docx
@@ -3577,92 +3577,175 @@
     <w:p>
       <w:pPr>
         <w:pStyle w:val="CodeBlock"/>
-        <w:shd w:fill="1E1E1E" w:val="clear"/>
         <w:pBdr>
-          <w:left w:val="single" w:sz="4" w:space="8" w:color="1E1E1E"/>
+          <w:left w:val="single" w:sz="12" w:space="8" w:color="B8DDE0"/>
         </w:pBdr>
+        <w:shd w:val="clear" w:color="auto" w:fill="F2F3F7"/>
       </w:pPr>
       <w:r>
         <w:rPr>
           <w:rFonts w:ascii="Consolas" w:hAnsi="Consolas"/>
-          <w:color w:val="4EC9B0"/>
+          <w:b/>
+          <w:color w:val="000080"/>
           <w:sz w:val="16"/>
         </w:rPr>
-        <w:t>php</w:t>
+        <w:t xml:space="preserve">php</w:t>
       </w:r>
       <w:r>
         <w:rPr>
           <w:rFonts w:ascii="Consolas" w:hAnsi="Consolas"/>
-          <w:color w:val="D4D4D4"/>
+          <w:color w:val="262626"/>
           <w:sz w:val="16"/>
         </w:rPr>
-        <w:t xml:space="preserve"> artisan optimize:clear</w:t>
+        <w:t xml:space="preserve"> artisan </w:t>
+      </w:r>
+      <w:r>
+        <w:rPr>
+          <w:rFonts w:ascii="Consolas" w:hAnsi="Consolas"/>
+          <w:color w:val="795E26"/>
+          <w:sz w:val="16"/>
+        </w:rPr>
+        <w:t xml:space="preserve">optimize:clear</w:t>
+      </w:r>
+      <w:r>
         <w:br/>
       </w:r>
       <w:r>
         <w:rPr>
           <w:rFonts w:ascii="Consolas" w:hAnsi="Consolas"/>
-          <w:color w:val="4EC9B0"/>
+          <w:b/>
+          <w:color w:val="000080"/>
           <w:sz w:val="16"/>
         </w:rPr>
-        <w:t>php</w:t>
+        <w:t xml:space="preserve">php</w:t>
       </w:r>
       <w:r>
         <w:rPr>
           <w:rFonts w:ascii="Consolas" w:hAnsi="Consolas"/>
-          <w:color w:val="D4D4D4"/>
+          <w:color w:val="262626"/>
           <w:sz w:val="16"/>
         </w:rPr>
-        <w:t xml:space="preserve"> artisan migrate:fresh --seed --env=testing</w:t>
+        <w:t xml:space="preserve"> artisan </w:t>
+      </w:r>
+      <w:r>
+        <w:rPr>
+          <w:rFonts w:ascii="Consolas" w:hAnsi="Consolas"/>
+          <w:color w:val="795E26"/>
+          <w:sz w:val="16"/>
+        </w:rPr>
+        <w:t xml:space="preserve">migrate:fresh</w:t>
+      </w:r>
+      <w:r>
+        <w:rPr>
+          <w:rFonts w:ascii="Consolas" w:hAnsi="Consolas"/>
+          <w:color w:val="262626"/>
+          <w:sz w:val="16"/>
+        </w:rPr>
+        <w:t xml:space="preserve"> </w:t>
+      </w:r>
+      <w:r>
+        <w:rPr>
+          <w:rFonts w:ascii="Consolas" w:hAnsi="Consolas"/>
+          <w:color w:val="0073E6"/>
+          <w:sz w:val="16"/>
+        </w:rPr>
+        <w:t xml:space="preserve">--seed</w:t>
+      </w:r>
+      <w:r>
+        <w:rPr>
+          <w:rFonts w:ascii="Consolas" w:hAnsi="Consolas"/>
+          <w:color w:val="262626"/>
+          <w:sz w:val="16"/>
+        </w:rPr>
+        <w:t xml:space="preserve"> </w:t>
+      </w:r>
+      <w:r>
+        <w:rPr>
+          <w:rFonts w:ascii="Consolas" w:hAnsi="Consolas"/>
+          <w:color w:val="0073E6"/>
+          <w:sz w:val="16"/>
+        </w:rPr>
+        <w:t xml:space="preserve">--env=testing</w:t>
+      </w:r>
+      <w:r>
         <w:br/>
       </w:r>
       <w:r>
         <w:rPr>
           <w:rFonts w:ascii="Consolas" w:hAnsi="Consolas"/>
-          <w:color w:val="4EC9B0"/>
+          <w:b/>
+          <w:color w:val="000080"/>
           <w:sz w:val="16"/>
         </w:rPr>
-        <w:t>php</w:t>
+        <w:t xml:space="preserve">php</w:t>
       </w:r>
       <w:r>
         <w:rPr>
           <w:rFonts w:ascii="Consolas" w:hAnsi="Consolas"/>
-          <w:color w:val="D4D4D4"/>
+          <w:color w:val="262626"/>
           <w:sz w:val="16"/>
         </w:rPr>
-        <w:t xml:space="preserve"> artisan test --testsuite=</w:t>
+        <w:t xml:space="preserve"> artisan test </w:t>
       </w:r>
       <w:r>
         <w:rPr>
           <w:rFonts w:ascii="Consolas" w:hAnsi="Consolas"/>
-          <w:color w:val="4EC9B0"/>
+          <w:color w:val="0073E6"/>
           <w:sz w:val="16"/>
         </w:rPr>
-        <w:t>Feature</w:t>
+        <w:t xml:space="preserve">--testsuite=Feature</w:t>
       </w:r>
       <w:r>
         <w:rPr>
           <w:rFonts w:ascii="Consolas" w:hAnsi="Consolas"/>
-          <w:color w:val="D4D4D4"/>
+          <w:color w:val="262626"/>
           <w:sz w:val="16"/>
         </w:rPr>
-        <w:t xml:space="preserve"> --stop-on-failure</w:t>
-        <w:br/>
-        <w:t xml:space="preserve">./vendor/bin/pint --test</w:t>
+        <w:t xml:space="preserve"> </w:t>
+      </w:r>
+      <w:r>
+        <w:rPr>
+          <w:rFonts w:ascii="Consolas" w:hAnsi="Consolas"/>
+          <w:color w:val="0073E6"/>
+          <w:sz w:val="16"/>
+        </w:rPr>
+        <w:t xml:space="preserve">--stop-on-failure</w:t>
+      </w:r>
+      <w:r>
         <w:br/>
       </w:r>
       <w:r>
         <w:rPr>
           <w:rFonts w:ascii="Consolas" w:hAnsi="Consolas"/>
-          <w:color w:val="4EC9B0"/>
+          <w:color w:val="262626"/>
           <w:sz w:val="16"/>
         </w:rPr>
-        <w:t>npm</w:t>
+        <w:t xml:space="preserve">./vendor/bin/pint </w:t>
       </w:r>
       <w:r>
         <w:rPr>
           <w:rFonts w:ascii="Consolas" w:hAnsi="Consolas"/>
-          <w:color w:val="D4D4D4"/>
+          <w:color w:val="0073E6"/>
+          <w:sz w:val="16"/>
+        </w:rPr>
+        <w:t xml:space="preserve">--test</w:t>
+      </w:r>
+      <w:r>
+        <w:br/>
+      </w:r>
+      <w:r>
+        <w:rPr>
+          <w:rFonts w:ascii="Consolas" w:hAnsi="Consolas"/>
+          <w:b/>
+          <w:color w:val="000080"/>
+          <w:sz w:val="16"/>
+        </w:rPr>
+        <w:t xml:space="preserve">npm</w:t>
+      </w:r>
+      <w:r>
+        <w:rPr>
+          <w:rFonts w:ascii="Consolas" w:hAnsi="Consolas"/>
+          <w:color w:val="262626"/>
           <w:sz w:val="16"/>
         </w:rPr>
         <w:t xml:space="preserve"> run build</w:t>
@@ -5044,431 +5127,215 @@
     <w:p>
       <w:pPr>
         <w:pStyle w:val="CodeHeader"/>
-        <w:shd w:fill="2D2D30"/>
+        <w:keepNext/>
         <w:pBdr>
-          <w:left w:val="single" w:sz="4" w:space="8" w:color="2D2D30"/>
+          <w:left w:val="single" w:sz="12" w:space="8" w:color="B8DDE0"/>
         </w:pBdr>
+        <w:shd w:val="clear" w:color="auto" w:fill="E4EAED"/>
       </w:pPr>
       <w:r>
-        <w:t>AUDIT KOMPATIBILITAS DEPENDENSI SRS — terminal root proyek   •   BASH</w:t>
+        <w:rPr>
+          <w:rFonts w:ascii="Consolas" w:hAnsi="Consolas"/>
+          <w:b/>
+          <w:color w:val="262626"/>
+          <w:sz w:val="16"/>
+        </w:rPr>
+        <w:t xml:space="preserve">AUDIT KOMPATIBILITAS DEPENDENSI SRS — terminal root proyek   •   BASH</w:t>
       </w:r>
     </w:p>
     <w:p>
       <w:pPr>
         <w:pStyle w:val="CodeBlock"/>
-        <w:shd w:fill="1E1E1E"/>
         <w:keepLines/>
         <w:pBdr>
-          <w:left w:val="single" w:sz="4" w:space="8" w:color="1E1E1E"/>
+          <w:left w:val="single" w:sz="12" w:space="8" w:color="B8DDE0"/>
         </w:pBdr>
+        <w:shd w:val="clear" w:color="auto" w:fill="F2F3F7"/>
       </w:pPr>
       <w:r>
         <w:rPr>
-          <w:rFonts w:ascii="Consolas" w:hAnsi="Consolas" w:eastAsia="Consolas"/>
-          <w:color w:val="4EC9B0"/>
+          <w:rFonts w:ascii="Consolas" w:hAnsi="Consolas"/>
+          <w:b/>
+          <w:color w:val="000080"/>
           <w:sz w:val="16"/>
         </w:rPr>
-        <w:t>composer</w:t>
+        <w:t xml:space="preserve">composer</w:t>
       </w:r>
       <w:r>
         <w:rPr>
-          <w:rFonts w:ascii="Consolas" w:hAnsi="Consolas" w:eastAsia="Consolas"/>
-          <w:color w:val="D4D4D4"/>
+          <w:rFonts w:ascii="Consolas" w:hAnsi="Consolas"/>
+          <w:color w:val="262626"/>
           <w:sz w:val="16"/>
         </w:rPr>
-        <w:t xml:space="preserve"> </w:t>
+        <w:t xml:space="preserve"> require chillerlan/php-qrcode intervention/image-laravel </w:t>
       </w:r>
       <w:r>
         <w:rPr>
-          <w:rFonts w:ascii="Consolas" w:hAnsi="Consolas" w:eastAsia="Consolas"/>
-          <w:color w:val="D4D4D4"/>
+          <w:rFonts w:ascii="Consolas" w:hAnsi="Consolas"/>
+          <w:color w:val="0073E6"/>
           <w:sz w:val="16"/>
         </w:rPr>
-        <w:t>require</w:t>
+        <w:t xml:space="preserve">--dry-run</w:t>
       </w:r>
       <w:r>
-        <w:rPr>
-          <w:rFonts w:ascii="Consolas" w:hAnsi="Consolas" w:eastAsia="Consolas"/>
-          <w:color w:val="D4D4D4"/>
-          <w:sz w:val="16"/>
-        </w:rPr>
-        <w:t xml:space="preserve"> </w:t>
-      </w:r>
-      <w:r>
-        <w:rPr>
-          <w:rFonts w:ascii="Consolas" w:hAnsi="Consolas" w:eastAsia="Consolas"/>
-          <w:color w:val="D4D4D4"/>
-          <w:sz w:val="16"/>
-        </w:rPr>
-        <w:t>chillerlan/php-qrcode</w:t>
-      </w:r>
-      <w:r>
-        <w:rPr>
-          <w:rFonts w:ascii="Consolas" w:hAnsi="Consolas" w:eastAsia="Consolas"/>
-          <w:color w:val="D4D4D4"/>
-          <w:sz w:val="16"/>
-        </w:rPr>
-        <w:t xml:space="preserve"> </w:t>
-      </w:r>
-      <w:r>
-        <w:rPr>
-          <w:rFonts w:ascii="Consolas" w:hAnsi="Consolas" w:eastAsia="Consolas"/>
-          <w:color w:val="D4D4D4"/>
-          <w:sz w:val="16"/>
-        </w:rPr>
-        <w:t>intervention/image-laravel</w:t>
-      </w:r>
-      <w:r>
-        <w:rPr>
-          <w:rFonts w:ascii="Consolas" w:hAnsi="Consolas" w:eastAsia="Consolas"/>
-          <w:color w:val="D4D4D4"/>
-          <w:sz w:val="16"/>
-        </w:rPr>
-        <w:t xml:space="preserve"> </w:t>
-      </w:r>
-      <w:r>
-        <w:rPr>
-          <w:rFonts w:ascii="Consolas" w:hAnsi="Consolas" w:eastAsia="Consolas"/>
-          <w:color w:val="9CDCFE"/>
-          <w:sz w:val="16"/>
-        </w:rPr>
-        <w:t>--dry-run</w:t>
-      </w:r>
-      <w:r>
-        <w:rPr>
-          <w:rFonts w:ascii="Consolas" w:hAnsi="Consolas" w:eastAsia="Consolas"/>
-          <w:color w:val="D4D4D4"/>
-          <w:sz w:val="16"/>
-        </w:rPr>
         <w:br/>
       </w:r>
       <w:r>
         <w:rPr>
-          <w:rFonts w:ascii="Consolas" w:hAnsi="Consolas" w:eastAsia="Consolas"/>
-          <w:color w:val="4EC9B0"/>
+          <w:rFonts w:ascii="Consolas" w:hAnsi="Consolas"/>
+          <w:b/>
+          <w:color w:val="000080"/>
           <w:sz w:val="16"/>
         </w:rPr>
-        <w:t>composer</w:t>
+        <w:t xml:space="preserve">composer</w:t>
       </w:r>
       <w:r>
         <w:rPr>
-          <w:rFonts w:ascii="Consolas" w:hAnsi="Consolas" w:eastAsia="Consolas"/>
-          <w:color w:val="D4D4D4"/>
+          <w:rFonts w:ascii="Consolas" w:hAnsi="Consolas"/>
+          <w:color w:val="262626"/>
           <w:sz w:val="16"/>
         </w:rPr>
-        <w:t xml:space="preserve"> </w:t>
+        <w:t xml:space="preserve"> require maatwebsite/excel barryvdh/laravel-dompdf </w:t>
       </w:r>
       <w:r>
         <w:rPr>
-          <w:rFonts w:ascii="Consolas" w:hAnsi="Consolas" w:eastAsia="Consolas"/>
-          <w:color w:val="D4D4D4"/>
+          <w:rFonts w:ascii="Consolas" w:hAnsi="Consolas"/>
+          <w:color w:val="0073E6"/>
           <w:sz w:val="16"/>
         </w:rPr>
-        <w:t>require</w:t>
+        <w:t xml:space="preserve">--dry-run</w:t>
       </w:r>
       <w:r>
-        <w:rPr>
-          <w:rFonts w:ascii="Consolas" w:hAnsi="Consolas" w:eastAsia="Consolas"/>
-          <w:color w:val="D4D4D4"/>
-          <w:sz w:val="16"/>
-        </w:rPr>
-        <w:t xml:space="preserve"> </w:t>
-      </w:r>
-      <w:r>
-        <w:rPr>
-          <w:rFonts w:ascii="Consolas" w:hAnsi="Consolas" w:eastAsia="Consolas"/>
-          <w:color w:val="D4D4D4"/>
-          <w:sz w:val="16"/>
-        </w:rPr>
-        <w:t>maatwebsite/excel</w:t>
-      </w:r>
-      <w:r>
-        <w:rPr>
-          <w:rFonts w:ascii="Consolas" w:hAnsi="Consolas" w:eastAsia="Consolas"/>
-          <w:color w:val="D4D4D4"/>
-          <w:sz w:val="16"/>
-        </w:rPr>
-        <w:t xml:space="preserve"> </w:t>
-      </w:r>
-      <w:r>
-        <w:rPr>
-          <w:rFonts w:ascii="Consolas" w:hAnsi="Consolas" w:eastAsia="Consolas"/>
-          <w:color w:val="D4D4D4"/>
-          <w:sz w:val="16"/>
-        </w:rPr>
-        <w:t>barryvdh/laravel-dompdf</w:t>
-      </w:r>
-      <w:r>
-        <w:rPr>
-          <w:rFonts w:ascii="Consolas" w:hAnsi="Consolas" w:eastAsia="Consolas"/>
-          <w:color w:val="D4D4D4"/>
-          <w:sz w:val="16"/>
-        </w:rPr>
-        <w:t xml:space="preserve"> </w:t>
-      </w:r>
-      <w:r>
-        <w:rPr>
-          <w:rFonts w:ascii="Consolas" w:hAnsi="Consolas" w:eastAsia="Consolas"/>
-          <w:color w:val="9CDCFE"/>
-          <w:sz w:val="16"/>
-        </w:rPr>
-        <w:t>--dry-run</w:t>
-      </w:r>
-      <w:r>
-        <w:rPr>
-          <w:rFonts w:ascii="Consolas" w:hAnsi="Consolas" w:eastAsia="Consolas"/>
-          <w:color w:val="D4D4D4"/>
-          <w:sz w:val="16"/>
-        </w:rPr>
         <w:br/>
       </w:r>
       <w:r>
         <w:rPr>
-          <w:rFonts w:ascii="Consolas" w:hAnsi="Consolas" w:eastAsia="Consolas"/>
-          <w:color w:val="4EC9B0"/>
+          <w:rFonts w:ascii="Consolas" w:hAnsi="Consolas"/>
+          <w:b/>
+          <w:color w:val="000080"/>
           <w:sz w:val="16"/>
         </w:rPr>
-        <w:t>composer</w:t>
+        <w:t xml:space="preserve">composer</w:t>
       </w:r>
       <w:r>
         <w:rPr>
-          <w:rFonts w:ascii="Consolas" w:hAnsi="Consolas" w:eastAsia="Consolas"/>
-          <w:color w:val="D4D4D4"/>
+          <w:rFonts w:ascii="Consolas" w:hAnsi="Consolas"/>
+          <w:color w:val="262626"/>
           <w:sz w:val="16"/>
         </w:rPr>
-        <w:t xml:space="preserve"> </w:t>
+        <w:t xml:space="preserve"> require laravel-notification-channels/webpush </w:t>
       </w:r>
       <w:r>
         <w:rPr>
-          <w:rFonts w:ascii="Consolas" w:hAnsi="Consolas" w:eastAsia="Consolas"/>
-          <w:color w:val="D4D4D4"/>
+          <w:rFonts w:ascii="Consolas" w:hAnsi="Consolas"/>
+          <w:color w:val="0073E6"/>
           <w:sz w:val="16"/>
         </w:rPr>
-        <w:t>require</w:t>
+        <w:t xml:space="preserve">--dry-run</w:t>
       </w:r>
       <w:r>
-        <w:rPr>
-          <w:rFonts w:ascii="Consolas" w:hAnsi="Consolas" w:eastAsia="Consolas"/>
-          <w:color w:val="D4D4D4"/>
-          <w:sz w:val="16"/>
-        </w:rPr>
-        <w:t xml:space="preserve"> </w:t>
-      </w:r>
-      <w:r>
-        <w:rPr>
-          <w:rFonts w:ascii="Consolas" w:hAnsi="Consolas" w:eastAsia="Consolas"/>
-          <w:color w:val="D4D4D4"/>
-          <w:sz w:val="16"/>
-        </w:rPr>
-        <w:t>laravel-notification-channels/webpush</w:t>
-      </w:r>
-      <w:r>
-        <w:rPr>
-          <w:rFonts w:ascii="Consolas" w:hAnsi="Consolas" w:eastAsia="Consolas"/>
-          <w:color w:val="D4D4D4"/>
-          <w:sz w:val="16"/>
-        </w:rPr>
-        <w:t xml:space="preserve"> </w:t>
-      </w:r>
-      <w:r>
-        <w:rPr>
-          <w:rFonts w:ascii="Consolas" w:hAnsi="Consolas" w:eastAsia="Consolas"/>
-          <w:color w:val="9CDCFE"/>
-          <w:sz w:val="16"/>
-        </w:rPr>
-        <w:t>--dry-run</w:t>
-      </w:r>
-      <w:r>
-        <w:rPr>
-          <w:rFonts w:ascii="Consolas" w:hAnsi="Consolas" w:eastAsia="Consolas"/>
-          <w:color w:val="D4D4D4"/>
-          <w:sz w:val="16"/>
-        </w:rPr>
         <w:br/>
       </w:r>
       <w:r>
         <w:rPr>
-          <w:rFonts w:ascii="Consolas" w:hAnsi="Consolas" w:eastAsia="Consolas"/>
-          <w:color w:val="4EC9B0"/>
+          <w:rFonts w:ascii="Consolas" w:hAnsi="Consolas"/>
+          <w:b/>
+          <w:color w:val="000080"/>
           <w:sz w:val="16"/>
         </w:rPr>
-        <w:t>npm</w:t>
+        <w:t xml:space="preserve">npm</w:t>
       </w:r>
       <w:r>
         <w:rPr>
-          <w:rFonts w:ascii="Consolas" w:hAnsi="Consolas" w:eastAsia="Consolas"/>
-          <w:color w:val="D4D4D4"/>
+          <w:rFonts w:ascii="Consolas" w:hAnsi="Consolas"/>
+          <w:color w:val="262626"/>
           <w:sz w:val="16"/>
         </w:rPr>
-        <w:t xml:space="preserve"> </w:t>
+        <w:t xml:space="preserve"> install </w:t>
       </w:r>
       <w:r>
         <w:rPr>
-          <w:rFonts w:ascii="Consolas" w:hAnsi="Consolas" w:eastAsia="Consolas"/>
-          <w:color w:val="D4D4D4"/>
+          <w:rFonts w:ascii="Consolas" w:hAnsi="Consolas"/>
+          <w:color w:val="0073E6"/>
           <w:sz w:val="16"/>
         </w:rPr>
-        <w:t>install</w:t>
+        <w:t xml:space="preserve">--dry-run</w:t>
       </w:r>
       <w:r>
         <w:rPr>
-          <w:rFonts w:ascii="Consolas" w:hAnsi="Consolas" w:eastAsia="Consolas"/>
-          <w:color w:val="D4D4D4"/>
+          <w:rFonts w:ascii="Consolas" w:hAnsi="Consolas"/>
+          <w:color w:val="262626"/>
           <w:sz w:val="16"/>
         </w:rPr>
-        <w:t xml:space="preserve"> </w:t>
+        <w:t xml:space="preserve"> laravel-echo pusher-js</w:t>
       </w:r>
       <w:r>
-        <w:rPr>
-          <w:rFonts w:ascii="Consolas" w:hAnsi="Consolas" w:eastAsia="Consolas"/>
-          <w:color w:val="9CDCFE"/>
-          <w:sz w:val="16"/>
-        </w:rPr>
-        <w:t>--dry-run</w:t>
-      </w:r>
-      <w:r>
-        <w:rPr>
-          <w:rFonts w:ascii="Consolas" w:hAnsi="Consolas" w:eastAsia="Consolas"/>
-          <w:color w:val="D4D4D4"/>
-          <w:sz w:val="16"/>
-        </w:rPr>
-        <w:t xml:space="preserve"> </w:t>
-      </w:r>
-      <w:r>
-        <w:rPr>
-          <w:rFonts w:ascii="Consolas" w:hAnsi="Consolas" w:eastAsia="Consolas"/>
-          <w:color w:val="D4D4D4"/>
-          <w:sz w:val="16"/>
-        </w:rPr>
-        <w:t>laravel-echo</w:t>
-      </w:r>
-      <w:r>
-        <w:rPr>
-          <w:rFonts w:ascii="Consolas" w:hAnsi="Consolas" w:eastAsia="Consolas"/>
-          <w:color w:val="D4D4D4"/>
-          <w:sz w:val="16"/>
-        </w:rPr>
-        <w:t xml:space="preserve"> </w:t>
-      </w:r>
-      <w:r>
-        <w:rPr>
-          <w:rFonts w:ascii="Consolas" w:hAnsi="Consolas" w:eastAsia="Consolas"/>
-          <w:color w:val="D4D4D4"/>
-          <w:sz w:val="16"/>
-        </w:rPr>
-        <w:t>pusher-js</w:t>
-      </w:r>
-      <w:r>
-        <w:rPr>
-          <w:rFonts w:ascii="Consolas" w:hAnsi="Consolas" w:eastAsia="Consolas"/>
-          <w:color w:val="D4D4D4"/>
-          <w:sz w:val="16"/>
-        </w:rPr>
         <w:br/>
       </w:r>
       <w:r>
         <w:rPr>
-          <w:rFonts w:ascii="Consolas" w:hAnsi="Consolas" w:eastAsia="Consolas"/>
-          <w:color w:val="4EC9B0"/>
+          <w:rFonts w:ascii="Consolas" w:hAnsi="Consolas"/>
+          <w:b/>
+          <w:color w:val="000080"/>
           <w:sz w:val="16"/>
         </w:rPr>
-        <w:t>composer</w:t>
+        <w:t xml:space="preserve">composer</w:t>
       </w:r>
       <w:r>
         <w:rPr>
-          <w:rFonts w:ascii="Consolas" w:hAnsi="Consolas" w:eastAsia="Consolas"/>
-          <w:color w:val="D4D4D4"/>
+          <w:rFonts w:ascii="Consolas" w:hAnsi="Consolas"/>
+          <w:color w:val="262626"/>
           <w:sz w:val="16"/>
         </w:rPr>
-        <w:t xml:space="preserve"> </w:t>
+        <w:t xml:space="preserve"> validate </w:t>
       </w:r>
       <w:r>
         <w:rPr>
-          <w:rFonts w:ascii="Consolas" w:hAnsi="Consolas" w:eastAsia="Consolas"/>
-          <w:color w:val="D4D4D4"/>
+          <w:rFonts w:ascii="Consolas" w:hAnsi="Consolas"/>
+          <w:color w:val="0073E6"/>
           <w:sz w:val="16"/>
         </w:rPr>
-        <w:t>validate</w:t>
+        <w:t xml:space="preserve">--strict</w:t>
       </w:r>
       <w:r>
-        <w:rPr>
-          <w:rFonts w:ascii="Consolas" w:hAnsi="Consolas" w:eastAsia="Consolas"/>
-          <w:color w:val="D4D4D4"/>
-          <w:sz w:val="16"/>
-        </w:rPr>
-        <w:t xml:space="preserve"> </w:t>
-      </w:r>
-      <w:r>
-        <w:rPr>
-          <w:rFonts w:ascii="Consolas" w:hAnsi="Consolas" w:eastAsia="Consolas"/>
-          <w:color w:val="9CDCFE"/>
-          <w:sz w:val="16"/>
-        </w:rPr>
-        <w:t>--strict</w:t>
-      </w:r>
-      <w:r>
-        <w:rPr>
-          <w:rFonts w:ascii="Consolas" w:hAnsi="Consolas" w:eastAsia="Consolas"/>
-          <w:color w:val="D4D4D4"/>
-          <w:sz w:val="16"/>
-        </w:rPr>
         <w:br/>
       </w:r>
       <w:r>
         <w:rPr>
-          <w:rFonts w:ascii="Consolas" w:hAnsi="Consolas" w:eastAsia="Consolas"/>
-          <w:color w:val="4EC9B0"/>
+          <w:rFonts w:ascii="Consolas" w:hAnsi="Consolas"/>
+          <w:b/>
+          <w:color w:val="000080"/>
           <w:sz w:val="16"/>
         </w:rPr>
-        <w:t>composer</w:t>
+        <w:t xml:space="preserve">composer</w:t>
       </w:r>
       <w:r>
         <w:rPr>
-          <w:rFonts w:ascii="Consolas" w:hAnsi="Consolas" w:eastAsia="Consolas"/>
-          <w:color w:val="D4D4D4"/>
+          <w:rFonts w:ascii="Consolas" w:hAnsi="Consolas"/>
+          <w:color w:val="262626"/>
           <w:sz w:val="16"/>
         </w:rPr>
-        <w:t xml:space="preserve"> </w:t>
+        <w:t xml:space="preserve"> audit</w:t>
       </w:r>
       <w:r>
-        <w:rPr>
-          <w:rFonts w:ascii="Consolas" w:hAnsi="Consolas" w:eastAsia="Consolas"/>
-          <w:color w:val="D4D4D4"/>
-          <w:sz w:val="16"/>
-        </w:rPr>
-        <w:t>audit</w:t>
-      </w:r>
-      <w:r>
-        <w:rPr>
-          <w:rFonts w:ascii="Consolas" w:hAnsi="Consolas" w:eastAsia="Consolas"/>
-          <w:color w:val="D4D4D4"/>
-          <w:sz w:val="16"/>
-        </w:rPr>
         <w:br/>
       </w:r>
       <w:r>
         <w:rPr>
-          <w:rFonts w:ascii="Consolas" w:hAnsi="Consolas" w:eastAsia="Consolas"/>
-          <w:color w:val="4EC9B0"/>
+          <w:rFonts w:ascii="Consolas" w:hAnsi="Consolas"/>
+          <w:b/>
+          <w:color w:val="000080"/>
           <w:sz w:val="16"/>
         </w:rPr>
-        <w:t>npm</w:t>
+        <w:t xml:space="preserve">npm</w:t>
       </w:r>
       <w:r>
         <w:rPr>
-          <w:rFonts w:ascii="Consolas" w:hAnsi="Consolas" w:eastAsia="Consolas"/>
-          <w:color w:val="D4D4D4"/>
+          <w:rFonts w:ascii="Consolas" w:hAnsi="Consolas"/>
+          <w:color w:val="262626"/>
           <w:sz w:val="16"/>
         </w:rPr>
-        <w:t xml:space="preserve"> </w:t>
-      </w:r>
-      <w:r>
-        <w:rPr>
-          <w:rFonts w:ascii="Consolas" w:hAnsi="Consolas" w:eastAsia="Consolas"/>
-          <w:color w:val="D4D4D4"/>
-          <w:sz w:val="16"/>
-        </w:rPr>
-        <w:t>audit</w:t>
+        <w:t xml:space="preserve"> audit</w:t>
       </w:r>
     </w:p>
     <w:p>
@@ -7909,8 +7776,10 @@
       <w:r>
         <w:rPr>
           <w:rFonts w:ascii="Aptos" w:hAnsi="Aptos"/>
+          <w:color w:val="1F2937"/>
+          <w:sz w:val="19"/>
         </w:rPr>
-        <w:t>Preset dasar yang digunakan adalah compact_reference_guide dengan named override untuk modul pembelajaran: A4 portrait; margin atas 1,65 cm, bawah 1,55 cm, kiri/kanan 1,75 cm; Aptos 10,2 pt; line spacing 1,16; heading beraksen Laravel red; tabel ringkas; callout Predict/Try/Observe; code block Consolas bertema Visual Studio Code Dark+; checklist; exit ticket; serta screenshot mockup UI.</w:t>
+        <w:t xml:space="preserve">Preset dasar yang digunakan adalah compact_reference_guide dengan named override untuk modul pembelajaran: A4 portrait; margin atas 1,65 cm, bawah 1,55 cm, kiri/kanan 1,75 cm; Aptos 10,2 pt; line spacing 1,16; heading beraksen Laravel red; tabel ringkas; callout Predict/Try/Observe; code block Consolas berlatar Cyan Light dengan pewarnaan token Visual Studio Code; checklist; exit ticket; serta screenshot mockup UI.</w:t>
       </w:r>
     </w:p>
     <w:p>
@@ -8491,6 +8360,19 @@
         <w:pStyle w:val="ListBody"/>
       </w:pPr>
       <w:r>
+        <w:rPr>
+          <w:rFonts w:ascii="Aptos" w:hAnsi="Aptos"/>
+          <w:color w:val="1F2937"/>
+          <w:sz w:val="19"/>
+        </w:rPr>
+        <w:t xml:space="preserve">DOC-00-001 — Seluruh blok kode (208 blok, 133 label) memakai latar terang tema Cyan Light (JetBrains) dengan pewarnaan token standar Visual Studio Code untuk PHP, HTML/Blade, cmd, dan bash; teks kode tidak berubah; penjelasan palet di “Cara Membaca Sampel Kode” dan Lampiran diperbarui.</w:t>
+      </w:r>
+    </w:p>
+    <w:p>
+      <w:pPr>
+        <w:pStyle w:val="ListBody"/>
+      </w:pPr>
+      <w:r>
         <w:t xml:space="preserve">DOC-01-001 — Basis dokumen: parameter menyebut v4/v5 yang tidak ada; basis nyata adalah v7. Revisi kumulatif ditulis ke berkas v8; v7 tetap utuh di references/.</w:t>
       </w:r>
     </w:p>
@@ -8869,6 +8751,19 @@
           <w:color w:val="1F2937"/>
           <w:sz w:val="19"/>
         </w:rPr>
+        <w:t xml:space="preserve">DOC-05-007 — Rantai v3 (use case SRS v2): Modul 5 menuntaskan UC-19 (penguncian 5x/10 menit, pesan generik, redirect per peran, sesi 8 jam) dan UC-21 (onboarding penanggung jawab + rekening + tautan atur kata sandi, aktif/nonaktif tenant, riwayat komisi beserta pengelola); ditambahkan deskripsi use case, mockup, Tahap 8, dan output nyata browser.</w:t>
+      </w:r>
+    </w:p>
+    <w:p>
+      <w:pPr>
+        <w:pStyle w:val="ListBody"/>
+      </w:pPr>
+      <w:r>
+        <w:rPr>
+          <w:rFonts w:ascii="Aptos" w:hAnsi="Aptos"/>
+          <w:color w:val="1F2937"/>
+          <w:sz w:val="19"/>
+        </w:rPr>
         <w:t xml:space="preserve">DOC-06-004 — Controller/view/route meja di modul Admin; controller + route publik scan QR di modul Ordering (</w:t>
       </w:r>
       <w:r>
@@ -8934,6 +8829,19 @@
           <w:sz w:val="19"/>
         </w:rPr>
         <w:t xml:space="preserve">DOC-06-005 — Blok BUAT FILE per tahap Modul 6: make:model, make:policy --model, make:controller FQN (termasuk --invokable untuk /q/{token}), make:trait FQN, make:class (OpaqueToken, service Admin/Ordering), make:test --unit; view &amp; route modul manual.</w:t>
+      </w:r>
+    </w:p>
+    <w:p>
+      <w:pPr>
+        <w:pStyle w:val="ListBody"/>
+      </w:pPr>
+      <w:r>
+        <w:rPr>
+          <w:rFonts w:ascii="Aptos" w:hAnsi="Aptos"/>
+          <w:color w:val="1F2937"/>
+          <w:sz w:val="19"/>
+        </w:rPr>
+        <w:t xml:space="preserve">DOC-06-006 — Rantai v3 (use case SRS v2): Modul 6 menuntaskan UC-22 (QR siap cetak SVG via bacon/bacon-qr-code, nonaktif/aktif meja, ringkasan meja) dan UC-02 (halaman sambutan meja + tenant buka/tutup, pesan QR tidak valid, penolakan di luar jam operasional); ditambahkan deskripsi use case, mockup, Tahap 8, dan output nyata browser.</w:t>
       </w:r>
     </w:p>
     <w:p>
@@ -9028,6 +8936,19 @@
           <w:sz w:val="19"/>
         </w:rPr>
         <w:t xml:space="preserve">DOC-07-005 — Blok BUAT FILE per tahap Modul 7: make:livewire catalog::menu-manager / catalog::menu-catalog (langsung ke folder modul), make:class MenuStockService, make:test; halaman &amp; route modul manual.</w:t>
+      </w:r>
+    </w:p>
+    <w:p>
+      <w:pPr>
+        <w:pStyle w:val="ListBody"/>
+      </w:pPr>
+      <w:r>
+        <w:rPr>
+          <w:rFonts w:ascii="Aptos" w:hAnsi="Aptos"/>
+          <w:color w:val="1F2937"/>
+          <w:sz w:val="19"/>
+        </w:rPr>
+        <w:t xml:space="preserve">DOC-07-006 — Rantai v3 (use case SRS v2): Modul 7 menuntaskan UC-13 (deskripsi, foto WebP, ubah, soft delete, cari/saring), UC-14 (sakelar satu ketukan), UC-01 (kelompok per tenant, menu habis nonaktif, tenant tutup, chip kategori, pembaruan ≤ 5 detik), dan UC-11 (WaitTimeEstimator); ditambahkan deskripsi use case, mockup, Tahap 8, dan output nyata browser.</w:t>
       </w:r>
     </w:p>
     <w:p>
@@ -9151,6 +9072,19 @@
           <w:color w:val="1F2937"/>
           <w:sz w:val="19"/>
         </w:rPr>
+        <w:t xml:space="preserve">DOC-08-006 — Rantai v3 (use case SRS v2): Modul 8 menuntaskan UC-03 (kelompok per tenant, pajak dan biaya layanan, “Menu telah habis”, checkout nonaktif saat kosong) dan UC-04 (formulir kustomisasi min/maks, opsi habis nonaktif, catatan ≤ 200 karakter tersaring, harga akhir) serta halaman tenant Kelola Modifier; ditambahkan deskripsi use case, mockup, Tahap 8, dan output nyata browser.</w:t>
+      </w:r>
+    </w:p>
+    <w:p>
+      <w:pPr>
+        <w:pStyle w:val="ListBody"/>
+      </w:pPr>
+      <w:r>
+        <w:rPr>
+          <w:rFonts w:ascii="Aptos" w:hAnsi="Aptos"/>
+          <w:color w:val="1F2937"/>
+          <w:sz w:val="19"/>
+        </w:rPr>
         <w:t xml:space="preserve">DOC-09-004 — Checkout dan status pesanan sebagai vertical slice modul Ordering (</w:t>
       </w:r>
       <w:r>
@@ -9250,6 +9184,19 @@
           <w:sz w:val="19"/>
         </w:rPr>
         <w:t xml:space="preserve">DOC-09-005 — Blok BUAT FILE per tahap Modul 9: make:class (DTO CheckoutResult, CheckoutService), make:exception FQN, make:model OrderItemModifier, make:controller FQN --invokable, make:test; view &amp; route pelanggan modul manual.</w:t>
+      </w:r>
+    </w:p>
+    <w:p>
+      <w:pPr>
+        <w:pStyle w:val="ListBody"/>
+      </w:pPr>
+      <w:r>
+        <w:rPr>
+          <w:rFonts w:ascii="Aptos" w:hAnsi="Aptos"/>
+          <w:color w:val="1F2937"/>
+          <w:sz w:val="19"/>
+        </w:rPr>
+        <w:t xml:space="preserve">DOC-09-006 — Rantai v3 (use case SRS v2): Modul 9 menuntaskan UC-05 (halaman checkout: ringkasan, nomor meja, mode penyajian, identitas ringkas, tenant wajib buka, kembali ke keranjang bila item bermasalah, catatan item tersimpan) dan UC-06 (slot pre-order 15 menit, jam operasional, kapasitas slot + slot terdekat, status terjadwal, pelepasan otomatis ke dapur tiap menit) serta halaman tenant Pengaturan Pre-Order; ditambahkan deskripsi use case, mockup, Tahap 8, dan output nyata browser.</w:t>
       </w:r>
     </w:p>
     <w:sectPr>
@@ -21512,7 +21459,7 @@
     </w:pPr>
     <w:rPr>
       <w:rFonts w:ascii="Consolas" w:hAnsi="Consolas"/>
-      <w:color w:val="D4D4D4"/>
+      <w:color w:val="262626"/>
       <w:sz w:val="16"/>
     </w:rPr>
   </w:style>
@@ -21624,7 +21571,7 @@
     <w:rPr>
       <w:rFonts w:ascii="Consolas" w:hAnsi="Consolas"/>
       <w:b/>
-      <w:color w:val="FFFFFF"/>
+      <w:color w:val="262626"/>
       <w:sz w:val="16"/>
     </w:rPr>
   </w:style>

</xml_diff>

<commit_message>
docs(v8): Modul 10 — use case UC-07 + langkah Windows (cmd + VS Code)
- Bagian Use Case SRS (deskripsi + mockup #uc-07), Tahap 8, output nyata browser (QRIS, gangguan
  gateway, QRIS kedaluwarsa, dibayar).
- Tahap 1–8 ditulis ulang untuk Windows: perintah cmd dengan output nyata, isi berkas lengkap;
  diverifikasi di worktree bersih (Tahap 7 = kode v2 P10, 186 test; Tahap 8 = kode akhir, 193 test).
- Revision log DOC-10-006/007, RTM UC-07, status, laporan rantai v3.
- modul_praktikum/ dibuat ulang dari master (hanya Modul 10 dan Lampiran berubah).

Co-Authored-By: Claude Opus 5.5 <noreply@anthropic.com>
</commit_message>
<xml_diff>
--- a/modul_praktikum/Lampiran.docx
+++ b/modul_praktikum/Lampiran.docx
@@ -3577,92 +3577,175 @@
     <w:p>
       <w:pPr>
         <w:pStyle w:val="CodeBlock"/>
-        <w:shd w:fill="1E1E1E" w:val="clear"/>
         <w:pBdr>
-          <w:left w:val="single" w:sz="4" w:space="8" w:color="1E1E1E"/>
+          <w:left w:val="single" w:sz="12" w:space="8" w:color="B8DDE0"/>
         </w:pBdr>
+        <w:shd w:val="clear" w:color="auto" w:fill="F2F3F7"/>
       </w:pPr>
       <w:r>
         <w:rPr>
           <w:rFonts w:ascii="Consolas" w:hAnsi="Consolas"/>
-          <w:color w:val="4EC9B0"/>
+          <w:b/>
+          <w:color w:val="000080"/>
           <w:sz w:val="16"/>
         </w:rPr>
-        <w:t>php</w:t>
+        <w:t xml:space="preserve">php</w:t>
       </w:r>
       <w:r>
         <w:rPr>
           <w:rFonts w:ascii="Consolas" w:hAnsi="Consolas"/>
-          <w:color w:val="D4D4D4"/>
+          <w:color w:val="262626"/>
           <w:sz w:val="16"/>
         </w:rPr>
-        <w:t xml:space="preserve"> artisan optimize:clear</w:t>
+        <w:t xml:space="preserve"> artisan </w:t>
+      </w:r>
+      <w:r>
+        <w:rPr>
+          <w:rFonts w:ascii="Consolas" w:hAnsi="Consolas"/>
+          <w:color w:val="795E26"/>
+          <w:sz w:val="16"/>
+        </w:rPr>
+        <w:t xml:space="preserve">optimize:clear</w:t>
+      </w:r>
+      <w:r>
         <w:br/>
       </w:r>
       <w:r>
         <w:rPr>
           <w:rFonts w:ascii="Consolas" w:hAnsi="Consolas"/>
-          <w:color w:val="4EC9B0"/>
+          <w:b/>
+          <w:color w:val="000080"/>
           <w:sz w:val="16"/>
         </w:rPr>
-        <w:t>php</w:t>
+        <w:t xml:space="preserve">php</w:t>
       </w:r>
       <w:r>
         <w:rPr>
           <w:rFonts w:ascii="Consolas" w:hAnsi="Consolas"/>
-          <w:color w:val="D4D4D4"/>
+          <w:color w:val="262626"/>
           <w:sz w:val="16"/>
         </w:rPr>
-        <w:t xml:space="preserve"> artisan migrate:fresh --seed --env=testing</w:t>
+        <w:t xml:space="preserve"> artisan </w:t>
+      </w:r>
+      <w:r>
+        <w:rPr>
+          <w:rFonts w:ascii="Consolas" w:hAnsi="Consolas"/>
+          <w:color w:val="795E26"/>
+          <w:sz w:val="16"/>
+        </w:rPr>
+        <w:t xml:space="preserve">migrate:fresh</w:t>
+      </w:r>
+      <w:r>
+        <w:rPr>
+          <w:rFonts w:ascii="Consolas" w:hAnsi="Consolas"/>
+          <w:color w:val="262626"/>
+          <w:sz w:val="16"/>
+        </w:rPr>
+        <w:t xml:space="preserve"> </w:t>
+      </w:r>
+      <w:r>
+        <w:rPr>
+          <w:rFonts w:ascii="Consolas" w:hAnsi="Consolas"/>
+          <w:color w:val="0073E6"/>
+          <w:sz w:val="16"/>
+        </w:rPr>
+        <w:t xml:space="preserve">--seed</w:t>
+      </w:r>
+      <w:r>
+        <w:rPr>
+          <w:rFonts w:ascii="Consolas" w:hAnsi="Consolas"/>
+          <w:color w:val="262626"/>
+          <w:sz w:val="16"/>
+        </w:rPr>
+        <w:t xml:space="preserve"> </w:t>
+      </w:r>
+      <w:r>
+        <w:rPr>
+          <w:rFonts w:ascii="Consolas" w:hAnsi="Consolas"/>
+          <w:color w:val="0073E6"/>
+          <w:sz w:val="16"/>
+        </w:rPr>
+        <w:t xml:space="preserve">--env=testing</w:t>
+      </w:r>
+      <w:r>
         <w:br/>
       </w:r>
       <w:r>
         <w:rPr>
           <w:rFonts w:ascii="Consolas" w:hAnsi="Consolas"/>
-          <w:color w:val="4EC9B0"/>
+          <w:b/>
+          <w:color w:val="000080"/>
           <w:sz w:val="16"/>
         </w:rPr>
-        <w:t>php</w:t>
+        <w:t xml:space="preserve">php</w:t>
       </w:r>
       <w:r>
         <w:rPr>
           <w:rFonts w:ascii="Consolas" w:hAnsi="Consolas"/>
-          <w:color w:val="D4D4D4"/>
+          <w:color w:val="262626"/>
           <w:sz w:val="16"/>
         </w:rPr>
-        <w:t xml:space="preserve"> artisan test --testsuite=</w:t>
+        <w:t xml:space="preserve"> artisan test </w:t>
       </w:r>
       <w:r>
         <w:rPr>
           <w:rFonts w:ascii="Consolas" w:hAnsi="Consolas"/>
-          <w:color w:val="4EC9B0"/>
+          <w:color w:val="0073E6"/>
           <w:sz w:val="16"/>
         </w:rPr>
-        <w:t>Feature</w:t>
+        <w:t xml:space="preserve">--testsuite=Feature</w:t>
       </w:r>
       <w:r>
         <w:rPr>
           <w:rFonts w:ascii="Consolas" w:hAnsi="Consolas"/>
-          <w:color w:val="D4D4D4"/>
+          <w:color w:val="262626"/>
           <w:sz w:val="16"/>
         </w:rPr>
-        <w:t xml:space="preserve"> --stop-on-failure</w:t>
-        <w:br/>
-        <w:t xml:space="preserve">./vendor/bin/pint --test</w:t>
+        <w:t xml:space="preserve"> </w:t>
+      </w:r>
+      <w:r>
+        <w:rPr>
+          <w:rFonts w:ascii="Consolas" w:hAnsi="Consolas"/>
+          <w:color w:val="0073E6"/>
+          <w:sz w:val="16"/>
+        </w:rPr>
+        <w:t xml:space="preserve">--stop-on-failure</w:t>
+      </w:r>
+      <w:r>
         <w:br/>
       </w:r>
       <w:r>
         <w:rPr>
           <w:rFonts w:ascii="Consolas" w:hAnsi="Consolas"/>
-          <w:color w:val="4EC9B0"/>
+          <w:color w:val="262626"/>
           <w:sz w:val="16"/>
         </w:rPr>
-        <w:t>npm</w:t>
+        <w:t xml:space="preserve">./vendor/bin/pint </w:t>
       </w:r>
       <w:r>
         <w:rPr>
           <w:rFonts w:ascii="Consolas" w:hAnsi="Consolas"/>
-          <w:color w:val="D4D4D4"/>
+          <w:color w:val="0073E6"/>
+          <w:sz w:val="16"/>
+        </w:rPr>
+        <w:t xml:space="preserve">--test</w:t>
+      </w:r>
+      <w:r>
+        <w:br/>
+      </w:r>
+      <w:r>
+        <w:rPr>
+          <w:rFonts w:ascii="Consolas" w:hAnsi="Consolas"/>
+          <w:b/>
+          <w:color w:val="000080"/>
+          <w:sz w:val="16"/>
+        </w:rPr>
+        <w:t xml:space="preserve">npm</w:t>
+      </w:r>
+      <w:r>
+        <w:rPr>
+          <w:rFonts w:ascii="Consolas" w:hAnsi="Consolas"/>
+          <w:color w:val="262626"/>
           <w:sz w:val="16"/>
         </w:rPr>
         <w:t xml:space="preserve"> run build</w:t>
@@ -5044,431 +5127,215 @@
     <w:p>
       <w:pPr>
         <w:pStyle w:val="CodeHeader"/>
-        <w:shd w:fill="2D2D30"/>
+        <w:keepNext/>
         <w:pBdr>
-          <w:left w:val="single" w:sz="4" w:space="8" w:color="2D2D30"/>
+          <w:left w:val="single" w:sz="12" w:space="8" w:color="B8DDE0"/>
         </w:pBdr>
+        <w:shd w:val="clear" w:color="auto" w:fill="E4EAED"/>
       </w:pPr>
       <w:r>
-        <w:t>AUDIT KOMPATIBILITAS DEPENDENSI SRS — terminal root proyek   •   BASH</w:t>
+        <w:rPr>
+          <w:rFonts w:ascii="Consolas" w:hAnsi="Consolas"/>
+          <w:b/>
+          <w:color w:val="262626"/>
+          <w:sz w:val="16"/>
+        </w:rPr>
+        <w:t xml:space="preserve">AUDIT KOMPATIBILITAS DEPENDENSI SRS — terminal root proyek   •   BASH</w:t>
       </w:r>
     </w:p>
     <w:p>
       <w:pPr>
         <w:pStyle w:val="CodeBlock"/>
-        <w:shd w:fill="1E1E1E"/>
         <w:keepLines/>
         <w:pBdr>
-          <w:left w:val="single" w:sz="4" w:space="8" w:color="1E1E1E"/>
+          <w:left w:val="single" w:sz="12" w:space="8" w:color="B8DDE0"/>
         </w:pBdr>
+        <w:shd w:val="clear" w:color="auto" w:fill="F2F3F7"/>
       </w:pPr>
       <w:r>
         <w:rPr>
-          <w:rFonts w:ascii="Consolas" w:hAnsi="Consolas" w:eastAsia="Consolas"/>
-          <w:color w:val="4EC9B0"/>
+          <w:rFonts w:ascii="Consolas" w:hAnsi="Consolas"/>
+          <w:b/>
+          <w:color w:val="000080"/>
           <w:sz w:val="16"/>
         </w:rPr>
-        <w:t>composer</w:t>
+        <w:t xml:space="preserve">composer</w:t>
       </w:r>
       <w:r>
         <w:rPr>
-          <w:rFonts w:ascii="Consolas" w:hAnsi="Consolas" w:eastAsia="Consolas"/>
-          <w:color w:val="D4D4D4"/>
+          <w:rFonts w:ascii="Consolas" w:hAnsi="Consolas"/>
+          <w:color w:val="262626"/>
           <w:sz w:val="16"/>
         </w:rPr>
-        <w:t xml:space="preserve"> </w:t>
+        <w:t xml:space="preserve"> require chillerlan/php-qrcode intervention/image-laravel </w:t>
       </w:r>
       <w:r>
         <w:rPr>
-          <w:rFonts w:ascii="Consolas" w:hAnsi="Consolas" w:eastAsia="Consolas"/>
-          <w:color w:val="D4D4D4"/>
+          <w:rFonts w:ascii="Consolas" w:hAnsi="Consolas"/>
+          <w:color w:val="0073E6"/>
           <w:sz w:val="16"/>
         </w:rPr>
-        <w:t>require</w:t>
+        <w:t xml:space="preserve">--dry-run</w:t>
       </w:r>
       <w:r>
-        <w:rPr>
-          <w:rFonts w:ascii="Consolas" w:hAnsi="Consolas" w:eastAsia="Consolas"/>
-          <w:color w:val="D4D4D4"/>
-          <w:sz w:val="16"/>
-        </w:rPr>
-        <w:t xml:space="preserve"> </w:t>
-      </w:r>
-      <w:r>
-        <w:rPr>
-          <w:rFonts w:ascii="Consolas" w:hAnsi="Consolas" w:eastAsia="Consolas"/>
-          <w:color w:val="D4D4D4"/>
-          <w:sz w:val="16"/>
-        </w:rPr>
-        <w:t>chillerlan/php-qrcode</w:t>
-      </w:r>
-      <w:r>
-        <w:rPr>
-          <w:rFonts w:ascii="Consolas" w:hAnsi="Consolas" w:eastAsia="Consolas"/>
-          <w:color w:val="D4D4D4"/>
-          <w:sz w:val="16"/>
-        </w:rPr>
-        <w:t xml:space="preserve"> </w:t>
-      </w:r>
-      <w:r>
-        <w:rPr>
-          <w:rFonts w:ascii="Consolas" w:hAnsi="Consolas" w:eastAsia="Consolas"/>
-          <w:color w:val="D4D4D4"/>
-          <w:sz w:val="16"/>
-        </w:rPr>
-        <w:t>intervention/image-laravel</w:t>
-      </w:r>
-      <w:r>
-        <w:rPr>
-          <w:rFonts w:ascii="Consolas" w:hAnsi="Consolas" w:eastAsia="Consolas"/>
-          <w:color w:val="D4D4D4"/>
-          <w:sz w:val="16"/>
-        </w:rPr>
-        <w:t xml:space="preserve"> </w:t>
-      </w:r>
-      <w:r>
-        <w:rPr>
-          <w:rFonts w:ascii="Consolas" w:hAnsi="Consolas" w:eastAsia="Consolas"/>
-          <w:color w:val="9CDCFE"/>
-          <w:sz w:val="16"/>
-        </w:rPr>
-        <w:t>--dry-run</w:t>
-      </w:r>
-      <w:r>
-        <w:rPr>
-          <w:rFonts w:ascii="Consolas" w:hAnsi="Consolas" w:eastAsia="Consolas"/>
-          <w:color w:val="D4D4D4"/>
-          <w:sz w:val="16"/>
-        </w:rPr>
         <w:br/>
       </w:r>
       <w:r>
         <w:rPr>
-          <w:rFonts w:ascii="Consolas" w:hAnsi="Consolas" w:eastAsia="Consolas"/>
-          <w:color w:val="4EC9B0"/>
+          <w:rFonts w:ascii="Consolas" w:hAnsi="Consolas"/>
+          <w:b/>
+          <w:color w:val="000080"/>
           <w:sz w:val="16"/>
         </w:rPr>
-        <w:t>composer</w:t>
+        <w:t xml:space="preserve">composer</w:t>
       </w:r>
       <w:r>
         <w:rPr>
-          <w:rFonts w:ascii="Consolas" w:hAnsi="Consolas" w:eastAsia="Consolas"/>
-          <w:color w:val="D4D4D4"/>
+          <w:rFonts w:ascii="Consolas" w:hAnsi="Consolas"/>
+          <w:color w:val="262626"/>
           <w:sz w:val="16"/>
         </w:rPr>
-        <w:t xml:space="preserve"> </w:t>
+        <w:t xml:space="preserve"> require maatwebsite/excel barryvdh/laravel-dompdf </w:t>
       </w:r>
       <w:r>
         <w:rPr>
-          <w:rFonts w:ascii="Consolas" w:hAnsi="Consolas" w:eastAsia="Consolas"/>
-          <w:color w:val="D4D4D4"/>
+          <w:rFonts w:ascii="Consolas" w:hAnsi="Consolas"/>
+          <w:color w:val="0073E6"/>
           <w:sz w:val="16"/>
         </w:rPr>
-        <w:t>require</w:t>
+        <w:t xml:space="preserve">--dry-run</w:t>
       </w:r>
       <w:r>
-        <w:rPr>
-          <w:rFonts w:ascii="Consolas" w:hAnsi="Consolas" w:eastAsia="Consolas"/>
-          <w:color w:val="D4D4D4"/>
-          <w:sz w:val="16"/>
-        </w:rPr>
-        <w:t xml:space="preserve"> </w:t>
-      </w:r>
-      <w:r>
-        <w:rPr>
-          <w:rFonts w:ascii="Consolas" w:hAnsi="Consolas" w:eastAsia="Consolas"/>
-          <w:color w:val="D4D4D4"/>
-          <w:sz w:val="16"/>
-        </w:rPr>
-        <w:t>maatwebsite/excel</w:t>
-      </w:r>
-      <w:r>
-        <w:rPr>
-          <w:rFonts w:ascii="Consolas" w:hAnsi="Consolas" w:eastAsia="Consolas"/>
-          <w:color w:val="D4D4D4"/>
-          <w:sz w:val="16"/>
-        </w:rPr>
-        <w:t xml:space="preserve"> </w:t>
-      </w:r>
-      <w:r>
-        <w:rPr>
-          <w:rFonts w:ascii="Consolas" w:hAnsi="Consolas" w:eastAsia="Consolas"/>
-          <w:color w:val="D4D4D4"/>
-          <w:sz w:val="16"/>
-        </w:rPr>
-        <w:t>barryvdh/laravel-dompdf</w:t>
-      </w:r>
-      <w:r>
-        <w:rPr>
-          <w:rFonts w:ascii="Consolas" w:hAnsi="Consolas" w:eastAsia="Consolas"/>
-          <w:color w:val="D4D4D4"/>
-          <w:sz w:val="16"/>
-        </w:rPr>
-        <w:t xml:space="preserve"> </w:t>
-      </w:r>
-      <w:r>
-        <w:rPr>
-          <w:rFonts w:ascii="Consolas" w:hAnsi="Consolas" w:eastAsia="Consolas"/>
-          <w:color w:val="9CDCFE"/>
-          <w:sz w:val="16"/>
-        </w:rPr>
-        <w:t>--dry-run</w:t>
-      </w:r>
-      <w:r>
-        <w:rPr>
-          <w:rFonts w:ascii="Consolas" w:hAnsi="Consolas" w:eastAsia="Consolas"/>
-          <w:color w:val="D4D4D4"/>
-          <w:sz w:val="16"/>
-        </w:rPr>
         <w:br/>
       </w:r>
       <w:r>
         <w:rPr>
-          <w:rFonts w:ascii="Consolas" w:hAnsi="Consolas" w:eastAsia="Consolas"/>
-          <w:color w:val="4EC9B0"/>
+          <w:rFonts w:ascii="Consolas" w:hAnsi="Consolas"/>
+          <w:b/>
+          <w:color w:val="000080"/>
           <w:sz w:val="16"/>
         </w:rPr>
-        <w:t>composer</w:t>
+        <w:t xml:space="preserve">composer</w:t>
       </w:r>
       <w:r>
         <w:rPr>
-          <w:rFonts w:ascii="Consolas" w:hAnsi="Consolas" w:eastAsia="Consolas"/>
-          <w:color w:val="D4D4D4"/>
+          <w:rFonts w:ascii="Consolas" w:hAnsi="Consolas"/>
+          <w:color w:val="262626"/>
           <w:sz w:val="16"/>
         </w:rPr>
-        <w:t xml:space="preserve"> </w:t>
+        <w:t xml:space="preserve"> require laravel-notification-channels/webpush </w:t>
       </w:r>
       <w:r>
         <w:rPr>
-          <w:rFonts w:ascii="Consolas" w:hAnsi="Consolas" w:eastAsia="Consolas"/>
-          <w:color w:val="D4D4D4"/>
+          <w:rFonts w:ascii="Consolas" w:hAnsi="Consolas"/>
+          <w:color w:val="0073E6"/>
           <w:sz w:val="16"/>
         </w:rPr>
-        <w:t>require</w:t>
+        <w:t xml:space="preserve">--dry-run</w:t>
       </w:r>
       <w:r>
-        <w:rPr>
-          <w:rFonts w:ascii="Consolas" w:hAnsi="Consolas" w:eastAsia="Consolas"/>
-          <w:color w:val="D4D4D4"/>
-          <w:sz w:val="16"/>
-        </w:rPr>
-        <w:t xml:space="preserve"> </w:t>
-      </w:r>
-      <w:r>
-        <w:rPr>
-          <w:rFonts w:ascii="Consolas" w:hAnsi="Consolas" w:eastAsia="Consolas"/>
-          <w:color w:val="D4D4D4"/>
-          <w:sz w:val="16"/>
-        </w:rPr>
-        <w:t>laravel-notification-channels/webpush</w:t>
-      </w:r>
-      <w:r>
-        <w:rPr>
-          <w:rFonts w:ascii="Consolas" w:hAnsi="Consolas" w:eastAsia="Consolas"/>
-          <w:color w:val="D4D4D4"/>
-          <w:sz w:val="16"/>
-        </w:rPr>
-        <w:t xml:space="preserve"> </w:t>
-      </w:r>
-      <w:r>
-        <w:rPr>
-          <w:rFonts w:ascii="Consolas" w:hAnsi="Consolas" w:eastAsia="Consolas"/>
-          <w:color w:val="9CDCFE"/>
-          <w:sz w:val="16"/>
-        </w:rPr>
-        <w:t>--dry-run</w:t>
-      </w:r>
-      <w:r>
-        <w:rPr>
-          <w:rFonts w:ascii="Consolas" w:hAnsi="Consolas" w:eastAsia="Consolas"/>
-          <w:color w:val="D4D4D4"/>
-          <w:sz w:val="16"/>
-        </w:rPr>
         <w:br/>
       </w:r>
       <w:r>
         <w:rPr>
-          <w:rFonts w:ascii="Consolas" w:hAnsi="Consolas" w:eastAsia="Consolas"/>
-          <w:color w:val="4EC9B0"/>
+          <w:rFonts w:ascii="Consolas" w:hAnsi="Consolas"/>
+          <w:b/>
+          <w:color w:val="000080"/>
           <w:sz w:val="16"/>
         </w:rPr>
-        <w:t>npm</w:t>
+        <w:t xml:space="preserve">npm</w:t>
       </w:r>
       <w:r>
         <w:rPr>
-          <w:rFonts w:ascii="Consolas" w:hAnsi="Consolas" w:eastAsia="Consolas"/>
-          <w:color w:val="D4D4D4"/>
+          <w:rFonts w:ascii="Consolas" w:hAnsi="Consolas"/>
+          <w:color w:val="262626"/>
           <w:sz w:val="16"/>
         </w:rPr>
-        <w:t xml:space="preserve"> </w:t>
+        <w:t xml:space="preserve"> install </w:t>
       </w:r>
       <w:r>
         <w:rPr>
-          <w:rFonts w:ascii="Consolas" w:hAnsi="Consolas" w:eastAsia="Consolas"/>
-          <w:color w:val="D4D4D4"/>
+          <w:rFonts w:ascii="Consolas" w:hAnsi="Consolas"/>
+          <w:color w:val="0073E6"/>
           <w:sz w:val="16"/>
         </w:rPr>
-        <w:t>install</w:t>
+        <w:t xml:space="preserve">--dry-run</w:t>
       </w:r>
       <w:r>
         <w:rPr>
-          <w:rFonts w:ascii="Consolas" w:hAnsi="Consolas" w:eastAsia="Consolas"/>
-          <w:color w:val="D4D4D4"/>
+          <w:rFonts w:ascii="Consolas" w:hAnsi="Consolas"/>
+          <w:color w:val="262626"/>
           <w:sz w:val="16"/>
         </w:rPr>
-        <w:t xml:space="preserve"> </w:t>
+        <w:t xml:space="preserve"> laravel-echo pusher-js</w:t>
       </w:r>
       <w:r>
-        <w:rPr>
-          <w:rFonts w:ascii="Consolas" w:hAnsi="Consolas" w:eastAsia="Consolas"/>
-          <w:color w:val="9CDCFE"/>
-          <w:sz w:val="16"/>
-        </w:rPr>
-        <w:t>--dry-run</w:t>
-      </w:r>
-      <w:r>
-        <w:rPr>
-          <w:rFonts w:ascii="Consolas" w:hAnsi="Consolas" w:eastAsia="Consolas"/>
-          <w:color w:val="D4D4D4"/>
-          <w:sz w:val="16"/>
-        </w:rPr>
-        <w:t xml:space="preserve"> </w:t>
-      </w:r>
-      <w:r>
-        <w:rPr>
-          <w:rFonts w:ascii="Consolas" w:hAnsi="Consolas" w:eastAsia="Consolas"/>
-          <w:color w:val="D4D4D4"/>
-          <w:sz w:val="16"/>
-        </w:rPr>
-        <w:t>laravel-echo</w:t>
-      </w:r>
-      <w:r>
-        <w:rPr>
-          <w:rFonts w:ascii="Consolas" w:hAnsi="Consolas" w:eastAsia="Consolas"/>
-          <w:color w:val="D4D4D4"/>
-          <w:sz w:val="16"/>
-        </w:rPr>
-        <w:t xml:space="preserve"> </w:t>
-      </w:r>
-      <w:r>
-        <w:rPr>
-          <w:rFonts w:ascii="Consolas" w:hAnsi="Consolas" w:eastAsia="Consolas"/>
-          <w:color w:val="D4D4D4"/>
-          <w:sz w:val="16"/>
-        </w:rPr>
-        <w:t>pusher-js</w:t>
-      </w:r>
-      <w:r>
-        <w:rPr>
-          <w:rFonts w:ascii="Consolas" w:hAnsi="Consolas" w:eastAsia="Consolas"/>
-          <w:color w:val="D4D4D4"/>
-          <w:sz w:val="16"/>
-        </w:rPr>
         <w:br/>
       </w:r>
       <w:r>
         <w:rPr>
-          <w:rFonts w:ascii="Consolas" w:hAnsi="Consolas" w:eastAsia="Consolas"/>
-          <w:color w:val="4EC9B0"/>
+          <w:rFonts w:ascii="Consolas" w:hAnsi="Consolas"/>
+          <w:b/>
+          <w:color w:val="000080"/>
           <w:sz w:val="16"/>
         </w:rPr>
-        <w:t>composer</w:t>
+        <w:t xml:space="preserve">composer</w:t>
       </w:r>
       <w:r>
         <w:rPr>
-          <w:rFonts w:ascii="Consolas" w:hAnsi="Consolas" w:eastAsia="Consolas"/>
-          <w:color w:val="D4D4D4"/>
+          <w:rFonts w:ascii="Consolas" w:hAnsi="Consolas"/>
+          <w:color w:val="262626"/>
           <w:sz w:val="16"/>
         </w:rPr>
-        <w:t xml:space="preserve"> </w:t>
+        <w:t xml:space="preserve"> validate </w:t>
       </w:r>
       <w:r>
         <w:rPr>
-          <w:rFonts w:ascii="Consolas" w:hAnsi="Consolas" w:eastAsia="Consolas"/>
-          <w:color w:val="D4D4D4"/>
+          <w:rFonts w:ascii="Consolas" w:hAnsi="Consolas"/>
+          <w:color w:val="0073E6"/>
           <w:sz w:val="16"/>
         </w:rPr>
-        <w:t>validate</w:t>
+        <w:t xml:space="preserve">--strict</w:t>
       </w:r>
       <w:r>
-        <w:rPr>
-          <w:rFonts w:ascii="Consolas" w:hAnsi="Consolas" w:eastAsia="Consolas"/>
-          <w:color w:val="D4D4D4"/>
-          <w:sz w:val="16"/>
-        </w:rPr>
-        <w:t xml:space="preserve"> </w:t>
-      </w:r>
-      <w:r>
-        <w:rPr>
-          <w:rFonts w:ascii="Consolas" w:hAnsi="Consolas" w:eastAsia="Consolas"/>
-          <w:color w:val="9CDCFE"/>
-          <w:sz w:val="16"/>
-        </w:rPr>
-        <w:t>--strict</w:t>
-      </w:r>
-      <w:r>
-        <w:rPr>
-          <w:rFonts w:ascii="Consolas" w:hAnsi="Consolas" w:eastAsia="Consolas"/>
-          <w:color w:val="D4D4D4"/>
-          <w:sz w:val="16"/>
-        </w:rPr>
         <w:br/>
       </w:r>
       <w:r>
         <w:rPr>
-          <w:rFonts w:ascii="Consolas" w:hAnsi="Consolas" w:eastAsia="Consolas"/>
-          <w:color w:val="4EC9B0"/>
+          <w:rFonts w:ascii="Consolas" w:hAnsi="Consolas"/>
+          <w:b/>
+          <w:color w:val="000080"/>
           <w:sz w:val="16"/>
         </w:rPr>
-        <w:t>composer</w:t>
+        <w:t xml:space="preserve">composer</w:t>
       </w:r>
       <w:r>
         <w:rPr>
-          <w:rFonts w:ascii="Consolas" w:hAnsi="Consolas" w:eastAsia="Consolas"/>
-          <w:color w:val="D4D4D4"/>
+          <w:rFonts w:ascii="Consolas" w:hAnsi="Consolas"/>
+          <w:color w:val="262626"/>
           <w:sz w:val="16"/>
         </w:rPr>
-        <w:t xml:space="preserve"> </w:t>
+        <w:t xml:space="preserve"> audit</w:t>
       </w:r>
       <w:r>
-        <w:rPr>
-          <w:rFonts w:ascii="Consolas" w:hAnsi="Consolas" w:eastAsia="Consolas"/>
-          <w:color w:val="D4D4D4"/>
-          <w:sz w:val="16"/>
-        </w:rPr>
-        <w:t>audit</w:t>
-      </w:r>
-      <w:r>
-        <w:rPr>
-          <w:rFonts w:ascii="Consolas" w:hAnsi="Consolas" w:eastAsia="Consolas"/>
-          <w:color w:val="D4D4D4"/>
-          <w:sz w:val="16"/>
-        </w:rPr>
         <w:br/>
       </w:r>
       <w:r>
         <w:rPr>
-          <w:rFonts w:ascii="Consolas" w:hAnsi="Consolas" w:eastAsia="Consolas"/>
-          <w:color w:val="4EC9B0"/>
+          <w:rFonts w:ascii="Consolas" w:hAnsi="Consolas"/>
+          <w:b/>
+          <w:color w:val="000080"/>
           <w:sz w:val="16"/>
         </w:rPr>
-        <w:t>npm</w:t>
+        <w:t xml:space="preserve">npm</w:t>
       </w:r>
       <w:r>
         <w:rPr>
-          <w:rFonts w:ascii="Consolas" w:hAnsi="Consolas" w:eastAsia="Consolas"/>
-          <w:color w:val="D4D4D4"/>
+          <w:rFonts w:ascii="Consolas" w:hAnsi="Consolas"/>
+          <w:color w:val="262626"/>
           <w:sz w:val="16"/>
         </w:rPr>
-        <w:t xml:space="preserve"> </w:t>
-      </w:r>
-      <w:r>
-        <w:rPr>
-          <w:rFonts w:ascii="Consolas" w:hAnsi="Consolas" w:eastAsia="Consolas"/>
-          <w:color w:val="D4D4D4"/>
-          <w:sz w:val="16"/>
-        </w:rPr>
-        <w:t>audit</w:t>
+        <w:t xml:space="preserve"> audit</w:t>
       </w:r>
     </w:p>
     <w:p>
@@ -7909,8 +7776,10 @@
       <w:r>
         <w:rPr>
           <w:rFonts w:ascii="Aptos" w:hAnsi="Aptos"/>
+          <w:color w:val="1F2937"/>
+          <w:sz w:val="19"/>
         </w:rPr>
-        <w:t>Preset dasar yang digunakan adalah compact_reference_guide dengan named override untuk modul pembelajaran: A4 portrait; margin atas 1,65 cm, bawah 1,55 cm, kiri/kanan 1,75 cm; Aptos 10,2 pt; line spacing 1,16; heading beraksen Laravel red; tabel ringkas; callout Predict/Try/Observe; code block Consolas bertema Visual Studio Code Dark+; checklist; exit ticket; serta screenshot mockup UI.</w:t>
+        <w:t xml:space="preserve">Preset dasar yang digunakan adalah compact_reference_guide dengan named override untuk modul pembelajaran: A4 portrait; margin atas 1,65 cm, bawah 1,55 cm, kiri/kanan 1,75 cm; Aptos 10,2 pt; line spacing 1,16; heading beraksen Laravel red; tabel ringkas; callout Predict/Try/Observe; code block Consolas berlatar Cyan Light dengan pewarnaan token Visual Studio Code; checklist; exit ticket; serta screenshot mockup UI.</w:t>
       </w:r>
     </w:p>
     <w:p>
@@ -8491,6 +8360,19 @@
         <w:pStyle w:val="ListBody"/>
       </w:pPr>
       <w:r>
+        <w:rPr>
+          <w:rFonts w:ascii="Aptos" w:hAnsi="Aptos"/>
+          <w:color w:val="1F2937"/>
+          <w:sz w:val="19"/>
+        </w:rPr>
+        <w:t xml:space="preserve">DOC-00-001 — Seluruh blok kode (208 blok, 133 label) memakai latar terang tema Cyan Light (JetBrains) dengan pewarnaan token standar Visual Studio Code untuk PHP, HTML/Blade, cmd, dan bash; teks kode tidak berubah; penjelasan palet di “Cara Membaca Sampel Kode” dan Lampiran diperbarui.</w:t>
+      </w:r>
+    </w:p>
+    <w:p>
+      <w:pPr>
+        <w:pStyle w:val="ListBody"/>
+      </w:pPr>
+      <w:r>
         <w:t xml:space="preserve">DOC-01-001 — Basis dokumen: parameter menyebut v4/v5 yang tidak ada; basis nyata adalah v7. Revisi kumulatif ditulis ke berkas v8; v7 tetap utuh di references/.</w:t>
       </w:r>
     </w:p>
@@ -8869,6 +8751,19 @@
           <w:color w:val="1F2937"/>
           <w:sz w:val="19"/>
         </w:rPr>
+        <w:t xml:space="preserve">DOC-05-007 — Rantai v3 (use case SRS v2): Modul 5 menuntaskan UC-19 (penguncian 5x/10 menit, pesan generik, redirect per peran, sesi 8 jam) dan UC-21 (onboarding penanggung jawab + rekening + tautan atur kata sandi, aktif/nonaktif tenant, riwayat komisi beserta pengelola); ditambahkan deskripsi use case, mockup, Tahap 8, dan output nyata browser.</w:t>
+      </w:r>
+    </w:p>
+    <w:p>
+      <w:pPr>
+        <w:pStyle w:val="ListBody"/>
+      </w:pPr>
+      <w:r>
+        <w:rPr>
+          <w:rFonts w:ascii="Aptos" w:hAnsi="Aptos"/>
+          <w:color w:val="1F2937"/>
+          <w:sz w:val="19"/>
+        </w:rPr>
         <w:t xml:space="preserve">DOC-06-004 — Controller/view/route meja di modul Admin; controller + route publik scan QR di modul Ordering (</w:t>
       </w:r>
       <w:r>
@@ -8934,6 +8829,19 @@
           <w:sz w:val="19"/>
         </w:rPr>
         <w:t xml:space="preserve">DOC-06-005 — Blok BUAT FILE per tahap Modul 6: make:model, make:policy --model, make:controller FQN (termasuk --invokable untuk /q/{token}), make:trait FQN, make:class (OpaqueToken, service Admin/Ordering), make:test --unit; view &amp; route modul manual.</w:t>
+      </w:r>
+    </w:p>
+    <w:p>
+      <w:pPr>
+        <w:pStyle w:val="ListBody"/>
+      </w:pPr>
+      <w:r>
+        <w:rPr>
+          <w:rFonts w:ascii="Aptos" w:hAnsi="Aptos"/>
+          <w:color w:val="1F2937"/>
+          <w:sz w:val="19"/>
+        </w:rPr>
+        <w:t xml:space="preserve">DOC-06-006 — Rantai v3 (use case SRS v2): Modul 6 menuntaskan UC-22 (QR siap cetak SVG via bacon/bacon-qr-code, nonaktif/aktif meja, ringkasan meja) dan UC-02 (halaman sambutan meja + tenant buka/tutup, pesan QR tidak valid, penolakan di luar jam operasional); ditambahkan deskripsi use case, mockup, Tahap 8, dan output nyata browser.</w:t>
       </w:r>
     </w:p>
     <w:p>
@@ -9028,6 +8936,19 @@
           <w:sz w:val="19"/>
         </w:rPr>
         <w:t xml:space="preserve">DOC-07-005 — Blok BUAT FILE per tahap Modul 7: make:livewire catalog::menu-manager / catalog::menu-catalog (langsung ke folder modul), make:class MenuStockService, make:test; halaman &amp; route modul manual.</w:t>
+      </w:r>
+    </w:p>
+    <w:p>
+      <w:pPr>
+        <w:pStyle w:val="ListBody"/>
+      </w:pPr>
+      <w:r>
+        <w:rPr>
+          <w:rFonts w:ascii="Aptos" w:hAnsi="Aptos"/>
+          <w:color w:val="1F2937"/>
+          <w:sz w:val="19"/>
+        </w:rPr>
+        <w:t xml:space="preserve">DOC-07-006 — Rantai v3 (use case SRS v2): Modul 7 menuntaskan UC-13 (deskripsi, foto WebP, ubah, soft delete, cari/saring), UC-14 (sakelar satu ketukan), UC-01 (kelompok per tenant, menu habis nonaktif, tenant tutup, chip kategori, pembaruan ≤ 5 detik), dan UC-11 (WaitTimeEstimator); ditambahkan deskripsi use case, mockup, Tahap 8, dan output nyata browser.</w:t>
       </w:r>
     </w:p>
     <w:p>
@@ -9151,6 +9072,19 @@
           <w:color w:val="1F2937"/>
           <w:sz w:val="19"/>
         </w:rPr>
+        <w:t xml:space="preserve">DOC-08-006 — Rantai v3 (use case SRS v2): Modul 8 menuntaskan UC-03 (kelompok per tenant, pajak dan biaya layanan, “Menu telah habis”, checkout nonaktif saat kosong) dan UC-04 (formulir kustomisasi min/maks, opsi habis nonaktif, catatan ≤ 200 karakter tersaring, harga akhir) serta halaman tenant Kelola Modifier; ditambahkan deskripsi use case, mockup, Tahap 8, dan output nyata browser.</w:t>
+      </w:r>
+    </w:p>
+    <w:p>
+      <w:pPr>
+        <w:pStyle w:val="ListBody"/>
+      </w:pPr>
+      <w:r>
+        <w:rPr>
+          <w:rFonts w:ascii="Aptos" w:hAnsi="Aptos"/>
+          <w:color w:val="1F2937"/>
+          <w:sz w:val="19"/>
+        </w:rPr>
         <w:t xml:space="preserve">DOC-09-004 — Checkout dan status pesanan sebagai vertical slice modul Ordering (</w:t>
       </w:r>
       <w:r>
@@ -9250,6 +9184,19 @@
           <w:sz w:val="19"/>
         </w:rPr>
         <w:t xml:space="preserve">DOC-09-005 — Blok BUAT FILE per tahap Modul 9: make:class (DTO CheckoutResult, CheckoutService), make:exception FQN, make:model OrderItemModifier, make:controller FQN --invokable, make:test; view &amp; route pelanggan modul manual.</w:t>
+      </w:r>
+    </w:p>
+    <w:p>
+      <w:pPr>
+        <w:pStyle w:val="ListBody"/>
+      </w:pPr>
+      <w:r>
+        <w:rPr>
+          <w:rFonts w:ascii="Aptos" w:hAnsi="Aptos"/>
+          <w:color w:val="1F2937"/>
+          <w:sz w:val="19"/>
+        </w:rPr>
+        <w:t xml:space="preserve">DOC-09-006 — Rantai v3 (use case SRS v2): Modul 9 menuntaskan UC-05 (halaman checkout: ringkasan, nomor meja, mode penyajian, identitas ringkas, tenant wajib buka, kembali ke keranjang bila item bermasalah, catatan item tersimpan) dan UC-06 (slot pre-order 15 menit, jam operasional, kapasitas slot + slot terdekat, status terjadwal, pelepasan otomatis ke dapur tiap menit) serta halaman tenant Pengaturan Pre-Order; ditambahkan deskripsi use case, mockup, Tahap 8, dan output nyata browser.</w:t>
       </w:r>
     </w:p>
     <w:p>
@@ -9378,6 +9325,19 @@
           <w:sz w:val="19"/>
         </w:rPr>
         <w:t xml:space="preserve">DOC-10-005 — Blok BUAT FILE per tahap Modul 10: make:interface FQN, make:model ×3, make:class (DTO, service, adapter, ResolveTrackedOrder), make:exception FQN, make:livewire payments::order-payment, make:test (+ --unit).</w:t>
+      </w:r>
+    </w:p>
+    <w:p>
+      <w:pPr>
+        <w:pStyle w:val="ListBody"/>
+      </w:pPr>
+      <w:r>
+        <w:rPr>
+          <w:rFonts w:ascii="Aptos" w:hAnsi="Aptos"/>
+          <w:color w:val="1F2937"/>
+          <w:sz w:val="19"/>
+        </w:rPr>
+        <w:t xml:space="preserve">DOC-10-006 — Rantai v3 (use case SRS v2): Modul 10 menuntaskan UC-07 (QRIS otomatis setelah checkout, gambar QRIS + penghitung mundur ≤ 15 menit, rincian split per tenant, percobaan ulang 3 kali saat gateway tidak merespons, QRIS baru saat kedaluwarsa, pemantauan status, batalkan pesanan yang belum dibayar); ditambahkan deskripsi use case, mockup, Tahap 8, dan output nyata browser.</w:t>
       </w:r>
     </w:p>
     <w:sectPr>
@@ -21640,7 +21600,7 @@
     </w:pPr>
     <w:rPr>
       <w:rFonts w:ascii="Consolas" w:hAnsi="Consolas"/>
-      <w:color w:val="D4D4D4"/>
+      <w:color w:val="262626"/>
       <w:sz w:val="16"/>
     </w:rPr>
   </w:style>
@@ -21752,7 +21712,7 @@
     <w:rPr>
       <w:rFonts w:ascii="Consolas" w:hAnsi="Consolas"/>
       <w:b/>
-      <w:color w:val="FFFFFF"/>
+      <w:color w:val="262626"/>
       <w:sz w:val="16"/>
     </w:rPr>
   </w:style>

</xml_diff>

<commit_message>
docs(v8): Modul 11 — use case UC-08 & UC-10 + langkah Windows (cmd + VS Code)
- Bagian Use Case SRS (deskripsi + mockup #uc-08/#uc-10), Tahap 8, output nyata (layar
  terverifikasi, tinjau manual, rincian pemecahan basis data).
- Tahap 1–8 ditulis ulang untuk Windows: perintah cmd dengan output nyata, isi berkas lengkap;
  diverifikasi di worktree bersih (Tahap 7 = kode v2 P11, 205 test; Tahap 8 = kode akhir, 217 test).
- Revision log DOC-11-006/007, RTM UC-08/UC-10, status, laporan rantai v3.
- modul_praktikum/ dibuat ulang dari master (hanya Modul 11 dan Lampiran berubah).

Co-Authored-By: Claude Opus 5.5 <noreply@anthropic.com>
</commit_message>
<xml_diff>
--- a/modul_praktikum/Lampiran.docx
+++ b/modul_praktikum/Lampiran.docx
@@ -3577,92 +3577,175 @@
     <w:p>
       <w:pPr>
         <w:pStyle w:val="CodeBlock"/>
-        <w:shd w:fill="1E1E1E" w:val="clear"/>
         <w:pBdr>
-          <w:left w:val="single" w:sz="4" w:space="8" w:color="1E1E1E"/>
+          <w:left w:val="single" w:sz="12" w:space="8" w:color="B8DDE0"/>
         </w:pBdr>
+        <w:shd w:val="clear" w:color="auto" w:fill="F2F3F7"/>
       </w:pPr>
       <w:r>
         <w:rPr>
           <w:rFonts w:ascii="Consolas" w:hAnsi="Consolas"/>
-          <w:color w:val="4EC9B0"/>
+          <w:b/>
+          <w:color w:val="000080"/>
           <w:sz w:val="16"/>
         </w:rPr>
-        <w:t>php</w:t>
+        <w:t xml:space="preserve">php</w:t>
       </w:r>
       <w:r>
         <w:rPr>
           <w:rFonts w:ascii="Consolas" w:hAnsi="Consolas"/>
-          <w:color w:val="D4D4D4"/>
+          <w:color w:val="262626"/>
           <w:sz w:val="16"/>
         </w:rPr>
-        <w:t xml:space="preserve"> artisan optimize:clear</w:t>
+        <w:t xml:space="preserve"> artisan </w:t>
+      </w:r>
+      <w:r>
+        <w:rPr>
+          <w:rFonts w:ascii="Consolas" w:hAnsi="Consolas"/>
+          <w:color w:val="795E26"/>
+          <w:sz w:val="16"/>
+        </w:rPr>
+        <w:t xml:space="preserve">optimize:clear</w:t>
+      </w:r>
+      <w:r>
         <w:br/>
       </w:r>
       <w:r>
         <w:rPr>
           <w:rFonts w:ascii="Consolas" w:hAnsi="Consolas"/>
-          <w:color w:val="4EC9B0"/>
+          <w:b/>
+          <w:color w:val="000080"/>
           <w:sz w:val="16"/>
         </w:rPr>
-        <w:t>php</w:t>
+        <w:t xml:space="preserve">php</w:t>
       </w:r>
       <w:r>
         <w:rPr>
           <w:rFonts w:ascii="Consolas" w:hAnsi="Consolas"/>
-          <w:color w:val="D4D4D4"/>
+          <w:color w:val="262626"/>
           <w:sz w:val="16"/>
         </w:rPr>
-        <w:t xml:space="preserve"> artisan migrate:fresh --seed --env=testing</w:t>
+        <w:t xml:space="preserve"> artisan </w:t>
+      </w:r>
+      <w:r>
+        <w:rPr>
+          <w:rFonts w:ascii="Consolas" w:hAnsi="Consolas"/>
+          <w:color w:val="795E26"/>
+          <w:sz w:val="16"/>
+        </w:rPr>
+        <w:t xml:space="preserve">migrate:fresh</w:t>
+      </w:r>
+      <w:r>
+        <w:rPr>
+          <w:rFonts w:ascii="Consolas" w:hAnsi="Consolas"/>
+          <w:color w:val="262626"/>
+          <w:sz w:val="16"/>
+        </w:rPr>
+        <w:t xml:space="preserve"> </w:t>
+      </w:r>
+      <w:r>
+        <w:rPr>
+          <w:rFonts w:ascii="Consolas" w:hAnsi="Consolas"/>
+          <w:color w:val="0073E6"/>
+          <w:sz w:val="16"/>
+        </w:rPr>
+        <w:t xml:space="preserve">--seed</w:t>
+      </w:r>
+      <w:r>
+        <w:rPr>
+          <w:rFonts w:ascii="Consolas" w:hAnsi="Consolas"/>
+          <w:color w:val="262626"/>
+          <w:sz w:val="16"/>
+        </w:rPr>
+        <w:t xml:space="preserve"> </w:t>
+      </w:r>
+      <w:r>
+        <w:rPr>
+          <w:rFonts w:ascii="Consolas" w:hAnsi="Consolas"/>
+          <w:color w:val="0073E6"/>
+          <w:sz w:val="16"/>
+        </w:rPr>
+        <w:t xml:space="preserve">--env=testing</w:t>
+      </w:r>
+      <w:r>
         <w:br/>
       </w:r>
       <w:r>
         <w:rPr>
           <w:rFonts w:ascii="Consolas" w:hAnsi="Consolas"/>
-          <w:color w:val="4EC9B0"/>
+          <w:b/>
+          <w:color w:val="000080"/>
           <w:sz w:val="16"/>
         </w:rPr>
-        <w:t>php</w:t>
+        <w:t xml:space="preserve">php</w:t>
       </w:r>
       <w:r>
         <w:rPr>
           <w:rFonts w:ascii="Consolas" w:hAnsi="Consolas"/>
-          <w:color w:val="D4D4D4"/>
+          <w:color w:val="262626"/>
           <w:sz w:val="16"/>
         </w:rPr>
-        <w:t xml:space="preserve"> artisan test --testsuite=</w:t>
+        <w:t xml:space="preserve"> artisan test </w:t>
       </w:r>
       <w:r>
         <w:rPr>
           <w:rFonts w:ascii="Consolas" w:hAnsi="Consolas"/>
-          <w:color w:val="4EC9B0"/>
+          <w:color w:val="0073E6"/>
           <w:sz w:val="16"/>
         </w:rPr>
-        <w:t>Feature</w:t>
+        <w:t xml:space="preserve">--testsuite=Feature</w:t>
       </w:r>
       <w:r>
         <w:rPr>
           <w:rFonts w:ascii="Consolas" w:hAnsi="Consolas"/>
-          <w:color w:val="D4D4D4"/>
+          <w:color w:val="262626"/>
           <w:sz w:val="16"/>
         </w:rPr>
-        <w:t xml:space="preserve"> --stop-on-failure</w:t>
-        <w:br/>
-        <w:t xml:space="preserve">./vendor/bin/pint --test</w:t>
+        <w:t xml:space="preserve"> </w:t>
+      </w:r>
+      <w:r>
+        <w:rPr>
+          <w:rFonts w:ascii="Consolas" w:hAnsi="Consolas"/>
+          <w:color w:val="0073E6"/>
+          <w:sz w:val="16"/>
+        </w:rPr>
+        <w:t xml:space="preserve">--stop-on-failure</w:t>
+      </w:r>
+      <w:r>
         <w:br/>
       </w:r>
       <w:r>
         <w:rPr>
           <w:rFonts w:ascii="Consolas" w:hAnsi="Consolas"/>
-          <w:color w:val="4EC9B0"/>
+          <w:color w:val="262626"/>
           <w:sz w:val="16"/>
         </w:rPr>
-        <w:t>npm</w:t>
+        <w:t xml:space="preserve">./vendor/bin/pint </w:t>
       </w:r>
       <w:r>
         <w:rPr>
           <w:rFonts w:ascii="Consolas" w:hAnsi="Consolas"/>
-          <w:color w:val="D4D4D4"/>
+          <w:color w:val="0073E6"/>
+          <w:sz w:val="16"/>
+        </w:rPr>
+        <w:t xml:space="preserve">--test</w:t>
+      </w:r>
+      <w:r>
+        <w:br/>
+      </w:r>
+      <w:r>
+        <w:rPr>
+          <w:rFonts w:ascii="Consolas" w:hAnsi="Consolas"/>
+          <w:b/>
+          <w:color w:val="000080"/>
+          <w:sz w:val="16"/>
+        </w:rPr>
+        <w:t xml:space="preserve">npm</w:t>
+      </w:r>
+      <w:r>
+        <w:rPr>
+          <w:rFonts w:ascii="Consolas" w:hAnsi="Consolas"/>
+          <w:color w:val="262626"/>
           <w:sz w:val="16"/>
         </w:rPr>
         <w:t xml:space="preserve"> run build</w:t>
@@ -5044,431 +5127,215 @@
     <w:p>
       <w:pPr>
         <w:pStyle w:val="CodeHeader"/>
-        <w:shd w:fill="2D2D30"/>
+        <w:keepNext/>
         <w:pBdr>
-          <w:left w:val="single" w:sz="4" w:space="8" w:color="2D2D30"/>
+          <w:left w:val="single" w:sz="12" w:space="8" w:color="B8DDE0"/>
         </w:pBdr>
+        <w:shd w:val="clear" w:color="auto" w:fill="E4EAED"/>
       </w:pPr>
       <w:r>
-        <w:t>AUDIT KOMPATIBILITAS DEPENDENSI SRS — terminal root proyek   •   BASH</w:t>
+        <w:rPr>
+          <w:rFonts w:ascii="Consolas" w:hAnsi="Consolas"/>
+          <w:b/>
+          <w:color w:val="262626"/>
+          <w:sz w:val="16"/>
+        </w:rPr>
+        <w:t xml:space="preserve">AUDIT KOMPATIBILITAS DEPENDENSI SRS — terminal root proyek   •   BASH</w:t>
       </w:r>
     </w:p>
     <w:p>
       <w:pPr>
         <w:pStyle w:val="CodeBlock"/>
-        <w:shd w:fill="1E1E1E"/>
         <w:keepLines/>
         <w:pBdr>
-          <w:left w:val="single" w:sz="4" w:space="8" w:color="1E1E1E"/>
+          <w:left w:val="single" w:sz="12" w:space="8" w:color="B8DDE0"/>
         </w:pBdr>
+        <w:shd w:val="clear" w:color="auto" w:fill="F2F3F7"/>
       </w:pPr>
       <w:r>
         <w:rPr>
-          <w:rFonts w:ascii="Consolas" w:hAnsi="Consolas" w:eastAsia="Consolas"/>
-          <w:color w:val="4EC9B0"/>
+          <w:rFonts w:ascii="Consolas" w:hAnsi="Consolas"/>
+          <w:b/>
+          <w:color w:val="000080"/>
           <w:sz w:val="16"/>
         </w:rPr>
-        <w:t>composer</w:t>
+        <w:t xml:space="preserve">composer</w:t>
       </w:r>
       <w:r>
         <w:rPr>
-          <w:rFonts w:ascii="Consolas" w:hAnsi="Consolas" w:eastAsia="Consolas"/>
-          <w:color w:val="D4D4D4"/>
+          <w:rFonts w:ascii="Consolas" w:hAnsi="Consolas"/>
+          <w:color w:val="262626"/>
           <w:sz w:val="16"/>
         </w:rPr>
-        <w:t xml:space="preserve"> </w:t>
+        <w:t xml:space="preserve"> require chillerlan/php-qrcode intervention/image-laravel </w:t>
       </w:r>
       <w:r>
         <w:rPr>
-          <w:rFonts w:ascii="Consolas" w:hAnsi="Consolas" w:eastAsia="Consolas"/>
-          <w:color w:val="D4D4D4"/>
+          <w:rFonts w:ascii="Consolas" w:hAnsi="Consolas"/>
+          <w:color w:val="0073E6"/>
           <w:sz w:val="16"/>
         </w:rPr>
-        <w:t>require</w:t>
+        <w:t xml:space="preserve">--dry-run</w:t>
       </w:r>
       <w:r>
-        <w:rPr>
-          <w:rFonts w:ascii="Consolas" w:hAnsi="Consolas" w:eastAsia="Consolas"/>
-          <w:color w:val="D4D4D4"/>
-          <w:sz w:val="16"/>
-        </w:rPr>
-        <w:t xml:space="preserve"> </w:t>
-      </w:r>
-      <w:r>
-        <w:rPr>
-          <w:rFonts w:ascii="Consolas" w:hAnsi="Consolas" w:eastAsia="Consolas"/>
-          <w:color w:val="D4D4D4"/>
-          <w:sz w:val="16"/>
-        </w:rPr>
-        <w:t>chillerlan/php-qrcode</w:t>
-      </w:r>
-      <w:r>
-        <w:rPr>
-          <w:rFonts w:ascii="Consolas" w:hAnsi="Consolas" w:eastAsia="Consolas"/>
-          <w:color w:val="D4D4D4"/>
-          <w:sz w:val="16"/>
-        </w:rPr>
-        <w:t xml:space="preserve"> </w:t>
-      </w:r>
-      <w:r>
-        <w:rPr>
-          <w:rFonts w:ascii="Consolas" w:hAnsi="Consolas" w:eastAsia="Consolas"/>
-          <w:color w:val="D4D4D4"/>
-          <w:sz w:val="16"/>
-        </w:rPr>
-        <w:t>intervention/image-laravel</w:t>
-      </w:r>
-      <w:r>
-        <w:rPr>
-          <w:rFonts w:ascii="Consolas" w:hAnsi="Consolas" w:eastAsia="Consolas"/>
-          <w:color w:val="D4D4D4"/>
-          <w:sz w:val="16"/>
-        </w:rPr>
-        <w:t xml:space="preserve"> </w:t>
-      </w:r>
-      <w:r>
-        <w:rPr>
-          <w:rFonts w:ascii="Consolas" w:hAnsi="Consolas" w:eastAsia="Consolas"/>
-          <w:color w:val="9CDCFE"/>
-          <w:sz w:val="16"/>
-        </w:rPr>
-        <w:t>--dry-run</w:t>
-      </w:r>
-      <w:r>
-        <w:rPr>
-          <w:rFonts w:ascii="Consolas" w:hAnsi="Consolas" w:eastAsia="Consolas"/>
-          <w:color w:val="D4D4D4"/>
-          <w:sz w:val="16"/>
-        </w:rPr>
         <w:br/>
       </w:r>
       <w:r>
         <w:rPr>
-          <w:rFonts w:ascii="Consolas" w:hAnsi="Consolas" w:eastAsia="Consolas"/>
-          <w:color w:val="4EC9B0"/>
+          <w:rFonts w:ascii="Consolas" w:hAnsi="Consolas"/>
+          <w:b/>
+          <w:color w:val="000080"/>
           <w:sz w:val="16"/>
         </w:rPr>
-        <w:t>composer</w:t>
+        <w:t xml:space="preserve">composer</w:t>
       </w:r>
       <w:r>
         <w:rPr>
-          <w:rFonts w:ascii="Consolas" w:hAnsi="Consolas" w:eastAsia="Consolas"/>
-          <w:color w:val="D4D4D4"/>
+          <w:rFonts w:ascii="Consolas" w:hAnsi="Consolas"/>
+          <w:color w:val="262626"/>
           <w:sz w:val="16"/>
         </w:rPr>
-        <w:t xml:space="preserve"> </w:t>
+        <w:t xml:space="preserve"> require maatwebsite/excel barryvdh/laravel-dompdf </w:t>
       </w:r>
       <w:r>
         <w:rPr>
-          <w:rFonts w:ascii="Consolas" w:hAnsi="Consolas" w:eastAsia="Consolas"/>
-          <w:color w:val="D4D4D4"/>
+          <w:rFonts w:ascii="Consolas" w:hAnsi="Consolas"/>
+          <w:color w:val="0073E6"/>
           <w:sz w:val="16"/>
         </w:rPr>
-        <w:t>require</w:t>
+        <w:t xml:space="preserve">--dry-run</w:t>
       </w:r>
       <w:r>
-        <w:rPr>
-          <w:rFonts w:ascii="Consolas" w:hAnsi="Consolas" w:eastAsia="Consolas"/>
-          <w:color w:val="D4D4D4"/>
-          <w:sz w:val="16"/>
-        </w:rPr>
-        <w:t xml:space="preserve"> </w:t>
-      </w:r>
-      <w:r>
-        <w:rPr>
-          <w:rFonts w:ascii="Consolas" w:hAnsi="Consolas" w:eastAsia="Consolas"/>
-          <w:color w:val="D4D4D4"/>
-          <w:sz w:val="16"/>
-        </w:rPr>
-        <w:t>maatwebsite/excel</w:t>
-      </w:r>
-      <w:r>
-        <w:rPr>
-          <w:rFonts w:ascii="Consolas" w:hAnsi="Consolas" w:eastAsia="Consolas"/>
-          <w:color w:val="D4D4D4"/>
-          <w:sz w:val="16"/>
-        </w:rPr>
-        <w:t xml:space="preserve"> </w:t>
-      </w:r>
-      <w:r>
-        <w:rPr>
-          <w:rFonts w:ascii="Consolas" w:hAnsi="Consolas" w:eastAsia="Consolas"/>
-          <w:color w:val="D4D4D4"/>
-          <w:sz w:val="16"/>
-        </w:rPr>
-        <w:t>barryvdh/laravel-dompdf</w:t>
-      </w:r>
-      <w:r>
-        <w:rPr>
-          <w:rFonts w:ascii="Consolas" w:hAnsi="Consolas" w:eastAsia="Consolas"/>
-          <w:color w:val="D4D4D4"/>
-          <w:sz w:val="16"/>
-        </w:rPr>
-        <w:t xml:space="preserve"> </w:t>
-      </w:r>
-      <w:r>
-        <w:rPr>
-          <w:rFonts w:ascii="Consolas" w:hAnsi="Consolas" w:eastAsia="Consolas"/>
-          <w:color w:val="9CDCFE"/>
-          <w:sz w:val="16"/>
-        </w:rPr>
-        <w:t>--dry-run</w:t>
-      </w:r>
-      <w:r>
-        <w:rPr>
-          <w:rFonts w:ascii="Consolas" w:hAnsi="Consolas" w:eastAsia="Consolas"/>
-          <w:color w:val="D4D4D4"/>
-          <w:sz w:val="16"/>
-        </w:rPr>
         <w:br/>
       </w:r>
       <w:r>
         <w:rPr>
-          <w:rFonts w:ascii="Consolas" w:hAnsi="Consolas" w:eastAsia="Consolas"/>
-          <w:color w:val="4EC9B0"/>
+          <w:rFonts w:ascii="Consolas" w:hAnsi="Consolas"/>
+          <w:b/>
+          <w:color w:val="000080"/>
           <w:sz w:val="16"/>
         </w:rPr>
-        <w:t>composer</w:t>
+        <w:t xml:space="preserve">composer</w:t>
       </w:r>
       <w:r>
         <w:rPr>
-          <w:rFonts w:ascii="Consolas" w:hAnsi="Consolas" w:eastAsia="Consolas"/>
-          <w:color w:val="D4D4D4"/>
+          <w:rFonts w:ascii="Consolas" w:hAnsi="Consolas"/>
+          <w:color w:val="262626"/>
           <w:sz w:val="16"/>
         </w:rPr>
-        <w:t xml:space="preserve"> </w:t>
+        <w:t xml:space="preserve"> require laravel-notification-channels/webpush </w:t>
       </w:r>
       <w:r>
         <w:rPr>
-          <w:rFonts w:ascii="Consolas" w:hAnsi="Consolas" w:eastAsia="Consolas"/>
-          <w:color w:val="D4D4D4"/>
+          <w:rFonts w:ascii="Consolas" w:hAnsi="Consolas"/>
+          <w:color w:val="0073E6"/>
           <w:sz w:val="16"/>
         </w:rPr>
-        <w:t>require</w:t>
+        <w:t xml:space="preserve">--dry-run</w:t>
       </w:r>
       <w:r>
-        <w:rPr>
-          <w:rFonts w:ascii="Consolas" w:hAnsi="Consolas" w:eastAsia="Consolas"/>
-          <w:color w:val="D4D4D4"/>
-          <w:sz w:val="16"/>
-        </w:rPr>
-        <w:t xml:space="preserve"> </w:t>
-      </w:r>
-      <w:r>
-        <w:rPr>
-          <w:rFonts w:ascii="Consolas" w:hAnsi="Consolas" w:eastAsia="Consolas"/>
-          <w:color w:val="D4D4D4"/>
-          <w:sz w:val="16"/>
-        </w:rPr>
-        <w:t>laravel-notification-channels/webpush</w:t>
-      </w:r>
-      <w:r>
-        <w:rPr>
-          <w:rFonts w:ascii="Consolas" w:hAnsi="Consolas" w:eastAsia="Consolas"/>
-          <w:color w:val="D4D4D4"/>
-          <w:sz w:val="16"/>
-        </w:rPr>
-        <w:t xml:space="preserve"> </w:t>
-      </w:r>
-      <w:r>
-        <w:rPr>
-          <w:rFonts w:ascii="Consolas" w:hAnsi="Consolas" w:eastAsia="Consolas"/>
-          <w:color w:val="9CDCFE"/>
-          <w:sz w:val="16"/>
-        </w:rPr>
-        <w:t>--dry-run</w:t>
-      </w:r>
-      <w:r>
-        <w:rPr>
-          <w:rFonts w:ascii="Consolas" w:hAnsi="Consolas" w:eastAsia="Consolas"/>
-          <w:color w:val="D4D4D4"/>
-          <w:sz w:val="16"/>
-        </w:rPr>
         <w:br/>
       </w:r>
       <w:r>
         <w:rPr>
-          <w:rFonts w:ascii="Consolas" w:hAnsi="Consolas" w:eastAsia="Consolas"/>
-          <w:color w:val="4EC9B0"/>
+          <w:rFonts w:ascii="Consolas" w:hAnsi="Consolas"/>
+          <w:b/>
+          <w:color w:val="000080"/>
           <w:sz w:val="16"/>
         </w:rPr>
-        <w:t>npm</w:t>
+        <w:t xml:space="preserve">npm</w:t>
       </w:r>
       <w:r>
         <w:rPr>
-          <w:rFonts w:ascii="Consolas" w:hAnsi="Consolas" w:eastAsia="Consolas"/>
-          <w:color w:val="D4D4D4"/>
+          <w:rFonts w:ascii="Consolas" w:hAnsi="Consolas"/>
+          <w:color w:val="262626"/>
           <w:sz w:val="16"/>
         </w:rPr>
-        <w:t xml:space="preserve"> </w:t>
+        <w:t xml:space="preserve"> install </w:t>
       </w:r>
       <w:r>
         <w:rPr>
-          <w:rFonts w:ascii="Consolas" w:hAnsi="Consolas" w:eastAsia="Consolas"/>
-          <w:color w:val="D4D4D4"/>
+          <w:rFonts w:ascii="Consolas" w:hAnsi="Consolas"/>
+          <w:color w:val="0073E6"/>
           <w:sz w:val="16"/>
         </w:rPr>
-        <w:t>install</w:t>
+        <w:t xml:space="preserve">--dry-run</w:t>
       </w:r>
       <w:r>
         <w:rPr>
-          <w:rFonts w:ascii="Consolas" w:hAnsi="Consolas" w:eastAsia="Consolas"/>
-          <w:color w:val="D4D4D4"/>
+          <w:rFonts w:ascii="Consolas" w:hAnsi="Consolas"/>
+          <w:color w:val="262626"/>
           <w:sz w:val="16"/>
         </w:rPr>
-        <w:t xml:space="preserve"> </w:t>
+        <w:t xml:space="preserve"> laravel-echo pusher-js</w:t>
       </w:r>
       <w:r>
-        <w:rPr>
-          <w:rFonts w:ascii="Consolas" w:hAnsi="Consolas" w:eastAsia="Consolas"/>
-          <w:color w:val="9CDCFE"/>
-          <w:sz w:val="16"/>
-        </w:rPr>
-        <w:t>--dry-run</w:t>
-      </w:r>
-      <w:r>
-        <w:rPr>
-          <w:rFonts w:ascii="Consolas" w:hAnsi="Consolas" w:eastAsia="Consolas"/>
-          <w:color w:val="D4D4D4"/>
-          <w:sz w:val="16"/>
-        </w:rPr>
-        <w:t xml:space="preserve"> </w:t>
-      </w:r>
-      <w:r>
-        <w:rPr>
-          <w:rFonts w:ascii="Consolas" w:hAnsi="Consolas" w:eastAsia="Consolas"/>
-          <w:color w:val="D4D4D4"/>
-          <w:sz w:val="16"/>
-        </w:rPr>
-        <w:t>laravel-echo</w:t>
-      </w:r>
-      <w:r>
-        <w:rPr>
-          <w:rFonts w:ascii="Consolas" w:hAnsi="Consolas" w:eastAsia="Consolas"/>
-          <w:color w:val="D4D4D4"/>
-          <w:sz w:val="16"/>
-        </w:rPr>
-        <w:t xml:space="preserve"> </w:t>
-      </w:r>
-      <w:r>
-        <w:rPr>
-          <w:rFonts w:ascii="Consolas" w:hAnsi="Consolas" w:eastAsia="Consolas"/>
-          <w:color w:val="D4D4D4"/>
-          <w:sz w:val="16"/>
-        </w:rPr>
-        <w:t>pusher-js</w:t>
-      </w:r>
-      <w:r>
-        <w:rPr>
-          <w:rFonts w:ascii="Consolas" w:hAnsi="Consolas" w:eastAsia="Consolas"/>
-          <w:color w:val="D4D4D4"/>
-          <w:sz w:val="16"/>
-        </w:rPr>
         <w:br/>
       </w:r>
       <w:r>
         <w:rPr>
-          <w:rFonts w:ascii="Consolas" w:hAnsi="Consolas" w:eastAsia="Consolas"/>
-          <w:color w:val="4EC9B0"/>
+          <w:rFonts w:ascii="Consolas" w:hAnsi="Consolas"/>
+          <w:b/>
+          <w:color w:val="000080"/>
           <w:sz w:val="16"/>
         </w:rPr>
-        <w:t>composer</w:t>
+        <w:t xml:space="preserve">composer</w:t>
       </w:r>
       <w:r>
         <w:rPr>
-          <w:rFonts w:ascii="Consolas" w:hAnsi="Consolas" w:eastAsia="Consolas"/>
-          <w:color w:val="D4D4D4"/>
+          <w:rFonts w:ascii="Consolas" w:hAnsi="Consolas"/>
+          <w:color w:val="262626"/>
           <w:sz w:val="16"/>
         </w:rPr>
-        <w:t xml:space="preserve"> </w:t>
+        <w:t xml:space="preserve"> validate </w:t>
       </w:r>
       <w:r>
         <w:rPr>
-          <w:rFonts w:ascii="Consolas" w:hAnsi="Consolas" w:eastAsia="Consolas"/>
-          <w:color w:val="D4D4D4"/>
+          <w:rFonts w:ascii="Consolas" w:hAnsi="Consolas"/>
+          <w:color w:val="0073E6"/>
           <w:sz w:val="16"/>
         </w:rPr>
-        <w:t>validate</w:t>
+        <w:t xml:space="preserve">--strict</w:t>
       </w:r>
       <w:r>
-        <w:rPr>
-          <w:rFonts w:ascii="Consolas" w:hAnsi="Consolas" w:eastAsia="Consolas"/>
-          <w:color w:val="D4D4D4"/>
-          <w:sz w:val="16"/>
-        </w:rPr>
-        <w:t xml:space="preserve"> </w:t>
-      </w:r>
-      <w:r>
-        <w:rPr>
-          <w:rFonts w:ascii="Consolas" w:hAnsi="Consolas" w:eastAsia="Consolas"/>
-          <w:color w:val="9CDCFE"/>
-          <w:sz w:val="16"/>
-        </w:rPr>
-        <w:t>--strict</w:t>
-      </w:r>
-      <w:r>
-        <w:rPr>
-          <w:rFonts w:ascii="Consolas" w:hAnsi="Consolas" w:eastAsia="Consolas"/>
-          <w:color w:val="D4D4D4"/>
-          <w:sz w:val="16"/>
-        </w:rPr>
         <w:br/>
       </w:r>
       <w:r>
         <w:rPr>
-          <w:rFonts w:ascii="Consolas" w:hAnsi="Consolas" w:eastAsia="Consolas"/>
-          <w:color w:val="4EC9B0"/>
+          <w:rFonts w:ascii="Consolas" w:hAnsi="Consolas"/>
+          <w:b/>
+          <w:color w:val="000080"/>
           <w:sz w:val="16"/>
         </w:rPr>
-        <w:t>composer</w:t>
+        <w:t xml:space="preserve">composer</w:t>
       </w:r>
       <w:r>
         <w:rPr>
-          <w:rFonts w:ascii="Consolas" w:hAnsi="Consolas" w:eastAsia="Consolas"/>
-          <w:color w:val="D4D4D4"/>
+          <w:rFonts w:ascii="Consolas" w:hAnsi="Consolas"/>
+          <w:color w:val="262626"/>
           <w:sz w:val="16"/>
         </w:rPr>
-        <w:t xml:space="preserve"> </w:t>
+        <w:t xml:space="preserve"> audit</w:t>
       </w:r>
       <w:r>
-        <w:rPr>
-          <w:rFonts w:ascii="Consolas" w:hAnsi="Consolas" w:eastAsia="Consolas"/>
-          <w:color w:val="D4D4D4"/>
-          <w:sz w:val="16"/>
-        </w:rPr>
-        <w:t>audit</w:t>
-      </w:r>
-      <w:r>
-        <w:rPr>
-          <w:rFonts w:ascii="Consolas" w:hAnsi="Consolas" w:eastAsia="Consolas"/>
-          <w:color w:val="D4D4D4"/>
-          <w:sz w:val="16"/>
-        </w:rPr>
         <w:br/>
       </w:r>
       <w:r>
         <w:rPr>
-          <w:rFonts w:ascii="Consolas" w:hAnsi="Consolas" w:eastAsia="Consolas"/>
-          <w:color w:val="4EC9B0"/>
+          <w:rFonts w:ascii="Consolas" w:hAnsi="Consolas"/>
+          <w:b/>
+          <w:color w:val="000080"/>
           <w:sz w:val="16"/>
         </w:rPr>
-        <w:t>npm</w:t>
+        <w:t xml:space="preserve">npm</w:t>
       </w:r>
       <w:r>
         <w:rPr>
-          <w:rFonts w:ascii="Consolas" w:hAnsi="Consolas" w:eastAsia="Consolas"/>
-          <w:color w:val="D4D4D4"/>
+          <w:rFonts w:ascii="Consolas" w:hAnsi="Consolas"/>
+          <w:color w:val="262626"/>
           <w:sz w:val="16"/>
         </w:rPr>
-        <w:t xml:space="preserve"> </w:t>
-      </w:r>
-      <w:r>
-        <w:rPr>
-          <w:rFonts w:ascii="Consolas" w:hAnsi="Consolas" w:eastAsia="Consolas"/>
-          <w:color w:val="D4D4D4"/>
-          <w:sz w:val="16"/>
-        </w:rPr>
-        <w:t>audit</w:t>
+        <w:t xml:space="preserve"> audit</w:t>
       </w:r>
     </w:p>
     <w:p>
@@ -7909,8 +7776,10 @@
       <w:r>
         <w:rPr>
           <w:rFonts w:ascii="Aptos" w:hAnsi="Aptos"/>
+          <w:color w:val="1F2937"/>
+          <w:sz w:val="19"/>
         </w:rPr>
-        <w:t>Preset dasar yang digunakan adalah compact_reference_guide dengan named override untuk modul pembelajaran: A4 portrait; margin atas 1,65 cm, bawah 1,55 cm, kiri/kanan 1,75 cm; Aptos 10,2 pt; line spacing 1,16; heading beraksen Laravel red; tabel ringkas; callout Predict/Try/Observe; code block Consolas bertema Visual Studio Code Dark+; checklist; exit ticket; serta screenshot mockup UI.</w:t>
+        <w:t xml:space="preserve">Preset dasar yang digunakan adalah compact_reference_guide dengan named override untuk modul pembelajaran: A4 portrait; margin atas 1,65 cm, bawah 1,55 cm, kiri/kanan 1,75 cm; Aptos 10,2 pt; line spacing 1,16; heading beraksen Laravel red; tabel ringkas; callout Predict/Try/Observe; code block Consolas berlatar Cyan Light dengan pewarnaan token Visual Studio Code; checklist; exit ticket; serta screenshot mockup UI.</w:t>
       </w:r>
     </w:p>
     <w:p>
@@ -8491,6 +8360,19 @@
         <w:pStyle w:val="ListBody"/>
       </w:pPr>
       <w:r>
+        <w:rPr>
+          <w:rFonts w:ascii="Aptos" w:hAnsi="Aptos"/>
+          <w:color w:val="1F2937"/>
+          <w:sz w:val="19"/>
+        </w:rPr>
+        <w:t xml:space="preserve">DOC-00-001 — Seluruh blok kode (208 blok, 133 label) memakai latar terang tema Cyan Light (JetBrains) dengan pewarnaan token standar Visual Studio Code untuk PHP, HTML/Blade, cmd, dan bash; teks kode tidak berubah; penjelasan palet di “Cara Membaca Sampel Kode” dan Lampiran diperbarui.</w:t>
+      </w:r>
+    </w:p>
+    <w:p>
+      <w:pPr>
+        <w:pStyle w:val="ListBody"/>
+      </w:pPr>
+      <w:r>
         <w:t xml:space="preserve">DOC-01-001 — Basis dokumen: parameter menyebut v4/v5 yang tidak ada; basis nyata adalah v7. Revisi kumulatif ditulis ke berkas v8; v7 tetap utuh di references/.</w:t>
       </w:r>
     </w:p>
@@ -8869,6 +8751,19 @@
           <w:color w:val="1F2937"/>
           <w:sz w:val="19"/>
         </w:rPr>
+        <w:t xml:space="preserve">DOC-05-007 — Rantai v3 (use case SRS v2): Modul 5 menuntaskan UC-19 (penguncian 5x/10 menit, pesan generik, redirect per peran, sesi 8 jam) dan UC-21 (onboarding penanggung jawab + rekening + tautan atur kata sandi, aktif/nonaktif tenant, riwayat komisi beserta pengelola); ditambahkan deskripsi use case, mockup, Tahap 8, dan output nyata browser.</w:t>
+      </w:r>
+    </w:p>
+    <w:p>
+      <w:pPr>
+        <w:pStyle w:val="ListBody"/>
+      </w:pPr>
+      <w:r>
+        <w:rPr>
+          <w:rFonts w:ascii="Aptos" w:hAnsi="Aptos"/>
+          <w:color w:val="1F2937"/>
+          <w:sz w:val="19"/>
+        </w:rPr>
         <w:t xml:space="preserve">DOC-06-004 — Controller/view/route meja di modul Admin; controller + route publik scan QR di modul Ordering (</w:t>
       </w:r>
       <w:r>
@@ -8934,6 +8829,19 @@
           <w:sz w:val="19"/>
         </w:rPr>
         <w:t xml:space="preserve">DOC-06-005 — Blok BUAT FILE per tahap Modul 6: make:model, make:policy --model, make:controller FQN (termasuk --invokable untuk /q/{token}), make:trait FQN, make:class (OpaqueToken, service Admin/Ordering), make:test --unit; view &amp; route modul manual.</w:t>
+      </w:r>
+    </w:p>
+    <w:p>
+      <w:pPr>
+        <w:pStyle w:val="ListBody"/>
+      </w:pPr>
+      <w:r>
+        <w:rPr>
+          <w:rFonts w:ascii="Aptos" w:hAnsi="Aptos"/>
+          <w:color w:val="1F2937"/>
+          <w:sz w:val="19"/>
+        </w:rPr>
+        <w:t xml:space="preserve">DOC-06-006 — Rantai v3 (use case SRS v2): Modul 6 menuntaskan UC-22 (QR siap cetak SVG via bacon/bacon-qr-code, nonaktif/aktif meja, ringkasan meja) dan UC-02 (halaman sambutan meja + tenant buka/tutup, pesan QR tidak valid, penolakan di luar jam operasional); ditambahkan deskripsi use case, mockup, Tahap 8, dan output nyata browser.</w:t>
       </w:r>
     </w:p>
     <w:p>
@@ -9028,6 +8936,19 @@
           <w:sz w:val="19"/>
         </w:rPr>
         <w:t xml:space="preserve">DOC-07-005 — Blok BUAT FILE per tahap Modul 7: make:livewire catalog::menu-manager / catalog::menu-catalog (langsung ke folder modul), make:class MenuStockService, make:test; halaman &amp; route modul manual.</w:t>
+      </w:r>
+    </w:p>
+    <w:p>
+      <w:pPr>
+        <w:pStyle w:val="ListBody"/>
+      </w:pPr>
+      <w:r>
+        <w:rPr>
+          <w:rFonts w:ascii="Aptos" w:hAnsi="Aptos"/>
+          <w:color w:val="1F2937"/>
+          <w:sz w:val="19"/>
+        </w:rPr>
+        <w:t xml:space="preserve">DOC-07-006 — Rantai v3 (use case SRS v2): Modul 7 menuntaskan UC-13 (deskripsi, foto WebP, ubah, soft delete, cari/saring), UC-14 (sakelar satu ketukan), UC-01 (kelompok per tenant, menu habis nonaktif, tenant tutup, chip kategori, pembaruan ≤ 5 detik), dan UC-11 (WaitTimeEstimator); ditambahkan deskripsi use case, mockup, Tahap 8, dan output nyata browser.</w:t>
       </w:r>
     </w:p>
     <w:p>
@@ -9151,6 +9072,19 @@
           <w:color w:val="1F2937"/>
           <w:sz w:val="19"/>
         </w:rPr>
+        <w:t xml:space="preserve">DOC-08-006 — Rantai v3 (use case SRS v2): Modul 8 menuntaskan UC-03 (kelompok per tenant, pajak dan biaya layanan, “Menu telah habis”, checkout nonaktif saat kosong) dan UC-04 (formulir kustomisasi min/maks, opsi habis nonaktif, catatan ≤ 200 karakter tersaring, harga akhir) serta halaman tenant Kelola Modifier; ditambahkan deskripsi use case, mockup, Tahap 8, dan output nyata browser.</w:t>
+      </w:r>
+    </w:p>
+    <w:p>
+      <w:pPr>
+        <w:pStyle w:val="ListBody"/>
+      </w:pPr>
+      <w:r>
+        <w:rPr>
+          <w:rFonts w:ascii="Aptos" w:hAnsi="Aptos"/>
+          <w:color w:val="1F2937"/>
+          <w:sz w:val="19"/>
+        </w:rPr>
         <w:t xml:space="preserve">DOC-09-004 — Checkout dan status pesanan sebagai vertical slice modul Ordering (</w:t>
       </w:r>
       <w:r>
@@ -9250,6 +9184,19 @@
           <w:sz w:val="19"/>
         </w:rPr>
         <w:t xml:space="preserve">DOC-09-005 — Blok BUAT FILE per tahap Modul 9: make:class (DTO CheckoutResult, CheckoutService), make:exception FQN, make:model OrderItemModifier, make:controller FQN --invokable, make:test; view &amp; route pelanggan modul manual.</w:t>
+      </w:r>
+    </w:p>
+    <w:p>
+      <w:pPr>
+        <w:pStyle w:val="ListBody"/>
+      </w:pPr>
+      <w:r>
+        <w:rPr>
+          <w:rFonts w:ascii="Aptos" w:hAnsi="Aptos"/>
+          <w:color w:val="1F2937"/>
+          <w:sz w:val="19"/>
+        </w:rPr>
+        <w:t xml:space="preserve">DOC-09-006 — Rantai v3 (use case SRS v2): Modul 9 menuntaskan UC-05 (halaman checkout: ringkasan, nomor meja, mode penyajian, identitas ringkas, tenant wajib buka, kembali ke keranjang bila item bermasalah, catatan item tersimpan) dan UC-06 (slot pre-order 15 menit, jam operasional, kapasitas slot + slot terdekat, status terjadwal, pelepasan otomatis ke dapur tiap menit) serta halaman tenant Pengaturan Pre-Order; ditambahkan deskripsi use case, mockup, Tahap 8, dan output nyata browser.</w:t>
       </w:r>
     </w:p>
     <w:p>
@@ -9378,6 +9325,19 @@
           <w:sz w:val="19"/>
         </w:rPr>
         <w:t xml:space="preserve">DOC-10-005 — Blok BUAT FILE per tahap Modul 10: make:interface FQN, make:model ×3, make:class (DTO, service, adapter, ResolveTrackedOrder), make:exception FQN, make:livewire payments::order-payment, make:test (+ --unit).</w:t>
+      </w:r>
+    </w:p>
+    <w:p>
+      <w:pPr>
+        <w:pStyle w:val="ListBody"/>
+      </w:pPr>
+      <w:r>
+        <w:rPr>
+          <w:rFonts w:ascii="Aptos" w:hAnsi="Aptos"/>
+          <w:color w:val="1F2937"/>
+          <w:sz w:val="19"/>
+        </w:rPr>
+        <w:t xml:space="preserve">DOC-10-006 — Rantai v3 (use case SRS v2): Modul 10 menuntaskan UC-07 (QRIS otomatis setelah checkout, gambar QRIS + penghitung mundur ≤ 15 menit, rincian split per tenant, percobaan ulang 3 kali saat gateway tidak merespons, QRIS baru saat kedaluwarsa, pemantauan status, batalkan pesanan yang belum dibayar); ditambahkan deskripsi use case, mockup, Tahap 8, dan output nyata browser.</w:t>
       </w:r>
     </w:p>
     <w:p>
@@ -21764,7 +21724,7 @@
     </w:pPr>
     <w:rPr>
       <w:rFonts w:ascii="Consolas" w:hAnsi="Consolas"/>
-      <w:color w:val="D4D4D4"/>
+      <w:color w:val="262626"/>
       <w:sz w:val="16"/>
     </w:rPr>
   </w:style>
@@ -21876,7 +21836,7 @@
     <w:rPr>
       <w:rFonts w:ascii="Consolas" w:hAnsi="Consolas"/>
       <w:b/>
-      <w:color w:val="FFFFFF"/>
+      <w:color w:val="262626"/>
       <w:sz w:val="16"/>
     </w:rPr>
   </w:style>

</xml_diff>

<commit_message>
docs(v8): Modul 12 — use case UC-15, UC-09 & UC-12 + langkah Windows (cmd + VS Code)
- DOCX: bagian Use Case SRS (UC-15/UC-09/UC-12 + mockup), Tahap 8, output nyata
  (KDS, batal beralasan, pelacakan, log WhatsApp sandbox); langkah Tahap 1–8 format
  Windows diverifikasi di worktree bersih (T7 identik v2, 226 test; T8 identik kode
  akhir, 241 test); tema kode Cyan Light; modul_praktikum dipecah ulang.
- Id entri use case Modul 11 dipindah ke DOC-11-008 (DOC-11-006 sudah dipakai
  penjelasan CSRF) sehingga kini tercatat di Change Log DOCX.
- MODULE_REVISION_LOG DOC-12-006/007, RTM UC-15/UC-09/UC-12, IMPLEMENTATION_STATUS
  baris 12, laporan-implementasi (rantai v3: 20 dari 23 UC).

Co-Authored-By: Claude Opus 5.5 <noreply@anthropic.com>
</commit_message>
<xml_diff>
--- a/modul_praktikum/Lampiran.docx
+++ b/modul_praktikum/Lampiran.docx
@@ -3577,92 +3577,175 @@
     <w:p>
       <w:pPr>
         <w:pStyle w:val="CodeBlock"/>
-        <w:shd w:fill="1E1E1E" w:val="clear"/>
         <w:pBdr>
-          <w:left w:val="single" w:sz="4" w:space="8" w:color="1E1E1E"/>
+          <w:left w:val="single" w:sz="12" w:space="8" w:color="B8DDE0"/>
         </w:pBdr>
+        <w:shd w:val="clear" w:color="auto" w:fill="F2F3F7"/>
       </w:pPr>
       <w:r>
         <w:rPr>
           <w:rFonts w:ascii="Consolas" w:hAnsi="Consolas"/>
-          <w:color w:val="4EC9B0"/>
+          <w:b/>
+          <w:color w:val="000080"/>
           <w:sz w:val="16"/>
         </w:rPr>
-        <w:t>php</w:t>
+        <w:t xml:space="preserve">php</w:t>
       </w:r>
       <w:r>
         <w:rPr>
           <w:rFonts w:ascii="Consolas" w:hAnsi="Consolas"/>
-          <w:color w:val="D4D4D4"/>
+          <w:color w:val="262626"/>
           <w:sz w:val="16"/>
         </w:rPr>
-        <w:t xml:space="preserve"> artisan optimize:clear</w:t>
-        <w:br/>
+        <w:t xml:space="preserve"> artisan </w:t>
       </w:r>
       <w:r>
         <w:rPr>
           <w:rFonts w:ascii="Consolas" w:hAnsi="Consolas"/>
-          <w:color w:val="4EC9B0"/>
+          <w:color w:val="795E26"/>
           <w:sz w:val="16"/>
         </w:rPr>
-        <w:t>php</w:t>
+        <w:t xml:space="preserve">optimize:clear</w:t>
+      </w:r>
+      <w:r>
+        <w:br/>
       </w:r>
       <w:r>
         <w:rPr>
           <w:rFonts w:ascii="Consolas" w:hAnsi="Consolas"/>
-          <w:color w:val="D4D4D4"/>
+          <w:b/>
+          <w:color w:val="000080"/>
           <w:sz w:val="16"/>
         </w:rPr>
-        <w:t xml:space="preserve"> artisan migrate:fresh --seed --env=testing</w:t>
-        <w:br/>
+        <w:t xml:space="preserve">php</w:t>
       </w:r>
       <w:r>
         <w:rPr>
           <w:rFonts w:ascii="Consolas" w:hAnsi="Consolas"/>
-          <w:color w:val="4EC9B0"/>
+          <w:color w:val="262626"/>
           <w:sz w:val="16"/>
         </w:rPr>
-        <w:t>php</w:t>
+        <w:t xml:space="preserve"> artisan </w:t>
       </w:r>
       <w:r>
         <w:rPr>
           <w:rFonts w:ascii="Consolas" w:hAnsi="Consolas"/>
-          <w:color w:val="D4D4D4"/>
+          <w:color w:val="795E26"/>
           <w:sz w:val="16"/>
         </w:rPr>
-        <w:t xml:space="preserve"> artisan test --testsuite=</w:t>
+        <w:t xml:space="preserve">migrate:fresh</w:t>
       </w:r>
       <w:r>
         <w:rPr>
           <w:rFonts w:ascii="Consolas" w:hAnsi="Consolas"/>
-          <w:color w:val="4EC9B0"/>
+          <w:color w:val="262626"/>
           <w:sz w:val="16"/>
         </w:rPr>
-        <w:t>Feature</w:t>
+        <w:t xml:space="preserve"> </w:t>
       </w:r>
       <w:r>
         <w:rPr>
           <w:rFonts w:ascii="Consolas" w:hAnsi="Consolas"/>
-          <w:color w:val="D4D4D4"/>
+          <w:color w:val="0073E6"/>
           <w:sz w:val="16"/>
         </w:rPr>
-        <w:t xml:space="preserve"> --stop-on-failure</w:t>
-        <w:br/>
-        <w:t xml:space="preserve">./vendor/bin/pint --test</w:t>
-        <w:br/>
+        <w:t xml:space="preserve">--seed</w:t>
       </w:r>
       <w:r>
         <w:rPr>
           <w:rFonts w:ascii="Consolas" w:hAnsi="Consolas"/>
-          <w:color w:val="4EC9B0"/>
+          <w:color w:val="262626"/>
           <w:sz w:val="16"/>
         </w:rPr>
-        <w:t>npm</w:t>
+        <w:t xml:space="preserve"> </w:t>
       </w:r>
       <w:r>
         <w:rPr>
           <w:rFonts w:ascii="Consolas" w:hAnsi="Consolas"/>
-          <w:color w:val="D4D4D4"/>
+          <w:color w:val="0073E6"/>
+          <w:sz w:val="16"/>
+        </w:rPr>
+        <w:t xml:space="preserve">--env=testing</w:t>
+      </w:r>
+      <w:r>
+        <w:br/>
+      </w:r>
+      <w:r>
+        <w:rPr>
+          <w:rFonts w:ascii="Consolas" w:hAnsi="Consolas"/>
+          <w:b/>
+          <w:color w:val="000080"/>
+          <w:sz w:val="16"/>
+        </w:rPr>
+        <w:t xml:space="preserve">php</w:t>
+      </w:r>
+      <w:r>
+        <w:rPr>
+          <w:rFonts w:ascii="Consolas" w:hAnsi="Consolas"/>
+          <w:color w:val="262626"/>
+          <w:sz w:val="16"/>
+        </w:rPr>
+        <w:t xml:space="preserve"> artisan test </w:t>
+      </w:r>
+      <w:r>
+        <w:rPr>
+          <w:rFonts w:ascii="Consolas" w:hAnsi="Consolas"/>
+          <w:color w:val="0073E6"/>
+          <w:sz w:val="16"/>
+        </w:rPr>
+        <w:t xml:space="preserve">--testsuite=Feature</w:t>
+      </w:r>
+      <w:r>
+        <w:rPr>
+          <w:rFonts w:ascii="Consolas" w:hAnsi="Consolas"/>
+          <w:color w:val="262626"/>
+          <w:sz w:val="16"/>
+        </w:rPr>
+        <w:t xml:space="preserve"> </w:t>
+      </w:r>
+      <w:r>
+        <w:rPr>
+          <w:rFonts w:ascii="Consolas" w:hAnsi="Consolas"/>
+          <w:color w:val="0073E6"/>
+          <w:sz w:val="16"/>
+        </w:rPr>
+        <w:t xml:space="preserve">--stop-on-failure</w:t>
+      </w:r>
+      <w:r>
+        <w:br/>
+      </w:r>
+      <w:r>
+        <w:rPr>
+          <w:rFonts w:ascii="Consolas" w:hAnsi="Consolas"/>
+          <w:color w:val="262626"/>
+          <w:sz w:val="16"/>
+        </w:rPr>
+        <w:t xml:space="preserve">./vendor/bin/pint </w:t>
+      </w:r>
+      <w:r>
+        <w:rPr>
+          <w:rFonts w:ascii="Consolas" w:hAnsi="Consolas"/>
+          <w:color w:val="0073E6"/>
+          <w:sz w:val="16"/>
+        </w:rPr>
+        <w:t xml:space="preserve">--test</w:t>
+      </w:r>
+      <w:r>
+        <w:br/>
+      </w:r>
+      <w:r>
+        <w:rPr>
+          <w:rFonts w:ascii="Consolas" w:hAnsi="Consolas"/>
+          <w:b/>
+          <w:color w:val="000080"/>
+          <w:sz w:val="16"/>
+        </w:rPr>
+        <w:t xml:space="preserve">npm</w:t>
+      </w:r>
+      <w:r>
+        <w:rPr>
+          <w:rFonts w:ascii="Consolas" w:hAnsi="Consolas"/>
+          <w:color w:val="262626"/>
           <w:sz w:val="16"/>
         </w:rPr>
         <w:t xml:space="preserve"> run build</w:t>
@@ -5044,431 +5127,215 @@
     <w:p>
       <w:pPr>
         <w:pStyle w:val="CodeHeader"/>
-        <w:shd w:fill="2D2D30"/>
+        <w:keepNext/>
         <w:pBdr>
-          <w:left w:val="single" w:sz="4" w:space="8" w:color="2D2D30"/>
+          <w:left w:val="single" w:sz="12" w:space="8" w:color="B8DDE0"/>
         </w:pBdr>
+        <w:shd w:val="clear" w:color="auto" w:fill="E4EAED"/>
       </w:pPr>
       <w:r>
-        <w:t>AUDIT KOMPATIBILITAS DEPENDENSI SRS — terminal root proyek   •   BASH</w:t>
+        <w:rPr>
+          <w:rFonts w:ascii="Consolas" w:hAnsi="Consolas"/>
+          <w:b/>
+          <w:color w:val="262626"/>
+          <w:sz w:val="16"/>
+        </w:rPr>
+        <w:t xml:space="preserve">AUDIT KOMPATIBILITAS DEPENDENSI SRS — terminal root proyek   •   BASH</w:t>
       </w:r>
     </w:p>
     <w:p>
       <w:pPr>
         <w:pStyle w:val="CodeBlock"/>
-        <w:shd w:fill="1E1E1E"/>
         <w:keepLines/>
         <w:pBdr>
-          <w:left w:val="single" w:sz="4" w:space="8" w:color="1E1E1E"/>
+          <w:left w:val="single" w:sz="12" w:space="8" w:color="B8DDE0"/>
         </w:pBdr>
+        <w:shd w:val="clear" w:color="auto" w:fill="F2F3F7"/>
       </w:pPr>
       <w:r>
         <w:rPr>
-          <w:rFonts w:ascii="Consolas" w:hAnsi="Consolas" w:eastAsia="Consolas"/>
-          <w:color w:val="4EC9B0"/>
+          <w:rFonts w:ascii="Consolas" w:hAnsi="Consolas"/>
+          <w:b/>
+          <w:color w:val="000080"/>
           <w:sz w:val="16"/>
         </w:rPr>
-        <w:t>composer</w:t>
+        <w:t xml:space="preserve">composer</w:t>
       </w:r>
       <w:r>
         <w:rPr>
-          <w:rFonts w:ascii="Consolas" w:hAnsi="Consolas" w:eastAsia="Consolas"/>
-          <w:color w:val="D4D4D4"/>
+          <w:rFonts w:ascii="Consolas" w:hAnsi="Consolas"/>
+          <w:color w:val="262626"/>
           <w:sz w:val="16"/>
         </w:rPr>
-        <w:t xml:space="preserve"> </w:t>
+        <w:t xml:space="preserve"> require chillerlan/php-qrcode intervention/image-laravel </w:t>
       </w:r>
       <w:r>
         <w:rPr>
-          <w:rFonts w:ascii="Consolas" w:hAnsi="Consolas" w:eastAsia="Consolas"/>
-          <w:color w:val="D4D4D4"/>
+          <w:rFonts w:ascii="Consolas" w:hAnsi="Consolas"/>
+          <w:color w:val="0073E6"/>
           <w:sz w:val="16"/>
         </w:rPr>
-        <w:t>require</w:t>
+        <w:t xml:space="preserve">--dry-run</w:t>
+      </w:r>
+      <w:r>
+        <w:br/>
       </w:r>
       <w:r>
         <w:rPr>
-          <w:rFonts w:ascii="Consolas" w:hAnsi="Consolas" w:eastAsia="Consolas"/>
-          <w:color w:val="D4D4D4"/>
+          <w:rFonts w:ascii="Consolas" w:hAnsi="Consolas"/>
+          <w:b/>
+          <w:color w:val="000080"/>
           <w:sz w:val="16"/>
         </w:rPr>
-        <w:t xml:space="preserve"> </w:t>
+        <w:t xml:space="preserve">composer</w:t>
       </w:r>
       <w:r>
         <w:rPr>
-          <w:rFonts w:ascii="Consolas" w:hAnsi="Consolas" w:eastAsia="Consolas"/>
-          <w:color w:val="D4D4D4"/>
+          <w:rFonts w:ascii="Consolas" w:hAnsi="Consolas"/>
+          <w:color w:val="262626"/>
           <w:sz w:val="16"/>
         </w:rPr>
-        <w:t>chillerlan/php-qrcode</w:t>
+        <w:t xml:space="preserve"> require maatwebsite/excel barryvdh/laravel-dompdf </w:t>
       </w:r>
       <w:r>
         <w:rPr>
-          <w:rFonts w:ascii="Consolas" w:hAnsi="Consolas" w:eastAsia="Consolas"/>
-          <w:color w:val="D4D4D4"/>
+          <w:rFonts w:ascii="Consolas" w:hAnsi="Consolas"/>
+          <w:color w:val="0073E6"/>
           <w:sz w:val="16"/>
         </w:rPr>
-        <w:t xml:space="preserve"> </w:t>
+        <w:t xml:space="preserve">--dry-run</w:t>
+      </w:r>
+      <w:r>
+        <w:br/>
       </w:r>
       <w:r>
         <w:rPr>
-          <w:rFonts w:ascii="Consolas" w:hAnsi="Consolas" w:eastAsia="Consolas"/>
-          <w:color w:val="D4D4D4"/>
+          <w:rFonts w:ascii="Consolas" w:hAnsi="Consolas"/>
+          <w:b/>
+          <w:color w:val="000080"/>
           <w:sz w:val="16"/>
         </w:rPr>
-        <w:t>intervention/image-laravel</w:t>
+        <w:t xml:space="preserve">composer</w:t>
       </w:r>
       <w:r>
         <w:rPr>
-          <w:rFonts w:ascii="Consolas" w:hAnsi="Consolas" w:eastAsia="Consolas"/>
-          <w:color w:val="D4D4D4"/>
+          <w:rFonts w:ascii="Consolas" w:hAnsi="Consolas"/>
+          <w:color w:val="262626"/>
           <w:sz w:val="16"/>
         </w:rPr>
-        <w:t xml:space="preserve"> </w:t>
+        <w:t xml:space="preserve"> require laravel-notification-channels/webpush </w:t>
       </w:r>
       <w:r>
         <w:rPr>
-          <w:rFonts w:ascii="Consolas" w:hAnsi="Consolas" w:eastAsia="Consolas"/>
-          <w:color w:val="9CDCFE"/>
+          <w:rFonts w:ascii="Consolas" w:hAnsi="Consolas"/>
+          <w:color w:val="0073E6"/>
           <w:sz w:val="16"/>
         </w:rPr>
-        <w:t>--dry-run</w:t>
+        <w:t xml:space="preserve">--dry-run</w:t>
+      </w:r>
+      <w:r>
+        <w:br/>
       </w:r>
       <w:r>
         <w:rPr>
-          <w:rFonts w:ascii="Consolas" w:hAnsi="Consolas" w:eastAsia="Consolas"/>
-          <w:color w:val="D4D4D4"/>
+          <w:rFonts w:ascii="Consolas" w:hAnsi="Consolas"/>
+          <w:b/>
+          <w:color w:val="000080"/>
           <w:sz w:val="16"/>
         </w:rPr>
-        <w:br/>
+        <w:t xml:space="preserve">npm</w:t>
       </w:r>
       <w:r>
         <w:rPr>
-          <w:rFonts w:ascii="Consolas" w:hAnsi="Consolas" w:eastAsia="Consolas"/>
-          <w:color w:val="4EC9B0"/>
+          <w:rFonts w:ascii="Consolas" w:hAnsi="Consolas"/>
+          <w:color w:val="262626"/>
           <w:sz w:val="16"/>
         </w:rPr>
-        <w:t>composer</w:t>
+        <w:t xml:space="preserve"> install </w:t>
       </w:r>
       <w:r>
         <w:rPr>
-          <w:rFonts w:ascii="Consolas" w:hAnsi="Consolas" w:eastAsia="Consolas"/>
-          <w:color w:val="D4D4D4"/>
+          <w:rFonts w:ascii="Consolas" w:hAnsi="Consolas"/>
+          <w:color w:val="0073E6"/>
           <w:sz w:val="16"/>
         </w:rPr>
-        <w:t xml:space="preserve"> </w:t>
+        <w:t xml:space="preserve">--dry-run</w:t>
       </w:r>
       <w:r>
         <w:rPr>
-          <w:rFonts w:ascii="Consolas" w:hAnsi="Consolas" w:eastAsia="Consolas"/>
-          <w:color w:val="D4D4D4"/>
+          <w:rFonts w:ascii="Consolas" w:hAnsi="Consolas"/>
+          <w:color w:val="262626"/>
           <w:sz w:val="16"/>
         </w:rPr>
-        <w:t>require</w:t>
+        <w:t xml:space="preserve"> laravel-echo pusher-js</w:t>
+      </w:r>
+      <w:r>
+        <w:br/>
       </w:r>
       <w:r>
         <w:rPr>
-          <w:rFonts w:ascii="Consolas" w:hAnsi="Consolas" w:eastAsia="Consolas"/>
-          <w:color w:val="D4D4D4"/>
+          <w:rFonts w:ascii="Consolas" w:hAnsi="Consolas"/>
+          <w:b/>
+          <w:color w:val="000080"/>
           <w:sz w:val="16"/>
         </w:rPr>
-        <w:t xml:space="preserve"> </w:t>
+        <w:t xml:space="preserve">composer</w:t>
       </w:r>
       <w:r>
         <w:rPr>
-          <w:rFonts w:ascii="Consolas" w:hAnsi="Consolas" w:eastAsia="Consolas"/>
-          <w:color w:val="D4D4D4"/>
+          <w:rFonts w:ascii="Consolas" w:hAnsi="Consolas"/>
+          <w:color w:val="262626"/>
           <w:sz w:val="16"/>
         </w:rPr>
-        <w:t>maatwebsite/excel</w:t>
+        <w:t xml:space="preserve"> validate </w:t>
       </w:r>
       <w:r>
         <w:rPr>
-          <w:rFonts w:ascii="Consolas" w:hAnsi="Consolas" w:eastAsia="Consolas"/>
-          <w:color w:val="D4D4D4"/>
+          <w:rFonts w:ascii="Consolas" w:hAnsi="Consolas"/>
+          <w:color w:val="0073E6"/>
           <w:sz w:val="16"/>
         </w:rPr>
-        <w:t xml:space="preserve"> </w:t>
+        <w:t xml:space="preserve">--strict</w:t>
+      </w:r>
+      <w:r>
+        <w:br/>
       </w:r>
       <w:r>
         <w:rPr>
-          <w:rFonts w:ascii="Consolas" w:hAnsi="Consolas" w:eastAsia="Consolas"/>
-          <w:color w:val="D4D4D4"/>
+          <w:rFonts w:ascii="Consolas" w:hAnsi="Consolas"/>
+          <w:b/>
+          <w:color w:val="000080"/>
           <w:sz w:val="16"/>
         </w:rPr>
-        <w:t>barryvdh/laravel-dompdf</w:t>
+        <w:t xml:space="preserve">composer</w:t>
       </w:r>
       <w:r>
         <w:rPr>
-          <w:rFonts w:ascii="Consolas" w:hAnsi="Consolas" w:eastAsia="Consolas"/>
-          <w:color w:val="D4D4D4"/>
+          <w:rFonts w:ascii="Consolas" w:hAnsi="Consolas"/>
+          <w:color w:val="262626"/>
           <w:sz w:val="16"/>
         </w:rPr>
-        <w:t xml:space="preserve"> </w:t>
+        <w:t xml:space="preserve"> audit</w:t>
+      </w:r>
+      <w:r>
+        <w:br/>
       </w:r>
       <w:r>
         <w:rPr>
-          <w:rFonts w:ascii="Consolas" w:hAnsi="Consolas" w:eastAsia="Consolas"/>
-          <w:color w:val="9CDCFE"/>
+          <w:rFonts w:ascii="Consolas" w:hAnsi="Consolas"/>
+          <w:b/>
+          <w:color w:val="000080"/>
           <w:sz w:val="16"/>
         </w:rPr>
-        <w:t>--dry-run</w:t>
+        <w:t xml:space="preserve">npm</w:t>
       </w:r>
       <w:r>
         <w:rPr>
-          <w:rFonts w:ascii="Consolas" w:hAnsi="Consolas" w:eastAsia="Consolas"/>
-          <w:color w:val="D4D4D4"/>
+          <w:rFonts w:ascii="Consolas" w:hAnsi="Consolas"/>
+          <w:color w:val="262626"/>
           <w:sz w:val="16"/>
         </w:rPr>
-        <w:br/>
-      </w:r>
-      <w:r>
-        <w:rPr>
-          <w:rFonts w:ascii="Consolas" w:hAnsi="Consolas" w:eastAsia="Consolas"/>
-          <w:color w:val="4EC9B0"/>
-          <w:sz w:val="16"/>
-        </w:rPr>
-        <w:t>composer</w:t>
-      </w:r>
-      <w:r>
-        <w:rPr>
-          <w:rFonts w:ascii="Consolas" w:hAnsi="Consolas" w:eastAsia="Consolas"/>
-          <w:color w:val="D4D4D4"/>
-          <w:sz w:val="16"/>
-        </w:rPr>
-        <w:t xml:space="preserve"> </w:t>
-      </w:r>
-      <w:r>
-        <w:rPr>
-          <w:rFonts w:ascii="Consolas" w:hAnsi="Consolas" w:eastAsia="Consolas"/>
-          <w:color w:val="D4D4D4"/>
-          <w:sz w:val="16"/>
-        </w:rPr>
-        <w:t>require</w:t>
-      </w:r>
-      <w:r>
-        <w:rPr>
-          <w:rFonts w:ascii="Consolas" w:hAnsi="Consolas" w:eastAsia="Consolas"/>
-          <w:color w:val="D4D4D4"/>
-          <w:sz w:val="16"/>
-        </w:rPr>
-        <w:t xml:space="preserve"> </w:t>
-      </w:r>
-      <w:r>
-        <w:rPr>
-          <w:rFonts w:ascii="Consolas" w:hAnsi="Consolas" w:eastAsia="Consolas"/>
-          <w:color w:val="D4D4D4"/>
-          <w:sz w:val="16"/>
-        </w:rPr>
-        <w:t>laravel-notification-channels/webpush</w:t>
-      </w:r>
-      <w:r>
-        <w:rPr>
-          <w:rFonts w:ascii="Consolas" w:hAnsi="Consolas" w:eastAsia="Consolas"/>
-          <w:color w:val="D4D4D4"/>
-          <w:sz w:val="16"/>
-        </w:rPr>
-        <w:t xml:space="preserve"> </w:t>
-      </w:r>
-      <w:r>
-        <w:rPr>
-          <w:rFonts w:ascii="Consolas" w:hAnsi="Consolas" w:eastAsia="Consolas"/>
-          <w:color w:val="9CDCFE"/>
-          <w:sz w:val="16"/>
-        </w:rPr>
-        <w:t>--dry-run</w:t>
-      </w:r>
-      <w:r>
-        <w:rPr>
-          <w:rFonts w:ascii="Consolas" w:hAnsi="Consolas" w:eastAsia="Consolas"/>
-          <w:color w:val="D4D4D4"/>
-          <w:sz w:val="16"/>
-        </w:rPr>
-        <w:br/>
-      </w:r>
-      <w:r>
-        <w:rPr>
-          <w:rFonts w:ascii="Consolas" w:hAnsi="Consolas" w:eastAsia="Consolas"/>
-          <w:color w:val="4EC9B0"/>
-          <w:sz w:val="16"/>
-        </w:rPr>
-        <w:t>npm</w:t>
-      </w:r>
-      <w:r>
-        <w:rPr>
-          <w:rFonts w:ascii="Consolas" w:hAnsi="Consolas" w:eastAsia="Consolas"/>
-          <w:color w:val="D4D4D4"/>
-          <w:sz w:val="16"/>
-        </w:rPr>
-        <w:t xml:space="preserve"> </w:t>
-      </w:r>
-      <w:r>
-        <w:rPr>
-          <w:rFonts w:ascii="Consolas" w:hAnsi="Consolas" w:eastAsia="Consolas"/>
-          <w:color w:val="D4D4D4"/>
-          <w:sz w:val="16"/>
-        </w:rPr>
-        <w:t>install</w:t>
-      </w:r>
-      <w:r>
-        <w:rPr>
-          <w:rFonts w:ascii="Consolas" w:hAnsi="Consolas" w:eastAsia="Consolas"/>
-          <w:color w:val="D4D4D4"/>
-          <w:sz w:val="16"/>
-        </w:rPr>
-        <w:t xml:space="preserve"> </w:t>
-      </w:r>
-      <w:r>
-        <w:rPr>
-          <w:rFonts w:ascii="Consolas" w:hAnsi="Consolas" w:eastAsia="Consolas"/>
-          <w:color w:val="9CDCFE"/>
-          <w:sz w:val="16"/>
-        </w:rPr>
-        <w:t>--dry-run</w:t>
-      </w:r>
-      <w:r>
-        <w:rPr>
-          <w:rFonts w:ascii="Consolas" w:hAnsi="Consolas" w:eastAsia="Consolas"/>
-          <w:color w:val="D4D4D4"/>
-          <w:sz w:val="16"/>
-        </w:rPr>
-        <w:t xml:space="preserve"> </w:t>
-      </w:r>
-      <w:r>
-        <w:rPr>
-          <w:rFonts w:ascii="Consolas" w:hAnsi="Consolas" w:eastAsia="Consolas"/>
-          <w:color w:val="D4D4D4"/>
-          <w:sz w:val="16"/>
-        </w:rPr>
-        <w:t>laravel-echo</w:t>
-      </w:r>
-      <w:r>
-        <w:rPr>
-          <w:rFonts w:ascii="Consolas" w:hAnsi="Consolas" w:eastAsia="Consolas"/>
-          <w:color w:val="D4D4D4"/>
-          <w:sz w:val="16"/>
-        </w:rPr>
-        <w:t xml:space="preserve"> </w:t>
-      </w:r>
-      <w:r>
-        <w:rPr>
-          <w:rFonts w:ascii="Consolas" w:hAnsi="Consolas" w:eastAsia="Consolas"/>
-          <w:color w:val="D4D4D4"/>
-          <w:sz w:val="16"/>
-        </w:rPr>
-        <w:t>pusher-js</w:t>
-      </w:r>
-      <w:r>
-        <w:rPr>
-          <w:rFonts w:ascii="Consolas" w:hAnsi="Consolas" w:eastAsia="Consolas"/>
-          <w:color w:val="D4D4D4"/>
-          <w:sz w:val="16"/>
-        </w:rPr>
-        <w:br/>
-      </w:r>
-      <w:r>
-        <w:rPr>
-          <w:rFonts w:ascii="Consolas" w:hAnsi="Consolas" w:eastAsia="Consolas"/>
-          <w:color w:val="4EC9B0"/>
-          <w:sz w:val="16"/>
-        </w:rPr>
-        <w:t>composer</w:t>
-      </w:r>
-      <w:r>
-        <w:rPr>
-          <w:rFonts w:ascii="Consolas" w:hAnsi="Consolas" w:eastAsia="Consolas"/>
-          <w:color w:val="D4D4D4"/>
-          <w:sz w:val="16"/>
-        </w:rPr>
-        <w:t xml:space="preserve"> </w:t>
-      </w:r>
-      <w:r>
-        <w:rPr>
-          <w:rFonts w:ascii="Consolas" w:hAnsi="Consolas" w:eastAsia="Consolas"/>
-          <w:color w:val="D4D4D4"/>
-          <w:sz w:val="16"/>
-        </w:rPr>
-        <w:t>validate</w:t>
-      </w:r>
-      <w:r>
-        <w:rPr>
-          <w:rFonts w:ascii="Consolas" w:hAnsi="Consolas" w:eastAsia="Consolas"/>
-          <w:color w:val="D4D4D4"/>
-          <w:sz w:val="16"/>
-        </w:rPr>
-        <w:t xml:space="preserve"> </w:t>
-      </w:r>
-      <w:r>
-        <w:rPr>
-          <w:rFonts w:ascii="Consolas" w:hAnsi="Consolas" w:eastAsia="Consolas"/>
-          <w:color w:val="9CDCFE"/>
-          <w:sz w:val="16"/>
-        </w:rPr>
-        <w:t>--strict</w:t>
-      </w:r>
-      <w:r>
-        <w:rPr>
-          <w:rFonts w:ascii="Consolas" w:hAnsi="Consolas" w:eastAsia="Consolas"/>
-          <w:color w:val="D4D4D4"/>
-          <w:sz w:val="16"/>
-        </w:rPr>
-        <w:br/>
-      </w:r>
-      <w:r>
-        <w:rPr>
-          <w:rFonts w:ascii="Consolas" w:hAnsi="Consolas" w:eastAsia="Consolas"/>
-          <w:color w:val="4EC9B0"/>
-          <w:sz w:val="16"/>
-        </w:rPr>
-        <w:t>composer</w:t>
-      </w:r>
-      <w:r>
-        <w:rPr>
-          <w:rFonts w:ascii="Consolas" w:hAnsi="Consolas" w:eastAsia="Consolas"/>
-          <w:color w:val="D4D4D4"/>
-          <w:sz w:val="16"/>
-        </w:rPr>
-        <w:t xml:space="preserve"> </w:t>
-      </w:r>
-      <w:r>
-        <w:rPr>
-          <w:rFonts w:ascii="Consolas" w:hAnsi="Consolas" w:eastAsia="Consolas"/>
-          <w:color w:val="D4D4D4"/>
-          <w:sz w:val="16"/>
-        </w:rPr>
-        <w:t>audit</w:t>
-      </w:r>
-      <w:r>
-        <w:rPr>
-          <w:rFonts w:ascii="Consolas" w:hAnsi="Consolas" w:eastAsia="Consolas"/>
-          <w:color w:val="D4D4D4"/>
-          <w:sz w:val="16"/>
-        </w:rPr>
-        <w:br/>
-      </w:r>
-      <w:r>
-        <w:rPr>
-          <w:rFonts w:ascii="Consolas" w:hAnsi="Consolas" w:eastAsia="Consolas"/>
-          <w:color w:val="4EC9B0"/>
-          <w:sz w:val="16"/>
-        </w:rPr>
-        <w:t>npm</w:t>
-      </w:r>
-      <w:r>
-        <w:rPr>
-          <w:rFonts w:ascii="Consolas" w:hAnsi="Consolas" w:eastAsia="Consolas"/>
-          <w:color w:val="D4D4D4"/>
-          <w:sz w:val="16"/>
-        </w:rPr>
-        <w:t xml:space="preserve"> </w:t>
-      </w:r>
-      <w:r>
-        <w:rPr>
-          <w:rFonts w:ascii="Consolas" w:hAnsi="Consolas" w:eastAsia="Consolas"/>
-          <w:color w:val="D4D4D4"/>
-          <w:sz w:val="16"/>
-        </w:rPr>
-        <w:t>audit</w:t>
+        <w:t xml:space="preserve"> audit</w:t>
       </w:r>
     </w:p>
     <w:p>
@@ -7909,8 +7776,10 @@
       <w:r>
         <w:rPr>
           <w:rFonts w:ascii="Aptos" w:hAnsi="Aptos"/>
+          <w:color w:val="1F2937"/>
+          <w:sz w:val="19"/>
         </w:rPr>
-        <w:t>Preset dasar yang digunakan adalah compact_reference_guide dengan named override untuk modul pembelajaran: A4 portrait; margin atas 1,65 cm, bawah 1,55 cm, kiri/kanan 1,75 cm; Aptos 10,2 pt; line spacing 1,16; heading beraksen Laravel red; tabel ringkas; callout Predict/Try/Observe; code block Consolas bertema Visual Studio Code Dark+; checklist; exit ticket; serta screenshot mockup UI.</w:t>
+        <w:t xml:space="preserve">Preset dasar yang digunakan adalah compact_reference_guide dengan named override untuk modul pembelajaran: A4 portrait; margin atas 1,65 cm, bawah 1,55 cm, kiri/kanan 1,75 cm; Aptos 10,2 pt; line spacing 1,16; heading beraksen Laravel red; tabel ringkas; callout Predict/Try/Observe; code block Consolas berlatar Cyan Light dengan pewarnaan token Visual Studio Code; checklist; exit ticket; serta screenshot mockup UI.</w:t>
       </w:r>
     </w:p>
     <w:p>
@@ -8491,6 +8360,19 @@
         <w:pStyle w:val="ListBody"/>
       </w:pPr>
       <w:r>
+        <w:rPr>
+          <w:rFonts w:ascii="Aptos" w:hAnsi="Aptos"/>
+          <w:color w:val="1F2937"/>
+          <w:sz w:val="19"/>
+        </w:rPr>
+        <w:t xml:space="preserve">DOC-00-001 — Seluruh blok kode (208 blok, 133 label) memakai latar terang tema Cyan Light (JetBrains) dengan pewarnaan token standar Visual Studio Code untuk PHP, HTML/Blade, cmd, dan bash; teks kode tidak berubah; penjelasan palet di “Cara Membaca Sampel Kode” dan Lampiran diperbarui.</w:t>
+      </w:r>
+    </w:p>
+    <w:p>
+      <w:pPr>
+        <w:pStyle w:val="ListBody"/>
+      </w:pPr>
+      <w:r>
         <w:t xml:space="preserve">DOC-01-001 — Basis dokumen: parameter menyebut v4/v5 yang tidak ada; basis nyata adalah v7. Revisi kumulatif ditulis ke berkas v8; v7 tetap utuh di references/.</w:t>
       </w:r>
     </w:p>
@@ -8869,6 +8751,19 @@
           <w:color w:val="1F2937"/>
           <w:sz w:val="19"/>
         </w:rPr>
+        <w:t xml:space="preserve">DOC-05-007 — Rantai v3 (use case SRS v2): Modul 5 menuntaskan UC-19 (penguncian 5x/10 menit, pesan generik, redirect per peran, sesi 8 jam) dan UC-21 (onboarding penanggung jawab + rekening + tautan atur kata sandi, aktif/nonaktif tenant, riwayat komisi beserta pengelola); ditambahkan deskripsi use case, mockup, Tahap 8, dan output nyata browser.</w:t>
+      </w:r>
+    </w:p>
+    <w:p>
+      <w:pPr>
+        <w:pStyle w:val="ListBody"/>
+      </w:pPr>
+      <w:r>
+        <w:rPr>
+          <w:rFonts w:ascii="Aptos" w:hAnsi="Aptos"/>
+          <w:color w:val="1F2937"/>
+          <w:sz w:val="19"/>
+        </w:rPr>
         <w:t xml:space="preserve">DOC-06-004 — Controller/view/route meja di modul Admin; controller + route publik scan QR di modul Ordering (</w:t>
       </w:r>
       <w:r>
@@ -8946,6 +8841,19 @@
           <w:color w:val="1F2937"/>
           <w:sz w:val="19"/>
         </w:rPr>
+        <w:t xml:space="preserve">DOC-06-006 — Rantai v3 (use case SRS v2): Modul 6 menuntaskan UC-22 (QR siap cetak SVG via bacon/bacon-qr-code, nonaktif/aktif meja, ringkasan meja) dan UC-02 (halaman sambutan meja + tenant buka/tutup, pesan QR tidak valid, penolakan di luar jam operasional); ditambahkan deskripsi use case, mockup, Tahap 8, dan output nyata browser.</w:t>
+      </w:r>
+    </w:p>
+    <w:p>
+      <w:pPr>
+        <w:pStyle w:val="ListBody"/>
+      </w:pPr>
+      <w:r>
+        <w:rPr>
+          <w:rFonts w:ascii="Aptos" w:hAnsi="Aptos"/>
+          <w:color w:val="1F2937"/>
+          <w:sz w:val="19"/>
+        </w:rPr>
         <w:t xml:space="preserve">DOC-07-004 — Komponen Livewire katalog (</w:t>
       </w:r>
       <w:r>
@@ -9040,6 +8948,19 @@
           <w:color w:val="1F2937"/>
           <w:sz w:val="19"/>
         </w:rPr>
+        <w:t xml:space="preserve">DOC-07-006 — Rantai v3 (use case SRS v2): Modul 7 menuntaskan UC-13 (deskripsi, foto WebP, ubah, soft delete, cari/saring), UC-14 (sakelar satu ketukan), UC-01 (kelompok per tenant, menu habis nonaktif, tenant tutup, chip kategori, pembaruan ≤ 5 detik), dan UC-11 (WaitTimeEstimator); ditambahkan deskripsi use case, mockup, Tahap 8, dan output nyata browser.</w:t>
+      </w:r>
+    </w:p>
+    <w:p>
+      <w:pPr>
+        <w:pStyle w:val="ListBody"/>
+      </w:pPr>
+      <w:r>
+        <w:rPr>
+          <w:rFonts w:ascii="Aptos" w:hAnsi="Aptos"/>
+          <w:color w:val="1F2937"/>
+          <w:sz w:val="19"/>
+        </w:rPr>
         <w:t xml:space="preserve">DOC-08-004 — Keranjang sebagai vertical slice modul Ordering: </w:t>
       </w:r>
       <w:r>
@@ -9151,6 +9072,19 @@
           <w:color w:val="1F2937"/>
           <w:sz w:val="19"/>
         </w:rPr>
+        <w:t xml:space="preserve">DOC-08-006 — Rantai v3 (use case SRS v2): Modul 8 menuntaskan UC-03 (kelompok per tenant, pajak dan biaya layanan, “Menu telah habis”, checkout nonaktif saat kosong) dan UC-04 (formulir kustomisasi min/maks, opsi habis nonaktif, catatan ≤ 200 karakter tersaring, harga akhir) serta halaman tenant Kelola Modifier; ditambahkan deskripsi use case, mockup, Tahap 8, dan output nyata browser.</w:t>
+      </w:r>
+    </w:p>
+    <w:p>
+      <w:pPr>
+        <w:pStyle w:val="ListBody"/>
+      </w:pPr>
+      <w:r>
+        <w:rPr>
+          <w:rFonts w:ascii="Aptos" w:hAnsi="Aptos"/>
+          <w:color w:val="1F2937"/>
+          <w:sz w:val="19"/>
+        </w:rPr>
         <w:t xml:space="preserve">DOC-09-004 — Checkout dan status pesanan sebagai vertical slice modul Ordering (</w:t>
       </w:r>
       <w:r>
@@ -9262,6 +9196,19 @@
           <w:color w:val="1F2937"/>
           <w:sz w:val="19"/>
         </w:rPr>
+        <w:t xml:space="preserve">DOC-09-006 — Rantai v3 (use case SRS v2): Modul 9 menuntaskan UC-05 (halaman checkout: ringkasan, nomor meja, mode penyajian, identitas ringkas, tenant wajib buka, kembali ke keranjang bila item bermasalah, catatan item tersimpan) dan UC-06 (slot pre-order 15 menit, jam operasional, kapasitas slot + slot terdekat, status terjadwal, pelepasan otomatis ke dapur tiap menit) serta halaman tenant Pengaturan Pre-Order; ditambahkan deskripsi use case, mockup, Tahap 8, dan output nyata browser.</w:t>
+      </w:r>
+    </w:p>
+    <w:p>
+      <w:pPr>
+        <w:pStyle w:val="ListBody"/>
+      </w:pPr>
+      <w:r>
+        <w:rPr>
+          <w:rFonts w:ascii="Aptos" w:hAnsi="Aptos"/>
+          <w:color w:val="1F2937"/>
+          <w:sz w:val="19"/>
+        </w:rPr>
         <w:t xml:space="preserve">DOC-10-004 — Pembayaran sebagai vertical slice modul Payments: kontrak </w:t>
       </w:r>
       <w:r>
@@ -9390,6 +9337,19 @@
           <w:color w:val="1F2937"/>
           <w:sz w:val="19"/>
         </w:rPr>
+        <w:t xml:space="preserve">DOC-10-006 — Rantai v3 (use case SRS v2): Modul 10 menuntaskan UC-07 (QRIS otomatis setelah checkout, gambar QRIS + penghitung mundur ≤ 15 menit, rincian split per tenant, percobaan ulang 3 kali saat gateway tidak merespons, QRIS baru saat kedaluwarsa, pemantauan status, batalkan pesanan yang belum dibayar); ditambahkan deskripsi use case, mockup, Tahap 8, dan output nyata browser.</w:t>
+      </w:r>
+    </w:p>
+    <w:p>
+      <w:pPr>
+        <w:pStyle w:val="ListBody"/>
+      </w:pPr>
+      <w:r>
+        <w:rPr>
+          <w:rFonts w:ascii="Aptos" w:hAnsi="Aptos"/>
+          <w:color w:val="1F2937"/>
+          <w:sz w:val="19"/>
+        </w:rPr>
         <w:t xml:space="preserve">DOC-11-004 — Webhook sebagai vertical slice modul Payments: </w:t>
       </w:r>
       <w:r>
@@ -9514,6 +9474,19 @@
           <w:color w:val="1F2937"/>
           <w:sz w:val="19"/>
         </w:rPr>
+        <w:t xml:space="preserve">DOC-11-008 — Rantai v3 (use case SRS v2): Modul 11 menuntaskan UC-08 (nominal dicocokkan + tinjau manual, audit signature salah, penguncian baris, expire/deny membatalkan pesanan, event setelah commit, layar Pembayaran terverifikasi) dan UC-10 (ledger pengelola kantin, rincian pemecahan selisih 0, alokasi pembulatan, proses ulang settlement gagal); ditambahkan deskripsi use case, mockup, Tahap 8, dan output nyata.</w:t>
+      </w:r>
+    </w:p>
+    <w:p>
+      <w:pPr>
+        <w:pStyle w:val="ListBody"/>
+      </w:pPr>
+      <w:r>
+        <w:rPr>
+          <w:rFonts w:ascii="Aptos" w:hAnsi="Aptos"/>
+          <w:color w:val="1F2937"/>
+          <w:sz w:val="19"/>
+        </w:rPr>
         <w:t xml:space="preserve">DOC-12-004 — KDS sebagai vertical slice modul Kitchen: event (</w:t>
       </w:r>
       <w:r>
@@ -9698,6 +9671,19 @@
           <w:sz w:val="19"/>
         </w:rPr>
         <w:t xml:space="preserve">DOC-12-005 — Blok BUAT FILE per tahap Modul 12: make:class (TenantChannels, KitchenService), make:exception FQN, make:livewire kitchen::kitchen-board, make:event FQN ×2 ke modul Kitchen, make:test; halaman &amp; route modul manual.</w:t>
+      </w:r>
+    </w:p>
+    <w:p>
+      <w:pPr>
+        <w:pStyle w:val="ListBody"/>
+      </w:pPr>
+      <w:r>
+        <w:rPr>
+          <w:rFonts w:ascii="Aptos" w:hAnsi="Aptos"/>
+          <w:color w:val="1F2937"/>
+          <w:sz w:val="19"/>
+        </w:rPr>
+        <w:t xml:space="preserve">DOC-12-006 — Rantai v3 (use case SRS v2): Modul 12 menuntaskan UC-15 (KDS kolom Baru/Diproses/Siap, Terima → Selesai → Diserahkan, batal beralasan + refund pending, penanda suara, indikator koneksi + polling 10 detik), UC-09 (halaman pelacakan real-time lewat channel privat order.{public_id}, estimasi UC-11, polling 15 detik), dan UC-12 (NotificationGateway + FakeWhatsAppGateway, job antrean 3 percobaan, notification_deliveries, pengingat pre-order); ditambahkan deskripsi use case, mockup, Tahap 8, dan output nyata.</w:t>
       </w:r>
     </w:p>
     <w:sectPr>
@@ -21960,7 +21946,7 @@
     </w:pPr>
     <w:rPr>
       <w:rFonts w:ascii="Consolas" w:hAnsi="Consolas"/>
-      <w:color w:val="D4D4D4"/>
+      <w:color w:val="262626"/>
       <w:sz w:val="16"/>
     </w:rPr>
   </w:style>
@@ -22072,7 +22058,7 @@
     <w:rPr>
       <w:rFonts w:ascii="Consolas" w:hAnsi="Consolas"/>
       <w:b/>
-      <w:color w:val="FFFFFF"/>
+      <w:color w:val="262626"/>
       <w:sz w:val="16"/>
     </w:rPr>
   </w:style>

</xml_diff>

<commit_message>
docs(v8): Modul 13 — use case UC-16, UC-17, UC-18, UC-20 & UC-23 + langkah Windows (cmd + VS Code)
- Bagian Use Case SRS (deskripsi + mockup), Tahap 8, output nyata browser.
- Tahap 1–8 ditulis ulang untuk Windows: perintah cmd dengan output nyata, isi berkas lengkap;
  diverifikasi di worktree bersih (Tahap 7 = kode v2 P13, 253 test; Tahap 8 = kode akhir, 284 test).
- Catatan waktu ganda di Modul 11 dihapus.
- Revision log DOC-13-006/007, RTM UC-16/17/18/20/23 (23 dari 23 UC), status, laporan rantai v3.
- modul_praktikum/ dibuat ulang dari master.

Co-Authored-By: Claude Opus 5.5 <noreply@anthropic.com>
</commit_message>
<xml_diff>
--- a/modul_praktikum/Lampiran.docx
+++ b/modul_praktikum/Lampiran.docx
@@ -3577,92 +3577,175 @@
     <w:p>
       <w:pPr>
         <w:pStyle w:val="CodeBlock"/>
-        <w:shd w:fill="1E1E1E" w:val="clear"/>
         <w:pBdr>
-          <w:left w:val="single" w:sz="4" w:space="8" w:color="1E1E1E"/>
+          <w:left w:val="single" w:sz="12" w:space="8" w:color="B8DDE0"/>
         </w:pBdr>
+        <w:shd w:val="clear" w:color="auto" w:fill="F2F3F7"/>
       </w:pPr>
       <w:r>
         <w:rPr>
           <w:rFonts w:ascii="Consolas" w:hAnsi="Consolas"/>
-          <w:color w:val="4EC9B0"/>
+          <w:b/>
+          <w:color w:val="000080"/>
           <w:sz w:val="16"/>
         </w:rPr>
-        <w:t>php</w:t>
+        <w:t xml:space="preserve">php</w:t>
       </w:r>
       <w:r>
         <w:rPr>
           <w:rFonts w:ascii="Consolas" w:hAnsi="Consolas"/>
-          <w:color w:val="D4D4D4"/>
+          <w:color w:val="262626"/>
           <w:sz w:val="16"/>
         </w:rPr>
-        <w:t xml:space="preserve"> artisan optimize:clear</w:t>
-        <w:br/>
+        <w:t xml:space="preserve"> artisan </w:t>
       </w:r>
       <w:r>
         <w:rPr>
           <w:rFonts w:ascii="Consolas" w:hAnsi="Consolas"/>
-          <w:color w:val="4EC9B0"/>
+          <w:color w:val="795E26"/>
           <w:sz w:val="16"/>
         </w:rPr>
-        <w:t>php</w:t>
+        <w:t xml:space="preserve">optimize:clear</w:t>
+      </w:r>
+      <w:r>
+        <w:br/>
       </w:r>
       <w:r>
         <w:rPr>
           <w:rFonts w:ascii="Consolas" w:hAnsi="Consolas"/>
-          <w:color w:val="D4D4D4"/>
+          <w:b/>
+          <w:color w:val="000080"/>
           <w:sz w:val="16"/>
         </w:rPr>
-        <w:t xml:space="preserve"> artisan migrate:fresh --seed --env=testing</w:t>
-        <w:br/>
+        <w:t xml:space="preserve">php</w:t>
       </w:r>
       <w:r>
         <w:rPr>
           <w:rFonts w:ascii="Consolas" w:hAnsi="Consolas"/>
-          <w:color w:val="4EC9B0"/>
+          <w:color w:val="262626"/>
           <w:sz w:val="16"/>
         </w:rPr>
-        <w:t>php</w:t>
+        <w:t xml:space="preserve"> artisan </w:t>
       </w:r>
       <w:r>
         <w:rPr>
           <w:rFonts w:ascii="Consolas" w:hAnsi="Consolas"/>
-          <w:color w:val="D4D4D4"/>
+          <w:color w:val="795E26"/>
           <w:sz w:val="16"/>
         </w:rPr>
-        <w:t xml:space="preserve"> artisan test --testsuite=</w:t>
+        <w:t xml:space="preserve">migrate:fresh</w:t>
       </w:r>
       <w:r>
         <w:rPr>
           <w:rFonts w:ascii="Consolas" w:hAnsi="Consolas"/>
-          <w:color w:val="4EC9B0"/>
+          <w:color w:val="262626"/>
           <w:sz w:val="16"/>
         </w:rPr>
-        <w:t>Feature</w:t>
+        <w:t xml:space="preserve"> </w:t>
       </w:r>
       <w:r>
         <w:rPr>
           <w:rFonts w:ascii="Consolas" w:hAnsi="Consolas"/>
-          <w:color w:val="D4D4D4"/>
+          <w:color w:val="0073E6"/>
           <w:sz w:val="16"/>
         </w:rPr>
-        <w:t xml:space="preserve"> --stop-on-failure</w:t>
-        <w:br/>
-        <w:t xml:space="preserve">./vendor/bin/pint --test</w:t>
-        <w:br/>
+        <w:t xml:space="preserve">--seed</w:t>
       </w:r>
       <w:r>
         <w:rPr>
           <w:rFonts w:ascii="Consolas" w:hAnsi="Consolas"/>
-          <w:color w:val="4EC9B0"/>
+          <w:color w:val="262626"/>
           <w:sz w:val="16"/>
         </w:rPr>
-        <w:t>npm</w:t>
+        <w:t xml:space="preserve"> </w:t>
       </w:r>
       <w:r>
         <w:rPr>
           <w:rFonts w:ascii="Consolas" w:hAnsi="Consolas"/>
-          <w:color w:val="D4D4D4"/>
+          <w:color w:val="0073E6"/>
+          <w:sz w:val="16"/>
+        </w:rPr>
+        <w:t xml:space="preserve">--env=testing</w:t>
+      </w:r>
+      <w:r>
+        <w:br/>
+      </w:r>
+      <w:r>
+        <w:rPr>
+          <w:rFonts w:ascii="Consolas" w:hAnsi="Consolas"/>
+          <w:b/>
+          <w:color w:val="000080"/>
+          <w:sz w:val="16"/>
+        </w:rPr>
+        <w:t xml:space="preserve">php</w:t>
+      </w:r>
+      <w:r>
+        <w:rPr>
+          <w:rFonts w:ascii="Consolas" w:hAnsi="Consolas"/>
+          <w:color w:val="262626"/>
+          <w:sz w:val="16"/>
+        </w:rPr>
+        <w:t xml:space="preserve"> artisan test </w:t>
+      </w:r>
+      <w:r>
+        <w:rPr>
+          <w:rFonts w:ascii="Consolas" w:hAnsi="Consolas"/>
+          <w:color w:val="0073E6"/>
+          <w:sz w:val="16"/>
+        </w:rPr>
+        <w:t xml:space="preserve">--testsuite=Feature</w:t>
+      </w:r>
+      <w:r>
+        <w:rPr>
+          <w:rFonts w:ascii="Consolas" w:hAnsi="Consolas"/>
+          <w:color w:val="262626"/>
+          <w:sz w:val="16"/>
+        </w:rPr>
+        <w:t xml:space="preserve"> </w:t>
+      </w:r>
+      <w:r>
+        <w:rPr>
+          <w:rFonts w:ascii="Consolas" w:hAnsi="Consolas"/>
+          <w:color w:val="0073E6"/>
+          <w:sz w:val="16"/>
+        </w:rPr>
+        <w:t xml:space="preserve">--stop-on-failure</w:t>
+      </w:r>
+      <w:r>
+        <w:br/>
+      </w:r>
+      <w:r>
+        <w:rPr>
+          <w:rFonts w:ascii="Consolas" w:hAnsi="Consolas"/>
+          <w:color w:val="262626"/>
+          <w:sz w:val="16"/>
+        </w:rPr>
+        <w:t xml:space="preserve">./vendor/bin/pint </w:t>
+      </w:r>
+      <w:r>
+        <w:rPr>
+          <w:rFonts w:ascii="Consolas" w:hAnsi="Consolas"/>
+          <w:color w:val="0073E6"/>
+          <w:sz w:val="16"/>
+        </w:rPr>
+        <w:t xml:space="preserve">--test</w:t>
+      </w:r>
+      <w:r>
+        <w:br/>
+      </w:r>
+      <w:r>
+        <w:rPr>
+          <w:rFonts w:ascii="Consolas" w:hAnsi="Consolas"/>
+          <w:b/>
+          <w:color w:val="000080"/>
+          <w:sz w:val="16"/>
+        </w:rPr>
+        <w:t xml:space="preserve">npm</w:t>
+      </w:r>
+      <w:r>
+        <w:rPr>
+          <w:rFonts w:ascii="Consolas" w:hAnsi="Consolas"/>
+          <w:color w:val="262626"/>
           <w:sz w:val="16"/>
         </w:rPr>
         <w:t xml:space="preserve"> run build</w:t>
@@ -5044,431 +5127,215 @@
     <w:p>
       <w:pPr>
         <w:pStyle w:val="CodeHeader"/>
-        <w:shd w:fill="2D2D30"/>
+        <w:keepNext/>
         <w:pBdr>
-          <w:left w:val="single" w:sz="4" w:space="8" w:color="2D2D30"/>
+          <w:left w:val="single" w:sz="12" w:space="8" w:color="B8DDE0"/>
         </w:pBdr>
+        <w:shd w:val="clear" w:color="auto" w:fill="E4EAED"/>
       </w:pPr>
       <w:r>
-        <w:t>AUDIT KOMPATIBILITAS DEPENDENSI SRS — terminal root proyek   •   BASH</w:t>
+        <w:rPr>
+          <w:rFonts w:ascii="Consolas" w:hAnsi="Consolas"/>
+          <w:b/>
+          <w:color w:val="262626"/>
+          <w:sz w:val="16"/>
+        </w:rPr>
+        <w:t xml:space="preserve">AUDIT KOMPATIBILITAS DEPENDENSI SRS — terminal root proyek   •   BASH</w:t>
       </w:r>
     </w:p>
     <w:p>
       <w:pPr>
         <w:pStyle w:val="CodeBlock"/>
-        <w:shd w:fill="1E1E1E"/>
         <w:keepLines/>
         <w:pBdr>
-          <w:left w:val="single" w:sz="4" w:space="8" w:color="1E1E1E"/>
+          <w:left w:val="single" w:sz="12" w:space="8" w:color="B8DDE0"/>
         </w:pBdr>
+        <w:shd w:val="clear" w:color="auto" w:fill="F2F3F7"/>
       </w:pPr>
       <w:r>
         <w:rPr>
-          <w:rFonts w:ascii="Consolas" w:hAnsi="Consolas" w:eastAsia="Consolas"/>
-          <w:color w:val="4EC9B0"/>
+          <w:rFonts w:ascii="Consolas" w:hAnsi="Consolas"/>
+          <w:b/>
+          <w:color w:val="000080"/>
           <w:sz w:val="16"/>
         </w:rPr>
-        <w:t>composer</w:t>
+        <w:t xml:space="preserve">composer</w:t>
       </w:r>
       <w:r>
         <w:rPr>
-          <w:rFonts w:ascii="Consolas" w:hAnsi="Consolas" w:eastAsia="Consolas"/>
-          <w:color w:val="D4D4D4"/>
+          <w:rFonts w:ascii="Consolas" w:hAnsi="Consolas"/>
+          <w:color w:val="262626"/>
           <w:sz w:val="16"/>
         </w:rPr>
-        <w:t xml:space="preserve"> </w:t>
+        <w:t xml:space="preserve"> require chillerlan/php-qrcode intervention/image-laravel </w:t>
       </w:r>
       <w:r>
         <w:rPr>
-          <w:rFonts w:ascii="Consolas" w:hAnsi="Consolas" w:eastAsia="Consolas"/>
-          <w:color w:val="D4D4D4"/>
+          <w:rFonts w:ascii="Consolas" w:hAnsi="Consolas"/>
+          <w:color w:val="0073E6"/>
           <w:sz w:val="16"/>
         </w:rPr>
-        <w:t>require</w:t>
+        <w:t xml:space="preserve">--dry-run</w:t>
+      </w:r>
+      <w:r>
+        <w:br/>
       </w:r>
       <w:r>
         <w:rPr>
-          <w:rFonts w:ascii="Consolas" w:hAnsi="Consolas" w:eastAsia="Consolas"/>
-          <w:color w:val="D4D4D4"/>
+          <w:rFonts w:ascii="Consolas" w:hAnsi="Consolas"/>
+          <w:b/>
+          <w:color w:val="000080"/>
           <w:sz w:val="16"/>
         </w:rPr>
-        <w:t xml:space="preserve"> </w:t>
+        <w:t xml:space="preserve">composer</w:t>
       </w:r>
       <w:r>
         <w:rPr>
-          <w:rFonts w:ascii="Consolas" w:hAnsi="Consolas" w:eastAsia="Consolas"/>
-          <w:color w:val="D4D4D4"/>
+          <w:rFonts w:ascii="Consolas" w:hAnsi="Consolas"/>
+          <w:color w:val="262626"/>
           <w:sz w:val="16"/>
         </w:rPr>
-        <w:t>chillerlan/php-qrcode</w:t>
+        <w:t xml:space="preserve"> require maatwebsite/excel barryvdh/laravel-dompdf </w:t>
       </w:r>
       <w:r>
         <w:rPr>
-          <w:rFonts w:ascii="Consolas" w:hAnsi="Consolas" w:eastAsia="Consolas"/>
-          <w:color w:val="D4D4D4"/>
+          <w:rFonts w:ascii="Consolas" w:hAnsi="Consolas"/>
+          <w:color w:val="0073E6"/>
           <w:sz w:val="16"/>
         </w:rPr>
-        <w:t xml:space="preserve"> </w:t>
+        <w:t xml:space="preserve">--dry-run</w:t>
+      </w:r>
+      <w:r>
+        <w:br/>
       </w:r>
       <w:r>
         <w:rPr>
-          <w:rFonts w:ascii="Consolas" w:hAnsi="Consolas" w:eastAsia="Consolas"/>
-          <w:color w:val="D4D4D4"/>
+          <w:rFonts w:ascii="Consolas" w:hAnsi="Consolas"/>
+          <w:b/>
+          <w:color w:val="000080"/>
           <w:sz w:val="16"/>
         </w:rPr>
-        <w:t>intervention/image-laravel</w:t>
+        <w:t xml:space="preserve">composer</w:t>
       </w:r>
       <w:r>
         <w:rPr>
-          <w:rFonts w:ascii="Consolas" w:hAnsi="Consolas" w:eastAsia="Consolas"/>
-          <w:color w:val="D4D4D4"/>
+          <w:rFonts w:ascii="Consolas" w:hAnsi="Consolas"/>
+          <w:color w:val="262626"/>
           <w:sz w:val="16"/>
         </w:rPr>
-        <w:t xml:space="preserve"> </w:t>
+        <w:t xml:space="preserve"> require laravel-notification-channels/webpush </w:t>
       </w:r>
       <w:r>
         <w:rPr>
-          <w:rFonts w:ascii="Consolas" w:hAnsi="Consolas" w:eastAsia="Consolas"/>
-          <w:color w:val="9CDCFE"/>
+          <w:rFonts w:ascii="Consolas" w:hAnsi="Consolas"/>
+          <w:color w:val="0073E6"/>
           <w:sz w:val="16"/>
         </w:rPr>
-        <w:t>--dry-run</w:t>
+        <w:t xml:space="preserve">--dry-run</w:t>
+      </w:r>
+      <w:r>
+        <w:br/>
       </w:r>
       <w:r>
         <w:rPr>
-          <w:rFonts w:ascii="Consolas" w:hAnsi="Consolas" w:eastAsia="Consolas"/>
-          <w:color w:val="D4D4D4"/>
+          <w:rFonts w:ascii="Consolas" w:hAnsi="Consolas"/>
+          <w:b/>
+          <w:color w:val="000080"/>
           <w:sz w:val="16"/>
         </w:rPr>
-        <w:br/>
+        <w:t xml:space="preserve">npm</w:t>
       </w:r>
       <w:r>
         <w:rPr>
-          <w:rFonts w:ascii="Consolas" w:hAnsi="Consolas" w:eastAsia="Consolas"/>
-          <w:color w:val="4EC9B0"/>
+          <w:rFonts w:ascii="Consolas" w:hAnsi="Consolas"/>
+          <w:color w:val="262626"/>
           <w:sz w:val="16"/>
         </w:rPr>
-        <w:t>composer</w:t>
+        <w:t xml:space="preserve"> install </w:t>
       </w:r>
       <w:r>
         <w:rPr>
-          <w:rFonts w:ascii="Consolas" w:hAnsi="Consolas" w:eastAsia="Consolas"/>
-          <w:color w:val="D4D4D4"/>
+          <w:rFonts w:ascii="Consolas" w:hAnsi="Consolas"/>
+          <w:color w:val="0073E6"/>
           <w:sz w:val="16"/>
         </w:rPr>
-        <w:t xml:space="preserve"> </w:t>
+        <w:t xml:space="preserve">--dry-run</w:t>
       </w:r>
       <w:r>
         <w:rPr>
-          <w:rFonts w:ascii="Consolas" w:hAnsi="Consolas" w:eastAsia="Consolas"/>
-          <w:color w:val="D4D4D4"/>
+          <w:rFonts w:ascii="Consolas" w:hAnsi="Consolas"/>
+          <w:color w:val="262626"/>
           <w:sz w:val="16"/>
         </w:rPr>
-        <w:t>require</w:t>
+        <w:t xml:space="preserve"> laravel-echo pusher-js</w:t>
+      </w:r>
+      <w:r>
+        <w:br/>
       </w:r>
       <w:r>
         <w:rPr>
-          <w:rFonts w:ascii="Consolas" w:hAnsi="Consolas" w:eastAsia="Consolas"/>
-          <w:color w:val="D4D4D4"/>
+          <w:rFonts w:ascii="Consolas" w:hAnsi="Consolas"/>
+          <w:b/>
+          <w:color w:val="000080"/>
           <w:sz w:val="16"/>
         </w:rPr>
-        <w:t xml:space="preserve"> </w:t>
+        <w:t xml:space="preserve">composer</w:t>
       </w:r>
       <w:r>
         <w:rPr>
-          <w:rFonts w:ascii="Consolas" w:hAnsi="Consolas" w:eastAsia="Consolas"/>
-          <w:color w:val="D4D4D4"/>
+          <w:rFonts w:ascii="Consolas" w:hAnsi="Consolas"/>
+          <w:color w:val="262626"/>
           <w:sz w:val="16"/>
         </w:rPr>
-        <w:t>maatwebsite/excel</w:t>
+        <w:t xml:space="preserve"> validate </w:t>
       </w:r>
       <w:r>
         <w:rPr>
-          <w:rFonts w:ascii="Consolas" w:hAnsi="Consolas" w:eastAsia="Consolas"/>
-          <w:color w:val="D4D4D4"/>
+          <w:rFonts w:ascii="Consolas" w:hAnsi="Consolas"/>
+          <w:color w:val="0073E6"/>
           <w:sz w:val="16"/>
         </w:rPr>
-        <w:t xml:space="preserve"> </w:t>
+        <w:t xml:space="preserve">--strict</w:t>
+      </w:r>
+      <w:r>
+        <w:br/>
       </w:r>
       <w:r>
         <w:rPr>
-          <w:rFonts w:ascii="Consolas" w:hAnsi="Consolas" w:eastAsia="Consolas"/>
-          <w:color w:val="D4D4D4"/>
+          <w:rFonts w:ascii="Consolas" w:hAnsi="Consolas"/>
+          <w:b/>
+          <w:color w:val="000080"/>
           <w:sz w:val="16"/>
         </w:rPr>
-        <w:t>barryvdh/laravel-dompdf</w:t>
+        <w:t xml:space="preserve">composer</w:t>
       </w:r>
       <w:r>
         <w:rPr>
-          <w:rFonts w:ascii="Consolas" w:hAnsi="Consolas" w:eastAsia="Consolas"/>
-          <w:color w:val="D4D4D4"/>
+          <w:rFonts w:ascii="Consolas" w:hAnsi="Consolas"/>
+          <w:color w:val="262626"/>
           <w:sz w:val="16"/>
         </w:rPr>
-        <w:t xml:space="preserve"> </w:t>
+        <w:t xml:space="preserve"> audit</w:t>
+      </w:r>
+      <w:r>
+        <w:br/>
       </w:r>
       <w:r>
         <w:rPr>
-          <w:rFonts w:ascii="Consolas" w:hAnsi="Consolas" w:eastAsia="Consolas"/>
-          <w:color w:val="9CDCFE"/>
+          <w:rFonts w:ascii="Consolas" w:hAnsi="Consolas"/>
+          <w:b/>
+          <w:color w:val="000080"/>
           <w:sz w:val="16"/>
         </w:rPr>
-        <w:t>--dry-run</w:t>
+        <w:t xml:space="preserve">npm</w:t>
       </w:r>
       <w:r>
         <w:rPr>
-          <w:rFonts w:ascii="Consolas" w:hAnsi="Consolas" w:eastAsia="Consolas"/>
-          <w:color w:val="D4D4D4"/>
+          <w:rFonts w:ascii="Consolas" w:hAnsi="Consolas"/>
+          <w:color w:val="262626"/>
           <w:sz w:val="16"/>
         </w:rPr>
-        <w:br/>
-      </w:r>
-      <w:r>
-        <w:rPr>
-          <w:rFonts w:ascii="Consolas" w:hAnsi="Consolas" w:eastAsia="Consolas"/>
-          <w:color w:val="4EC9B0"/>
-          <w:sz w:val="16"/>
-        </w:rPr>
-        <w:t>composer</w:t>
-      </w:r>
-      <w:r>
-        <w:rPr>
-          <w:rFonts w:ascii="Consolas" w:hAnsi="Consolas" w:eastAsia="Consolas"/>
-          <w:color w:val="D4D4D4"/>
-          <w:sz w:val="16"/>
-        </w:rPr>
-        <w:t xml:space="preserve"> </w:t>
-      </w:r>
-      <w:r>
-        <w:rPr>
-          <w:rFonts w:ascii="Consolas" w:hAnsi="Consolas" w:eastAsia="Consolas"/>
-          <w:color w:val="D4D4D4"/>
-          <w:sz w:val="16"/>
-        </w:rPr>
-        <w:t>require</w:t>
-      </w:r>
-      <w:r>
-        <w:rPr>
-          <w:rFonts w:ascii="Consolas" w:hAnsi="Consolas" w:eastAsia="Consolas"/>
-          <w:color w:val="D4D4D4"/>
-          <w:sz w:val="16"/>
-        </w:rPr>
-        <w:t xml:space="preserve"> </w:t>
-      </w:r>
-      <w:r>
-        <w:rPr>
-          <w:rFonts w:ascii="Consolas" w:hAnsi="Consolas" w:eastAsia="Consolas"/>
-          <w:color w:val="D4D4D4"/>
-          <w:sz w:val="16"/>
-        </w:rPr>
-        <w:t>laravel-notification-channels/webpush</w:t>
-      </w:r>
-      <w:r>
-        <w:rPr>
-          <w:rFonts w:ascii="Consolas" w:hAnsi="Consolas" w:eastAsia="Consolas"/>
-          <w:color w:val="D4D4D4"/>
-          <w:sz w:val="16"/>
-        </w:rPr>
-        <w:t xml:space="preserve"> </w:t>
-      </w:r>
-      <w:r>
-        <w:rPr>
-          <w:rFonts w:ascii="Consolas" w:hAnsi="Consolas" w:eastAsia="Consolas"/>
-          <w:color w:val="9CDCFE"/>
-          <w:sz w:val="16"/>
-        </w:rPr>
-        <w:t>--dry-run</w:t>
-      </w:r>
-      <w:r>
-        <w:rPr>
-          <w:rFonts w:ascii="Consolas" w:hAnsi="Consolas" w:eastAsia="Consolas"/>
-          <w:color w:val="D4D4D4"/>
-          <w:sz w:val="16"/>
-        </w:rPr>
-        <w:br/>
-      </w:r>
-      <w:r>
-        <w:rPr>
-          <w:rFonts w:ascii="Consolas" w:hAnsi="Consolas" w:eastAsia="Consolas"/>
-          <w:color w:val="4EC9B0"/>
-          <w:sz w:val="16"/>
-        </w:rPr>
-        <w:t>npm</w:t>
-      </w:r>
-      <w:r>
-        <w:rPr>
-          <w:rFonts w:ascii="Consolas" w:hAnsi="Consolas" w:eastAsia="Consolas"/>
-          <w:color w:val="D4D4D4"/>
-          <w:sz w:val="16"/>
-        </w:rPr>
-        <w:t xml:space="preserve"> </w:t>
-      </w:r>
-      <w:r>
-        <w:rPr>
-          <w:rFonts w:ascii="Consolas" w:hAnsi="Consolas" w:eastAsia="Consolas"/>
-          <w:color w:val="D4D4D4"/>
-          <w:sz w:val="16"/>
-        </w:rPr>
-        <w:t>install</w:t>
-      </w:r>
-      <w:r>
-        <w:rPr>
-          <w:rFonts w:ascii="Consolas" w:hAnsi="Consolas" w:eastAsia="Consolas"/>
-          <w:color w:val="D4D4D4"/>
-          <w:sz w:val="16"/>
-        </w:rPr>
-        <w:t xml:space="preserve"> </w:t>
-      </w:r>
-      <w:r>
-        <w:rPr>
-          <w:rFonts w:ascii="Consolas" w:hAnsi="Consolas" w:eastAsia="Consolas"/>
-          <w:color w:val="9CDCFE"/>
-          <w:sz w:val="16"/>
-        </w:rPr>
-        <w:t>--dry-run</w:t>
-      </w:r>
-      <w:r>
-        <w:rPr>
-          <w:rFonts w:ascii="Consolas" w:hAnsi="Consolas" w:eastAsia="Consolas"/>
-          <w:color w:val="D4D4D4"/>
-          <w:sz w:val="16"/>
-        </w:rPr>
-        <w:t xml:space="preserve"> </w:t>
-      </w:r>
-      <w:r>
-        <w:rPr>
-          <w:rFonts w:ascii="Consolas" w:hAnsi="Consolas" w:eastAsia="Consolas"/>
-          <w:color w:val="D4D4D4"/>
-          <w:sz w:val="16"/>
-        </w:rPr>
-        <w:t>laravel-echo</w:t>
-      </w:r>
-      <w:r>
-        <w:rPr>
-          <w:rFonts w:ascii="Consolas" w:hAnsi="Consolas" w:eastAsia="Consolas"/>
-          <w:color w:val="D4D4D4"/>
-          <w:sz w:val="16"/>
-        </w:rPr>
-        <w:t xml:space="preserve"> </w:t>
-      </w:r>
-      <w:r>
-        <w:rPr>
-          <w:rFonts w:ascii="Consolas" w:hAnsi="Consolas" w:eastAsia="Consolas"/>
-          <w:color w:val="D4D4D4"/>
-          <w:sz w:val="16"/>
-        </w:rPr>
-        <w:t>pusher-js</w:t>
-      </w:r>
-      <w:r>
-        <w:rPr>
-          <w:rFonts w:ascii="Consolas" w:hAnsi="Consolas" w:eastAsia="Consolas"/>
-          <w:color w:val="D4D4D4"/>
-          <w:sz w:val="16"/>
-        </w:rPr>
-        <w:br/>
-      </w:r>
-      <w:r>
-        <w:rPr>
-          <w:rFonts w:ascii="Consolas" w:hAnsi="Consolas" w:eastAsia="Consolas"/>
-          <w:color w:val="4EC9B0"/>
-          <w:sz w:val="16"/>
-        </w:rPr>
-        <w:t>composer</w:t>
-      </w:r>
-      <w:r>
-        <w:rPr>
-          <w:rFonts w:ascii="Consolas" w:hAnsi="Consolas" w:eastAsia="Consolas"/>
-          <w:color w:val="D4D4D4"/>
-          <w:sz w:val="16"/>
-        </w:rPr>
-        <w:t xml:space="preserve"> </w:t>
-      </w:r>
-      <w:r>
-        <w:rPr>
-          <w:rFonts w:ascii="Consolas" w:hAnsi="Consolas" w:eastAsia="Consolas"/>
-          <w:color w:val="D4D4D4"/>
-          <w:sz w:val="16"/>
-        </w:rPr>
-        <w:t>validate</w:t>
-      </w:r>
-      <w:r>
-        <w:rPr>
-          <w:rFonts w:ascii="Consolas" w:hAnsi="Consolas" w:eastAsia="Consolas"/>
-          <w:color w:val="D4D4D4"/>
-          <w:sz w:val="16"/>
-        </w:rPr>
-        <w:t xml:space="preserve"> </w:t>
-      </w:r>
-      <w:r>
-        <w:rPr>
-          <w:rFonts w:ascii="Consolas" w:hAnsi="Consolas" w:eastAsia="Consolas"/>
-          <w:color w:val="9CDCFE"/>
-          <w:sz w:val="16"/>
-        </w:rPr>
-        <w:t>--strict</w:t>
-      </w:r>
-      <w:r>
-        <w:rPr>
-          <w:rFonts w:ascii="Consolas" w:hAnsi="Consolas" w:eastAsia="Consolas"/>
-          <w:color w:val="D4D4D4"/>
-          <w:sz w:val="16"/>
-        </w:rPr>
-        <w:br/>
-      </w:r>
-      <w:r>
-        <w:rPr>
-          <w:rFonts w:ascii="Consolas" w:hAnsi="Consolas" w:eastAsia="Consolas"/>
-          <w:color w:val="4EC9B0"/>
-          <w:sz w:val="16"/>
-        </w:rPr>
-        <w:t>composer</w:t>
-      </w:r>
-      <w:r>
-        <w:rPr>
-          <w:rFonts w:ascii="Consolas" w:hAnsi="Consolas" w:eastAsia="Consolas"/>
-          <w:color w:val="D4D4D4"/>
-          <w:sz w:val="16"/>
-        </w:rPr>
-        <w:t xml:space="preserve"> </w:t>
-      </w:r>
-      <w:r>
-        <w:rPr>
-          <w:rFonts w:ascii="Consolas" w:hAnsi="Consolas" w:eastAsia="Consolas"/>
-          <w:color w:val="D4D4D4"/>
-          <w:sz w:val="16"/>
-        </w:rPr>
-        <w:t>audit</w:t>
-      </w:r>
-      <w:r>
-        <w:rPr>
-          <w:rFonts w:ascii="Consolas" w:hAnsi="Consolas" w:eastAsia="Consolas"/>
-          <w:color w:val="D4D4D4"/>
-          <w:sz w:val="16"/>
-        </w:rPr>
-        <w:br/>
-      </w:r>
-      <w:r>
-        <w:rPr>
-          <w:rFonts w:ascii="Consolas" w:hAnsi="Consolas" w:eastAsia="Consolas"/>
-          <w:color w:val="4EC9B0"/>
-          <w:sz w:val="16"/>
-        </w:rPr>
-        <w:t>npm</w:t>
-      </w:r>
-      <w:r>
-        <w:rPr>
-          <w:rFonts w:ascii="Consolas" w:hAnsi="Consolas" w:eastAsia="Consolas"/>
-          <w:color w:val="D4D4D4"/>
-          <w:sz w:val="16"/>
-        </w:rPr>
-        <w:t xml:space="preserve"> </w:t>
-      </w:r>
-      <w:r>
-        <w:rPr>
-          <w:rFonts w:ascii="Consolas" w:hAnsi="Consolas" w:eastAsia="Consolas"/>
-          <w:color w:val="D4D4D4"/>
-          <w:sz w:val="16"/>
-        </w:rPr>
-        <w:t>audit</w:t>
+        <w:t xml:space="preserve"> audit</w:t>
       </w:r>
     </w:p>
     <w:p>
@@ -7909,8 +7776,10 @@
       <w:r>
         <w:rPr>
           <w:rFonts w:ascii="Aptos" w:hAnsi="Aptos"/>
+          <w:color w:val="1F2937"/>
+          <w:sz w:val="19"/>
         </w:rPr>
-        <w:t>Preset dasar yang digunakan adalah compact_reference_guide dengan named override untuk modul pembelajaran: A4 portrait; margin atas 1,65 cm, bawah 1,55 cm, kiri/kanan 1,75 cm; Aptos 10,2 pt; line spacing 1,16; heading beraksen Laravel red; tabel ringkas; callout Predict/Try/Observe; code block Consolas bertema Visual Studio Code Dark+; checklist; exit ticket; serta screenshot mockup UI.</w:t>
+        <w:t xml:space="preserve">Preset dasar yang digunakan adalah compact_reference_guide dengan named override untuk modul pembelajaran: A4 portrait; margin atas 1,65 cm, bawah 1,55 cm, kiri/kanan 1,75 cm; Aptos 10,2 pt; line spacing 1,16; heading beraksen Laravel red; tabel ringkas; callout Predict/Try/Observe; code block Consolas berlatar Cyan Light dengan pewarnaan token Visual Studio Code; checklist; exit ticket; serta screenshot mockup UI.</w:t>
       </w:r>
     </w:p>
     <w:p>
@@ -8491,6 +8360,19 @@
         <w:pStyle w:val="ListBody"/>
       </w:pPr>
       <w:r>
+        <w:rPr>
+          <w:rFonts w:ascii="Aptos" w:hAnsi="Aptos"/>
+          <w:color w:val="1F2937"/>
+          <w:sz w:val="19"/>
+        </w:rPr>
+        <w:t xml:space="preserve">DOC-00-001 — Seluruh blok kode (208 blok, 133 label) memakai latar terang tema Cyan Light (JetBrains) dengan pewarnaan token standar Visual Studio Code untuk PHP, HTML/Blade, cmd, dan bash; teks kode tidak berubah; penjelasan palet di “Cara Membaca Sampel Kode” dan Lampiran diperbarui.</w:t>
+      </w:r>
+    </w:p>
+    <w:p>
+      <w:pPr>
+        <w:pStyle w:val="ListBody"/>
+      </w:pPr>
+      <w:r>
         <w:t xml:space="preserve">DOC-01-001 — Basis dokumen: parameter menyebut v4/v5 yang tidak ada; basis nyata adalah v7. Revisi kumulatif ditulis ke berkas v8; v7 tetap utuh di references/.</w:t>
       </w:r>
     </w:p>
@@ -8869,6 +8751,19 @@
           <w:color w:val="1F2937"/>
           <w:sz w:val="19"/>
         </w:rPr>
+        <w:t xml:space="preserve">DOC-05-007 — Rantai v3 (use case SRS v2): Modul 5 menuntaskan UC-19 (penguncian 5x/10 menit, pesan generik, redirect per peran, sesi 8 jam) dan UC-21 (onboarding penanggung jawab + rekening + tautan atur kata sandi, aktif/nonaktif tenant, riwayat komisi beserta pengelola); ditambahkan deskripsi use case, mockup, Tahap 8, dan output nyata browser.</w:t>
+      </w:r>
+    </w:p>
+    <w:p>
+      <w:pPr>
+        <w:pStyle w:val="ListBody"/>
+      </w:pPr>
+      <w:r>
+        <w:rPr>
+          <w:rFonts w:ascii="Aptos" w:hAnsi="Aptos"/>
+          <w:color w:val="1F2937"/>
+          <w:sz w:val="19"/>
+        </w:rPr>
         <w:t xml:space="preserve">DOC-06-004 — Controller/view/route meja di modul Admin; controller + route publik scan QR di modul Ordering (</w:t>
       </w:r>
       <w:r>
@@ -8946,6 +8841,19 @@
           <w:color w:val="1F2937"/>
           <w:sz w:val="19"/>
         </w:rPr>
+        <w:t xml:space="preserve">DOC-06-006 — Rantai v3 (use case SRS v2): Modul 6 menuntaskan UC-22 (QR siap cetak SVG via bacon/bacon-qr-code, nonaktif/aktif meja, ringkasan meja) dan UC-02 (halaman sambutan meja + tenant buka/tutup, pesan QR tidak valid, penolakan di luar jam operasional); ditambahkan deskripsi use case, mockup, Tahap 8, dan output nyata browser.</w:t>
+      </w:r>
+    </w:p>
+    <w:p>
+      <w:pPr>
+        <w:pStyle w:val="ListBody"/>
+      </w:pPr>
+      <w:r>
+        <w:rPr>
+          <w:rFonts w:ascii="Aptos" w:hAnsi="Aptos"/>
+          <w:color w:val="1F2937"/>
+          <w:sz w:val="19"/>
+        </w:rPr>
         <w:t xml:space="preserve">DOC-07-004 — Komponen Livewire katalog (</w:t>
       </w:r>
       <w:r>
@@ -9040,6 +8948,19 @@
           <w:color w:val="1F2937"/>
           <w:sz w:val="19"/>
         </w:rPr>
+        <w:t xml:space="preserve">DOC-07-006 — Rantai v3 (use case SRS v2): Modul 7 menuntaskan UC-13 (deskripsi, foto WebP, ubah, soft delete, cari/saring), UC-14 (sakelar satu ketukan), UC-01 (kelompok per tenant, menu habis nonaktif, tenant tutup, chip kategori, pembaruan ≤ 5 detik), dan UC-11 (WaitTimeEstimator); ditambahkan deskripsi use case, mockup, Tahap 8, dan output nyata browser.</w:t>
+      </w:r>
+    </w:p>
+    <w:p>
+      <w:pPr>
+        <w:pStyle w:val="ListBody"/>
+      </w:pPr>
+      <w:r>
+        <w:rPr>
+          <w:rFonts w:ascii="Aptos" w:hAnsi="Aptos"/>
+          <w:color w:val="1F2937"/>
+          <w:sz w:val="19"/>
+        </w:rPr>
         <w:t xml:space="preserve">DOC-08-004 — Keranjang sebagai vertical slice modul Ordering: </w:t>
       </w:r>
       <w:r>
@@ -9151,6 +9072,19 @@
           <w:color w:val="1F2937"/>
           <w:sz w:val="19"/>
         </w:rPr>
+        <w:t xml:space="preserve">DOC-08-006 — Rantai v3 (use case SRS v2): Modul 8 menuntaskan UC-03 (kelompok per tenant, pajak dan biaya layanan, “Menu telah habis”, checkout nonaktif saat kosong) dan UC-04 (formulir kustomisasi min/maks, opsi habis nonaktif, catatan ≤ 200 karakter tersaring, harga akhir) serta halaman tenant Kelola Modifier; ditambahkan deskripsi use case, mockup, Tahap 8, dan output nyata browser.</w:t>
+      </w:r>
+    </w:p>
+    <w:p>
+      <w:pPr>
+        <w:pStyle w:val="ListBody"/>
+      </w:pPr>
+      <w:r>
+        <w:rPr>
+          <w:rFonts w:ascii="Aptos" w:hAnsi="Aptos"/>
+          <w:color w:val="1F2937"/>
+          <w:sz w:val="19"/>
+        </w:rPr>
         <w:t xml:space="preserve">DOC-09-004 — Checkout dan status pesanan sebagai vertical slice modul Ordering (</w:t>
       </w:r>
       <w:r>
@@ -9262,6 +9196,19 @@
           <w:color w:val="1F2937"/>
           <w:sz w:val="19"/>
         </w:rPr>
+        <w:t xml:space="preserve">DOC-09-006 — Rantai v3 (use case SRS v2): Modul 9 menuntaskan UC-05 (halaman checkout: ringkasan, nomor meja, mode penyajian, identitas ringkas, tenant wajib buka, kembali ke keranjang bila item bermasalah, catatan item tersimpan) dan UC-06 (slot pre-order 15 menit, jam operasional, kapasitas slot + slot terdekat, status terjadwal, pelepasan otomatis ke dapur tiap menit) serta halaman tenant Pengaturan Pre-Order; ditambahkan deskripsi use case, mockup, Tahap 8, dan output nyata browser.</w:t>
+      </w:r>
+    </w:p>
+    <w:p>
+      <w:pPr>
+        <w:pStyle w:val="ListBody"/>
+      </w:pPr>
+      <w:r>
+        <w:rPr>
+          <w:rFonts w:ascii="Aptos" w:hAnsi="Aptos"/>
+          <w:color w:val="1F2937"/>
+          <w:sz w:val="19"/>
+        </w:rPr>
         <w:t xml:space="preserve">DOC-10-004 — Pembayaran sebagai vertical slice modul Payments: kontrak </w:t>
       </w:r>
       <w:r>
@@ -9390,6 +9337,19 @@
           <w:color w:val="1F2937"/>
           <w:sz w:val="19"/>
         </w:rPr>
+        <w:t xml:space="preserve">DOC-10-006 — Rantai v3 (use case SRS v2): Modul 10 menuntaskan UC-07 (QRIS otomatis setelah checkout, gambar QRIS + penghitung mundur ≤ 15 menit, rincian split per tenant, percobaan ulang 3 kali saat gateway tidak merespons, QRIS baru saat kedaluwarsa, pemantauan status, batalkan pesanan yang belum dibayar); ditambahkan deskripsi use case, mockup, Tahap 8, dan output nyata browser.</w:t>
+      </w:r>
+    </w:p>
+    <w:p>
+      <w:pPr>
+        <w:pStyle w:val="ListBody"/>
+      </w:pPr>
+      <w:r>
+        <w:rPr>
+          <w:rFonts w:ascii="Aptos" w:hAnsi="Aptos"/>
+          <w:color w:val="1F2937"/>
+          <w:sz w:val="19"/>
+        </w:rPr>
         <w:t xml:space="preserve">DOC-11-004 — Webhook sebagai vertical slice modul Payments: </w:t>
       </w:r>
       <w:r>
@@ -9514,6 +9474,19 @@
           <w:color w:val="1F2937"/>
           <w:sz w:val="19"/>
         </w:rPr>
+        <w:t xml:space="preserve">DOC-11-008 — Rantai v3 (use case SRS v2): Modul 11 menuntaskan UC-08 (nominal dicocokkan + tinjau manual, audit signature salah, penguncian baris, expire/deny membatalkan pesanan, event setelah commit, layar Pembayaran terverifikasi) dan UC-10 (ledger pengelola kantin, rincian pemecahan selisih 0, alokasi pembulatan, proses ulang settlement gagal); ditambahkan deskripsi use case, mockup, Tahap 8, dan output nyata.</w:t>
+      </w:r>
+    </w:p>
+    <w:p>
+      <w:pPr>
+        <w:pStyle w:val="ListBody"/>
+      </w:pPr>
+      <w:r>
+        <w:rPr>
+          <w:rFonts w:ascii="Aptos" w:hAnsi="Aptos"/>
+          <w:color w:val="1F2937"/>
+          <w:sz w:val="19"/>
+        </w:rPr>
         <w:t xml:space="preserve">DOC-12-004 — KDS sebagai vertical slice modul Kitchen: event (</w:t>
       </w:r>
       <w:r>
@@ -9710,6 +9683,19 @@
           <w:color w:val="1F2937"/>
           <w:sz w:val="19"/>
         </w:rPr>
+        <w:t xml:space="preserve">DOC-12-006 — Rantai v3 (use case SRS v2): Modul 12 menuntaskan UC-15 (KDS kolom Baru/Diproses/Siap, Terima → Selesai → Diserahkan, batal beralasan + refund pending, penanda suara, indikator koneksi + polling 10 detik), UC-09 (halaman pelacakan real-time lewat channel privat order.{public_id}, estimasi UC-11, polling 15 detik), dan UC-12 (NotificationGateway + FakeWhatsAppGateway, job antrean 3 percobaan, notification_deliveries, pengingat pre-order); ditambahkan deskripsi use case, mockup, Tahap 8, dan output nyata.</w:t>
+      </w:r>
+    </w:p>
+    <w:p>
+      <w:pPr>
+        <w:pStyle w:val="ListBody"/>
+      </w:pPr>
+      <w:r>
+        <w:rPr>
+          <w:rFonts w:ascii="Aptos" w:hAnsi="Aptos"/>
+          <w:color w:val="1F2937"/>
+          <w:sz w:val="19"/>
+        </w:rPr>
         <w:t xml:space="preserve">DOC-13-004 — Laporan/rekonsiliasi/ekspor dan panel keuangan tenant sebagai vertical slice modul Reporting; penarikan + peninjauan admin di modul Payments; path Contoh Mandiri, Landasan Teknis (termasuk </w:t>
       </w:r>
       <w:r>
@@ -9741,6 +9727,19 @@
           <w:sz w:val="19"/>
         </w:rPr>
         <w:t xml:space="preserve">DOC-13-005 — Blok BUAT FILE per tahap Modul 13: make:class (TenantLedgerReport, WithdrawalService), make:controller FQN --invokable (ekspor CSV), make:exception FQN, make:livewire reporting::finance-panel dan payments::withdrawal-review, make:test; halaman &amp; route modul manual.</w:t>
+      </w:r>
+    </w:p>
+    <w:p>
+      <w:pPr>
+        <w:pStyle w:val="ListBody"/>
+      </w:pPr>
+      <w:r>
+        <w:rPr>
+          <w:rFonts w:ascii="Aptos" w:hAnsi="Aptos"/>
+          <w:color w:val="1F2937"/>
+          <w:sz w:val="19"/>
+        </w:rPr>
+        <w:t xml:space="preserve">DOC-13-006 — Rantai v3 (use case SRS v2): Modul 13 menuntaskan UC-16 (laporan omset/transaksi/rata-rata, menu terlaris, jam sibuk, rentang tanggal, keadaan kosong), UC-17 (ekspor .xlsx via ZipArchive dan PDF via dompdf lewat antrean, tautan bertanda tangan 24 jam, surel untuk volume besar), UC-18 (rekonsiliasi per transaksi + referensi pembayaran, telusur pesanan, perlu peninjauan tidak dihitung), UC-20 (penarikan dengan kunci saldo, minimum, satu pengajuan aktif, notifikasi pengelola), dan UC-23 (verifikasi dengan bukti transfer, alasan penolakan, investigasi ledger, idempoten); ditambahkan deskripsi use case, mockup, Tahap 8, dan output nyata.</w:t>
       </w:r>
     </w:p>
     <w:sectPr>
@@ -22003,7 +22002,7 @@
     </w:pPr>
     <w:rPr>
       <w:rFonts w:ascii="Consolas" w:hAnsi="Consolas"/>
-      <w:color w:val="D4D4D4"/>
+      <w:color w:val="262626"/>
       <w:sz w:val="16"/>
     </w:rPr>
   </w:style>
@@ -22115,7 +22114,7 @@
     <w:rPr>
       <w:rFonts w:ascii="Consolas" w:hAnsi="Consolas"/>
       <w:b/>
-      <w:color w:val="FFFFFF"/>
+      <w:color w:val="262626"/>
       <w:sz w:val="16"/>
     </w:rPr>
   </w:style>

</xml_diff>

<commit_message>
docs(v8): Modul 14 — uji penerimaan 23 use case + langkah Windows (cmd + VS Code)
- Bagian Uji Penerimaan 23 Use Case SRS (daftar periksa), Tahap 8, output nyata browser.
- Tahap 1–8 ditulis ulang untuk Windows: perintah cmd dengan output nyata, isi berkas lengkap;
  diverifikasi di worktree bersih (Tahap 7 = kode v2 P14 diselaraskan, 287 test; Tahap 8 = kode akhir, 292 test).
- Master DOCX dibangun ulang dari seluruh spesifikasi P01–P14; Modul 1–13 identik byte-per-byte.
- Revision log DOC-14-006/007, status, laporan rantai v3 SELESAI.
- modul_praktikum/ dibuat ulang dari master.

Co-Authored-By: Claude Opus 5.5 <noreply@anthropic.com>
</commit_message>
<xml_diff>
--- a/modul_praktikum/Lampiran.docx
+++ b/modul_praktikum/Lampiran.docx
@@ -3577,92 +3577,175 @@
     <w:p>
       <w:pPr>
         <w:pStyle w:val="CodeBlock"/>
-        <w:shd w:fill="1E1E1E" w:val="clear"/>
         <w:pBdr>
-          <w:left w:val="single" w:sz="4" w:space="8" w:color="1E1E1E"/>
+          <w:left w:val="single" w:sz="12" w:space="8" w:color="B8DDE0"/>
         </w:pBdr>
+        <w:shd w:val="clear" w:color="auto" w:fill="F2F3F7"/>
       </w:pPr>
       <w:r>
         <w:rPr>
           <w:rFonts w:ascii="Consolas" w:hAnsi="Consolas"/>
-          <w:color w:val="4EC9B0"/>
+          <w:b/>
+          <w:color w:val="000080"/>
           <w:sz w:val="16"/>
         </w:rPr>
-        <w:t>php</w:t>
+        <w:t xml:space="preserve">php</w:t>
       </w:r>
       <w:r>
         <w:rPr>
           <w:rFonts w:ascii="Consolas" w:hAnsi="Consolas"/>
-          <w:color w:val="D4D4D4"/>
+          <w:color w:val="262626"/>
           <w:sz w:val="16"/>
         </w:rPr>
-        <w:t xml:space="preserve"> artisan optimize:clear</w:t>
-        <w:br/>
+        <w:t xml:space="preserve"> artisan </w:t>
       </w:r>
       <w:r>
         <w:rPr>
           <w:rFonts w:ascii="Consolas" w:hAnsi="Consolas"/>
-          <w:color w:val="4EC9B0"/>
+          <w:color w:val="795E26"/>
           <w:sz w:val="16"/>
         </w:rPr>
-        <w:t>php</w:t>
+        <w:t xml:space="preserve">optimize:clear</w:t>
+      </w:r>
+      <w:r>
+        <w:br/>
       </w:r>
       <w:r>
         <w:rPr>
           <w:rFonts w:ascii="Consolas" w:hAnsi="Consolas"/>
-          <w:color w:val="D4D4D4"/>
+          <w:b/>
+          <w:color w:val="000080"/>
           <w:sz w:val="16"/>
         </w:rPr>
-        <w:t xml:space="preserve"> artisan migrate:fresh --seed --env=testing</w:t>
-        <w:br/>
+        <w:t xml:space="preserve">php</w:t>
       </w:r>
       <w:r>
         <w:rPr>
           <w:rFonts w:ascii="Consolas" w:hAnsi="Consolas"/>
-          <w:color w:val="4EC9B0"/>
+          <w:color w:val="262626"/>
           <w:sz w:val="16"/>
         </w:rPr>
-        <w:t>php</w:t>
+        <w:t xml:space="preserve"> artisan </w:t>
       </w:r>
       <w:r>
         <w:rPr>
           <w:rFonts w:ascii="Consolas" w:hAnsi="Consolas"/>
-          <w:color w:val="D4D4D4"/>
+          <w:color w:val="795E26"/>
           <w:sz w:val="16"/>
         </w:rPr>
-        <w:t xml:space="preserve"> artisan test --testsuite=</w:t>
+        <w:t xml:space="preserve">migrate:fresh</w:t>
       </w:r>
       <w:r>
         <w:rPr>
           <w:rFonts w:ascii="Consolas" w:hAnsi="Consolas"/>
-          <w:color w:val="4EC9B0"/>
+          <w:color w:val="262626"/>
           <w:sz w:val="16"/>
         </w:rPr>
-        <w:t>Feature</w:t>
+        <w:t xml:space="preserve"> </w:t>
       </w:r>
       <w:r>
         <w:rPr>
           <w:rFonts w:ascii="Consolas" w:hAnsi="Consolas"/>
-          <w:color w:val="D4D4D4"/>
+          <w:color w:val="0073E6"/>
           <w:sz w:val="16"/>
         </w:rPr>
-        <w:t xml:space="preserve"> --stop-on-failure</w:t>
-        <w:br/>
-        <w:t xml:space="preserve">./vendor/bin/pint --test</w:t>
-        <w:br/>
+        <w:t xml:space="preserve">--seed</w:t>
       </w:r>
       <w:r>
         <w:rPr>
           <w:rFonts w:ascii="Consolas" w:hAnsi="Consolas"/>
-          <w:color w:val="4EC9B0"/>
+          <w:color w:val="262626"/>
           <w:sz w:val="16"/>
         </w:rPr>
-        <w:t>npm</w:t>
+        <w:t xml:space="preserve"> </w:t>
       </w:r>
       <w:r>
         <w:rPr>
           <w:rFonts w:ascii="Consolas" w:hAnsi="Consolas"/>
-          <w:color w:val="D4D4D4"/>
+          <w:color w:val="0073E6"/>
+          <w:sz w:val="16"/>
+        </w:rPr>
+        <w:t xml:space="preserve">--env=testing</w:t>
+      </w:r>
+      <w:r>
+        <w:br/>
+      </w:r>
+      <w:r>
+        <w:rPr>
+          <w:rFonts w:ascii="Consolas" w:hAnsi="Consolas"/>
+          <w:b/>
+          <w:color w:val="000080"/>
+          <w:sz w:val="16"/>
+        </w:rPr>
+        <w:t xml:space="preserve">php</w:t>
+      </w:r>
+      <w:r>
+        <w:rPr>
+          <w:rFonts w:ascii="Consolas" w:hAnsi="Consolas"/>
+          <w:color w:val="262626"/>
+          <w:sz w:val="16"/>
+        </w:rPr>
+        <w:t xml:space="preserve"> artisan test </w:t>
+      </w:r>
+      <w:r>
+        <w:rPr>
+          <w:rFonts w:ascii="Consolas" w:hAnsi="Consolas"/>
+          <w:color w:val="0073E6"/>
+          <w:sz w:val="16"/>
+        </w:rPr>
+        <w:t xml:space="preserve">--testsuite=Feature</w:t>
+      </w:r>
+      <w:r>
+        <w:rPr>
+          <w:rFonts w:ascii="Consolas" w:hAnsi="Consolas"/>
+          <w:color w:val="262626"/>
+          <w:sz w:val="16"/>
+        </w:rPr>
+        <w:t xml:space="preserve"> </w:t>
+      </w:r>
+      <w:r>
+        <w:rPr>
+          <w:rFonts w:ascii="Consolas" w:hAnsi="Consolas"/>
+          <w:color w:val="0073E6"/>
+          <w:sz w:val="16"/>
+        </w:rPr>
+        <w:t xml:space="preserve">--stop-on-failure</w:t>
+      </w:r>
+      <w:r>
+        <w:br/>
+      </w:r>
+      <w:r>
+        <w:rPr>
+          <w:rFonts w:ascii="Consolas" w:hAnsi="Consolas"/>
+          <w:color w:val="262626"/>
+          <w:sz w:val="16"/>
+        </w:rPr>
+        <w:t xml:space="preserve">./vendor/bin/pint </w:t>
+      </w:r>
+      <w:r>
+        <w:rPr>
+          <w:rFonts w:ascii="Consolas" w:hAnsi="Consolas"/>
+          <w:color w:val="0073E6"/>
+          <w:sz w:val="16"/>
+        </w:rPr>
+        <w:t xml:space="preserve">--test</w:t>
+      </w:r>
+      <w:r>
+        <w:br/>
+      </w:r>
+      <w:r>
+        <w:rPr>
+          <w:rFonts w:ascii="Consolas" w:hAnsi="Consolas"/>
+          <w:b/>
+          <w:color w:val="000080"/>
+          <w:sz w:val="16"/>
+        </w:rPr>
+        <w:t xml:space="preserve">npm</w:t>
+      </w:r>
+      <w:r>
+        <w:rPr>
+          <w:rFonts w:ascii="Consolas" w:hAnsi="Consolas"/>
+          <w:color w:val="262626"/>
           <w:sz w:val="16"/>
         </w:rPr>
         <w:t xml:space="preserve"> run build</w:t>
@@ -5044,431 +5127,215 @@
     <w:p>
       <w:pPr>
         <w:pStyle w:val="CodeHeader"/>
-        <w:shd w:fill="2D2D30"/>
+        <w:keepNext/>
         <w:pBdr>
-          <w:left w:val="single" w:sz="4" w:space="8" w:color="2D2D30"/>
+          <w:left w:val="single" w:sz="12" w:space="8" w:color="B8DDE0"/>
         </w:pBdr>
+        <w:shd w:val="clear" w:color="auto" w:fill="E4EAED"/>
       </w:pPr>
       <w:r>
-        <w:t>AUDIT KOMPATIBILITAS DEPENDENSI SRS — terminal root proyek   •   BASH</w:t>
+        <w:rPr>
+          <w:rFonts w:ascii="Consolas" w:hAnsi="Consolas"/>
+          <w:b/>
+          <w:color w:val="262626"/>
+          <w:sz w:val="16"/>
+        </w:rPr>
+        <w:t xml:space="preserve">AUDIT KOMPATIBILITAS DEPENDENSI SRS — terminal root proyek   •   BASH</w:t>
       </w:r>
     </w:p>
     <w:p>
       <w:pPr>
         <w:pStyle w:val="CodeBlock"/>
-        <w:shd w:fill="1E1E1E"/>
         <w:keepLines/>
         <w:pBdr>
-          <w:left w:val="single" w:sz="4" w:space="8" w:color="1E1E1E"/>
+          <w:left w:val="single" w:sz="12" w:space="8" w:color="B8DDE0"/>
         </w:pBdr>
+        <w:shd w:val="clear" w:color="auto" w:fill="F2F3F7"/>
       </w:pPr>
       <w:r>
         <w:rPr>
-          <w:rFonts w:ascii="Consolas" w:hAnsi="Consolas" w:eastAsia="Consolas"/>
-          <w:color w:val="4EC9B0"/>
+          <w:rFonts w:ascii="Consolas" w:hAnsi="Consolas"/>
+          <w:b/>
+          <w:color w:val="000080"/>
           <w:sz w:val="16"/>
         </w:rPr>
-        <w:t>composer</w:t>
+        <w:t xml:space="preserve">composer</w:t>
       </w:r>
       <w:r>
         <w:rPr>
-          <w:rFonts w:ascii="Consolas" w:hAnsi="Consolas" w:eastAsia="Consolas"/>
-          <w:color w:val="D4D4D4"/>
+          <w:rFonts w:ascii="Consolas" w:hAnsi="Consolas"/>
+          <w:color w:val="262626"/>
           <w:sz w:val="16"/>
         </w:rPr>
-        <w:t xml:space="preserve"> </w:t>
+        <w:t xml:space="preserve"> require chillerlan/php-qrcode intervention/image-laravel </w:t>
       </w:r>
       <w:r>
         <w:rPr>
-          <w:rFonts w:ascii="Consolas" w:hAnsi="Consolas" w:eastAsia="Consolas"/>
-          <w:color w:val="D4D4D4"/>
+          <w:rFonts w:ascii="Consolas" w:hAnsi="Consolas"/>
+          <w:color w:val="0073E6"/>
           <w:sz w:val="16"/>
         </w:rPr>
-        <w:t>require</w:t>
+        <w:t xml:space="preserve">--dry-run</w:t>
+      </w:r>
+      <w:r>
+        <w:br/>
       </w:r>
       <w:r>
         <w:rPr>
-          <w:rFonts w:ascii="Consolas" w:hAnsi="Consolas" w:eastAsia="Consolas"/>
-          <w:color w:val="D4D4D4"/>
+          <w:rFonts w:ascii="Consolas" w:hAnsi="Consolas"/>
+          <w:b/>
+          <w:color w:val="000080"/>
           <w:sz w:val="16"/>
         </w:rPr>
-        <w:t xml:space="preserve"> </w:t>
+        <w:t xml:space="preserve">composer</w:t>
       </w:r>
       <w:r>
         <w:rPr>
-          <w:rFonts w:ascii="Consolas" w:hAnsi="Consolas" w:eastAsia="Consolas"/>
-          <w:color w:val="D4D4D4"/>
+          <w:rFonts w:ascii="Consolas" w:hAnsi="Consolas"/>
+          <w:color w:val="262626"/>
           <w:sz w:val="16"/>
         </w:rPr>
-        <w:t>chillerlan/php-qrcode</w:t>
+        <w:t xml:space="preserve"> require maatwebsite/excel barryvdh/laravel-dompdf </w:t>
       </w:r>
       <w:r>
         <w:rPr>
-          <w:rFonts w:ascii="Consolas" w:hAnsi="Consolas" w:eastAsia="Consolas"/>
-          <w:color w:val="D4D4D4"/>
+          <w:rFonts w:ascii="Consolas" w:hAnsi="Consolas"/>
+          <w:color w:val="0073E6"/>
           <w:sz w:val="16"/>
         </w:rPr>
-        <w:t xml:space="preserve"> </w:t>
+        <w:t xml:space="preserve">--dry-run</w:t>
+      </w:r>
+      <w:r>
+        <w:br/>
       </w:r>
       <w:r>
         <w:rPr>
-          <w:rFonts w:ascii="Consolas" w:hAnsi="Consolas" w:eastAsia="Consolas"/>
-          <w:color w:val="D4D4D4"/>
+          <w:rFonts w:ascii="Consolas" w:hAnsi="Consolas"/>
+          <w:b/>
+          <w:color w:val="000080"/>
           <w:sz w:val="16"/>
         </w:rPr>
-        <w:t>intervention/image-laravel</w:t>
+        <w:t xml:space="preserve">composer</w:t>
       </w:r>
       <w:r>
         <w:rPr>
-          <w:rFonts w:ascii="Consolas" w:hAnsi="Consolas" w:eastAsia="Consolas"/>
-          <w:color w:val="D4D4D4"/>
+          <w:rFonts w:ascii="Consolas" w:hAnsi="Consolas"/>
+          <w:color w:val="262626"/>
           <w:sz w:val="16"/>
         </w:rPr>
-        <w:t xml:space="preserve"> </w:t>
+        <w:t xml:space="preserve"> require laravel-notification-channels/webpush </w:t>
       </w:r>
       <w:r>
         <w:rPr>
-          <w:rFonts w:ascii="Consolas" w:hAnsi="Consolas" w:eastAsia="Consolas"/>
-          <w:color w:val="9CDCFE"/>
+          <w:rFonts w:ascii="Consolas" w:hAnsi="Consolas"/>
+          <w:color w:val="0073E6"/>
           <w:sz w:val="16"/>
         </w:rPr>
-        <w:t>--dry-run</w:t>
+        <w:t xml:space="preserve">--dry-run</w:t>
+      </w:r>
+      <w:r>
+        <w:br/>
       </w:r>
       <w:r>
         <w:rPr>
-          <w:rFonts w:ascii="Consolas" w:hAnsi="Consolas" w:eastAsia="Consolas"/>
-          <w:color w:val="D4D4D4"/>
+          <w:rFonts w:ascii="Consolas" w:hAnsi="Consolas"/>
+          <w:b/>
+          <w:color w:val="000080"/>
           <w:sz w:val="16"/>
         </w:rPr>
-        <w:br/>
+        <w:t xml:space="preserve">npm</w:t>
       </w:r>
       <w:r>
         <w:rPr>
-          <w:rFonts w:ascii="Consolas" w:hAnsi="Consolas" w:eastAsia="Consolas"/>
-          <w:color w:val="4EC9B0"/>
+          <w:rFonts w:ascii="Consolas" w:hAnsi="Consolas"/>
+          <w:color w:val="262626"/>
           <w:sz w:val="16"/>
         </w:rPr>
-        <w:t>composer</w:t>
+        <w:t xml:space="preserve"> install </w:t>
       </w:r>
       <w:r>
         <w:rPr>
-          <w:rFonts w:ascii="Consolas" w:hAnsi="Consolas" w:eastAsia="Consolas"/>
-          <w:color w:val="D4D4D4"/>
+          <w:rFonts w:ascii="Consolas" w:hAnsi="Consolas"/>
+          <w:color w:val="0073E6"/>
           <w:sz w:val="16"/>
         </w:rPr>
-        <w:t xml:space="preserve"> </w:t>
+        <w:t xml:space="preserve">--dry-run</w:t>
       </w:r>
       <w:r>
         <w:rPr>
-          <w:rFonts w:ascii="Consolas" w:hAnsi="Consolas" w:eastAsia="Consolas"/>
-          <w:color w:val="D4D4D4"/>
+          <w:rFonts w:ascii="Consolas" w:hAnsi="Consolas"/>
+          <w:color w:val="262626"/>
           <w:sz w:val="16"/>
         </w:rPr>
-        <w:t>require</w:t>
+        <w:t xml:space="preserve"> laravel-echo pusher-js</w:t>
+      </w:r>
+      <w:r>
+        <w:br/>
       </w:r>
       <w:r>
         <w:rPr>
-          <w:rFonts w:ascii="Consolas" w:hAnsi="Consolas" w:eastAsia="Consolas"/>
-          <w:color w:val="D4D4D4"/>
+          <w:rFonts w:ascii="Consolas" w:hAnsi="Consolas"/>
+          <w:b/>
+          <w:color w:val="000080"/>
           <w:sz w:val="16"/>
         </w:rPr>
-        <w:t xml:space="preserve"> </w:t>
+        <w:t xml:space="preserve">composer</w:t>
       </w:r>
       <w:r>
         <w:rPr>
-          <w:rFonts w:ascii="Consolas" w:hAnsi="Consolas" w:eastAsia="Consolas"/>
-          <w:color w:val="D4D4D4"/>
+          <w:rFonts w:ascii="Consolas" w:hAnsi="Consolas"/>
+          <w:color w:val="262626"/>
           <w:sz w:val="16"/>
         </w:rPr>
-        <w:t>maatwebsite/excel</w:t>
+        <w:t xml:space="preserve"> validate </w:t>
       </w:r>
       <w:r>
         <w:rPr>
-          <w:rFonts w:ascii="Consolas" w:hAnsi="Consolas" w:eastAsia="Consolas"/>
-          <w:color w:val="D4D4D4"/>
+          <w:rFonts w:ascii="Consolas" w:hAnsi="Consolas"/>
+          <w:color w:val="0073E6"/>
           <w:sz w:val="16"/>
         </w:rPr>
-        <w:t xml:space="preserve"> </w:t>
+        <w:t xml:space="preserve">--strict</w:t>
+      </w:r>
+      <w:r>
+        <w:br/>
       </w:r>
       <w:r>
         <w:rPr>
-          <w:rFonts w:ascii="Consolas" w:hAnsi="Consolas" w:eastAsia="Consolas"/>
-          <w:color w:val="D4D4D4"/>
+          <w:rFonts w:ascii="Consolas" w:hAnsi="Consolas"/>
+          <w:b/>
+          <w:color w:val="000080"/>
           <w:sz w:val="16"/>
         </w:rPr>
-        <w:t>barryvdh/laravel-dompdf</w:t>
+        <w:t xml:space="preserve">composer</w:t>
       </w:r>
       <w:r>
         <w:rPr>
-          <w:rFonts w:ascii="Consolas" w:hAnsi="Consolas" w:eastAsia="Consolas"/>
-          <w:color w:val="D4D4D4"/>
+          <w:rFonts w:ascii="Consolas" w:hAnsi="Consolas"/>
+          <w:color w:val="262626"/>
           <w:sz w:val="16"/>
         </w:rPr>
-        <w:t xml:space="preserve"> </w:t>
+        <w:t xml:space="preserve"> audit</w:t>
+      </w:r>
+      <w:r>
+        <w:br/>
       </w:r>
       <w:r>
         <w:rPr>
-          <w:rFonts w:ascii="Consolas" w:hAnsi="Consolas" w:eastAsia="Consolas"/>
-          <w:color w:val="9CDCFE"/>
+          <w:rFonts w:ascii="Consolas" w:hAnsi="Consolas"/>
+          <w:b/>
+          <w:color w:val="000080"/>
           <w:sz w:val="16"/>
         </w:rPr>
-        <w:t>--dry-run</w:t>
+        <w:t xml:space="preserve">npm</w:t>
       </w:r>
       <w:r>
         <w:rPr>
-          <w:rFonts w:ascii="Consolas" w:hAnsi="Consolas" w:eastAsia="Consolas"/>
-          <w:color w:val="D4D4D4"/>
+          <w:rFonts w:ascii="Consolas" w:hAnsi="Consolas"/>
+          <w:color w:val="262626"/>
           <w:sz w:val="16"/>
         </w:rPr>
-        <w:br/>
-      </w:r>
-      <w:r>
-        <w:rPr>
-          <w:rFonts w:ascii="Consolas" w:hAnsi="Consolas" w:eastAsia="Consolas"/>
-          <w:color w:val="4EC9B0"/>
-          <w:sz w:val="16"/>
-        </w:rPr>
-        <w:t>composer</w:t>
-      </w:r>
-      <w:r>
-        <w:rPr>
-          <w:rFonts w:ascii="Consolas" w:hAnsi="Consolas" w:eastAsia="Consolas"/>
-          <w:color w:val="D4D4D4"/>
-          <w:sz w:val="16"/>
-        </w:rPr>
-        <w:t xml:space="preserve"> </w:t>
-      </w:r>
-      <w:r>
-        <w:rPr>
-          <w:rFonts w:ascii="Consolas" w:hAnsi="Consolas" w:eastAsia="Consolas"/>
-          <w:color w:val="D4D4D4"/>
-          <w:sz w:val="16"/>
-        </w:rPr>
-        <w:t>require</w:t>
-      </w:r>
-      <w:r>
-        <w:rPr>
-          <w:rFonts w:ascii="Consolas" w:hAnsi="Consolas" w:eastAsia="Consolas"/>
-          <w:color w:val="D4D4D4"/>
-          <w:sz w:val="16"/>
-        </w:rPr>
-        <w:t xml:space="preserve"> </w:t>
-      </w:r>
-      <w:r>
-        <w:rPr>
-          <w:rFonts w:ascii="Consolas" w:hAnsi="Consolas" w:eastAsia="Consolas"/>
-          <w:color w:val="D4D4D4"/>
-          <w:sz w:val="16"/>
-        </w:rPr>
-        <w:t>laravel-notification-channels/webpush</w:t>
-      </w:r>
-      <w:r>
-        <w:rPr>
-          <w:rFonts w:ascii="Consolas" w:hAnsi="Consolas" w:eastAsia="Consolas"/>
-          <w:color w:val="D4D4D4"/>
-          <w:sz w:val="16"/>
-        </w:rPr>
-        <w:t xml:space="preserve"> </w:t>
-      </w:r>
-      <w:r>
-        <w:rPr>
-          <w:rFonts w:ascii="Consolas" w:hAnsi="Consolas" w:eastAsia="Consolas"/>
-          <w:color w:val="9CDCFE"/>
-          <w:sz w:val="16"/>
-        </w:rPr>
-        <w:t>--dry-run</w:t>
-      </w:r>
-      <w:r>
-        <w:rPr>
-          <w:rFonts w:ascii="Consolas" w:hAnsi="Consolas" w:eastAsia="Consolas"/>
-          <w:color w:val="D4D4D4"/>
-          <w:sz w:val="16"/>
-        </w:rPr>
-        <w:br/>
-      </w:r>
-      <w:r>
-        <w:rPr>
-          <w:rFonts w:ascii="Consolas" w:hAnsi="Consolas" w:eastAsia="Consolas"/>
-          <w:color w:val="4EC9B0"/>
-          <w:sz w:val="16"/>
-        </w:rPr>
-        <w:t>npm</w:t>
-      </w:r>
-      <w:r>
-        <w:rPr>
-          <w:rFonts w:ascii="Consolas" w:hAnsi="Consolas" w:eastAsia="Consolas"/>
-          <w:color w:val="D4D4D4"/>
-          <w:sz w:val="16"/>
-        </w:rPr>
-        <w:t xml:space="preserve"> </w:t>
-      </w:r>
-      <w:r>
-        <w:rPr>
-          <w:rFonts w:ascii="Consolas" w:hAnsi="Consolas" w:eastAsia="Consolas"/>
-          <w:color w:val="D4D4D4"/>
-          <w:sz w:val="16"/>
-        </w:rPr>
-        <w:t>install</w:t>
-      </w:r>
-      <w:r>
-        <w:rPr>
-          <w:rFonts w:ascii="Consolas" w:hAnsi="Consolas" w:eastAsia="Consolas"/>
-          <w:color w:val="D4D4D4"/>
-          <w:sz w:val="16"/>
-        </w:rPr>
-        <w:t xml:space="preserve"> </w:t>
-      </w:r>
-      <w:r>
-        <w:rPr>
-          <w:rFonts w:ascii="Consolas" w:hAnsi="Consolas" w:eastAsia="Consolas"/>
-          <w:color w:val="9CDCFE"/>
-          <w:sz w:val="16"/>
-        </w:rPr>
-        <w:t>--dry-run</w:t>
-      </w:r>
-      <w:r>
-        <w:rPr>
-          <w:rFonts w:ascii="Consolas" w:hAnsi="Consolas" w:eastAsia="Consolas"/>
-          <w:color w:val="D4D4D4"/>
-          <w:sz w:val="16"/>
-        </w:rPr>
-        <w:t xml:space="preserve"> </w:t>
-      </w:r>
-      <w:r>
-        <w:rPr>
-          <w:rFonts w:ascii="Consolas" w:hAnsi="Consolas" w:eastAsia="Consolas"/>
-          <w:color w:val="D4D4D4"/>
-          <w:sz w:val="16"/>
-        </w:rPr>
-        <w:t>laravel-echo</w:t>
-      </w:r>
-      <w:r>
-        <w:rPr>
-          <w:rFonts w:ascii="Consolas" w:hAnsi="Consolas" w:eastAsia="Consolas"/>
-          <w:color w:val="D4D4D4"/>
-          <w:sz w:val="16"/>
-        </w:rPr>
-        <w:t xml:space="preserve"> </w:t>
-      </w:r>
-      <w:r>
-        <w:rPr>
-          <w:rFonts w:ascii="Consolas" w:hAnsi="Consolas" w:eastAsia="Consolas"/>
-          <w:color w:val="D4D4D4"/>
-          <w:sz w:val="16"/>
-        </w:rPr>
-        <w:t>pusher-js</w:t>
-      </w:r>
-      <w:r>
-        <w:rPr>
-          <w:rFonts w:ascii="Consolas" w:hAnsi="Consolas" w:eastAsia="Consolas"/>
-          <w:color w:val="D4D4D4"/>
-          <w:sz w:val="16"/>
-        </w:rPr>
-        <w:br/>
-      </w:r>
-      <w:r>
-        <w:rPr>
-          <w:rFonts w:ascii="Consolas" w:hAnsi="Consolas" w:eastAsia="Consolas"/>
-          <w:color w:val="4EC9B0"/>
-          <w:sz w:val="16"/>
-        </w:rPr>
-        <w:t>composer</w:t>
-      </w:r>
-      <w:r>
-        <w:rPr>
-          <w:rFonts w:ascii="Consolas" w:hAnsi="Consolas" w:eastAsia="Consolas"/>
-          <w:color w:val="D4D4D4"/>
-          <w:sz w:val="16"/>
-        </w:rPr>
-        <w:t xml:space="preserve"> </w:t>
-      </w:r>
-      <w:r>
-        <w:rPr>
-          <w:rFonts w:ascii="Consolas" w:hAnsi="Consolas" w:eastAsia="Consolas"/>
-          <w:color w:val="D4D4D4"/>
-          <w:sz w:val="16"/>
-        </w:rPr>
-        <w:t>validate</w:t>
-      </w:r>
-      <w:r>
-        <w:rPr>
-          <w:rFonts w:ascii="Consolas" w:hAnsi="Consolas" w:eastAsia="Consolas"/>
-          <w:color w:val="D4D4D4"/>
-          <w:sz w:val="16"/>
-        </w:rPr>
-        <w:t xml:space="preserve"> </w:t>
-      </w:r>
-      <w:r>
-        <w:rPr>
-          <w:rFonts w:ascii="Consolas" w:hAnsi="Consolas" w:eastAsia="Consolas"/>
-          <w:color w:val="9CDCFE"/>
-          <w:sz w:val="16"/>
-        </w:rPr>
-        <w:t>--strict</w:t>
-      </w:r>
-      <w:r>
-        <w:rPr>
-          <w:rFonts w:ascii="Consolas" w:hAnsi="Consolas" w:eastAsia="Consolas"/>
-          <w:color w:val="D4D4D4"/>
-          <w:sz w:val="16"/>
-        </w:rPr>
-        <w:br/>
-      </w:r>
-      <w:r>
-        <w:rPr>
-          <w:rFonts w:ascii="Consolas" w:hAnsi="Consolas" w:eastAsia="Consolas"/>
-          <w:color w:val="4EC9B0"/>
-          <w:sz w:val="16"/>
-        </w:rPr>
-        <w:t>composer</w:t>
-      </w:r>
-      <w:r>
-        <w:rPr>
-          <w:rFonts w:ascii="Consolas" w:hAnsi="Consolas" w:eastAsia="Consolas"/>
-          <w:color w:val="D4D4D4"/>
-          <w:sz w:val="16"/>
-        </w:rPr>
-        <w:t xml:space="preserve"> </w:t>
-      </w:r>
-      <w:r>
-        <w:rPr>
-          <w:rFonts w:ascii="Consolas" w:hAnsi="Consolas" w:eastAsia="Consolas"/>
-          <w:color w:val="D4D4D4"/>
-          <w:sz w:val="16"/>
-        </w:rPr>
-        <w:t>audit</w:t>
-      </w:r>
-      <w:r>
-        <w:rPr>
-          <w:rFonts w:ascii="Consolas" w:hAnsi="Consolas" w:eastAsia="Consolas"/>
-          <w:color w:val="D4D4D4"/>
-          <w:sz w:val="16"/>
-        </w:rPr>
-        <w:br/>
-      </w:r>
-      <w:r>
-        <w:rPr>
-          <w:rFonts w:ascii="Consolas" w:hAnsi="Consolas" w:eastAsia="Consolas"/>
-          <w:color w:val="4EC9B0"/>
-          <w:sz w:val="16"/>
-        </w:rPr>
-        <w:t>npm</w:t>
-      </w:r>
-      <w:r>
-        <w:rPr>
-          <w:rFonts w:ascii="Consolas" w:hAnsi="Consolas" w:eastAsia="Consolas"/>
-          <w:color w:val="D4D4D4"/>
-          <w:sz w:val="16"/>
-        </w:rPr>
-        <w:t xml:space="preserve"> </w:t>
-      </w:r>
-      <w:r>
-        <w:rPr>
-          <w:rFonts w:ascii="Consolas" w:hAnsi="Consolas" w:eastAsia="Consolas"/>
-          <w:color w:val="D4D4D4"/>
-          <w:sz w:val="16"/>
-        </w:rPr>
-        <w:t>audit</w:t>
+        <w:t xml:space="preserve"> audit</w:t>
       </w:r>
     </w:p>
     <w:p>
@@ -7909,8 +7776,10 @@
       <w:r>
         <w:rPr>
           <w:rFonts w:ascii="Aptos" w:hAnsi="Aptos"/>
+          <w:color w:val="1F2937"/>
+          <w:sz w:val="19"/>
         </w:rPr>
-        <w:t>Preset dasar yang digunakan adalah compact_reference_guide dengan named override untuk modul pembelajaran: A4 portrait; margin atas 1,65 cm, bawah 1,55 cm, kiri/kanan 1,75 cm; Aptos 10,2 pt; line spacing 1,16; heading beraksen Laravel red; tabel ringkas; callout Predict/Try/Observe; code block Consolas bertema Visual Studio Code Dark+; checklist; exit ticket; serta screenshot mockup UI.</w:t>
+        <w:t xml:space="preserve">Preset dasar yang digunakan adalah compact_reference_guide dengan named override untuk modul pembelajaran: A4 portrait; margin atas 1,65 cm, bawah 1,55 cm, kiri/kanan 1,75 cm; Aptos 10,2 pt; line spacing 1,16; heading beraksen Laravel red; tabel ringkas; callout Predict/Try/Observe; code block Consolas berlatar Cyan Light dengan pewarnaan token Visual Studio Code; checklist; exit ticket; serta screenshot mockup UI.</w:t>
       </w:r>
     </w:p>
     <w:p>
@@ -8491,6 +8360,19 @@
         <w:pStyle w:val="ListBody"/>
       </w:pPr>
       <w:r>
+        <w:rPr>
+          <w:rFonts w:ascii="Aptos" w:hAnsi="Aptos"/>
+          <w:color w:val="1F2937"/>
+          <w:sz w:val="19"/>
+        </w:rPr>
+        <w:t xml:space="preserve">DOC-00-001 — Seluruh blok kode (208 blok, 133 label) memakai latar terang tema Cyan Light (JetBrains) dengan pewarnaan token standar Visual Studio Code untuk PHP, HTML/Blade, cmd, dan bash; teks kode tidak berubah; penjelasan palet di “Cara Membaca Sampel Kode” dan Lampiran diperbarui.</w:t>
+      </w:r>
+    </w:p>
+    <w:p>
+      <w:pPr>
+        <w:pStyle w:val="ListBody"/>
+      </w:pPr>
+      <w:r>
         <w:t xml:space="preserve">DOC-01-001 — Basis dokumen: parameter menyebut v4/v5 yang tidak ada; basis nyata adalah v7. Revisi kumulatif ditulis ke berkas v8; v7 tetap utuh di references/.</w:t>
       </w:r>
     </w:p>
@@ -8869,6 +8751,19 @@
           <w:color w:val="1F2937"/>
           <w:sz w:val="19"/>
         </w:rPr>
+        <w:t xml:space="preserve">DOC-05-007 — Rantai v3 (use case SRS v2): Modul 5 menuntaskan UC-19 (penguncian 5x/10 menit, pesan generik, redirect per peran, sesi 8 jam) dan UC-21 (onboarding penanggung jawab + rekening + tautan atur kata sandi, aktif/nonaktif tenant, riwayat komisi beserta pengelola); ditambahkan deskripsi use case, mockup, Tahap 8, dan output nyata browser.</w:t>
+      </w:r>
+    </w:p>
+    <w:p>
+      <w:pPr>
+        <w:pStyle w:val="ListBody"/>
+      </w:pPr>
+      <w:r>
+        <w:rPr>
+          <w:rFonts w:ascii="Aptos" w:hAnsi="Aptos"/>
+          <w:color w:val="1F2937"/>
+          <w:sz w:val="19"/>
+        </w:rPr>
         <w:t xml:space="preserve">DOC-06-004 — Controller/view/route meja di modul Admin; controller + route publik scan QR di modul Ordering (</w:t>
       </w:r>
       <w:r>
@@ -8946,6 +8841,19 @@
           <w:color w:val="1F2937"/>
           <w:sz w:val="19"/>
         </w:rPr>
+        <w:t xml:space="preserve">DOC-06-006 — Rantai v3 (use case SRS v2): Modul 6 menuntaskan UC-22 (QR siap cetak SVG via bacon/bacon-qr-code, nonaktif/aktif meja, ringkasan meja) dan UC-02 (halaman sambutan meja + tenant buka/tutup, pesan QR tidak valid, penolakan di luar jam operasional); ditambahkan deskripsi use case, mockup, Tahap 8, dan output nyata browser.</w:t>
+      </w:r>
+    </w:p>
+    <w:p>
+      <w:pPr>
+        <w:pStyle w:val="ListBody"/>
+      </w:pPr>
+      <w:r>
+        <w:rPr>
+          <w:rFonts w:ascii="Aptos" w:hAnsi="Aptos"/>
+          <w:color w:val="1F2937"/>
+          <w:sz w:val="19"/>
+        </w:rPr>
         <w:t xml:space="preserve">DOC-07-004 — Komponen Livewire katalog (</w:t>
       </w:r>
       <w:r>
@@ -9040,6 +8948,19 @@
           <w:color w:val="1F2937"/>
           <w:sz w:val="19"/>
         </w:rPr>
+        <w:t xml:space="preserve">DOC-07-006 — Rantai v3 (use case SRS v2): Modul 7 menuntaskan UC-13 (deskripsi, foto WebP, ubah, soft delete, cari/saring), UC-14 (sakelar satu ketukan), UC-01 (kelompok per tenant, menu habis nonaktif, tenant tutup, chip kategori, pembaruan ≤ 5 detik), dan UC-11 (WaitTimeEstimator); ditambahkan deskripsi use case, mockup, Tahap 8, dan output nyata browser.</w:t>
+      </w:r>
+    </w:p>
+    <w:p>
+      <w:pPr>
+        <w:pStyle w:val="ListBody"/>
+      </w:pPr>
+      <w:r>
+        <w:rPr>
+          <w:rFonts w:ascii="Aptos" w:hAnsi="Aptos"/>
+          <w:color w:val="1F2937"/>
+          <w:sz w:val="19"/>
+        </w:rPr>
         <w:t xml:space="preserve">DOC-08-004 — Keranjang sebagai vertical slice modul Ordering: </w:t>
       </w:r>
       <w:r>
@@ -9151,6 +9072,19 @@
           <w:color w:val="1F2937"/>
           <w:sz w:val="19"/>
         </w:rPr>
+        <w:t xml:space="preserve">DOC-08-006 — Rantai v3 (use case SRS v2): Modul 8 menuntaskan UC-03 (kelompok per tenant, pajak dan biaya layanan, “Menu telah habis”, checkout nonaktif saat kosong) dan UC-04 (formulir kustomisasi min/maks, opsi habis nonaktif, catatan ≤ 200 karakter tersaring, harga akhir) serta halaman tenant Kelola Modifier; ditambahkan deskripsi use case, mockup, Tahap 8, dan output nyata browser.</w:t>
+      </w:r>
+    </w:p>
+    <w:p>
+      <w:pPr>
+        <w:pStyle w:val="ListBody"/>
+      </w:pPr>
+      <w:r>
+        <w:rPr>
+          <w:rFonts w:ascii="Aptos" w:hAnsi="Aptos"/>
+          <w:color w:val="1F2937"/>
+          <w:sz w:val="19"/>
+        </w:rPr>
         <w:t xml:space="preserve">DOC-09-004 — Checkout dan status pesanan sebagai vertical slice modul Ordering (</w:t>
       </w:r>
       <w:r>
@@ -9262,6 +9196,19 @@
           <w:color w:val="1F2937"/>
           <w:sz w:val="19"/>
         </w:rPr>
+        <w:t xml:space="preserve">DOC-09-006 — Rantai v3 (use case SRS v2): Modul 9 menuntaskan UC-05 (halaman checkout: ringkasan, nomor meja, mode penyajian, identitas ringkas, tenant wajib buka, kembali ke keranjang bila item bermasalah, catatan item tersimpan) dan UC-06 (slot pre-order 15 menit, jam operasional, kapasitas slot + slot terdekat, status terjadwal, pelepasan otomatis ke dapur tiap menit) serta halaman tenant Pengaturan Pre-Order; ditambahkan deskripsi use case, mockup, Tahap 8, dan output nyata browser.</w:t>
+      </w:r>
+    </w:p>
+    <w:p>
+      <w:pPr>
+        <w:pStyle w:val="ListBody"/>
+      </w:pPr>
+      <w:r>
+        <w:rPr>
+          <w:rFonts w:ascii="Aptos" w:hAnsi="Aptos"/>
+          <w:color w:val="1F2937"/>
+          <w:sz w:val="19"/>
+        </w:rPr>
         <w:t xml:space="preserve">DOC-10-004 — Pembayaran sebagai vertical slice modul Payments: kontrak </w:t>
       </w:r>
       <w:r>
@@ -9390,6 +9337,19 @@
           <w:color w:val="1F2937"/>
           <w:sz w:val="19"/>
         </w:rPr>
+        <w:t xml:space="preserve">DOC-10-006 — Rantai v3 (use case SRS v2): Modul 10 menuntaskan UC-07 (QRIS otomatis setelah checkout, gambar QRIS + penghitung mundur ≤ 15 menit, rincian split per tenant, percobaan ulang 3 kali saat gateway tidak merespons, QRIS baru saat kedaluwarsa, pemantauan status, batalkan pesanan yang belum dibayar); ditambahkan deskripsi use case, mockup, Tahap 8, dan output nyata browser.</w:t>
+      </w:r>
+    </w:p>
+    <w:p>
+      <w:pPr>
+        <w:pStyle w:val="ListBody"/>
+      </w:pPr>
+      <w:r>
+        <w:rPr>
+          <w:rFonts w:ascii="Aptos" w:hAnsi="Aptos"/>
+          <w:color w:val="1F2937"/>
+          <w:sz w:val="19"/>
+        </w:rPr>
         <w:t xml:space="preserve">DOC-11-004 — Webhook sebagai vertical slice modul Payments: </w:t>
       </w:r>
       <w:r>
@@ -9514,6 +9474,19 @@
           <w:color w:val="1F2937"/>
           <w:sz w:val="19"/>
         </w:rPr>
+        <w:t xml:space="preserve">DOC-11-008 — Rantai v3 (use case SRS v2): Modul 11 menuntaskan UC-08 (nominal dicocokkan + tinjau manual, audit signature salah, penguncian baris, expire/deny membatalkan pesanan, event setelah commit, layar Pembayaran terverifikasi) dan UC-10 (ledger pengelola kantin, rincian pemecahan selisih 0, alokasi pembulatan, proses ulang settlement gagal); ditambahkan deskripsi use case, mockup, Tahap 8, dan output nyata.</w:t>
+      </w:r>
+    </w:p>
+    <w:p>
+      <w:pPr>
+        <w:pStyle w:val="ListBody"/>
+      </w:pPr>
+      <w:r>
+        <w:rPr>
+          <w:rFonts w:ascii="Aptos" w:hAnsi="Aptos"/>
+          <w:color w:val="1F2937"/>
+          <w:sz w:val="19"/>
+        </w:rPr>
         <w:t xml:space="preserve">DOC-12-004 — KDS sebagai vertical slice modul Kitchen: event (</w:t>
       </w:r>
       <w:r>
@@ -9710,6 +9683,19 @@
           <w:color w:val="1F2937"/>
           <w:sz w:val="19"/>
         </w:rPr>
+        <w:t xml:space="preserve">DOC-12-006 — Rantai v3 (use case SRS v2): Modul 12 menuntaskan UC-15 (KDS kolom Baru/Diproses/Siap, Terima → Selesai → Diserahkan, batal beralasan + refund pending, penanda suara, indikator koneksi + polling 10 detik), UC-09 (halaman pelacakan real-time lewat channel privat order.{public_id}, estimasi UC-11, polling 15 detik), dan UC-12 (NotificationGateway + FakeWhatsAppGateway, job antrean 3 percobaan, notification_deliveries, pengingat pre-order); ditambahkan deskripsi use case, mockup, Tahap 8, dan output nyata.</w:t>
+      </w:r>
+    </w:p>
+    <w:p>
+      <w:pPr>
+        <w:pStyle w:val="ListBody"/>
+      </w:pPr>
+      <w:r>
+        <w:rPr>
+          <w:rFonts w:ascii="Aptos" w:hAnsi="Aptos"/>
+          <w:color w:val="1F2937"/>
+          <w:sz w:val="19"/>
+        </w:rPr>
         <w:t xml:space="preserve">DOC-13-004 — Laporan/rekonsiliasi/ekspor dan panel keuangan tenant sebagai vertical slice modul Reporting; penarikan + peninjauan admin di modul Payments; path Contoh Mandiri, Landasan Teknis (termasuk </w:t>
       </w:r>
       <w:r>
@@ -9753,6 +9739,19 @@
           <w:color w:val="1F2937"/>
           <w:sz w:val="19"/>
         </w:rPr>
+        <w:t xml:space="preserve">DOC-13-006 — Rantai v3 (use case SRS v2): Modul 13 menuntaskan UC-16 (laporan omset/transaksi/rata-rata, menu terlaris, jam sibuk, rentang tanggal, keadaan kosong), UC-17 (ekspor .xlsx via ZipArchive dan PDF via dompdf lewat antrean, tautan bertanda tangan 24 jam, surel untuk volume besar), UC-18 (rekonsiliasi per transaksi + referensi pembayaran, telusur pesanan, perlu peninjauan tidak dihitung), UC-20 (penarikan dengan kunci saldo, minimum, satu pengajuan aktif, notifikasi pengelola), dan UC-23 (verifikasi dengan bukti transfer, alasan penolakan, investigasi ledger, idempoten); ditambahkan deskripsi use case, mockup, Tahap 8, dan output nyata.</w:t>
+      </w:r>
+    </w:p>
+    <w:p>
+      <w:pPr>
+        <w:pStyle w:val="ListBody"/>
+      </w:pPr>
+      <w:r>
+        <w:rPr>
+          <w:rFonts w:ascii="Aptos" w:hAnsi="Aptos"/>
+          <w:color w:val="1F2937"/>
+          <w:sz w:val="19"/>
+        </w:rPr>
         <w:t xml:space="preserve">DOC-14-004 — Hardening pada rantai vertical slice: </w:t>
       </w:r>
       <w:r>
@@ -9835,6 +9834,19 @@
           <w:sz w:val="19"/>
         </w:rPr>
         <w:t xml:space="preserve">DOC-14-005 — Blok BUAT FILE per tahap Modul 14: make:middleware SecurityHeaders (shared kernel, global), make:test SecurityHeadersTest &amp; EndToEndJourneyTest, dokumen DEPLOYMENT/DEMO dan evidence manual.</w:t>
+      </w:r>
+    </w:p>
+    <w:p>
+      <w:pPr>
+        <w:pStyle w:val="ListBody"/>
+      </w:pPr>
+      <w:r>
+        <w:rPr>
+          <w:rFonts w:ascii="Aptos" w:hAnsi="Aptos"/>
+          <w:color w:val="1F2937"/>
+          <w:sz w:val="19"/>
+        </w:rPr>
+        <w:t xml:space="preserve">DOC-14-006 — Rantai v3 (use case SRS v2): Modul 14 menutup rantai dengan uji penerimaan 23 use case di browser (23/23 PASS), perbaikan temuan verifikasi rekening tenant (prasyarat UC-20), dan RequirementsTraceabilityTest yang menjaga RTM; ditambahkan daftar periksa uji penerimaan, Tahap 8, dan output nyata.</w:t>
       </w:r>
     </w:p>
     <w:sectPr>
@@ -22097,7 +22109,7 @@
     </w:pPr>
     <w:rPr>
       <w:rFonts w:ascii="Consolas" w:hAnsi="Consolas"/>
-      <w:color w:val="D4D4D4"/>
+      <w:color w:val="262626"/>
       <w:sz w:val="16"/>
     </w:rPr>
   </w:style>
@@ -22209,7 +22221,7 @@
     <w:rPr>
       <w:rFonts w:ascii="Consolas" w:hAnsi="Consolas"/>
       <w:b/>
-      <w:color w:val="FFFFFF"/>
+      <w:color w:val="262626"/>
       <w:sz w:val="16"/>
     </w:rPr>
   </w:style>

</xml_diff>